<commit_message>
Updated documentation. Started head IV - Program realisation
</commit_message>
<xml_diff>
--- a/Дипломна_работа_Мартин_Дамянов.docx
+++ b/Дипломна_работа_Мартин_Дамянов.docx
@@ -1814,11 +1814,479 @@
       <w:r>
         <w:t xml:space="preserve"> </w:t>
       </w:r>
-      <w:r>
-        <w:t>На фиг. 2 е показана електрическата схема на свързване.</w:t>
-      </w:r>
-    </w:p>
-    <w:p/>
+    </w:p>
+    <w:p>
+      <w:r>
+        <w:t>На фиг. 2 е показана ел</w:t>
+      </w:r>
+      <w:r>
+        <w:t xml:space="preserve">ектрическата схема на свързване. Към </w:t>
+      </w:r>
+      <w:r>
+        <w:rPr>
+          <w:lang w:val="en-US"/>
+        </w:rPr>
+        <w:t xml:space="preserve">ESP32 </w:t>
+      </w:r>
+      <w:r>
+        <w:t xml:space="preserve">са свързани </w:t>
+      </w:r>
+      <w:r>
+        <w:rPr>
+          <w:lang w:val="en-US"/>
+        </w:rPr>
+        <w:t xml:space="preserve">NFC </w:t>
+      </w:r>
+      <w:r>
+        <w:t xml:space="preserve">сензорът </w:t>
+      </w:r>
+      <w:r>
+        <w:rPr>
+          <w:lang w:val="en-US"/>
+        </w:rPr>
+        <w:t xml:space="preserve">PN532 </w:t>
+      </w:r>
+      <w:r>
+        <w:t xml:space="preserve">чрез </w:t>
+      </w:r>
+      <w:r>
+        <w:rPr>
+          <w:lang w:val="en-US"/>
+        </w:rPr>
+        <w:t xml:space="preserve">SPI </w:t>
+      </w:r>
+      <w:r>
+        <w:t>интерфейс, един зелен и един червен светодиод, както и зумер. Към последните три елемента са свързани и резистори със съпротивление 150Ω с цел ограничаване на тока през веригите на елементите. Тези съпротивления са избрани след решаване на следното уравнение:</w:t>
+      </w:r>
+    </w:p>
+    <w:p>
+      <m:oMathPara>
+        <m:oMath>
+          <m:r>
+            <w:rPr>
+              <w:rFonts w:ascii="Cambria Math" w:hAnsi="Cambria Math"/>
+            </w:rPr>
+            <w:lastRenderedPageBreak/>
+            <m:t xml:space="preserve">R= </m:t>
+          </m:r>
+          <m:f>
+            <m:fPr>
+              <m:ctrlPr>
+                <w:rPr>
+                  <w:rFonts w:ascii="Cambria Math" w:hAnsi="Cambria Math"/>
+                  <w:i/>
+                </w:rPr>
+              </m:ctrlPr>
+            </m:fPr>
+            <m:num>
+              <m:sSub>
+                <m:sSubPr>
+                  <m:ctrlPr>
+                    <w:rPr>
+                      <w:rFonts w:ascii="Cambria Math" w:hAnsi="Cambria Math"/>
+                      <w:i/>
+                    </w:rPr>
+                  </m:ctrlPr>
+                </m:sSubPr>
+                <m:e>
+                  <m:r>
+                    <w:rPr>
+                      <w:rFonts w:ascii="Cambria Math" w:hAnsi="Cambria Math"/>
+                      <w:lang w:val="en-US"/>
+                    </w:rPr>
+                    <m:t>V</m:t>
+                  </m:r>
+                </m:e>
+                <m:sub>
+                  <m:r>
+                    <w:rPr>
+                      <w:rFonts w:ascii="Cambria Math" w:hAnsi="Cambria Math"/>
+                    </w:rPr>
+                    <m:t>cc</m:t>
+                  </m:r>
+                </m:sub>
+              </m:sSub>
+              <m:r>
+                <w:rPr>
+                  <w:rFonts w:ascii="Cambria Math" w:hAnsi="Cambria Math"/>
+                </w:rPr>
+                <m:t>-</m:t>
+              </m:r>
+              <m:sSub>
+                <m:sSubPr>
+                  <m:ctrlPr>
+                    <w:rPr>
+                      <w:rFonts w:ascii="Cambria Math" w:hAnsi="Cambria Math"/>
+                      <w:i/>
+                    </w:rPr>
+                  </m:ctrlPr>
+                </m:sSubPr>
+                <m:e>
+                  <m:r>
+                    <w:rPr>
+                      <w:rFonts w:ascii="Cambria Math" w:hAnsi="Cambria Math"/>
+                    </w:rPr>
+                    <m:t>V</m:t>
+                  </m:r>
+                </m:e>
+                <m:sub>
+                  <m:r>
+                    <w:rPr>
+                      <w:rFonts w:ascii="Cambria Math" w:hAnsi="Cambria Math"/>
+                    </w:rPr>
+                    <m:t>led</m:t>
+                  </m:r>
+                </m:sub>
+              </m:sSub>
+            </m:num>
+            <m:den>
+              <m:sSub>
+                <m:sSubPr>
+                  <m:ctrlPr>
+                    <w:rPr>
+                      <w:rFonts w:ascii="Cambria Math" w:hAnsi="Cambria Math"/>
+                      <w:i/>
+                    </w:rPr>
+                  </m:ctrlPr>
+                </m:sSubPr>
+                <m:e>
+                  <m:r>
+                    <w:rPr>
+                      <w:rFonts w:ascii="Cambria Math" w:hAnsi="Cambria Math"/>
+                    </w:rPr>
+                    <m:t>I</m:t>
+                  </m:r>
+                </m:e>
+                <m:sub>
+                  <m:r>
+                    <w:rPr>
+                      <w:rFonts w:ascii="Cambria Math" w:hAnsi="Cambria Math"/>
+                    </w:rPr>
+                    <m:t>led</m:t>
+                  </m:r>
+                </m:sub>
+              </m:sSub>
+            </m:den>
+          </m:f>
+        </m:oMath>
+      </m:oMathPara>
+    </w:p>
+    <w:p>
+      <w:r>
+        <w:t>Където:</w:t>
+      </w:r>
+    </w:p>
+    <w:p>
+      <w:pPr>
+        <w:pStyle w:val="a4"/>
+        <w:numPr>
+          <w:ilvl w:val="0"/>
+          <w:numId w:val="47"/>
+        </w:numPr>
+      </w:pPr>
+      <m:oMath>
+        <m:sSub>
+          <m:sSubPr>
+            <m:ctrlPr>
+              <w:rPr>
+                <w:rFonts w:ascii="Cambria Math" w:hAnsi="Cambria Math"/>
+                <w:i/>
+              </w:rPr>
+            </m:ctrlPr>
+          </m:sSubPr>
+          <m:e>
+            <m:r>
+              <w:rPr>
+                <w:rFonts w:ascii="Cambria Math" w:hAnsi="Cambria Math"/>
+                <w:lang w:val="en-US"/>
+              </w:rPr>
+              <m:t>V</m:t>
+            </m:r>
+          </m:e>
+          <m:sub>
+            <m:r>
+              <w:rPr>
+                <w:rFonts w:ascii="Cambria Math" w:hAnsi="Cambria Math"/>
+              </w:rPr>
+              <m:t>cc</m:t>
+            </m:r>
+          </m:sub>
+        </m:sSub>
+        <m:r>
+          <w:rPr>
+            <w:rFonts w:ascii="Cambria Math" w:hAnsi="Cambria Math"/>
+          </w:rPr>
+          <m:t xml:space="preserve">=3.3 </m:t>
+        </m:r>
+        <m:r>
+          <w:rPr>
+            <w:rFonts w:ascii="Cambria Math" w:hAnsi="Cambria Math"/>
+            <w:lang w:val="en-US"/>
+          </w:rPr>
+          <m:t>V</m:t>
+        </m:r>
+      </m:oMath>
+    </w:p>
+    <w:p>
+      <w:pPr>
+        <w:pStyle w:val="a4"/>
+        <w:numPr>
+          <w:ilvl w:val="0"/>
+          <w:numId w:val="47"/>
+        </w:numPr>
+      </w:pPr>
+      <m:oMath>
+        <m:sSub>
+          <m:sSubPr>
+            <m:ctrlPr>
+              <w:rPr>
+                <w:rFonts w:ascii="Cambria Math" w:hAnsi="Cambria Math"/>
+                <w:i/>
+              </w:rPr>
+            </m:ctrlPr>
+          </m:sSubPr>
+          <m:e>
+            <m:r>
+              <w:rPr>
+                <w:rFonts w:ascii="Cambria Math" w:hAnsi="Cambria Math"/>
+              </w:rPr>
+              <m:t>V</m:t>
+            </m:r>
+          </m:e>
+          <m:sub>
+            <m:r>
+              <w:rPr>
+                <w:rFonts w:ascii="Cambria Math" w:hAnsi="Cambria Math"/>
+              </w:rPr>
+              <m:t>led</m:t>
+            </m:r>
+          </m:sub>
+        </m:sSub>
+        <m:r>
+          <w:rPr>
+            <w:rFonts w:ascii="Cambria Math" w:hAnsi="Cambria Math"/>
+          </w:rPr>
+          <m:t xml:space="preserve"> е работно напрежение на светодиода</m:t>
+        </m:r>
+      </m:oMath>
+      <w:r>
+        <w:t xml:space="preserve"> (</w:t>
+      </w:r>
+      <w:r>
+        <w:t>≈</w:t>
+      </w:r>
+      <w:r>
+        <w:rPr>
+          <w:lang w:val="en-US"/>
+        </w:rPr>
+        <w:t>1.9V</w:t>
+      </w:r>
+      <w:r>
+        <w:t xml:space="preserve"> за червения</w:t>
+      </w:r>
+      <w:r>
+        <w:rPr>
+          <w:lang w:val="en-US"/>
+        </w:rPr>
+        <w:t xml:space="preserve"> </w:t>
+      </w:r>
+      <w:r>
+        <w:t>и</w:t>
+      </w:r>
+      <w:r>
+        <w:rPr>
+          <w:lang w:val="en-US"/>
+        </w:rPr>
+        <w:t xml:space="preserve"> </w:t>
+      </w:r>
+      <w:r>
+        <w:t>≈</w:t>
+      </w:r>
+      <w:r>
+        <w:rPr>
+          <w:lang w:val="en-US"/>
+        </w:rPr>
+        <w:t>2.0V</w:t>
+      </w:r>
+      <w:r>
+        <w:t xml:space="preserve"> за зеления светодиод)</w:t>
+      </w:r>
+    </w:p>
+    <w:p>
+      <w:pPr>
+        <w:pStyle w:val="a4"/>
+        <w:numPr>
+          <w:ilvl w:val="0"/>
+          <w:numId w:val="47"/>
+        </w:numPr>
+      </w:pPr>
+      <m:oMath>
+        <m:sSub>
+          <m:sSubPr>
+            <m:ctrlPr>
+              <w:rPr>
+                <w:rFonts w:ascii="Cambria Math" w:hAnsi="Cambria Math"/>
+                <w:i/>
+              </w:rPr>
+            </m:ctrlPr>
+          </m:sSubPr>
+          <m:e>
+            <m:r>
+              <w:rPr>
+                <w:rFonts w:ascii="Cambria Math" w:hAnsi="Cambria Math"/>
+              </w:rPr>
+              <m:t>I</m:t>
+            </m:r>
+          </m:e>
+          <m:sub>
+            <m:r>
+              <w:rPr>
+                <w:rFonts w:ascii="Cambria Math" w:hAnsi="Cambria Math"/>
+              </w:rPr>
+              <m:t>led</m:t>
+            </m:r>
+          </m:sub>
+        </m:sSub>
+      </m:oMath>
+      <w:r>
+        <w:t xml:space="preserve"> е желаният ток през светодиодите</w:t>
+      </w:r>
+    </w:p>
+    <w:p>
+      <w:r>
+        <w:t xml:space="preserve">Тъй като за продължителна и безопасна експлоатация на светодиодите, както и на зумера и на изводите на микроконтролера е препоръчително да не се надвишава стойността от </w:t>
+      </w:r>
+      <w:r>
+        <w:rPr>
+          <w:lang w:val="en-US"/>
+        </w:rPr>
+        <w:t>10mA</w:t>
+      </w:r>
+      <w:r>
+        <w:t xml:space="preserve"> ток</w:t>
+      </w:r>
+      <w:r>
+        <w:rPr>
+          <w:lang w:val="en-US"/>
+        </w:rPr>
+        <w:t>,</w:t>
+      </w:r>
+      <w:r>
+        <w:t xml:space="preserve"> то за съпротивление на резисторите е избрана стойността </w:t>
+      </w:r>
+      <w:r>
+        <w:t>150Ω</w:t>
+      </w:r>
+      <w:r>
+        <w:t xml:space="preserve">. По този начин тока във веригите може да бъде изчислен чрез горното уравнение. А </w:t>
+      </w:r>
+      <w:r>
+        <w:t>стойностите на тока през съответните светодиоди са</w:t>
+      </w:r>
+      <w:r>
+        <w:t>:</w:t>
+      </w:r>
+    </w:p>
+    <w:p>
+      <w:pPr>
+        <w:pStyle w:val="a4"/>
+        <w:numPr>
+          <w:ilvl w:val="0"/>
+          <w:numId w:val="48"/>
+        </w:numPr>
+      </w:pPr>
+      <w:r>
+        <w:t xml:space="preserve">През </w:t>
+      </w:r>
+      <w:r>
+        <w:t xml:space="preserve">зелен светодиод: </w:t>
+      </w:r>
+      <w:r>
+        <w:t>≈</w:t>
+      </w:r>
+      <w:r>
+        <w:t xml:space="preserve"> 8.6</w:t>
+      </w:r>
+      <w:r>
+        <w:rPr>
+          <w:lang w:val="en-US"/>
+        </w:rPr>
+        <w:t>mA</w:t>
+      </w:r>
+    </w:p>
+    <w:p>
+      <w:pPr>
+        <w:pStyle w:val="a4"/>
+        <w:numPr>
+          <w:ilvl w:val="0"/>
+          <w:numId w:val="48"/>
+        </w:numPr>
+      </w:pPr>
+      <w:r>
+        <w:t xml:space="preserve">През </w:t>
+      </w:r>
+      <w:r>
+        <w:t>червен светодиод</w:t>
+      </w:r>
+      <w:r>
+        <w:t xml:space="preserve"> </w:t>
+      </w:r>
+      <w:r>
+        <w:t>≈</w:t>
+      </w:r>
+      <w:r>
+        <w:t xml:space="preserve"> </w:t>
+      </w:r>
+      <w:r>
+        <w:rPr>
+          <w:lang w:val="en-US"/>
+        </w:rPr>
+        <w:t>9.3mA</w:t>
+      </w:r>
+    </w:p>
+    <w:p>
+      <w:pPr>
+        <w:spacing w:before="240"/>
+        <w:jc w:val="left"/>
+      </w:pPr>
+      <w:r>
+        <w:drawing>
+          <wp:inline distT="0" distB="0" distL="0" distR="0" wp14:anchorId="46228E84" wp14:editId="767768D1">
+            <wp:extent cx="5227320" cy="4132533"/>
+            <wp:effectExtent l="0" t="0" r="0" b="1905"/>
+            <wp:docPr id="3" name="Картина 3"/>
+            <wp:cNvGraphicFramePr>
+              <a:graphicFrameLocks xmlns:a="http://schemas.openxmlformats.org/drawingml/2006/main" noChangeAspect="1"/>
+            </wp:cNvGraphicFramePr>
+            <a:graphic xmlns:a="http://schemas.openxmlformats.org/drawingml/2006/main">
+              <a:graphicData uri="http://schemas.openxmlformats.org/drawingml/2006/picture">
+                <pic:pic xmlns:pic="http://schemas.openxmlformats.org/drawingml/2006/picture">
+                  <pic:nvPicPr>
+                    <pic:cNvPr id="1" name=""/>
+                    <pic:cNvPicPr/>
+                  </pic:nvPicPr>
+                  <pic:blipFill>
+                    <a:blip r:embed="rId10"/>
+                    <a:stretch>
+                      <a:fillRect/>
+                    </a:stretch>
+                  </pic:blipFill>
+                  <pic:spPr>
+                    <a:xfrm>
+                      <a:off x="0" y="0"/>
+                      <a:ext cx="5236101" cy="4139475"/>
+                    </a:xfrm>
+                    <a:prstGeom prst="rect">
+                      <a:avLst/>
+                    </a:prstGeom>
+                  </pic:spPr>
+                </pic:pic>
+              </a:graphicData>
+            </a:graphic>
+          </wp:inline>
+        </w:drawing>
+      </w:r>
+    </w:p>
     <w:p>
       <w:pPr>
         <w:pStyle w:val="a9"/>
@@ -1840,21 +2308,7 @@
           <w:b/>
           <w:i/>
         </w:rPr>
-        <w:t xml:space="preserve"> </w:t>
-      </w:r>
-      <w:r>
-        <w:rPr>
-          <w:b/>
-          <w:i/>
-        </w:rPr>
-        <w:t>2</w:t>
-      </w:r>
-      <w:r>
-        <w:rPr>
-          <w:b/>
-          <w:i/>
-        </w:rPr>
-        <w:t>.</w:t>
+        <w:t xml:space="preserve"> 2.</w:t>
       </w:r>
       <w:r>
         <w:rPr>
@@ -1882,7 +2336,6 @@
         <w:rPr>
           <w:lang w:val="en-US"/>
         </w:rPr>
-        <w:lastRenderedPageBreak/>
         <w:t xml:space="preserve">Android </w:t>
       </w:r>
       <w:r>
@@ -1902,31 +2355,7 @@
         <w:t>MainActivity</w:t>
       </w:r>
       <w:r>
-        <w:t xml:space="preserve"> обработва </w:t>
-      </w:r>
-      <w:r>
-        <w:t>логването и</w:t>
-      </w:r>
-      <w:r>
-        <w:t xml:space="preserve"> получава</w:t>
-      </w:r>
-      <w:r>
-        <w:t>нето на</w:t>
-      </w:r>
-      <w:r>
-        <w:t xml:space="preserve"> JWT токен, HMAC ключ и начал</w:t>
-      </w:r>
-      <w:r>
-        <w:t>на стойност на ATC от сървъра, след което ги записва локално в криптиран вид</w:t>
-      </w:r>
-      <w:r>
-        <w:t>. При следващо стартиране, ако данните вече са нали</w:t>
-      </w:r>
-      <w:r>
-        <w:t>чни, екранът за вход се пропуска, тъй като данните вече са запаметени локално</w:t>
-      </w:r>
-      <w:r>
-        <w:t>.</w:t>
+        <w:t xml:space="preserve"> обработва логването и получаването на JWT токен, HMAC ключ и начална стойност на ATC от сървъра, след което ги записва локално в криптиран вид. При следващо стартиране, ако данните вече са налични, екранът за вход се пропуска, тъй като данните вече са запаметени локално.</w:t>
       </w:r>
     </w:p>
     <w:p>
@@ -1937,25 +2366,7 @@
         <w:t xml:space="preserve">HomeActivity </w:t>
       </w:r>
       <w:r>
-        <w:t>е главният екран — показва факултетния номер</w:t>
-      </w:r>
-      <w:r>
-        <w:t xml:space="preserve"> на студента</w:t>
-      </w:r>
-      <w:r>
-        <w:t xml:space="preserve"> и статуса на NFC. Чекирането се активира ръчно с бутон и е ограничено до 30-секунден</w:t>
-      </w:r>
-      <w:r>
-        <w:t xml:space="preserve"> времеви</w:t>
-      </w:r>
-      <w:r>
-        <w:t xml:space="preserve"> прозорец, сл</w:t>
-      </w:r>
-      <w:r>
-        <w:t>ед когото сесията автоматично се спира</w:t>
-      </w:r>
-      <w:r>
-        <w:t>.</w:t>
+        <w:t>е главният екран — показва факултетния номер на студента и статуса на NFC. Чекирането се активира ръчно с бутон и е ограничено до 30-секунден времеви прозорец, след когото сесията автоматично се спира.</w:t>
       </w:r>
     </w:p>
     <w:p>
@@ -1977,16 +2388,7 @@
         <w:t>StudentPrefs</w:t>
       </w:r>
       <w:r>
-        <w:t xml:space="preserve"> е криптирано хранили</w:t>
-      </w:r>
-      <w:r>
-        <w:t>ще (EncryptedSharedPreferences с</w:t>
-      </w:r>
-      <w:r>
-        <w:t xml:space="preserve"> Android Keystore), което пази HMAC ключа, факултетния номер и ATC брояча.</w:t>
-      </w:r>
-      <w:r>
-        <w:t xml:space="preserve"> </w:t>
+        <w:t xml:space="preserve"> е криптирано хранилище (EncryptedSharedPreferences с Android Keystore), което пази HMAC ключа, факултетния номер и ATC брояча. </w:t>
       </w:r>
     </w:p>
     <w:p>
@@ -2010,10 +2412,7 @@
         <w:ind w:firstLine="720"/>
       </w:pPr>
       <w:r>
-        <w:t>Сървърът е реализиран с Python F</w:t>
-      </w:r>
-      <w:r>
-        <w:t>astAPI и асинхронен SQLAlchemy</w:t>
+        <w:t>Сървърът е реализиран с Python FastAPI и асинхронен SQLAlchemy</w:t>
       </w:r>
       <w:r>
         <w:rPr>
@@ -2022,10 +2421,7 @@
         <w:t xml:space="preserve">, </w:t>
       </w:r>
       <w:r>
-        <w:t>използващ</w:t>
-      </w:r>
-      <w:r>
-        <w:t xml:space="preserve"> SQLite. Организиран е в три рутера: auth (логин, провизиониране, регистрации), attendance (чекиране, CRUD на присъствия) и administration (дисциплини, разписания, групи). Всички endpoints са защитени с JWT Bearer токени и </w:t>
+        <w:t xml:space="preserve">използващ SQLite. Организиран е в три рутера: auth (логин, провизиониране, регистрации), attendance (чекиране, CRUD на присъствия) и administration (дисциплини, разписания, групи). Всички endpoints са защитени с JWT Bearer токени и </w:t>
       </w:r>
       <w:r>
         <w:t xml:space="preserve">оторизиране чрез </w:t>
@@ -2092,7 +2488,11 @@
         <w:t xml:space="preserve"> 3</w:t>
       </w:r>
       <w:r>
-        <w:t xml:space="preserve"> е показана диаграма (</w:t>
+        <w:t xml:space="preserve"> е показана </w:t>
+      </w:r>
+      <w:r>
+        <w:lastRenderedPageBreak/>
+        <w:t>диаграма (</w:t>
       </w:r>
       <w:r>
         <w:rPr>
@@ -2115,7 +2515,6 @@
     </w:p>
     <w:p>
       <w:r>
-        <w:lastRenderedPageBreak/>
         <w:t>Бинарният формат на payload-а</w:t>
       </w:r>
       <w:r>
@@ -2178,7 +2577,7 @@
                     </pic:cNvPicPr>
                   </pic:nvPicPr>
                   <pic:blipFill>
-                    <a:blip r:embed="rId10">
+                    <a:blip r:embed="rId11">
                       <a:extLst>
                         <a:ext uri="{28A0092B-C50C-407E-A947-70E740481C1C}">
                           <a14:useLocalDpi xmlns:a14="http://schemas.microsoft.com/office/drawing/2010/main" val="0"/>
@@ -2274,13 +2673,7 @@
         <w:spacing w:before="240"/>
       </w:pPr>
       <w:r>
-        <w:t>С</w:t>
-      </w:r>
-      <w:r>
-        <w:t>лед като студентът е натиснал бутона "Чекирай се" в мобилното приложение</w:t>
-      </w:r>
-      <w:r>
-        <w:t>, к</w:t>
+        <w:t>След като студентът е натиснал бутона "Чекирай се" в мобилното приложение, к</w:t>
       </w:r>
       <w:r>
         <w:t>омуникацията се р</w:t>
@@ -2306,6 +2699,7 @@
         <w:contextualSpacing w:val="0"/>
       </w:pPr>
       <w:r>
+        <w:lastRenderedPageBreak/>
         <w:t>ESP32 засича телефона чрез inListPassiveTarget(), което активира ISO-DEP (ISO 14443-4) сесия. След това и</w:t>
       </w:r>
       <w:r>
@@ -2326,7 +2720,6 @@
         <w:contextualSpacing w:val="0"/>
       </w:pPr>
       <w:r>
-        <w:lastRenderedPageBreak/>
         <w:t>NfcHceService</w:t>
       </w:r>
       <w:r>
@@ -2723,7 +3116,7 @@
                     <pic:cNvPicPr/>
                   </pic:nvPicPr>
                   <pic:blipFill>
-                    <a:blip r:embed="rId11"/>
+                    <a:blip r:embed="rId12"/>
                     <a:stretch>
                       <a:fillRect/>
                     </a:stretch>
@@ -2826,13 +3219,7 @@
         <w:t xml:space="preserve"> на паролата и роля (student, teacher, admin). Свързва се с Students или Teachers чрез </w:t>
       </w:r>
       <w:r>
-        <w:t xml:space="preserve">foreign keys </w:t>
-      </w:r>
-      <w:r>
-        <w:t>–</w:t>
-      </w:r>
-      <w:r>
-        <w:t xml:space="preserve"> п</w:t>
+        <w:t>foreign keys – п</w:t>
       </w:r>
       <w:r>
         <w:t>о този начин един потребителски акаунт е обвързан с конкретен студент или преподавател.</w:t>
@@ -3037,6 +3424,11 @@
       </w:r>
     </w:p>
     <w:p>
+      <w:pPr>
+        <w:rPr>
+          <w:lang w:val="en-US"/>
+        </w:rPr>
+      </w:pPr>
       <w:r>
         <w:t xml:space="preserve">В тази таблица се записват всички присъствия. </w:t>
       </w:r>
@@ -3058,8 +3450,6 @@
       <w:r>
         <w:br/>
       </w:r>
-      <w:bookmarkStart w:id="9" w:name="_GoBack"/>
-      <w:bookmarkEnd w:id="9"/>
     </w:p>
     <w:p>
       <w:pPr>
@@ -3079,6 +3469,1381 @@
         <w:ind w:firstLine="0"/>
         <w:jc w:val="left"/>
       </w:pPr>
+      <w:r>
+        <w:t xml:space="preserve">В </w:t>
+      </w:r>
+      <w:r>
+        <w:t xml:space="preserve">системата </w:t>
+      </w:r>
+      <w:r>
+        <w:t xml:space="preserve">са зададени няколко цели и изисквания за сигурността срещу съответните възможни </w:t>
+      </w:r>
+      <w:r>
+        <w:t>заплах</w:t>
+      </w:r>
+      <w:r>
+        <w:t>и</w:t>
+      </w:r>
+      <w:r>
+        <w:t>:</w:t>
+      </w:r>
+    </w:p>
+    <w:p>
+      <w:pPr>
+        <w:pStyle w:val="a4"/>
+        <w:numPr>
+          <w:ilvl w:val="0"/>
+          <w:numId w:val="44"/>
+        </w:numPr>
+        <w:spacing w:after="100"/>
+        <w:contextualSpacing w:val="0"/>
+        <w:jc w:val="left"/>
+      </w:pPr>
+      <w:r>
+        <w:t>Аутентикация: JWT Bearer токени с 24-часов живот, издавани при успешен логин. Всеки endpoint на бекенд сървъра е защитен с Depends(get_current_user).</w:t>
+      </w:r>
+    </w:p>
+    <w:p>
+      <w:pPr>
+        <w:pStyle w:val="a4"/>
+        <w:numPr>
+          <w:ilvl w:val="0"/>
+          <w:numId w:val="44"/>
+        </w:numPr>
+      </w:pPr>
+      <w:r>
+        <w:t xml:space="preserve">NFC верификация: HMAC-SHA256 подпис върху </w:t>
+      </w:r>
+      <w:r>
+        <w:t>факултетния номер и АТС брояча (</w:t>
+      </w:r>
+      <w:r>
+        <w:t>"FN|ATC"</w:t>
+      </w:r>
+      <w:r>
+        <w:t>)</w:t>
+      </w:r>
+      <w:r>
+        <w:t>. Ключът е 32 случайни байт</w:t>
+      </w:r>
+      <w:r>
+        <w:t>а, генерирани от os.urandom(),</w:t>
+      </w:r>
+      <w:r>
+        <w:t xml:space="preserve"> предава се на </w:t>
+      </w:r>
+      <w:r>
+        <w:t>мобилното приложение</w:t>
+      </w:r>
+      <w:r>
+        <w:t xml:space="preserve"> само веднъж по HTTPS</w:t>
+      </w:r>
+      <w:r>
+        <w:t xml:space="preserve"> при първо логване</w:t>
+      </w:r>
+      <w:r>
+        <w:t>.</w:t>
+      </w:r>
+    </w:p>
+    <w:p>
+      <w:pPr>
+        <w:pStyle w:val="a4"/>
+        <w:numPr>
+          <w:ilvl w:val="0"/>
+          <w:numId w:val="44"/>
+        </w:numPr>
+      </w:pPr>
+      <w:r>
+        <w:t>Replay защита: Application Transaction Counter (ATC) е монотонен брояч. Сървърът приема само ATC &gt; DB_ATC и ATC ≤ DB_ATC + 100. Прозорецът от 100 компенсира неуспешни допирания, при които телефонът увеличава ATC, но сървърът не записва присъствие.</w:t>
+      </w:r>
+    </w:p>
+    <w:p>
+      <w:pPr>
+        <w:pStyle w:val="a4"/>
+        <w:numPr>
+          <w:ilvl w:val="0"/>
+          <w:numId w:val="44"/>
+        </w:numPr>
+      </w:pPr>
+      <w:r>
+        <w:t>Защита от дублиране: за всеки студент, предмет и тип занятие се допуска само едно присъствие на ден (проверка по course_id, type и date).</w:t>
+      </w:r>
+    </w:p>
+    <w:p>
+      <w:pPr>
+        <w:pStyle w:val="a4"/>
+        <w:numPr>
+          <w:ilvl w:val="0"/>
+          <w:numId w:val="44"/>
+        </w:numPr>
+      </w:pPr>
+      <w:r>
+        <w:t xml:space="preserve">Съхранение на ключове: на Android устройството HMAC ключът се съхранява в EncryptedSharedPreferences, </w:t>
+      </w:r>
+      <w:r>
+        <w:t>поддържано от Android Keystore. Това е</w:t>
+      </w:r>
+      <w:r>
+        <w:t xml:space="preserve"> хардуерно изолирано хранилище,</w:t>
+      </w:r>
+      <w:r>
+        <w:t xml:space="preserve"> което е</w:t>
+      </w:r>
+      <w:r>
+        <w:t xml:space="preserve"> недостъпно дори при root достъп.</w:t>
+      </w:r>
+      <w:r>
+        <w:br w:type="page"/>
+      </w:r>
+    </w:p>
+    <w:p>
+      <w:pPr>
+        <w:pStyle w:val="1"/>
+      </w:pPr>
+      <w:r>
+        <w:lastRenderedPageBreak/>
+        <w:t>Използвани технологии</w:t>
+      </w:r>
+    </w:p>
+    <w:p>
+      <w:r>
+        <w:t xml:space="preserve">Следва да бъдат </w:t>
+      </w:r>
+      <w:r>
+        <w:t>описани технологиите, инструментите и библиотеките, използвани при разработката на системата. За всяка технология е посочена кратка характеристика и обосновка за нейния избор.</w:t>
+      </w:r>
+    </w:p>
+    <w:p>
+      <w:pPr>
+        <w:pStyle w:val="2"/>
+        <w:numPr>
+          <w:ilvl w:val="0"/>
+          <w:numId w:val="46"/>
+        </w:numPr>
+      </w:pPr>
+      <w:r>
+        <w:t>Хардуерни компоненти</w:t>
+      </w:r>
+    </w:p>
+    <w:p>
+      <w:pPr>
+        <w:pStyle w:val="3"/>
+        <w:numPr>
+          <w:ilvl w:val="1"/>
+          <w:numId w:val="46"/>
+        </w:numPr>
+      </w:pPr>
+      <w:r>
+        <w:rPr>
+          <w:lang w:val="en-US"/>
+        </w:rPr>
+        <w:t>ESP32</w:t>
+      </w:r>
+    </w:p>
+    <w:p>
+      <w:pPr>
+        <w:rPr>
+          <w:szCs w:val="24"/>
+        </w:rPr>
+      </w:pPr>
+      <w:r>
+        <w:t xml:space="preserve">Използва се микроконтролер </w:t>
+      </w:r>
+      <w:r>
+        <w:rPr>
+          <w:lang w:val="en-US"/>
+        </w:rPr>
+        <w:t>ESP32 Devkit V1</w:t>
+      </w:r>
+      <w:r>
+        <w:t xml:space="preserve">, базиран на </w:t>
+      </w:r>
+      <w:r>
+        <w:rPr>
+          <w:szCs w:val="24"/>
+        </w:rPr>
+        <w:t>ESP32-WROOM32</w:t>
+      </w:r>
+      <w:r>
+        <w:rPr>
+          <w:szCs w:val="24"/>
+          <w:lang w:val="en-US"/>
+        </w:rPr>
+        <w:t xml:space="preserve">. </w:t>
+      </w:r>
+      <w:r>
+        <w:rPr>
+          <w:szCs w:val="24"/>
+        </w:rPr>
+        <w:t xml:space="preserve">Той е </w:t>
+      </w:r>
+      <w:r>
+        <w:rPr>
+          <w:szCs w:val="24"/>
+        </w:rPr>
+        <w:t>двуядрен микроконтролер с тактова честота до 240 MHz, вградена Wi-Fi (802.11 b/g/n) и Bluetooth свързаност, произведен от Espressif Systems. Разполага с 38 GPIO пина, множество хардуерни интерфейси (SPI, I2C, UART) и 4 MB Flash памет.</w:t>
+      </w:r>
+    </w:p>
+    <w:p>
+      <w:pPr>
+        <w:rPr>
+          <w:szCs w:val="24"/>
+        </w:rPr>
+      </w:pPr>
+      <w:r>
+        <w:rPr>
+          <w:szCs w:val="24"/>
+        </w:rPr>
+        <w:t>Изборът на ESP32 пред алтернативи като Arduino Uno или Raspberry Pi е обоснован с три фактора: вградена Wi-Fi свързаност (без допълнителен модул), достатъчна изчислителна мощност за обработка на бинарни NFC p</w:t>
+      </w:r>
+      <w:r>
+        <w:rPr>
+          <w:szCs w:val="24"/>
+        </w:rPr>
+        <w:t>ayload-и и ниска цена (~5 USD).</w:t>
+      </w:r>
+    </w:p>
+    <w:p>
+      <w:pPr>
+        <w:pStyle w:val="2"/>
+        <w:numPr>
+          <w:ilvl w:val="1"/>
+          <w:numId w:val="46"/>
+        </w:numPr>
+      </w:pPr>
+      <w:r>
+        <w:rPr>
+          <w:lang w:val="en-US"/>
+        </w:rPr>
+        <w:t xml:space="preserve">PN532 (NFC </w:t>
+      </w:r>
+      <w:r>
+        <w:t>модул</w:t>
+      </w:r>
+      <w:r>
+        <w:rPr>
+          <w:lang w:val="en-US"/>
+        </w:rPr>
+        <w:t>)</w:t>
+      </w:r>
+    </w:p>
+    <w:p>
+      <w:pPr>
+        <w:rPr>
+          <w:lang w:val="en-US"/>
+        </w:rPr>
+      </w:pPr>
+      <w:r>
+        <w:t>PN532 е интегрална схема за NFC комуникация на NXP Semiconductors, поддържаща стандартите ISO 14443-A/B и ISO 18092. Поддържа три интерфейса: UART, I2C и SPI. В проекта е конфигуриран в SPI режим чрез DIP превключватели (SEL0=OFF, SEL1=ON).</w:t>
+      </w:r>
+      <w:r>
+        <w:rPr>
+          <w:lang w:val="en-US"/>
+        </w:rPr>
+        <w:t xml:space="preserve"> </w:t>
+      </w:r>
+      <w:r>
+        <w:t xml:space="preserve">Този режим е избран, тъй като </w:t>
+      </w:r>
+      <w:r>
+        <w:rPr>
+          <w:lang w:val="en-US"/>
+        </w:rPr>
+        <w:t xml:space="preserve">ESP32 </w:t>
+      </w:r>
+      <w:r>
+        <w:t xml:space="preserve">има готови библиотеки за комуникация по </w:t>
+      </w:r>
+      <w:r>
+        <w:rPr>
+          <w:lang w:val="en-US"/>
+        </w:rPr>
+        <w:t xml:space="preserve">SPI </w:t>
+      </w:r>
+      <w:r>
+        <w:t xml:space="preserve">и комуникацията му е по-бърза спрямо </w:t>
+      </w:r>
+      <w:r>
+        <w:rPr>
+          <w:lang w:val="en-US"/>
+        </w:rPr>
+        <w:t>I2C.</w:t>
+      </w:r>
+    </w:p>
+    <w:p>
+      <w:r>
+        <w:t>PN532 е избран пред</w:t>
+      </w:r>
+      <w:r>
+        <w:t xml:space="preserve"> </w:t>
+      </w:r>
+      <w:r>
+        <w:t xml:space="preserve">RC522 поради </w:t>
+      </w:r>
+      <w:r>
+        <w:t>едно основно</w:t>
+      </w:r>
+      <w:r>
+        <w:t xml:space="preserve"> предимство: поддръжка на</w:t>
+      </w:r>
+      <w:r>
+        <w:t xml:space="preserve"> ISO-DEP (ISO 14443-4) протокол, което му позволява да комуникира с мобилни устройства с </w:t>
+      </w:r>
+      <w:r>
+        <w:rPr>
+          <w:lang w:val="en-US"/>
+        </w:rPr>
+        <w:t xml:space="preserve">Android, </w:t>
+      </w:r>
+      <w:r>
+        <w:t xml:space="preserve">които имат вграден </w:t>
+      </w:r>
+      <w:r>
+        <w:rPr>
+          <w:lang w:val="en-US"/>
+        </w:rPr>
+        <w:t xml:space="preserve">NFC </w:t>
+      </w:r>
+      <w:r>
+        <w:t>модул</w:t>
+      </w:r>
+      <w:r>
+        <w:t>.</w:t>
+      </w:r>
+    </w:p>
+    <w:p>
+      <w:pPr>
+        <w:pStyle w:val="2"/>
+        <w:numPr>
+          <w:ilvl w:val="0"/>
+          <w:numId w:val="46"/>
+        </w:numPr>
+      </w:pPr>
+      <w:r>
+        <w:t>Програмни езици</w:t>
+      </w:r>
+    </w:p>
+    <w:p>
+      <w:pPr>
+        <w:pStyle w:val="3"/>
+        <w:numPr>
+          <w:ilvl w:val="1"/>
+          <w:numId w:val="46"/>
+        </w:numPr>
+      </w:pPr>
+      <w:r>
+        <w:rPr>
+          <w:lang w:val="en-US"/>
+        </w:rPr>
+        <w:t xml:space="preserve">C++ (ESP32 </w:t>
+      </w:r>
+      <w:r>
+        <w:t>фърмуер</w:t>
+      </w:r>
+      <w:r>
+        <w:rPr>
+          <w:lang w:val="en-US"/>
+        </w:rPr>
+        <w:t>)</w:t>
+      </w:r>
+    </w:p>
+    <w:p>
+      <w:r>
+        <w:t xml:space="preserve">Фърмуерът на ESP32 е написан на C++ в рамките на Arduino Framework, управляван чрез PlatformIO. Arduino Framework предоставя абстракционен слой над хардуера, </w:t>
+      </w:r>
+      <w:r>
+        <w:t xml:space="preserve">който позволява лесно програмиране на GPIO, SPI и Wi-Fi. Има готова библиотека </w:t>
+      </w:r>
+      <w:r>
+        <w:t>Adafruit PN532</w:t>
+      </w:r>
+      <w:r>
+        <w:t xml:space="preserve">, чрез която се използва и програмира </w:t>
+      </w:r>
+      <w:r>
+        <w:rPr>
+          <w:lang w:val="en-US"/>
+        </w:rPr>
+        <w:t xml:space="preserve">NFC </w:t>
+      </w:r>
+      <w:r>
+        <w:t>сензора.</w:t>
+      </w:r>
+    </w:p>
+    <w:p>
+      <w:pPr>
+        <w:pStyle w:val="3"/>
+        <w:numPr>
+          <w:ilvl w:val="1"/>
+          <w:numId w:val="46"/>
+        </w:numPr>
+      </w:pPr>
+      <w:r>
+        <w:rPr>
+          <w:lang w:val="en-US"/>
+        </w:rPr>
+        <w:lastRenderedPageBreak/>
+        <w:t>Kotlin</w:t>
+      </w:r>
+    </w:p>
+    <w:p>
+      <w:r>
+        <w:t>Kotlin е официалният препоръчан език за Android разработка от Google от 2019 г.</w:t>
+      </w:r>
+      <w:r>
+        <w:rPr>
+          <w:lang w:val="en-US"/>
+        </w:rPr>
+        <w:t xml:space="preserve"> </w:t>
+      </w:r>
+      <w:r>
+        <w:t>насам.</w:t>
+      </w:r>
+      <w:r>
+        <w:t xml:space="preserve"> Предлага пълна с</w:t>
+      </w:r>
+      <w:r>
+        <w:t>ъвместимост с Java, по-кратък синтаксис, вграден</w:t>
+      </w:r>
+      <w:r>
+        <w:t xml:space="preserve"> null-safety и поддръжка на </w:t>
+      </w:r>
+      <w:r>
+        <w:t xml:space="preserve">асинхронни операции. </w:t>
+      </w:r>
+      <w:r>
+        <w:t xml:space="preserve">Kotlin е избран пред Java поради </w:t>
+      </w:r>
+      <w:r>
+        <w:t xml:space="preserve">тъй като вече се е наложил като основен език за програмиране на </w:t>
+      </w:r>
+      <w:r>
+        <w:rPr>
+          <w:lang w:val="en-US"/>
+        </w:rPr>
+        <w:t>Android</w:t>
+      </w:r>
+      <w:r>
+        <w:t xml:space="preserve"> приложения</w:t>
+      </w:r>
+      <w:r>
+        <w:t xml:space="preserve"> </w:t>
+      </w:r>
+      <w:r>
+        <w:t xml:space="preserve">и има </w:t>
+      </w:r>
+      <w:r>
+        <w:t>интеграция с Jetpa</w:t>
+      </w:r>
+      <w:r>
+        <w:t>ck библиотеките.</w:t>
+      </w:r>
+    </w:p>
+    <w:p>
+      <w:pPr>
+        <w:pStyle w:val="3"/>
+        <w:numPr>
+          <w:ilvl w:val="1"/>
+          <w:numId w:val="46"/>
+        </w:numPr>
+      </w:pPr>
+      <w:r>
+        <w:rPr>
+          <w:lang w:val="en-US"/>
+        </w:rPr>
+        <w:t>Python</w:t>
+      </w:r>
+    </w:p>
+    <w:p>
+      <w:pPr>
+        <w:rPr>
+          <w:lang w:val="en-US"/>
+        </w:rPr>
+      </w:pPr>
+      <w:r>
+        <w:t>За</w:t>
+      </w:r>
+      <w:r>
+        <w:t xml:space="preserve"> реализацията на сървърната страна</w:t>
+      </w:r>
+      <w:r>
+        <w:t xml:space="preserve"> е използван</w:t>
+      </w:r>
+      <w:r>
+        <w:rPr>
+          <w:lang w:val="en-US"/>
+        </w:rPr>
+        <w:t xml:space="preserve"> Python 3.14</w:t>
+      </w:r>
+      <w:r>
+        <w:t xml:space="preserve">. </w:t>
+      </w:r>
+      <w:r>
+        <w:t>Избран е заради големият брой</w:t>
+      </w:r>
+      <w:r>
+        <w:t xml:space="preserve"> библиотеки за уеб разработка, ORM и криптография, бърз</w:t>
+      </w:r>
+      <w:r>
+        <w:t>а итерация и по-лесен</w:t>
+      </w:r>
+      <w:r>
+        <w:t xml:space="preserve"> синтаксис</w:t>
+      </w:r>
+      <w:r>
+        <w:t>. За</w:t>
+      </w:r>
+      <w:r>
+        <w:rPr>
+          <w:lang w:val="en-US"/>
+        </w:rPr>
+        <w:t xml:space="preserve"> </w:t>
+      </w:r>
+      <w:r>
+        <w:t xml:space="preserve">уеб фреймуърк е избран </w:t>
+      </w:r>
+      <w:r>
+        <w:rPr>
+          <w:lang w:val="en-US"/>
+        </w:rPr>
+        <w:t xml:space="preserve">FastAPI, </w:t>
+      </w:r>
+      <w:r>
+        <w:t>тъй като е по-нова и модерна технология, която позволява асинхронна обработка. Макар да не е паралелна, това подобрява производителността, особено ако постъпят заявки от много студенти наведнъж. За базите данни се използва SQLAlch</w:t>
+      </w:r>
+      <w:r>
+        <w:rPr>
+          <w:lang w:val="en-US"/>
+        </w:rPr>
+        <w:t>emy.</w:t>
+      </w:r>
+    </w:p>
+    <w:p>
+      <w:pPr>
+        <w:pStyle w:val="2"/>
+        <w:numPr>
+          <w:ilvl w:val="1"/>
+          <w:numId w:val="46"/>
+        </w:numPr>
+        <w:rPr>
+          <w:lang w:val="en-US"/>
+        </w:rPr>
+      </w:pPr>
+      <w:r>
+        <w:rPr>
+          <w:lang w:val="en-US"/>
+        </w:rPr>
+        <w:t>JavaScript</w:t>
+      </w:r>
+    </w:p>
+    <w:p>
+      <w:r>
+        <w:t>Фронтендът е реализиран с Vanilla JavaScript (ES2022) без допълнителен фреймуърк. HTML5 и CSS3 осигуряват структурата и визията на фронтенда, а JS обработва комуникацията с REST API и динамичното обновяване на съдържанието.</w:t>
+      </w:r>
+    </w:p>
+    <w:p>
+      <w:pPr>
+        <w:pStyle w:val="2"/>
+        <w:numPr>
+          <w:ilvl w:val="0"/>
+          <w:numId w:val="46"/>
+        </w:numPr>
+      </w:pPr>
+      <w:r>
+        <w:t>Фреймуъркове и библиотеки</w:t>
+      </w:r>
+    </w:p>
+    <w:p>
+      <w:pPr>
+        <w:pStyle w:val="3"/>
+        <w:numPr>
+          <w:ilvl w:val="1"/>
+          <w:numId w:val="46"/>
+        </w:numPr>
+      </w:pPr>
+      <w:r>
+        <w:rPr>
+          <w:lang w:val="en-US"/>
+        </w:rPr>
+        <w:t>FastAPI</w:t>
+      </w:r>
+    </w:p>
+    <w:p>
+      <w:r>
+        <w:t xml:space="preserve">FastAPI е </w:t>
+      </w:r>
+      <w:r>
+        <w:t xml:space="preserve"> Python уеб фреймуърк за изграждане на REST API, базиран на стандарта OpenAPI и Pydantic за валидация на данните. Поддържа асинхронно изпълнение чрез Python asyncio</w:t>
+      </w:r>
+      <w:r>
+        <w:t xml:space="preserve"> и има възможност за </w:t>
+      </w:r>
+      <w:r>
+        <w:t>автоматично генерира</w:t>
+      </w:r>
+      <w:r>
+        <w:t>не на</w:t>
+      </w:r>
+      <w:r>
+        <w:t xml:space="preserve"> документация.</w:t>
+      </w:r>
+    </w:p>
+    <w:p>
+      <w:r>
+        <w:t>FastAPI е избран пред Flask и Django пор</w:t>
+      </w:r>
+      <w:r>
+        <w:t>ади възможността за асинхронна обработка,</w:t>
+      </w:r>
+      <w:r>
+        <w:t xml:space="preserve"> автоматичната валидация</w:t>
+      </w:r>
+      <w:r>
+        <w:t xml:space="preserve"> на данните</w:t>
+      </w:r>
+      <w:r>
+        <w:t xml:space="preserve"> чрез Pydantic схеми и значително по-високата про</w:t>
+      </w:r>
+      <w:r>
+        <w:t>изводителност при I/O опе</w:t>
+      </w:r>
+      <w:r>
+        <w:t>рации.</w:t>
+      </w:r>
+    </w:p>
+    <w:p>
+      <w:pPr>
+        <w:pStyle w:val="2"/>
+        <w:numPr>
+          <w:ilvl w:val="1"/>
+          <w:numId w:val="46"/>
+        </w:numPr>
+      </w:pPr>
+      <w:r>
+        <w:t>SQLAlchemy</w:t>
+      </w:r>
+    </w:p>
+    <w:p>
+      <w:r>
+        <w:t>SQLAlchemy е ORM (Object-Relational Mapper) за Python, използван в асинхронен режим чрез разширението aiosqlite. Дефинира моделите на базата данни като Python класове и генерира SQL заявки автоматично.</w:t>
+      </w:r>
+    </w:p>
+    <w:p>
+      <w:r>
+        <w:lastRenderedPageBreak/>
+        <w:t>Асинхронният режим се използва</w:t>
+      </w:r>
+      <w:r>
+        <w:t>, за да не блокира FastAPI event loop при изпълнение на бавни I/O операции към б</w:t>
+      </w:r>
+      <w:r>
+        <w:t>азата данни.</w:t>
+      </w:r>
+    </w:p>
+    <w:p>
+      <w:pPr>
+        <w:pStyle w:val="3"/>
+        <w:numPr>
+          <w:ilvl w:val="1"/>
+          <w:numId w:val="46"/>
+        </w:numPr>
+      </w:pPr>
+      <w:r>
+        <w:t>Adafruit PN532</w:t>
+      </w:r>
+    </w:p>
+    <w:p>
+      <w:r>
+        <w:t>Adafruit PN532 е C++ библиотека за управление на PN532 NFC модула в Arduino среда. Предоставя функции за инициализация, конфигурация и обмен на данни с NFC устройства</w:t>
+      </w:r>
+      <w:r>
+        <w:t xml:space="preserve">. </w:t>
+      </w:r>
+      <w:r>
+        <w:t>Ключово ограничение на верс</w:t>
+      </w:r>
+      <w:r>
+        <w:t xml:space="preserve">ия 1.3.1 е вътрешният буфер от 64 байта. </w:t>
+      </w:r>
+      <w:r>
+        <w:t>Това определя макс</w:t>
+      </w:r>
+      <w:r>
+        <w:t>ималния размер на NFC payload-а.</w:t>
+      </w:r>
+    </w:p>
+    <w:p>
+      <w:pPr>
+        <w:pStyle w:val="3"/>
+        <w:numPr>
+          <w:ilvl w:val="1"/>
+          <w:numId w:val="46"/>
+        </w:numPr>
+      </w:pPr>
+      <w:r>
+        <w:t>Retrofit2 (Android)</w:t>
+      </w:r>
+    </w:p>
+    <w:p>
+      <w:r>
+        <w:t xml:space="preserve">Retrofit2 е типобезопасен HTTP клиент за Android и Java, </w:t>
+      </w:r>
+      <w:r>
+        <w:t xml:space="preserve">разработен от Square. Позволява </w:t>
+      </w:r>
+      <w:r>
+        <w:t>дефиниране на REST API endpoints като Kotlin и</w:t>
+      </w:r>
+      <w:r>
+        <w:t xml:space="preserve">нтерфейси с анотации и поддържа асинхронно изпълнение. </w:t>
+      </w:r>
+      <w:r>
+        <w:t>Retrofit е стандартният избор за мрежова комуникация в Android</w:t>
+      </w:r>
+      <w:r>
+        <w:t>.</w:t>
+      </w:r>
+    </w:p>
+    <w:p>
+      <w:pPr>
+        <w:pStyle w:val="2"/>
+        <w:numPr>
+          <w:ilvl w:val="0"/>
+          <w:numId w:val="46"/>
+        </w:numPr>
+      </w:pPr>
+      <w:r>
+        <w:t>База данни</w:t>
+      </w:r>
+    </w:p>
+    <w:p>
+      <w:r>
+        <w:t xml:space="preserve">За съхранение </w:t>
+      </w:r>
+      <w:r>
+        <w:t>на данните е използвана SQLite. Тя е</w:t>
+      </w:r>
+      <w:r>
+        <w:t xml:space="preserve"> </w:t>
+      </w:r>
+      <w:r>
+        <w:t>олекотена</w:t>
+      </w:r>
+      <w:r>
+        <w:t xml:space="preserve"> релационна база данни, която не изисква отделен сървърен процес. Достъпът се осъществява асинхронно чрез драйвера aiosqlite, съвместим с asyncio event loop на FastAPI.</w:t>
+      </w:r>
+    </w:p>
+    <w:p>
+      <w:r>
+        <w:t xml:space="preserve">SQLite е избрана поради </w:t>
+      </w:r>
+      <w:r>
+        <w:t>лесното внедряване – използва се един .db файл. П</w:t>
+      </w:r>
+      <w:r>
+        <w:t>роизводителност</w:t>
+      </w:r>
+      <w:r>
+        <w:t>та му е достатъчна за проекта (</w:t>
+      </w:r>
+      <w:r>
+        <w:t>стотици студенти) и пълната съвместимост с SQLAlchemy ORM. При нужда от мащабиране SQLAlchemy позволява миграция към PostgreSQL</w:t>
+      </w:r>
+      <w:r>
+        <w:t xml:space="preserve"> или</w:t>
+      </w:r>
+      <w:r>
+        <w:rPr>
+          <w:lang w:val="en-US"/>
+        </w:rPr>
+        <w:t xml:space="preserve"> MySql</w:t>
+      </w:r>
+      <w:r>
+        <w:t xml:space="preserve"> с минимални промени в кода.</w:t>
+      </w:r>
+    </w:p>
+    <w:p>
+      <w:pPr>
+        <w:pStyle w:val="2"/>
+        <w:numPr>
+          <w:ilvl w:val="0"/>
+          <w:numId w:val="46"/>
+        </w:numPr>
+      </w:pPr>
+      <w:r>
+        <w:t>Сигурност и криптография</w:t>
+      </w:r>
+    </w:p>
+    <w:p>
+      <w:pPr>
+        <w:pStyle w:val="3"/>
+        <w:numPr>
+          <w:ilvl w:val="1"/>
+          <w:numId w:val="46"/>
+        </w:numPr>
+      </w:pPr>
+      <w:r>
+        <w:t>HMAC-SHA256</w:t>
+      </w:r>
+    </w:p>
+    <w:p>
+      <w:r>
+        <w:t xml:space="preserve">HMAC (Hash-based Message Authentication Code) с SHA-256 хеш функция се използва за криптографска верификация на NFC payload-а. Алгоритъмът изчислява </w:t>
+      </w:r>
+      <w:r>
+        <w:t>функция</w:t>
+      </w:r>
+      <w:r>
+        <w:t xml:space="preserve"> върху съобщението "ФН|ATC", използвайки споделен таен ключ.</w:t>
+      </w:r>
+    </w:p>
+    <w:p>
+      <w:pPr>
+        <w:pStyle w:val="3"/>
+        <w:numPr>
+          <w:ilvl w:val="1"/>
+          <w:numId w:val="46"/>
+        </w:numPr>
+      </w:pPr>
+      <w:r>
+        <w:t xml:space="preserve">Android Keystore и EncryptedSharedPreferences </w:t>
+      </w:r>
+    </w:p>
+    <w:p>
+      <w:r>
+        <w:t>Android Keystore System е хардуерно изолирано хранилище за криптографски ключове, достъпно чрез Android API. EncryptedSharedPreferences използва AES256-GCM за криптиране на стойностите и AES256-SIV за ключовете, управлявани от Keystore.</w:t>
+      </w:r>
+    </w:p>
+    <w:p>
+      <w:r>
+        <w:lastRenderedPageBreak/>
+        <w:t>По този начин</w:t>
+      </w:r>
+      <w:r>
+        <w:t xml:space="preserve"> HMAC ключът не може да бъде извлечен дори при root достъп до устройството, тъй като дешифрирането изисква хардуерна атестация от самия Keystore чип.</w:t>
+      </w:r>
+    </w:p>
+    <w:p>
+      <w:pPr>
+        <w:pStyle w:val="3"/>
+        <w:numPr>
+          <w:ilvl w:val="1"/>
+          <w:numId w:val="46"/>
+        </w:numPr>
+      </w:pPr>
+      <w:r>
+        <w:t>JSON Web Tokens</w:t>
+      </w:r>
+    </w:p>
+    <w:p>
+      <w:r>
+        <w:rPr>
+          <w:lang w:val="en-US"/>
+        </w:rPr>
+        <w:t>JSON Web Tokens (</w:t>
+      </w:r>
+      <w:r>
+        <w:t>JWT</w:t>
+      </w:r>
+      <w:r>
+        <w:rPr>
+          <w:lang w:val="en-US"/>
+        </w:rPr>
+        <w:t>)</w:t>
+      </w:r>
+      <w:r>
+        <w:t xml:space="preserve"> се използва за ау</w:t>
+      </w:r>
+      <w:r>
+        <w:t>тентикация в REST API. При успешен логин сървърът издава токен, подписан с HMAC-SHA256 и таен ключ, с 24-часов живот. Токенът се включва в Authorization hea</w:t>
+      </w:r>
+      <w:r>
+        <w:t>der на всяка последваща заявка.</w:t>
+      </w:r>
+      <w:r>
+        <w:rPr>
+          <w:lang w:val="en-US"/>
+        </w:rPr>
+        <w:t xml:space="preserve"> </w:t>
+      </w:r>
+      <w:r>
+        <w:t xml:space="preserve">JWT е предпочетен </w:t>
+      </w:r>
+      <w:r>
+        <w:t>поради съвместимостта му с</w:t>
+      </w:r>
+      <w:r>
+        <w:t xml:space="preserve"> FastAPI, и лесната интеграция с </w:t>
+      </w:r>
+      <w:r>
+        <w:t xml:space="preserve">други </w:t>
+      </w:r>
+      <w:r>
+        <w:rPr>
+          <w:lang w:val="en-US"/>
+        </w:rPr>
+        <w:t>P</w:t>
+      </w:r>
+      <w:r>
+        <w:t>ython</w:t>
+      </w:r>
+      <w:r>
+        <w:t xml:space="preserve"> библиотеката.</w:t>
+      </w:r>
+    </w:p>
+    <w:p>
+      <w:pPr>
+        <w:pStyle w:val="2"/>
+        <w:numPr>
+          <w:ilvl w:val="0"/>
+          <w:numId w:val="46"/>
+        </w:numPr>
+      </w:pPr>
+      <w:r>
+        <w:t>Стандарти и протоколи</w:t>
+      </w:r>
+    </w:p>
+    <w:p>
+      <w:pPr>
+        <w:pStyle w:val="3"/>
+        <w:numPr>
+          <w:ilvl w:val="1"/>
+          <w:numId w:val="46"/>
+        </w:numPr>
+      </w:pPr>
+      <w:r>
+        <w:t>ISO 14443 и ISO-DEP</w:t>
+      </w:r>
+    </w:p>
+    <w:p>
+      <w:r>
+        <w:t xml:space="preserve">ISO 14443 дефинира физическия и протоколния слой за безконтактни карти с обхват до 10 cm. Частта ISO 14443-3 дефинира инициализацията и </w:t>
+      </w:r>
+      <w:r>
+        <w:t>механизъм</w:t>
+      </w:r>
+      <w:r>
+        <w:rPr>
+          <w:lang w:val="en-US"/>
+        </w:rPr>
+        <w:t xml:space="preserve"> </w:t>
+      </w:r>
+      <w:r>
+        <w:t>против колизии</w:t>
+      </w:r>
+      <w:r>
+        <w:t>, докато ISO 14443-4 (ISO-DEP) добавя транспортен прот</w:t>
+      </w:r>
+      <w:r>
+        <w:t xml:space="preserve">окол за пренос на APDU команди. </w:t>
+      </w:r>
+      <w:r>
+        <w:t>ISO-DEP е задължителен за комуникация с Android HCE услуги и се активира на ESP32 чрез функцията inListPassiveTarget() на Adafruit PN532 библиотеката.</w:t>
+      </w:r>
+    </w:p>
+    <w:p>
+      <w:pPr>
+        <w:pStyle w:val="3"/>
+        <w:numPr>
+          <w:ilvl w:val="1"/>
+          <w:numId w:val="46"/>
+        </w:numPr>
+      </w:pPr>
+      <w:r>
+        <w:t>ISO 7816-4</w:t>
+      </w:r>
+    </w:p>
+    <w:p>
+      <w:r>
+        <w:t>ISO 7816-4 дефинира структурата на APDU (Application Protocol Data Unit) командите, използвани за комуникация между четец</w:t>
+      </w:r>
+      <w:r>
+        <w:t>а</w:t>
+      </w:r>
+      <w:r>
+        <w:t xml:space="preserve"> и </w:t>
+      </w:r>
+      <w:r>
+        <w:t xml:space="preserve"> виртуалната </w:t>
+      </w:r>
+      <w:r>
+        <w:t>карта</w:t>
+      </w:r>
+      <w:r>
+        <w:t xml:space="preserve">. Командата </w:t>
+      </w:r>
+      <w:r>
+        <w:t>APDU съдържа полета CLA, INS, P1, P2, L</w:t>
+      </w:r>
+      <w:r>
+        <w:t>c (дължина на данни) и данните.</w:t>
+      </w:r>
+    </w:p>
+    <w:p>
+      <w:pPr>
+        <w:pStyle w:val="3"/>
+        <w:numPr>
+          <w:ilvl w:val="1"/>
+          <w:numId w:val="46"/>
+        </w:numPr>
+      </w:pPr>
+      <w:r>
+        <w:rPr>
+          <w:lang w:val="en-US"/>
+        </w:rPr>
+        <w:t>Host Card Emulation</w:t>
+      </w:r>
+    </w:p>
+    <w:p>
+      <w:r>
+        <w:t xml:space="preserve">Host Card Emulation </w:t>
+      </w:r>
+      <w:r>
+        <w:rPr>
+          <w:lang w:val="en-US"/>
+        </w:rPr>
+        <w:t>(</w:t>
+      </w:r>
+      <w:r>
+        <w:t>HCE</w:t>
+      </w:r>
+      <w:r>
+        <w:rPr>
+          <w:lang w:val="en-US"/>
+        </w:rPr>
+        <w:t>)</w:t>
+      </w:r>
+      <w:r>
+        <w:t xml:space="preserve"> е функционалност, въведена в Android 4.4 (API 19), позволяваща на Android приложения да емулират NFC смарт карти без хардуерен Secure Element. Приложението регистрира AID идентификатор в apdus</w:t>
+      </w:r>
+      <w:r>
+        <w:t>ervice.xml и Android OS маршрутизи</w:t>
+      </w:r>
+      <w:r>
+        <w:t xml:space="preserve">ра съответните APDU команди към </w:t>
+      </w:r>
+      <w:r>
+        <w:t>регистрираната HostApduService.</w:t>
+      </w:r>
+      <w:r>
+        <w:br w:type="page"/>
+      </w:r>
+    </w:p>
+    <w:p>
+      <w:pPr>
+        <w:pStyle w:val="1"/>
+      </w:pPr>
+      <w:r>
+        <w:lastRenderedPageBreak/>
+        <w:t>Програмна реализация</w:t>
+      </w:r>
+    </w:p>
+    <w:p>
+      <w:r>
+        <w:t>Четвърта глава описва програмната реализация на системата. Системата се състои от четири компонента — фърмуер за ESP32, Android мобилно приложение, сървърна част и уеб интерфейс. За всеки компонент са представени основните класове и функции с</w:t>
+      </w:r>
+      <w:r>
+        <w:t xml:space="preserve"> показани</w:t>
+      </w:r>
+      <w:r>
+        <w:t xml:space="preserve"> </w:t>
+      </w:r>
+      <w:r>
+        <w:t xml:space="preserve">части </w:t>
+      </w:r>
+      <w:r>
+        <w:t>от код</w:t>
+      </w:r>
+      <w:r>
+        <w:t>а</w:t>
+      </w:r>
+      <w:r>
+        <w:t>.</w:t>
+      </w:r>
+    </w:p>
+    <w:p>
+      <w:pPr>
+        <w:pStyle w:val="2"/>
+        <w:numPr>
+          <w:ilvl w:val="0"/>
+          <w:numId w:val="49"/>
+        </w:numPr>
+      </w:pPr>
+      <w:r>
+        <w:t>Фърмуер на ESP32</w:t>
+      </w:r>
+    </w:p>
+    <w:p>
+      <w:r>
+        <w:t xml:space="preserve">Фърмуерът на ESP32 е реализиран на C++ в рамките на </w:t>
+      </w:r>
+      <w:r>
+        <w:t>Arduino Framework</w:t>
+      </w:r>
+      <w:r>
+        <w:t>. Той не извър</w:t>
+      </w:r>
+      <w:r>
+        <w:t xml:space="preserve">шва криптографска верификация - </w:t>
+      </w:r>
+      <w:r>
+        <w:t>ролята му е да инициира NFC кому</w:t>
+      </w:r>
+      <w:r>
+        <w:t xml:space="preserve">никацията, да декодира бинарният пакет, получен </w:t>
+      </w:r>
+      <w:r>
+        <w:t>от телефона</w:t>
+      </w:r>
+      <w:r>
+        <w:t xml:space="preserve"> при чекирането,</w:t>
+      </w:r>
+      <w:r>
+        <w:t xml:space="preserve"> и да го</w:t>
+      </w:r>
+      <w:r>
+        <w:t xml:space="preserve"> препрати към FastAPI сървъра посредством</w:t>
+      </w:r>
+      <w:r>
+        <w:t xml:space="preserve"> Wi-Fi. Цялата б</w:t>
+      </w:r>
+      <w:r>
+        <w:t>изнес логика е в бекенд сървъра</w:t>
+      </w:r>
+      <w:r>
+        <w:t>.</w:t>
+      </w:r>
+    </w:p>
+    <w:p>
+      <w:pPr>
+        <w:pStyle w:val="3"/>
+        <w:numPr>
+          <w:ilvl w:val="1"/>
+          <w:numId w:val="49"/>
+        </w:numPr>
+      </w:pPr>
+      <w:r>
+        <w:t>Конфигурация</w:t>
+      </w:r>
+    </w:p>
+    <w:p>
+      <w:r>
+        <w:t xml:space="preserve">Параметрите </w:t>
+      </w:r>
+      <w:r>
+        <w:t xml:space="preserve">за свързване към </w:t>
+      </w:r>
+      <w:r>
+        <w:rPr>
+          <w:lang w:val="en-US"/>
+        </w:rPr>
+        <w:t xml:space="preserve">WIFI </w:t>
+      </w:r>
+      <w:r>
+        <w:t xml:space="preserve">мрежата </w:t>
+      </w:r>
+      <w:r>
+        <w:t>са дефинирани в</w:t>
+      </w:r>
+      <w:r>
+        <w:t xml:space="preserve"> отделен файл config.h</w:t>
+      </w:r>
+      <w:r>
+        <w:t xml:space="preserve"> като константи</w:t>
+      </w:r>
+      <w:r>
+        <w:t xml:space="preserve">. </w:t>
+      </w:r>
+      <w:r>
+        <w:t>GPIO пиновете са изб</w:t>
+      </w:r>
+      <w:r>
+        <w:t xml:space="preserve">рани така, че да не са в конфликт с вградените функции и запазени по подразбиране за други цели в ESP32. </w:t>
+      </w:r>
+      <w:r>
+        <w:rPr>
+          <w:lang w:val="en-US"/>
+        </w:rPr>
+        <w:t>SELECT_AID_APDU</w:t>
+      </w:r>
+      <w:r>
+        <w:rPr>
+          <w:lang w:val="en-US"/>
+        </w:rPr>
+        <w:t xml:space="preserve"> </w:t>
+      </w:r>
+      <w:r>
+        <w:t>също е записан като масив от константи</w:t>
+      </w:r>
+      <w:r>
+        <w:rPr>
+          <w:lang w:val="en-US"/>
+        </w:rPr>
+        <w:t>. (</w:t>
+      </w:r>
+      <w:r>
+        <w:t>фиг. 5)</w:t>
+      </w:r>
+    </w:p>
+    <w:p>
+      <w:r>
+        <w:drawing>
+          <wp:inline distT="0" distB="0" distL="0" distR="0" wp14:anchorId="5DE87688" wp14:editId="63A06E9F">
+            <wp:extent cx="4572000" cy="2700766"/>
+            <wp:effectExtent l="0" t="0" r="0" b="4445"/>
+            <wp:docPr id="5" name="Картина 5"/>
+            <wp:cNvGraphicFramePr>
+              <a:graphicFrameLocks xmlns:a="http://schemas.openxmlformats.org/drawingml/2006/main" noChangeAspect="1"/>
+            </wp:cNvGraphicFramePr>
+            <a:graphic xmlns:a="http://schemas.openxmlformats.org/drawingml/2006/main">
+              <a:graphicData uri="http://schemas.openxmlformats.org/drawingml/2006/picture">
+                <pic:pic xmlns:pic="http://schemas.openxmlformats.org/drawingml/2006/picture">
+                  <pic:nvPicPr>
+                    <pic:cNvPr id="1" name=""/>
+                    <pic:cNvPicPr/>
+                  </pic:nvPicPr>
+                  <pic:blipFill>
+                    <a:blip r:embed="rId13"/>
+                    <a:stretch>
+                      <a:fillRect/>
+                    </a:stretch>
+                  </pic:blipFill>
+                  <pic:spPr>
+                    <a:xfrm>
+                      <a:off x="0" y="0"/>
+                      <a:ext cx="4602278" cy="2718652"/>
+                    </a:xfrm>
+                    <a:prstGeom prst="rect">
+                      <a:avLst/>
+                    </a:prstGeom>
+                  </pic:spPr>
+                </pic:pic>
+              </a:graphicData>
+            </a:graphic>
+          </wp:inline>
+        </w:drawing>
+      </w:r>
+      <w:r>
+        <w:t xml:space="preserve"> </w:t>
+      </w:r>
+    </w:p>
+    <w:p>
+      <w:pPr>
+        <w:jc w:val="center"/>
+        <w:rPr>
+          <w:i/>
+        </w:rPr>
+      </w:pPr>
+      <w:r>
+        <w:rPr>
+          <w:b/>
+          <w:i/>
+        </w:rPr>
+        <w:t>Фиг. 5.</w:t>
+      </w:r>
+      <w:r>
+        <w:rPr>
+          <w:i/>
+        </w:rPr>
+        <w:t xml:space="preserve"> Конфигурация на пиновете и SELECT_AID_APDU </w:t>
+      </w:r>
+    </w:p>
+    <w:p>
+      <w:pPr>
+        <w:pStyle w:val="3"/>
+        <w:numPr>
+          <w:ilvl w:val="1"/>
+          <w:numId w:val="49"/>
+        </w:numPr>
+      </w:pPr>
+      <w:r>
+        <w:t>Визуална и звукова сигнализация</w:t>
+      </w:r>
+    </w:p>
+    <w:p>
+      <w:r>
+        <w:t>Към микроконтролера са свързани два светодиода и пиезо зумер за</w:t>
+      </w:r>
+      <w:r>
+        <w:t xml:space="preserve"> визуална и звукова обрат</w:t>
+      </w:r>
+      <w:r>
+        <w:t>на връзка към студента. Зелен светодиод и двутонов сигнал показват, че чекирането е минало</w:t>
+      </w:r>
+      <w:r>
+        <w:t xml:space="preserve"> успешно, </w:t>
+      </w:r>
+      <w:r>
+        <w:t xml:space="preserve">докато червен светодиод и нискотонов сигнал показват </w:t>
+      </w:r>
+      <w:r>
+        <w:lastRenderedPageBreak/>
+        <w:t xml:space="preserve">че има някаква </w:t>
+      </w:r>
+      <w:r>
+        <w:t>грешк</w:t>
+      </w:r>
+      <w:r>
+        <w:t>а. Зумерът се управлява чрез ШИМ</w:t>
+      </w:r>
+      <w:r>
+        <w:t xml:space="preserve"> (LEDC периферия на ESP32) за</w:t>
+      </w:r>
+      <w:r>
+        <w:t xml:space="preserve"> генериране на различни честоти. Кодът е показан на фиг. 6:</w:t>
+      </w:r>
+    </w:p>
+    <w:p>
+      <w:pPr>
+        <w:jc w:val="center"/>
+      </w:pPr>
+      <w:r>
+        <w:drawing>
+          <wp:inline distT="0" distB="0" distL="0" distR="0" wp14:anchorId="52ADE462" wp14:editId="0ADA8AF0">
+            <wp:extent cx="2904580" cy="3177540"/>
+            <wp:effectExtent l="0" t="0" r="0" b="3810"/>
+            <wp:docPr id="8" name="Картина 8"/>
+            <wp:cNvGraphicFramePr>
+              <a:graphicFrameLocks xmlns:a="http://schemas.openxmlformats.org/drawingml/2006/main" noChangeAspect="1"/>
+            </wp:cNvGraphicFramePr>
+            <a:graphic xmlns:a="http://schemas.openxmlformats.org/drawingml/2006/main">
+              <a:graphicData uri="http://schemas.openxmlformats.org/drawingml/2006/picture">
+                <pic:pic xmlns:pic="http://schemas.openxmlformats.org/drawingml/2006/picture">
+                  <pic:nvPicPr>
+                    <pic:cNvPr id="1" name=""/>
+                    <pic:cNvPicPr/>
+                  </pic:nvPicPr>
+                  <pic:blipFill>
+                    <a:blip r:embed="rId14"/>
+                    <a:stretch>
+                      <a:fillRect/>
+                    </a:stretch>
+                  </pic:blipFill>
+                  <pic:spPr>
+                    <a:xfrm>
+                      <a:off x="0" y="0"/>
+                      <a:ext cx="2926511" cy="3201532"/>
+                    </a:xfrm>
+                    <a:prstGeom prst="rect">
+                      <a:avLst/>
+                    </a:prstGeom>
+                  </pic:spPr>
+                </pic:pic>
+              </a:graphicData>
+            </a:graphic>
+          </wp:inline>
+        </w:drawing>
+      </w:r>
+    </w:p>
+    <w:p>
+      <w:pPr>
+        <w:jc w:val="center"/>
+      </w:pPr>
+      <w:r>
+        <w:t>Фиг. 6 Код за управление на светодиодите и зумера</w:t>
+      </w:r>
+      <w:bookmarkStart w:id="9" w:name="_GoBack"/>
+      <w:bookmarkEnd w:id="9"/>
       <w:r>
         <w:br w:type="page"/>
       </w:r>
@@ -4503,6 +6268,127 @@
     </w:lvl>
   </w:abstractNum>
   <w:abstractNum w:abstractNumId="14" w15:restartNumberingAfterBreak="0">
+    <w:nsid w:val="39855CCA"/>
+    <w:multiLevelType w:val="multilevel"/>
+    <w:tmpl w:val="E5E04AD0"/>
+    <w:lvl w:ilvl="0">
+      <w:start w:val="1"/>
+      <w:numFmt w:val="decimal"/>
+      <w:lvlText w:val="%1."/>
+      <w:lvlJc w:val="left"/>
+      <w:pPr>
+        <w:ind w:left="1069" w:hanging="360"/>
+      </w:pPr>
+      <w:rPr>
+        <w:rFonts w:hint="default"/>
+      </w:rPr>
+    </w:lvl>
+    <w:lvl w:ilvl="1">
+      <w:start w:val="1"/>
+      <w:numFmt w:val="decimal"/>
+      <w:isLgl/>
+      <w:lvlText w:val="%1.%2."/>
+      <w:lvlJc w:val="left"/>
+      <w:pPr>
+        <w:ind w:left="1854" w:hanging="720"/>
+      </w:pPr>
+      <w:rPr>
+        <w:rFonts w:hint="default"/>
+      </w:rPr>
+    </w:lvl>
+    <w:lvl w:ilvl="2">
+      <w:start w:val="1"/>
+      <w:numFmt w:val="decimal"/>
+      <w:isLgl/>
+      <w:lvlText w:val="%1.%2.%3."/>
+      <w:lvlJc w:val="left"/>
+      <w:pPr>
+        <w:ind w:left="2279" w:hanging="720"/>
+      </w:pPr>
+      <w:rPr>
+        <w:rFonts w:hint="default"/>
+      </w:rPr>
+    </w:lvl>
+    <w:lvl w:ilvl="3">
+      <w:start w:val="1"/>
+      <w:numFmt w:val="decimal"/>
+      <w:isLgl/>
+      <w:lvlText w:val="%1.%2.%3.%4."/>
+      <w:lvlJc w:val="left"/>
+      <w:pPr>
+        <w:ind w:left="3064" w:hanging="1080"/>
+      </w:pPr>
+      <w:rPr>
+        <w:rFonts w:hint="default"/>
+      </w:rPr>
+    </w:lvl>
+    <w:lvl w:ilvl="4">
+      <w:start w:val="1"/>
+      <w:numFmt w:val="decimal"/>
+      <w:isLgl/>
+      <w:lvlText w:val="%1.%2.%3.%4.%5."/>
+      <w:lvlJc w:val="left"/>
+      <w:pPr>
+        <w:ind w:left="3489" w:hanging="1080"/>
+      </w:pPr>
+      <w:rPr>
+        <w:rFonts w:hint="default"/>
+      </w:rPr>
+    </w:lvl>
+    <w:lvl w:ilvl="5">
+      <w:start w:val="1"/>
+      <w:numFmt w:val="decimal"/>
+      <w:isLgl/>
+      <w:lvlText w:val="%1.%2.%3.%4.%5.%6."/>
+      <w:lvlJc w:val="left"/>
+      <w:pPr>
+        <w:ind w:left="4274" w:hanging="1440"/>
+      </w:pPr>
+      <w:rPr>
+        <w:rFonts w:hint="default"/>
+      </w:rPr>
+    </w:lvl>
+    <w:lvl w:ilvl="6">
+      <w:start w:val="1"/>
+      <w:numFmt w:val="decimal"/>
+      <w:isLgl/>
+      <w:lvlText w:val="%1.%2.%3.%4.%5.%6.%7."/>
+      <w:lvlJc w:val="left"/>
+      <w:pPr>
+        <w:ind w:left="4699" w:hanging="1440"/>
+      </w:pPr>
+      <w:rPr>
+        <w:rFonts w:hint="default"/>
+      </w:rPr>
+    </w:lvl>
+    <w:lvl w:ilvl="7">
+      <w:start w:val="1"/>
+      <w:numFmt w:val="decimal"/>
+      <w:isLgl/>
+      <w:lvlText w:val="%1.%2.%3.%4.%5.%6.%7.%8."/>
+      <w:lvlJc w:val="left"/>
+      <w:pPr>
+        <w:ind w:left="5484" w:hanging="1800"/>
+      </w:pPr>
+      <w:rPr>
+        <w:rFonts w:hint="default"/>
+      </w:rPr>
+    </w:lvl>
+    <w:lvl w:ilvl="8">
+      <w:start w:val="1"/>
+      <w:numFmt w:val="decimal"/>
+      <w:isLgl/>
+      <w:lvlText w:val="%1.%2.%3.%4.%5.%6.%7.%8.%9."/>
+      <w:lvlJc w:val="left"/>
+      <w:pPr>
+        <w:ind w:left="5909" w:hanging="1800"/>
+      </w:pPr>
+      <w:rPr>
+        <w:rFonts w:hint="default"/>
+      </w:rPr>
+    </w:lvl>
+  </w:abstractNum>
+  <w:abstractNum w:abstractNumId="15" w15:restartNumberingAfterBreak="0">
     <w:nsid w:val="3A406685"/>
     <w:multiLevelType w:val="multilevel"/>
     <w:tmpl w:val="1DD60C70"/>
@@ -4623,7 +6509,128 @@
       </w:rPr>
     </w:lvl>
   </w:abstractNum>
-  <w:abstractNum w:abstractNumId="15" w15:restartNumberingAfterBreak="0">
+  <w:abstractNum w:abstractNumId="16" w15:restartNumberingAfterBreak="0">
+    <w:nsid w:val="3A7B3138"/>
+    <w:multiLevelType w:val="multilevel"/>
+    <w:tmpl w:val="77464A32"/>
+    <w:lvl w:ilvl="0">
+      <w:start w:val="1"/>
+      <w:numFmt w:val="decimal"/>
+      <w:lvlText w:val="%1."/>
+      <w:lvlJc w:val="left"/>
+      <w:pPr>
+        <w:ind w:left="1069" w:hanging="360"/>
+      </w:pPr>
+      <w:rPr>
+        <w:rFonts w:hint="default"/>
+      </w:rPr>
+    </w:lvl>
+    <w:lvl w:ilvl="1">
+      <w:start w:val="1"/>
+      <w:numFmt w:val="decimal"/>
+      <w:isLgl/>
+      <w:lvlText w:val="%1.%2."/>
+      <w:lvlJc w:val="left"/>
+      <w:pPr>
+        <w:ind w:left="1854" w:hanging="720"/>
+      </w:pPr>
+      <w:rPr>
+        <w:rFonts w:hint="default"/>
+      </w:rPr>
+    </w:lvl>
+    <w:lvl w:ilvl="2">
+      <w:start w:val="1"/>
+      <w:numFmt w:val="decimal"/>
+      <w:isLgl/>
+      <w:lvlText w:val="%1.%2.%3."/>
+      <w:lvlJc w:val="left"/>
+      <w:pPr>
+        <w:ind w:left="2279" w:hanging="720"/>
+      </w:pPr>
+      <w:rPr>
+        <w:rFonts w:hint="default"/>
+      </w:rPr>
+    </w:lvl>
+    <w:lvl w:ilvl="3">
+      <w:start w:val="1"/>
+      <w:numFmt w:val="decimal"/>
+      <w:isLgl/>
+      <w:lvlText w:val="%1.%2.%3.%4."/>
+      <w:lvlJc w:val="left"/>
+      <w:pPr>
+        <w:ind w:left="3064" w:hanging="1080"/>
+      </w:pPr>
+      <w:rPr>
+        <w:rFonts w:hint="default"/>
+      </w:rPr>
+    </w:lvl>
+    <w:lvl w:ilvl="4">
+      <w:start w:val="1"/>
+      <w:numFmt w:val="decimal"/>
+      <w:isLgl/>
+      <w:lvlText w:val="%1.%2.%3.%4.%5."/>
+      <w:lvlJc w:val="left"/>
+      <w:pPr>
+        <w:ind w:left="3489" w:hanging="1080"/>
+      </w:pPr>
+      <w:rPr>
+        <w:rFonts w:hint="default"/>
+      </w:rPr>
+    </w:lvl>
+    <w:lvl w:ilvl="5">
+      <w:start w:val="1"/>
+      <w:numFmt w:val="decimal"/>
+      <w:isLgl/>
+      <w:lvlText w:val="%1.%2.%3.%4.%5.%6."/>
+      <w:lvlJc w:val="left"/>
+      <w:pPr>
+        <w:ind w:left="4274" w:hanging="1440"/>
+      </w:pPr>
+      <w:rPr>
+        <w:rFonts w:hint="default"/>
+      </w:rPr>
+    </w:lvl>
+    <w:lvl w:ilvl="6">
+      <w:start w:val="1"/>
+      <w:numFmt w:val="decimal"/>
+      <w:isLgl/>
+      <w:lvlText w:val="%1.%2.%3.%4.%5.%6.%7."/>
+      <w:lvlJc w:val="left"/>
+      <w:pPr>
+        <w:ind w:left="4699" w:hanging="1440"/>
+      </w:pPr>
+      <w:rPr>
+        <w:rFonts w:hint="default"/>
+      </w:rPr>
+    </w:lvl>
+    <w:lvl w:ilvl="7">
+      <w:start w:val="1"/>
+      <w:numFmt w:val="decimal"/>
+      <w:isLgl/>
+      <w:lvlText w:val="%1.%2.%3.%4.%5.%6.%7.%8."/>
+      <w:lvlJc w:val="left"/>
+      <w:pPr>
+        <w:ind w:left="5484" w:hanging="1800"/>
+      </w:pPr>
+      <w:rPr>
+        <w:rFonts w:hint="default"/>
+      </w:rPr>
+    </w:lvl>
+    <w:lvl w:ilvl="8">
+      <w:start w:val="1"/>
+      <w:numFmt w:val="decimal"/>
+      <w:isLgl/>
+      <w:lvlText w:val="%1.%2.%3.%4.%5.%6.%7.%8.%9."/>
+      <w:lvlJc w:val="left"/>
+      <w:pPr>
+        <w:ind w:left="5909" w:hanging="1800"/>
+      </w:pPr>
+      <w:rPr>
+        <w:rFonts w:hint="default"/>
+      </w:rPr>
+    </w:lvl>
+  </w:abstractNum>
+  <w:abstractNum w:abstractNumId="17" w15:restartNumberingAfterBreak="0">
     <w:nsid w:val="3B6833E4"/>
     <w:multiLevelType w:val="hybridMultilevel"/>
     <w:tmpl w:val="ED8EF5F2"/>
@@ -4736,7 +6743,7 @@
       </w:rPr>
     </w:lvl>
   </w:abstractNum>
-  <w:abstractNum w:abstractNumId="16" w15:restartNumberingAfterBreak="0">
+  <w:abstractNum w:abstractNumId="18" w15:restartNumberingAfterBreak="0">
     <w:nsid w:val="44CC1B4B"/>
     <w:multiLevelType w:val="multilevel"/>
     <w:tmpl w:val="4F40A45A"/>
@@ -4854,7 +6861,7 @@
       </w:rPr>
     </w:lvl>
   </w:abstractNum>
-  <w:abstractNum w:abstractNumId="17" w15:restartNumberingAfterBreak="0">
+  <w:abstractNum w:abstractNumId="19" w15:restartNumberingAfterBreak="0">
     <w:nsid w:val="48FE6F08"/>
     <w:multiLevelType w:val="multilevel"/>
     <w:tmpl w:val="4F40A45A"/>
@@ -4972,7 +6979,7 @@
       </w:rPr>
     </w:lvl>
   </w:abstractNum>
-  <w:abstractNum w:abstractNumId="18" w15:restartNumberingAfterBreak="0">
+  <w:abstractNum w:abstractNumId="20" w15:restartNumberingAfterBreak="0">
     <w:nsid w:val="4AA734DF"/>
     <w:multiLevelType w:val="multilevel"/>
     <w:tmpl w:val="4F40A45A"/>
@@ -5090,7 +7097,7 @@
       </w:rPr>
     </w:lvl>
   </w:abstractNum>
-  <w:abstractNum w:abstractNumId="19" w15:restartNumberingAfterBreak="0">
+  <w:abstractNum w:abstractNumId="21" w15:restartNumberingAfterBreak="0">
     <w:nsid w:val="4CCF6101"/>
     <w:multiLevelType w:val="hybridMultilevel"/>
     <w:tmpl w:val="3C6C5AF0"/>
@@ -5176,7 +7183,7 @@
       </w:pPr>
     </w:lvl>
   </w:abstractNum>
-  <w:abstractNum w:abstractNumId="20" w15:restartNumberingAfterBreak="0">
+  <w:abstractNum w:abstractNumId="22" w15:restartNumberingAfterBreak="0">
     <w:nsid w:val="4D4C2BA0"/>
     <w:multiLevelType w:val="hybridMultilevel"/>
     <w:tmpl w:val="9FC6EDEE"/>
@@ -5289,7 +7296,174 @@
       </w:rPr>
     </w:lvl>
   </w:abstractNum>
-  <w:abstractNum w:abstractNumId="21" w15:restartNumberingAfterBreak="0">
+  <w:abstractNum w:abstractNumId="23" w15:restartNumberingAfterBreak="0">
+    <w:nsid w:val="4D6D0981"/>
+    <w:multiLevelType w:val="hybridMultilevel"/>
+    <w:tmpl w:val="7408F7C0"/>
+    <w:lvl w:ilvl="0" w:tplc="11E4B76A">
+      <w:start w:val="1"/>
+      <w:numFmt w:val="bullet"/>
+      <w:lvlText w:val="•"/>
+      <w:lvlJc w:val="left"/>
+      <w:pPr>
+        <w:ind w:left="720" w:hanging="360"/>
+      </w:pPr>
+    </w:lvl>
+    <w:lvl w:ilvl="1" w:tplc="09127564">
+      <w:numFmt w:val="decimal"/>
+      <w:lvlText w:val=""/>
+      <w:lvlJc w:val="left"/>
+    </w:lvl>
+    <w:lvl w:ilvl="2" w:tplc="15F2497A">
+      <w:numFmt w:val="decimal"/>
+      <w:lvlText w:val=""/>
+      <w:lvlJc w:val="left"/>
+    </w:lvl>
+    <w:lvl w:ilvl="3" w:tplc="5B02C390">
+      <w:numFmt w:val="decimal"/>
+      <w:lvlText w:val=""/>
+      <w:lvlJc w:val="left"/>
+    </w:lvl>
+    <w:lvl w:ilvl="4" w:tplc="1360AF00">
+      <w:numFmt w:val="decimal"/>
+      <w:lvlText w:val=""/>
+      <w:lvlJc w:val="left"/>
+    </w:lvl>
+    <w:lvl w:ilvl="5" w:tplc="2F9E1FFE">
+      <w:numFmt w:val="decimal"/>
+      <w:lvlText w:val=""/>
+      <w:lvlJc w:val="left"/>
+    </w:lvl>
+    <w:lvl w:ilvl="6" w:tplc="C6460006">
+      <w:numFmt w:val="decimal"/>
+      <w:lvlText w:val=""/>
+      <w:lvlJc w:val="left"/>
+    </w:lvl>
+    <w:lvl w:ilvl="7" w:tplc="542EE712">
+      <w:numFmt w:val="decimal"/>
+      <w:lvlText w:val=""/>
+      <w:lvlJc w:val="left"/>
+    </w:lvl>
+    <w:lvl w:ilvl="8" w:tplc="4F9A1B8C">
+      <w:numFmt w:val="decimal"/>
+      <w:lvlText w:val=""/>
+      <w:lvlJc w:val="left"/>
+    </w:lvl>
+  </w:abstractNum>
+  <w:abstractNum w:abstractNumId="24" w15:restartNumberingAfterBreak="0">
+    <w:nsid w:val="58D06560"/>
+    <w:multiLevelType w:val="hybridMultilevel"/>
+    <w:tmpl w:val="B718B76C"/>
+    <w:lvl w:ilvl="0" w:tplc="04020001">
+      <w:start w:val="1"/>
+      <w:numFmt w:val="bullet"/>
+      <w:lvlText w:val=""/>
+      <w:lvlJc w:val="left"/>
+      <w:pPr>
+        <w:ind w:left="3600" w:hanging="360"/>
+      </w:pPr>
+      <w:rPr>
+        <w:rFonts w:ascii="Symbol" w:hAnsi="Symbol" w:hint="default"/>
+      </w:rPr>
+    </w:lvl>
+    <w:lvl w:ilvl="1" w:tplc="04020003" w:tentative="1">
+      <w:start w:val="1"/>
+      <w:numFmt w:val="bullet"/>
+      <w:lvlText w:val="o"/>
+      <w:lvlJc w:val="left"/>
+      <w:pPr>
+        <w:ind w:left="4320" w:hanging="360"/>
+      </w:pPr>
+      <w:rPr>
+        <w:rFonts w:ascii="Courier New" w:hAnsi="Courier New" w:cs="Courier New" w:hint="default"/>
+      </w:rPr>
+    </w:lvl>
+    <w:lvl w:ilvl="2" w:tplc="04020005" w:tentative="1">
+      <w:start w:val="1"/>
+      <w:numFmt w:val="bullet"/>
+      <w:lvlText w:val=""/>
+      <w:lvlJc w:val="left"/>
+      <w:pPr>
+        <w:ind w:left="5040" w:hanging="360"/>
+      </w:pPr>
+      <w:rPr>
+        <w:rFonts w:ascii="Wingdings" w:hAnsi="Wingdings" w:hint="default"/>
+      </w:rPr>
+    </w:lvl>
+    <w:lvl w:ilvl="3" w:tplc="04020001" w:tentative="1">
+      <w:start w:val="1"/>
+      <w:numFmt w:val="bullet"/>
+      <w:lvlText w:val=""/>
+      <w:lvlJc w:val="left"/>
+      <w:pPr>
+        <w:ind w:left="5760" w:hanging="360"/>
+      </w:pPr>
+      <w:rPr>
+        <w:rFonts w:ascii="Symbol" w:hAnsi="Symbol" w:hint="default"/>
+      </w:rPr>
+    </w:lvl>
+    <w:lvl w:ilvl="4" w:tplc="04020003" w:tentative="1">
+      <w:start w:val="1"/>
+      <w:numFmt w:val="bullet"/>
+      <w:lvlText w:val="o"/>
+      <w:lvlJc w:val="left"/>
+      <w:pPr>
+        <w:ind w:left="6480" w:hanging="360"/>
+      </w:pPr>
+      <w:rPr>
+        <w:rFonts w:ascii="Courier New" w:hAnsi="Courier New" w:cs="Courier New" w:hint="default"/>
+      </w:rPr>
+    </w:lvl>
+    <w:lvl w:ilvl="5" w:tplc="04020005" w:tentative="1">
+      <w:start w:val="1"/>
+      <w:numFmt w:val="bullet"/>
+      <w:lvlText w:val=""/>
+      <w:lvlJc w:val="left"/>
+      <w:pPr>
+        <w:ind w:left="7200" w:hanging="360"/>
+      </w:pPr>
+      <w:rPr>
+        <w:rFonts w:ascii="Wingdings" w:hAnsi="Wingdings" w:hint="default"/>
+      </w:rPr>
+    </w:lvl>
+    <w:lvl w:ilvl="6" w:tplc="04020001" w:tentative="1">
+      <w:start w:val="1"/>
+      <w:numFmt w:val="bullet"/>
+      <w:lvlText w:val=""/>
+      <w:lvlJc w:val="left"/>
+      <w:pPr>
+        <w:ind w:left="7920" w:hanging="360"/>
+      </w:pPr>
+      <w:rPr>
+        <w:rFonts w:ascii="Symbol" w:hAnsi="Symbol" w:hint="default"/>
+      </w:rPr>
+    </w:lvl>
+    <w:lvl w:ilvl="7" w:tplc="04020003" w:tentative="1">
+      <w:start w:val="1"/>
+      <w:numFmt w:val="bullet"/>
+      <w:lvlText w:val="o"/>
+      <w:lvlJc w:val="left"/>
+      <w:pPr>
+        <w:ind w:left="8640" w:hanging="360"/>
+      </w:pPr>
+      <w:rPr>
+        <w:rFonts w:ascii="Courier New" w:hAnsi="Courier New" w:cs="Courier New" w:hint="default"/>
+      </w:rPr>
+    </w:lvl>
+    <w:lvl w:ilvl="8" w:tplc="04020005" w:tentative="1">
+      <w:start w:val="1"/>
+      <w:numFmt w:val="bullet"/>
+      <w:lvlText w:val=""/>
+      <w:lvlJc w:val="left"/>
+      <w:pPr>
+        <w:ind w:left="9360" w:hanging="360"/>
+      </w:pPr>
+      <w:rPr>
+        <w:rFonts w:ascii="Wingdings" w:hAnsi="Wingdings" w:hint="default"/>
+      </w:rPr>
+    </w:lvl>
+  </w:abstractNum>
+  <w:abstractNum w:abstractNumId="25" w15:restartNumberingAfterBreak="0">
     <w:nsid w:val="5C09030B"/>
     <w:multiLevelType w:val="multilevel"/>
     <w:tmpl w:val="4F40A45A"/>
@@ -5407,7 +7581,7 @@
       </w:rPr>
     </w:lvl>
   </w:abstractNum>
-  <w:abstractNum w:abstractNumId="22" w15:restartNumberingAfterBreak="0">
+  <w:abstractNum w:abstractNumId="26" w15:restartNumberingAfterBreak="0">
     <w:nsid w:val="5DDF03D8"/>
     <w:multiLevelType w:val="hybridMultilevel"/>
     <w:tmpl w:val="31281304"/>
@@ -5496,7 +7670,120 @@
       </w:pPr>
     </w:lvl>
   </w:abstractNum>
-  <w:abstractNum w:abstractNumId="23" w15:restartNumberingAfterBreak="0">
+  <w:abstractNum w:abstractNumId="27" w15:restartNumberingAfterBreak="0">
+    <w:nsid w:val="5F3D6FFA"/>
+    <w:multiLevelType w:val="hybridMultilevel"/>
+    <w:tmpl w:val="1A56B4AA"/>
+    <w:lvl w:ilvl="0" w:tplc="04020001">
+      <w:start w:val="1"/>
+      <w:numFmt w:val="bullet"/>
+      <w:lvlText w:val=""/>
+      <w:lvlJc w:val="left"/>
+      <w:pPr>
+        <w:ind w:left="3600" w:hanging="360"/>
+      </w:pPr>
+      <w:rPr>
+        <w:rFonts w:ascii="Symbol" w:hAnsi="Symbol" w:hint="default"/>
+      </w:rPr>
+    </w:lvl>
+    <w:lvl w:ilvl="1" w:tplc="04020003" w:tentative="1">
+      <w:start w:val="1"/>
+      <w:numFmt w:val="bullet"/>
+      <w:lvlText w:val="o"/>
+      <w:lvlJc w:val="left"/>
+      <w:pPr>
+        <w:ind w:left="4320" w:hanging="360"/>
+      </w:pPr>
+      <w:rPr>
+        <w:rFonts w:ascii="Courier New" w:hAnsi="Courier New" w:cs="Courier New" w:hint="default"/>
+      </w:rPr>
+    </w:lvl>
+    <w:lvl w:ilvl="2" w:tplc="04020005" w:tentative="1">
+      <w:start w:val="1"/>
+      <w:numFmt w:val="bullet"/>
+      <w:lvlText w:val=""/>
+      <w:lvlJc w:val="left"/>
+      <w:pPr>
+        <w:ind w:left="5040" w:hanging="360"/>
+      </w:pPr>
+      <w:rPr>
+        <w:rFonts w:ascii="Wingdings" w:hAnsi="Wingdings" w:hint="default"/>
+      </w:rPr>
+    </w:lvl>
+    <w:lvl w:ilvl="3" w:tplc="04020001" w:tentative="1">
+      <w:start w:val="1"/>
+      <w:numFmt w:val="bullet"/>
+      <w:lvlText w:val=""/>
+      <w:lvlJc w:val="left"/>
+      <w:pPr>
+        <w:ind w:left="5760" w:hanging="360"/>
+      </w:pPr>
+      <w:rPr>
+        <w:rFonts w:ascii="Symbol" w:hAnsi="Symbol" w:hint="default"/>
+      </w:rPr>
+    </w:lvl>
+    <w:lvl w:ilvl="4" w:tplc="04020003" w:tentative="1">
+      <w:start w:val="1"/>
+      <w:numFmt w:val="bullet"/>
+      <w:lvlText w:val="o"/>
+      <w:lvlJc w:val="left"/>
+      <w:pPr>
+        <w:ind w:left="6480" w:hanging="360"/>
+      </w:pPr>
+      <w:rPr>
+        <w:rFonts w:ascii="Courier New" w:hAnsi="Courier New" w:cs="Courier New" w:hint="default"/>
+      </w:rPr>
+    </w:lvl>
+    <w:lvl w:ilvl="5" w:tplc="04020005" w:tentative="1">
+      <w:start w:val="1"/>
+      <w:numFmt w:val="bullet"/>
+      <w:lvlText w:val=""/>
+      <w:lvlJc w:val="left"/>
+      <w:pPr>
+        <w:ind w:left="7200" w:hanging="360"/>
+      </w:pPr>
+      <w:rPr>
+        <w:rFonts w:ascii="Wingdings" w:hAnsi="Wingdings" w:hint="default"/>
+      </w:rPr>
+    </w:lvl>
+    <w:lvl w:ilvl="6" w:tplc="04020001" w:tentative="1">
+      <w:start w:val="1"/>
+      <w:numFmt w:val="bullet"/>
+      <w:lvlText w:val=""/>
+      <w:lvlJc w:val="left"/>
+      <w:pPr>
+        <w:ind w:left="7920" w:hanging="360"/>
+      </w:pPr>
+      <w:rPr>
+        <w:rFonts w:ascii="Symbol" w:hAnsi="Symbol" w:hint="default"/>
+      </w:rPr>
+    </w:lvl>
+    <w:lvl w:ilvl="7" w:tplc="04020003" w:tentative="1">
+      <w:start w:val="1"/>
+      <w:numFmt w:val="bullet"/>
+      <w:lvlText w:val="o"/>
+      <w:lvlJc w:val="left"/>
+      <w:pPr>
+        <w:ind w:left="8640" w:hanging="360"/>
+      </w:pPr>
+      <w:rPr>
+        <w:rFonts w:ascii="Courier New" w:hAnsi="Courier New" w:cs="Courier New" w:hint="default"/>
+      </w:rPr>
+    </w:lvl>
+    <w:lvl w:ilvl="8" w:tplc="04020005" w:tentative="1">
+      <w:start w:val="1"/>
+      <w:numFmt w:val="bullet"/>
+      <w:lvlText w:val=""/>
+      <w:lvlJc w:val="left"/>
+      <w:pPr>
+        <w:ind w:left="9360" w:hanging="360"/>
+      </w:pPr>
+      <w:rPr>
+        <w:rFonts w:ascii="Wingdings" w:hAnsi="Wingdings" w:hint="default"/>
+      </w:rPr>
+    </w:lvl>
+  </w:abstractNum>
+  <w:abstractNum w:abstractNumId="28" w15:restartNumberingAfterBreak="0">
     <w:nsid w:val="60100592"/>
     <w:multiLevelType w:val="hybridMultilevel"/>
     <w:tmpl w:val="A08EE3FC"/>
@@ -5582,7 +7869,7 @@
       </w:pPr>
     </w:lvl>
   </w:abstractNum>
-  <w:abstractNum w:abstractNumId="24" w15:restartNumberingAfterBreak="0">
+  <w:abstractNum w:abstractNumId="29" w15:restartNumberingAfterBreak="0">
     <w:nsid w:val="6387057F"/>
     <w:multiLevelType w:val="multilevel"/>
     <w:tmpl w:val="0BAE68B4"/>
@@ -5695,7 +7982,7 @@
       </w:rPr>
     </w:lvl>
   </w:abstractNum>
-  <w:abstractNum w:abstractNumId="25" w15:restartNumberingAfterBreak="0">
+  <w:abstractNum w:abstractNumId="30" w15:restartNumberingAfterBreak="0">
     <w:nsid w:val="649D2532"/>
     <w:multiLevelType w:val="multilevel"/>
     <w:tmpl w:val="0402001F"/>
@@ -5781,7 +8068,7 @@
       </w:pPr>
     </w:lvl>
   </w:abstractNum>
-  <w:abstractNum w:abstractNumId="26" w15:restartNumberingAfterBreak="0">
+  <w:abstractNum w:abstractNumId="31" w15:restartNumberingAfterBreak="0">
     <w:nsid w:val="682B068D"/>
     <w:multiLevelType w:val="hybridMultilevel"/>
     <w:tmpl w:val="FDE85BCE"/>
@@ -5870,7 +8157,120 @@
       </w:pPr>
     </w:lvl>
   </w:abstractNum>
-  <w:abstractNum w:abstractNumId="27" w15:restartNumberingAfterBreak="0">
+  <w:abstractNum w:abstractNumId="32" w15:restartNumberingAfterBreak="0">
+    <w:nsid w:val="6CE67D37"/>
+    <w:multiLevelType w:val="hybridMultilevel"/>
+    <w:tmpl w:val="EB466624"/>
+    <w:lvl w:ilvl="0" w:tplc="04020001">
+      <w:start w:val="1"/>
+      <w:numFmt w:val="bullet"/>
+      <w:lvlText w:val=""/>
+      <w:lvlJc w:val="left"/>
+      <w:pPr>
+        <w:ind w:left="1429" w:hanging="360"/>
+      </w:pPr>
+      <w:rPr>
+        <w:rFonts w:ascii="Symbol" w:hAnsi="Symbol" w:hint="default"/>
+      </w:rPr>
+    </w:lvl>
+    <w:lvl w:ilvl="1" w:tplc="04020003" w:tentative="1">
+      <w:start w:val="1"/>
+      <w:numFmt w:val="bullet"/>
+      <w:lvlText w:val="o"/>
+      <w:lvlJc w:val="left"/>
+      <w:pPr>
+        <w:ind w:left="2149" w:hanging="360"/>
+      </w:pPr>
+      <w:rPr>
+        <w:rFonts w:ascii="Courier New" w:hAnsi="Courier New" w:cs="Courier New" w:hint="default"/>
+      </w:rPr>
+    </w:lvl>
+    <w:lvl w:ilvl="2" w:tplc="04020005" w:tentative="1">
+      <w:start w:val="1"/>
+      <w:numFmt w:val="bullet"/>
+      <w:lvlText w:val=""/>
+      <w:lvlJc w:val="left"/>
+      <w:pPr>
+        <w:ind w:left="2869" w:hanging="360"/>
+      </w:pPr>
+      <w:rPr>
+        <w:rFonts w:ascii="Wingdings" w:hAnsi="Wingdings" w:hint="default"/>
+      </w:rPr>
+    </w:lvl>
+    <w:lvl w:ilvl="3" w:tplc="04020001" w:tentative="1">
+      <w:start w:val="1"/>
+      <w:numFmt w:val="bullet"/>
+      <w:lvlText w:val=""/>
+      <w:lvlJc w:val="left"/>
+      <w:pPr>
+        <w:ind w:left="3589" w:hanging="360"/>
+      </w:pPr>
+      <w:rPr>
+        <w:rFonts w:ascii="Symbol" w:hAnsi="Symbol" w:hint="default"/>
+      </w:rPr>
+    </w:lvl>
+    <w:lvl w:ilvl="4" w:tplc="04020003" w:tentative="1">
+      <w:start w:val="1"/>
+      <w:numFmt w:val="bullet"/>
+      <w:lvlText w:val="o"/>
+      <w:lvlJc w:val="left"/>
+      <w:pPr>
+        <w:ind w:left="4309" w:hanging="360"/>
+      </w:pPr>
+      <w:rPr>
+        <w:rFonts w:ascii="Courier New" w:hAnsi="Courier New" w:cs="Courier New" w:hint="default"/>
+      </w:rPr>
+    </w:lvl>
+    <w:lvl w:ilvl="5" w:tplc="04020005" w:tentative="1">
+      <w:start w:val="1"/>
+      <w:numFmt w:val="bullet"/>
+      <w:lvlText w:val=""/>
+      <w:lvlJc w:val="left"/>
+      <w:pPr>
+        <w:ind w:left="5029" w:hanging="360"/>
+      </w:pPr>
+      <w:rPr>
+        <w:rFonts w:ascii="Wingdings" w:hAnsi="Wingdings" w:hint="default"/>
+      </w:rPr>
+    </w:lvl>
+    <w:lvl w:ilvl="6" w:tplc="04020001" w:tentative="1">
+      <w:start w:val="1"/>
+      <w:numFmt w:val="bullet"/>
+      <w:lvlText w:val=""/>
+      <w:lvlJc w:val="left"/>
+      <w:pPr>
+        <w:ind w:left="5749" w:hanging="360"/>
+      </w:pPr>
+      <w:rPr>
+        <w:rFonts w:ascii="Symbol" w:hAnsi="Symbol" w:hint="default"/>
+      </w:rPr>
+    </w:lvl>
+    <w:lvl w:ilvl="7" w:tplc="04020003" w:tentative="1">
+      <w:start w:val="1"/>
+      <w:numFmt w:val="bullet"/>
+      <w:lvlText w:val="o"/>
+      <w:lvlJc w:val="left"/>
+      <w:pPr>
+        <w:ind w:left="6469" w:hanging="360"/>
+      </w:pPr>
+      <w:rPr>
+        <w:rFonts w:ascii="Courier New" w:hAnsi="Courier New" w:cs="Courier New" w:hint="default"/>
+      </w:rPr>
+    </w:lvl>
+    <w:lvl w:ilvl="8" w:tplc="04020005" w:tentative="1">
+      <w:start w:val="1"/>
+      <w:numFmt w:val="bullet"/>
+      <w:lvlText w:val=""/>
+      <w:lvlJc w:val="left"/>
+      <w:pPr>
+        <w:ind w:left="7189" w:hanging="360"/>
+      </w:pPr>
+      <w:rPr>
+        <w:rFonts w:ascii="Wingdings" w:hAnsi="Wingdings" w:hint="default"/>
+      </w:rPr>
+    </w:lvl>
+  </w:abstractNum>
+  <w:abstractNum w:abstractNumId="33" w15:restartNumberingAfterBreak="0">
     <w:nsid w:val="6DA21F36"/>
     <w:multiLevelType w:val="multilevel"/>
     <w:tmpl w:val="4F40A45A"/>
@@ -5991,7 +8391,7 @@
       </w:rPr>
     </w:lvl>
   </w:abstractNum>
-  <w:abstractNum w:abstractNumId="28" w15:restartNumberingAfterBreak="0">
+  <w:abstractNum w:abstractNumId="34" w15:restartNumberingAfterBreak="0">
     <w:nsid w:val="6FE33583"/>
     <w:multiLevelType w:val="multilevel"/>
     <w:tmpl w:val="3C5CE852"/>
@@ -6112,7 +8512,7 @@
       </w:rPr>
     </w:lvl>
   </w:abstractNum>
-  <w:abstractNum w:abstractNumId="29" w15:restartNumberingAfterBreak="0">
+  <w:abstractNum w:abstractNumId="35" w15:restartNumberingAfterBreak="0">
     <w:nsid w:val="72074BD2"/>
     <w:multiLevelType w:val="hybridMultilevel"/>
     <w:tmpl w:val="A0F8CF48"/>
@@ -6201,7 +8601,7 @@
       </w:pPr>
     </w:lvl>
   </w:abstractNum>
-  <w:abstractNum w:abstractNumId="30" w15:restartNumberingAfterBreak="0">
+  <w:abstractNum w:abstractNumId="36" w15:restartNumberingAfterBreak="0">
     <w:nsid w:val="72F337EA"/>
     <w:multiLevelType w:val="multilevel"/>
     <w:tmpl w:val="D800F3AA"/>
@@ -6322,7 +8722,120 @@
       </w:rPr>
     </w:lvl>
   </w:abstractNum>
-  <w:abstractNum w:abstractNumId="31" w15:restartNumberingAfterBreak="0">
+  <w:abstractNum w:abstractNumId="37" w15:restartNumberingAfterBreak="0">
+    <w:nsid w:val="74855B0A"/>
+    <w:multiLevelType w:val="hybridMultilevel"/>
+    <w:tmpl w:val="BF243F80"/>
+    <w:lvl w:ilvl="0" w:tplc="04020001">
+      <w:start w:val="1"/>
+      <w:numFmt w:val="bullet"/>
+      <w:lvlText w:val=""/>
+      <w:lvlJc w:val="left"/>
+      <w:pPr>
+        <w:ind w:left="1429" w:hanging="360"/>
+      </w:pPr>
+      <w:rPr>
+        <w:rFonts w:ascii="Symbol" w:hAnsi="Symbol" w:hint="default"/>
+      </w:rPr>
+    </w:lvl>
+    <w:lvl w:ilvl="1" w:tplc="04020003" w:tentative="1">
+      <w:start w:val="1"/>
+      <w:numFmt w:val="bullet"/>
+      <w:lvlText w:val="o"/>
+      <w:lvlJc w:val="left"/>
+      <w:pPr>
+        <w:ind w:left="2149" w:hanging="360"/>
+      </w:pPr>
+      <w:rPr>
+        <w:rFonts w:ascii="Courier New" w:hAnsi="Courier New" w:cs="Courier New" w:hint="default"/>
+      </w:rPr>
+    </w:lvl>
+    <w:lvl w:ilvl="2" w:tplc="04020005" w:tentative="1">
+      <w:start w:val="1"/>
+      <w:numFmt w:val="bullet"/>
+      <w:lvlText w:val=""/>
+      <w:lvlJc w:val="left"/>
+      <w:pPr>
+        <w:ind w:left="2869" w:hanging="360"/>
+      </w:pPr>
+      <w:rPr>
+        <w:rFonts w:ascii="Wingdings" w:hAnsi="Wingdings" w:hint="default"/>
+      </w:rPr>
+    </w:lvl>
+    <w:lvl w:ilvl="3" w:tplc="04020001" w:tentative="1">
+      <w:start w:val="1"/>
+      <w:numFmt w:val="bullet"/>
+      <w:lvlText w:val=""/>
+      <w:lvlJc w:val="left"/>
+      <w:pPr>
+        <w:ind w:left="3589" w:hanging="360"/>
+      </w:pPr>
+      <w:rPr>
+        <w:rFonts w:ascii="Symbol" w:hAnsi="Symbol" w:hint="default"/>
+      </w:rPr>
+    </w:lvl>
+    <w:lvl w:ilvl="4" w:tplc="04020003" w:tentative="1">
+      <w:start w:val="1"/>
+      <w:numFmt w:val="bullet"/>
+      <w:lvlText w:val="o"/>
+      <w:lvlJc w:val="left"/>
+      <w:pPr>
+        <w:ind w:left="4309" w:hanging="360"/>
+      </w:pPr>
+      <w:rPr>
+        <w:rFonts w:ascii="Courier New" w:hAnsi="Courier New" w:cs="Courier New" w:hint="default"/>
+      </w:rPr>
+    </w:lvl>
+    <w:lvl w:ilvl="5" w:tplc="04020005" w:tentative="1">
+      <w:start w:val="1"/>
+      <w:numFmt w:val="bullet"/>
+      <w:lvlText w:val=""/>
+      <w:lvlJc w:val="left"/>
+      <w:pPr>
+        <w:ind w:left="5029" w:hanging="360"/>
+      </w:pPr>
+      <w:rPr>
+        <w:rFonts w:ascii="Wingdings" w:hAnsi="Wingdings" w:hint="default"/>
+      </w:rPr>
+    </w:lvl>
+    <w:lvl w:ilvl="6" w:tplc="04020001" w:tentative="1">
+      <w:start w:val="1"/>
+      <w:numFmt w:val="bullet"/>
+      <w:lvlText w:val=""/>
+      <w:lvlJc w:val="left"/>
+      <w:pPr>
+        <w:ind w:left="5749" w:hanging="360"/>
+      </w:pPr>
+      <w:rPr>
+        <w:rFonts w:ascii="Symbol" w:hAnsi="Symbol" w:hint="default"/>
+      </w:rPr>
+    </w:lvl>
+    <w:lvl w:ilvl="7" w:tplc="04020003" w:tentative="1">
+      <w:start w:val="1"/>
+      <w:numFmt w:val="bullet"/>
+      <w:lvlText w:val="o"/>
+      <w:lvlJc w:val="left"/>
+      <w:pPr>
+        <w:ind w:left="6469" w:hanging="360"/>
+      </w:pPr>
+      <w:rPr>
+        <w:rFonts w:ascii="Courier New" w:hAnsi="Courier New" w:cs="Courier New" w:hint="default"/>
+      </w:rPr>
+    </w:lvl>
+    <w:lvl w:ilvl="8" w:tplc="04020005" w:tentative="1">
+      <w:start w:val="1"/>
+      <w:numFmt w:val="bullet"/>
+      <w:lvlText w:val=""/>
+      <w:lvlJc w:val="left"/>
+      <w:pPr>
+        <w:ind w:left="7189" w:hanging="360"/>
+      </w:pPr>
+      <w:rPr>
+        <w:rFonts w:ascii="Wingdings" w:hAnsi="Wingdings" w:hint="default"/>
+      </w:rPr>
+    </w:lvl>
+  </w:abstractNum>
+  <w:abstractNum w:abstractNumId="38" w15:restartNumberingAfterBreak="0">
     <w:nsid w:val="763B79FE"/>
     <w:multiLevelType w:val="multilevel"/>
     <w:tmpl w:val="4F40A45A"/>
@@ -6440,7 +8953,7 @@
       </w:rPr>
     </w:lvl>
   </w:abstractNum>
-  <w:abstractNum w:abstractNumId="32" w15:restartNumberingAfterBreak="0">
+  <w:abstractNum w:abstractNumId="39" w15:restartNumberingAfterBreak="0">
     <w:nsid w:val="76A01A5D"/>
     <w:multiLevelType w:val="hybridMultilevel"/>
     <w:tmpl w:val="355C5A40"/>
@@ -6553,7 +9066,7 @@
       </w:rPr>
     </w:lvl>
   </w:abstractNum>
-  <w:abstractNum w:abstractNumId="33" w15:restartNumberingAfterBreak="0">
+  <w:abstractNum w:abstractNumId="40" w15:restartNumberingAfterBreak="0">
     <w:nsid w:val="7C547861"/>
     <w:multiLevelType w:val="multilevel"/>
     <w:tmpl w:val="0402001D"/>
@@ -6637,13 +9150,126 @@
       <w:pPr>
         <w:ind w:left="3240" w:hanging="360"/>
       </w:pPr>
+    </w:lvl>
+  </w:abstractNum>
+  <w:abstractNum w:abstractNumId="41" w15:restartNumberingAfterBreak="0">
+    <w:nsid w:val="7E54300F"/>
+    <w:multiLevelType w:val="hybridMultilevel"/>
+    <w:tmpl w:val="E26864AE"/>
+    <w:lvl w:ilvl="0" w:tplc="04020001">
+      <w:start w:val="1"/>
+      <w:numFmt w:val="bullet"/>
+      <w:lvlText w:val=""/>
+      <w:lvlJc w:val="left"/>
+      <w:pPr>
+        <w:ind w:left="1429" w:hanging="360"/>
+      </w:pPr>
+      <w:rPr>
+        <w:rFonts w:ascii="Symbol" w:hAnsi="Symbol" w:hint="default"/>
+      </w:rPr>
+    </w:lvl>
+    <w:lvl w:ilvl="1" w:tplc="04020003" w:tentative="1">
+      <w:start w:val="1"/>
+      <w:numFmt w:val="bullet"/>
+      <w:lvlText w:val="o"/>
+      <w:lvlJc w:val="left"/>
+      <w:pPr>
+        <w:ind w:left="2149" w:hanging="360"/>
+      </w:pPr>
+      <w:rPr>
+        <w:rFonts w:ascii="Courier New" w:hAnsi="Courier New" w:cs="Courier New" w:hint="default"/>
+      </w:rPr>
+    </w:lvl>
+    <w:lvl w:ilvl="2" w:tplc="04020005" w:tentative="1">
+      <w:start w:val="1"/>
+      <w:numFmt w:val="bullet"/>
+      <w:lvlText w:val=""/>
+      <w:lvlJc w:val="left"/>
+      <w:pPr>
+        <w:ind w:left="2869" w:hanging="360"/>
+      </w:pPr>
+      <w:rPr>
+        <w:rFonts w:ascii="Wingdings" w:hAnsi="Wingdings" w:hint="default"/>
+      </w:rPr>
+    </w:lvl>
+    <w:lvl w:ilvl="3" w:tplc="04020001" w:tentative="1">
+      <w:start w:val="1"/>
+      <w:numFmt w:val="bullet"/>
+      <w:lvlText w:val=""/>
+      <w:lvlJc w:val="left"/>
+      <w:pPr>
+        <w:ind w:left="3589" w:hanging="360"/>
+      </w:pPr>
+      <w:rPr>
+        <w:rFonts w:ascii="Symbol" w:hAnsi="Symbol" w:hint="default"/>
+      </w:rPr>
+    </w:lvl>
+    <w:lvl w:ilvl="4" w:tplc="04020003" w:tentative="1">
+      <w:start w:val="1"/>
+      <w:numFmt w:val="bullet"/>
+      <w:lvlText w:val="o"/>
+      <w:lvlJc w:val="left"/>
+      <w:pPr>
+        <w:ind w:left="4309" w:hanging="360"/>
+      </w:pPr>
+      <w:rPr>
+        <w:rFonts w:ascii="Courier New" w:hAnsi="Courier New" w:cs="Courier New" w:hint="default"/>
+      </w:rPr>
+    </w:lvl>
+    <w:lvl w:ilvl="5" w:tplc="04020005" w:tentative="1">
+      <w:start w:val="1"/>
+      <w:numFmt w:val="bullet"/>
+      <w:lvlText w:val=""/>
+      <w:lvlJc w:val="left"/>
+      <w:pPr>
+        <w:ind w:left="5029" w:hanging="360"/>
+      </w:pPr>
+      <w:rPr>
+        <w:rFonts w:ascii="Wingdings" w:hAnsi="Wingdings" w:hint="default"/>
+      </w:rPr>
+    </w:lvl>
+    <w:lvl w:ilvl="6" w:tplc="04020001" w:tentative="1">
+      <w:start w:val="1"/>
+      <w:numFmt w:val="bullet"/>
+      <w:lvlText w:val=""/>
+      <w:lvlJc w:val="left"/>
+      <w:pPr>
+        <w:ind w:left="5749" w:hanging="360"/>
+      </w:pPr>
+      <w:rPr>
+        <w:rFonts w:ascii="Symbol" w:hAnsi="Symbol" w:hint="default"/>
+      </w:rPr>
+    </w:lvl>
+    <w:lvl w:ilvl="7" w:tplc="04020003" w:tentative="1">
+      <w:start w:val="1"/>
+      <w:numFmt w:val="bullet"/>
+      <w:lvlText w:val="o"/>
+      <w:lvlJc w:val="left"/>
+      <w:pPr>
+        <w:ind w:left="6469" w:hanging="360"/>
+      </w:pPr>
+      <w:rPr>
+        <w:rFonts w:ascii="Courier New" w:hAnsi="Courier New" w:cs="Courier New" w:hint="default"/>
+      </w:rPr>
+    </w:lvl>
+    <w:lvl w:ilvl="8" w:tplc="04020005" w:tentative="1">
+      <w:start w:val="1"/>
+      <w:numFmt w:val="bullet"/>
+      <w:lvlText w:val=""/>
+      <w:lvlJc w:val="left"/>
+      <w:pPr>
+        <w:ind w:left="7189" w:hanging="360"/>
+      </w:pPr>
+      <w:rPr>
+        <w:rFonts w:ascii="Wingdings" w:hAnsi="Wingdings" w:hint="default"/>
+      </w:rPr>
     </w:lvl>
   </w:abstractNum>
   <w:num w:numId="1">
     <w:abstractNumId w:val="8"/>
   </w:num>
   <w:num w:numId="2">
-    <w:abstractNumId w:val="31"/>
+    <w:abstractNumId w:val="38"/>
   </w:num>
   <w:num w:numId="3">
     <w:abstractNumId w:val="7"/>
@@ -6652,10 +9278,10 @@
     <w:abstractNumId w:val="0"/>
   </w:num>
   <w:num w:numId="5">
-    <w:abstractNumId w:val="15"/>
+    <w:abstractNumId w:val="17"/>
   </w:num>
   <w:num w:numId="6">
-    <w:abstractNumId w:val="20"/>
+    <w:abstractNumId w:val="22"/>
   </w:num>
   <w:num w:numId="7">
     <w:abstractNumId w:val="1"/>
@@ -6670,13 +9296,13 @@
     </w:lvlOverride>
   </w:num>
   <w:num w:numId="10">
-    <w:abstractNumId w:val="18"/>
+    <w:abstractNumId w:val="20"/>
   </w:num>
   <w:num w:numId="11">
     <w:abstractNumId w:val="5"/>
   </w:num>
   <w:num w:numId="12">
-    <w:abstractNumId w:val="18"/>
+    <w:abstractNumId w:val="20"/>
     <w:lvlOverride w:ilvl="0">
       <w:startOverride w:val="1"/>
     </w:lvlOverride>
@@ -6712,43 +9338,43 @@
     </w:lvlOverride>
   </w:num>
   <w:num w:numId="14">
-    <w:abstractNumId w:val="22"/>
+    <w:abstractNumId w:val="26"/>
   </w:num>
   <w:num w:numId="15">
-    <w:abstractNumId w:val="25"/>
+    <w:abstractNumId w:val="30"/>
   </w:num>
   <w:num w:numId="16">
     <w:abstractNumId w:val="9"/>
   </w:num>
   <w:num w:numId="17">
-    <w:abstractNumId w:val="24"/>
+    <w:abstractNumId w:val="29"/>
   </w:num>
   <w:num w:numId="18">
-    <w:abstractNumId w:val="18"/>
+    <w:abstractNumId w:val="20"/>
   </w:num>
   <w:num w:numId="19">
-    <w:abstractNumId w:val="30"/>
+    <w:abstractNumId w:val="36"/>
   </w:num>
   <w:num w:numId="20">
-    <w:abstractNumId w:val="21"/>
+    <w:abstractNumId w:val="25"/>
   </w:num>
   <w:num w:numId="21">
     <w:abstractNumId w:val="13"/>
   </w:num>
   <w:num w:numId="22">
-    <w:abstractNumId w:val="17"/>
+    <w:abstractNumId w:val="19"/>
   </w:num>
   <w:num w:numId="23">
-    <w:abstractNumId w:val="16"/>
+    <w:abstractNumId w:val="18"/>
   </w:num>
   <w:num w:numId="24">
-    <w:abstractNumId w:val="33"/>
+    <w:abstractNumId w:val="40"/>
   </w:num>
   <w:num w:numId="25">
     <w:abstractNumId w:val="4"/>
   </w:num>
   <w:num w:numId="26">
-    <w:abstractNumId w:val="18"/>
+    <w:abstractNumId w:val="20"/>
     <w:lvlOverride w:ilvl="0">
       <w:lvl w:ilvl="0">
         <w:start w:val="1"/>
@@ -6886,7 +9512,7 @@
     </w:lvlOverride>
   </w:num>
   <w:num w:numId="27">
-    <w:abstractNumId w:val="18"/>
+    <w:abstractNumId w:val="20"/>
     <w:lvlOverride w:ilvl="0">
       <w:lvl w:ilvl="0">
         <w:start w:val="1"/>
@@ -7023,28 +9649,28 @@
     </w:lvlOverride>
   </w:num>
   <w:num w:numId="28">
-    <w:abstractNumId w:val="28"/>
+    <w:abstractNumId w:val="34"/>
   </w:num>
   <w:num w:numId="29">
-    <w:abstractNumId w:val="14"/>
+    <w:abstractNumId w:val="15"/>
   </w:num>
   <w:num w:numId="30">
-    <w:abstractNumId w:val="19"/>
+    <w:abstractNumId w:val="21"/>
   </w:num>
   <w:num w:numId="31">
     <w:abstractNumId w:val="6"/>
   </w:num>
   <w:num w:numId="32">
-    <w:abstractNumId w:val="23"/>
+    <w:abstractNumId w:val="28"/>
   </w:num>
   <w:num w:numId="33">
-    <w:abstractNumId w:val="29"/>
+    <w:abstractNumId w:val="35"/>
   </w:num>
   <w:num w:numId="34">
     <w:abstractNumId w:val="2"/>
   </w:num>
   <w:num w:numId="35">
-    <w:abstractNumId w:val="29"/>
+    <w:abstractNumId w:val="35"/>
     <w:lvlOverride w:ilvl="0">
       <w:startOverride w:val="1"/>
     </w:lvlOverride>
@@ -7059,13 +9685,40 @@
     <w:abstractNumId w:val="3"/>
   </w:num>
   <w:num w:numId="39">
-    <w:abstractNumId w:val="26"/>
+    <w:abstractNumId w:val="31"/>
   </w:num>
   <w:num w:numId="40">
+    <w:abstractNumId w:val="33"/>
+  </w:num>
+  <w:num w:numId="41">
+    <w:abstractNumId w:val="39"/>
+  </w:num>
+  <w:num w:numId="42">
     <w:abstractNumId w:val="27"/>
   </w:num>
-  <w:num w:numId="41">
+  <w:num w:numId="43">
+    <w:abstractNumId w:val="24"/>
+  </w:num>
+  <w:num w:numId="44">
+    <w:abstractNumId w:val="37"/>
+  </w:num>
+  <w:num w:numId="45">
+    <w:abstractNumId w:val="23"/>
+    <w:lvlOverride w:ilvl="0">
+      <w:startOverride w:val="1"/>
+    </w:lvlOverride>
+  </w:num>
+  <w:num w:numId="46">
+    <w:abstractNumId w:val="14"/>
+  </w:num>
+  <w:num w:numId="47">
     <w:abstractNumId w:val="32"/>
+  </w:num>
+  <w:num w:numId="48">
+    <w:abstractNumId w:val="41"/>
+  </w:num>
+  <w:num w:numId="49">
+    <w:abstractNumId w:val="16"/>
   </w:num>
 </w:numbering>
 </file>
@@ -7079,6 +9732,845 @@
         <w:sz w:val="22"/>
         <w:szCs w:val="22"/>
         <w:lang w:val="bg-BG" w:eastAsia="en-US" w:bidi="ar-SA"/>
+      </w:rPr>
+    </w:rPrDefault>
+    <w:pPrDefault>
+      <w:pPr>
+        <w:spacing w:after="160" w:line="259" w:lineRule="auto"/>
+      </w:pPr>
+    </w:pPrDefault>
+  </w:docDefaults>
+  <w:latentStyles w:defLockedState="0" w:defUIPriority="99" w:defSemiHidden="0" w:defUnhideWhenUsed="0" w:defQFormat="0" w:count="371">
+    <w:lsdException w:name="Normal" w:uiPriority="0" w:qFormat="1"/>
+    <w:lsdException w:name="heading 1" w:uiPriority="9" w:qFormat="1"/>
+    <w:lsdException w:name="heading 2" w:semiHidden="1" w:uiPriority="9" w:unhideWhenUsed="1" w:qFormat="1"/>
+    <w:lsdException w:name="heading 3" w:semiHidden="1" w:uiPriority="9" w:unhideWhenUsed="1" w:qFormat="1"/>
+    <w:lsdException w:name="heading 4" w:semiHidden="1" w:uiPriority="9" w:unhideWhenUsed="1" w:qFormat="1"/>
+    <w:lsdException w:name="heading 5" w:semiHidden="1" w:uiPriority="9" w:unhideWhenUsed="1" w:qFormat="1"/>
+    <w:lsdException w:name="heading 6" w:semiHidden="1" w:uiPriority="9" w:unhideWhenUsed="1" w:qFormat="1"/>
+    <w:lsdException w:name="heading 7" w:semiHidden="1" w:uiPriority="9" w:unhideWhenUsed="1" w:qFormat="1"/>
+    <w:lsdException w:name="heading 8" w:semiHidden="1" w:uiPriority="9" w:unhideWhenUsed="1" w:qFormat="1"/>
+    <w:lsdException w:name="heading 9" w:semiHidden="1" w:uiPriority="9" w:unhideWhenUsed="1" w:qFormat="1"/>
+    <w:lsdException w:name="index 1" w:semiHidden="1" w:unhideWhenUsed="1"/>
+    <w:lsdException w:name="index 2" w:semiHidden="1" w:unhideWhenUsed="1"/>
+    <w:lsdException w:name="index 3" w:semiHidden="1" w:unhideWhenUsed="1"/>
+    <w:lsdException w:name="index 4" w:semiHidden="1" w:unhideWhenUsed="1"/>
+    <w:lsdException w:name="index 5" w:semiHidden="1" w:unhideWhenUsed="1"/>
+    <w:lsdException w:name="index 6" w:semiHidden="1" w:unhideWhenUsed="1"/>
+    <w:lsdException w:name="index 7" w:semiHidden="1" w:unhideWhenUsed="1"/>
+    <w:lsdException w:name="index 8" w:semiHidden="1" w:unhideWhenUsed="1"/>
+    <w:lsdException w:name="index 9" w:semiHidden="1" w:unhideWhenUsed="1"/>
+    <w:lsdException w:name="toc 1" w:semiHidden="1" w:uiPriority="39" w:unhideWhenUsed="1"/>
+    <w:lsdException w:name="toc 2" w:semiHidden="1" w:uiPriority="39" w:unhideWhenUsed="1"/>
+    <w:lsdException w:name="toc 3" w:semiHidden="1" w:uiPriority="39" w:unhideWhenUsed="1"/>
+    <w:lsdException w:name="toc 4" w:semiHidden="1" w:uiPriority="39" w:unhideWhenUsed="1"/>
+    <w:lsdException w:name="toc 5" w:semiHidden="1" w:uiPriority="39" w:unhideWhenUsed="1"/>
+    <w:lsdException w:name="toc 6" w:semiHidden="1" w:uiPriority="39" w:unhideWhenUsed="1"/>
+    <w:lsdException w:name="toc 7" w:semiHidden="1" w:uiPriority="39" w:unhideWhenUsed="1"/>
+    <w:lsdException w:name="toc 8" w:semiHidden="1" w:uiPriority="39" w:unhideWhenUsed="1"/>
+    <w:lsdException w:name="toc 9" w:semiHidden="1" w:uiPriority="39" w:unhideWhenUsed="1"/>
+    <w:lsdException w:name="Normal Indent" w:semiHidden="1" w:unhideWhenUsed="1"/>
+    <w:lsdException w:name="footnote text" w:semiHidden="1" w:unhideWhenUsed="1"/>
+    <w:lsdException w:name="annotation text" w:semiHidden="1" w:unhideWhenUsed="1"/>
+    <w:lsdException w:name="header" w:semiHidden="1" w:unhideWhenUsed="1"/>
+    <w:lsdException w:name="footer" w:semiHidden="1" w:unhideWhenUsed="1"/>
+    <w:lsdException w:name="index heading" w:semiHidden="1" w:unhideWhenUsed="1"/>
+    <w:lsdException w:name="caption" w:semiHidden="1" w:uiPriority="35" w:unhideWhenUsed="1" w:qFormat="1"/>
+    <w:lsdException w:name="table of figures" w:semiHidden="1" w:unhideWhenUsed="1"/>
+    <w:lsdException w:name="envelope address" w:semiHidden="1" w:unhideWhenUsed="1"/>
+    <w:lsdException w:name="envelope return" w:semiHidden="1" w:unhideWhenUsed="1"/>
+    <w:lsdException w:name="footnote reference" w:semiHidden="1" w:unhideWhenUsed="1"/>
+    <w:lsdException w:name="annotation reference" w:semiHidden="1" w:unhideWhenUsed="1"/>
+    <w:lsdException w:name="line number" w:semiHidden="1" w:unhideWhenUsed="1"/>
+    <w:lsdException w:name="page number" w:semiHidden="1" w:unhideWhenUsed="1"/>
+    <w:lsdException w:name="endnote reference" w:semiHidden="1" w:unhideWhenUsed="1"/>
+    <w:lsdException w:name="endnote text" w:semiHidden="1" w:unhideWhenUsed="1"/>
+    <w:lsdException w:name="table of authorities" w:semiHidden="1" w:unhideWhenUsed="1"/>
+    <w:lsdException w:name="macro" w:semiHidden="1" w:unhideWhenUsed="1"/>
+    <w:lsdException w:name="toa heading" w:semiHidden="1" w:unhideWhenUsed="1"/>
+    <w:lsdException w:name="List" w:semiHidden="1" w:unhideWhenUsed="1"/>
+    <w:lsdException w:name="List Bullet" w:semiHidden="1" w:unhideWhenUsed="1"/>
+    <w:lsdException w:name="List Number" w:semiHidden="1" w:unhideWhenUsed="1"/>
+    <w:lsdException w:name="List 2" w:semiHidden="1" w:unhideWhenUsed="1"/>
+    <w:lsdException w:name="List 3" w:semiHidden="1" w:unhideWhenUsed="1"/>
+    <w:lsdException w:name="List 4" w:semiHidden="1" w:unhideWhenUsed="1"/>
+    <w:lsdException w:name="List 5" w:semiHidden="1" w:unhideWhenUsed="1"/>
+    <w:lsdException w:name="List Bullet 2" w:semiHidden="1" w:unhideWhenUsed="1"/>
+    <w:lsdException w:name="List Bullet 3" w:semiHidden="1" w:unhideWhenUsed="1"/>
+    <w:lsdException w:name="List Bullet 4" w:semiHidden="1" w:unhideWhenUsed="1"/>
+    <w:lsdException w:name="List Bullet 5" w:semiHidden="1" w:unhideWhenUsed="1"/>
+    <w:lsdException w:name="List Number 2" w:semiHidden="1" w:unhideWhenUsed="1"/>
+    <w:lsdException w:name="List Number 3" w:semiHidden="1" w:unhideWhenUsed="1"/>
+    <w:lsdException w:name="List Number 4" w:semiHidden="1" w:unhideWhenUsed="1"/>
+    <w:lsdException w:name="List Number 5" w:semiHidden="1" w:unhideWhenUsed="1"/>
+    <w:lsdException w:name="Title" w:uiPriority="10" w:qFormat="1"/>
+    <w:lsdException w:name="Closing" w:semiHidden="1" w:unhideWhenUsed="1"/>
+    <w:lsdException w:name="Signature" w:semiHidden="1" w:unhideWhenUsed="1"/>
+    <w:lsdException w:name="Default Paragraph Font" w:semiHidden="1" w:uiPriority="1" w:unhideWhenUsed="1"/>
+    <w:lsdException w:name="Body Text" w:semiHidden="1" w:unhideWhenUsed="1"/>
+    <w:lsdException w:name="Body Text Indent" w:semiHidden="1" w:unhideWhenUsed="1"/>
+    <w:lsdException w:name="List Continue" w:semiHidden="1" w:unhideWhenUsed="1"/>
+    <w:lsdException w:name="List Continue 2" w:semiHidden="1" w:unhideWhenUsed="1"/>
+    <w:lsdException w:name="List Continue 3" w:semiHidden="1" w:unhideWhenUsed="1"/>
+    <w:lsdException w:name="List Continue 4" w:semiHidden="1" w:unhideWhenUsed="1"/>
+    <w:lsdException w:name="List Continue 5" w:semiHidden="1" w:unhideWhenUsed="1"/>
+    <w:lsdException w:name="Message Header" w:semiHidden="1" w:unhideWhenUsed="1"/>
+    <w:lsdException w:name="Subtitle" w:uiPriority="11" w:qFormat="1"/>
+    <w:lsdException w:name="Salutation" w:semiHidden="1" w:unhideWhenUsed="1"/>
+    <w:lsdException w:name="Date" w:semiHidden="1" w:unhideWhenUsed="1"/>
+    <w:lsdException w:name="Body Text First Indent" w:semiHidden="1" w:unhideWhenUsed="1"/>
+    <w:lsdException w:name="Body Text First Indent 2" w:semiHidden="1" w:unhideWhenUsed="1"/>
+    <w:lsdException w:name="Note Heading" w:semiHidden="1" w:unhideWhenUsed="1"/>
+    <w:lsdException w:name="Body Text 2" w:semiHidden="1" w:unhideWhenUsed="1"/>
+    <w:lsdException w:name="Body Text 3" w:semiHidden="1" w:unhideWhenUsed="1"/>
+    <w:lsdException w:name="Body Text Indent 2" w:semiHidden="1" w:unhideWhenUsed="1"/>
+    <w:lsdException w:name="Body Text Indent 3" w:semiHidden="1" w:unhideWhenUsed="1"/>
+    <w:lsdException w:name="Block Text" w:semiHidden="1" w:unhideWhenUsed="1"/>
+    <w:lsdException w:name="Hyperlink" w:semiHidden="1" w:unhideWhenUsed="1"/>
+    <w:lsdException w:name="FollowedHyperlink" w:semiHidden="1" w:unhideWhenUsed="1"/>
+    <w:lsdException w:name="Strong" w:uiPriority="22" w:qFormat="1"/>
+    <w:lsdException w:name="Emphasis" w:uiPriority="20" w:qFormat="1"/>
+    <w:lsdException w:name="Document Map" w:semiHidden="1" w:unhideWhenUsed="1"/>
+    <w:lsdException w:name="Plain Text" w:semiHidden="1" w:unhideWhenUsed="1"/>
+    <w:lsdException w:name="E-mail Signature" w:semiHidden="1" w:unhideWhenUsed="1"/>
+    <w:lsdException w:name="HTML Top of Form" w:semiHidden="1" w:unhideWhenUsed="1"/>
+    <w:lsdException w:name="HTML Bottom of Form" w:semiHidden="1" w:unhideWhenUsed="1"/>
+    <w:lsdException w:name="Normal (Web)" w:semiHidden="1" w:unhideWhenUsed="1"/>
+    <w:lsdException w:name="HTML Acronym" w:semiHidden="1" w:unhideWhenUsed="1"/>
+    <w:lsdException w:name="HTML Address" w:semiHidden="1" w:unhideWhenUsed="1"/>
+    <w:lsdException w:name="HTML Cite" w:semiHidden="1" w:unhideWhenUsed="1"/>
+    <w:lsdException w:name="HTML Code" w:semiHidden="1" w:unhideWhenUsed="1"/>
+    <w:lsdException w:name="HTML Definition" w:semiHidden="1" w:unhideWhenUsed="1"/>
+    <w:lsdException w:name="HTML Keyboard" w:semiHidden="1" w:unhideWhenUsed="1"/>
+    <w:lsdException w:name="HTML Preformatted" w:semiHidden="1" w:unhideWhenUsed="1"/>
+    <w:lsdException w:name="HTML Sample" w:semiHidden="1" w:unhideWhenUsed="1"/>
+    <w:lsdException w:name="HTML Typewriter" w:semiHidden="1" w:unhideWhenUsed="1"/>
+    <w:lsdException w:name="HTML Variable" w:semiHidden="1" w:unhideWhenUsed="1"/>
+    <w:lsdException w:name="Normal Table" w:semiHidden="1" w:unhideWhenUsed="1"/>
+    <w:lsdException w:name="annotation subject" w:semiHidden="1" w:unhideWhenUsed="1"/>
+    <w:lsdException w:name="No List" w:semiHidden="1" w:unhideWhenUsed="1"/>
+    <w:lsdException w:name="Outline List 1" w:semiHidden="1" w:unhideWhenUsed="1"/>
+    <w:lsdException w:name="Outline List 2" w:semiHidden="1" w:unhideWhenUsed="1"/>
+    <w:lsdException w:name="Outline List 3" w:semiHidden="1" w:unhideWhenUsed="1"/>
+    <w:lsdException w:name="Table Simple 1" w:semiHidden="1" w:unhideWhenUsed="1"/>
+    <w:lsdException w:name="Table Simple 2" w:semiHidden="1" w:unhideWhenUsed="1"/>
+    <w:lsdException w:name="Table Simple 3" w:semiHidden="1" w:unhideWhenUsed="1"/>
+    <w:lsdException w:name="Table Classic 1" w:semiHidden="1" w:unhideWhenUsed="1"/>
+    <w:lsdException w:name="Table Classic 2" w:semiHidden="1" w:unhideWhenUsed="1"/>
+    <w:lsdException w:name="Table Classic 3" w:semiHidden="1" w:unhideWhenUsed="1"/>
+    <w:lsdException w:name="Table Classic 4" w:semiHidden="1" w:unhideWhenUsed="1"/>
+    <w:lsdException w:name="Table Colorful 1" w:semiHidden="1" w:unhideWhenUsed="1"/>
+    <w:lsdException w:name="Table Colorful 2" w:semiHidden="1" w:unhideWhenUsed="1"/>
+    <w:lsdException w:name="Table Colorful 3" w:semiHidden="1" w:unhideWhenUsed="1"/>
+    <w:lsdException w:name="Table Columns 1" w:semiHidden="1" w:unhideWhenUsed="1"/>
+    <w:lsdException w:name="Table Columns 2" w:semiHidden="1" w:unhideWhenUsed="1"/>
+    <w:lsdException w:name="Table Columns 3" w:semiHidden="1" w:unhideWhenUsed="1"/>
+    <w:lsdException w:name="Table Columns 4" w:semiHidden="1" w:unhideWhenUsed="1"/>
+    <w:lsdException w:name="Table Columns 5" w:semiHidden="1" w:unhideWhenUsed="1"/>
+    <w:lsdException w:name="Table Grid 1" w:semiHidden="1" w:unhideWhenUsed="1"/>
+    <w:lsdException w:name="Table Grid 2" w:semiHidden="1" w:unhideWhenUsed="1"/>
+    <w:lsdException w:name="Table Grid 3" w:semiHidden="1" w:unhideWhenUsed="1"/>
+    <w:lsdException w:name="Table Grid 4" w:semiHidden="1" w:unhideWhenUsed="1"/>
+    <w:lsdException w:name="Table Grid 5" w:semiHidden="1" w:unhideWhenUsed="1"/>
+    <w:lsdException w:name="Table Grid 6" w:semiHidden="1" w:unhideWhenUsed="1"/>
+    <w:lsdException w:name="Table Grid 7" w:semiHidden="1" w:unhideWhenUsed="1"/>
+    <w:lsdException w:name="Table Grid 8" w:semiHidden="1" w:unhideWhenUsed="1"/>
+    <w:lsdException w:name="Table List 1" w:semiHidden="1" w:unhideWhenUsed="1"/>
+    <w:lsdException w:name="Table List 2" w:semiHidden="1" w:unhideWhenUsed="1"/>
+    <w:lsdException w:name="Table List 3" w:semiHidden="1" w:unhideWhenUsed="1"/>
+    <w:lsdException w:name="Table List 4" w:semiHidden="1" w:unhideWhenUsed="1"/>
+    <w:lsdException w:name="Table List 5" w:semiHidden="1" w:unhideWhenUsed="1"/>
+    <w:lsdException w:name="Table List 6" w:semiHidden="1" w:unhideWhenUsed="1"/>
+    <w:lsdException w:name="Table List 7" w:semiHidden="1" w:unhideWhenUsed="1"/>
+    <w:lsdException w:name="Table List 8" w:semiHidden="1" w:unhideWhenUsed="1"/>
+    <w:lsdException w:name="Table 3D effects 1" w:semiHidden="1" w:unhideWhenUsed="1"/>
+    <w:lsdException w:name="Table 3D effects 2" w:semiHidden="1" w:unhideWhenUsed="1"/>
+    <w:lsdException w:name="Table 3D effects 3" w:semiHidden="1" w:unhideWhenUsed="1"/>
+    <w:lsdException w:name="Table Contemporary" w:semiHidden="1" w:unhideWhenUsed="1"/>
+    <w:lsdException w:name="Table Elegant" w:semiHidden="1" w:unhideWhenUsed="1"/>
+    <w:lsdException w:name="Table Professional" w:semiHidden="1" w:unhideWhenUsed="1"/>
+    <w:lsdException w:name="Table Subtle 1" w:semiHidden="1" w:unhideWhenUsed="1"/>
+    <w:lsdException w:name="Table Subtle 2" w:semiHidden="1" w:unhideWhenUsed="1"/>
+    <w:lsdException w:name="Table Web 1" w:semiHidden="1" w:unhideWhenUsed="1"/>
+    <w:lsdException w:name="Table Web 2" w:semiHidden="1" w:unhideWhenUsed="1"/>
+    <w:lsdException w:name="Table Web 3" w:semiHidden="1" w:unhideWhenUsed="1"/>
+    <w:lsdException w:name="Balloon Text" w:semiHidden="1" w:unhideWhenUsed="1"/>
+    <w:lsdException w:name="Table Grid" w:uiPriority="39"/>
+    <w:lsdException w:name="Table Theme" w:semiHidden="1" w:unhideWhenUsed="1"/>
+    <w:lsdException w:name="Placeholder Text" w:semiHidden="1"/>
+    <w:lsdException w:name="No Spacing" w:uiPriority="1" w:qFormat="1"/>
+    <w:lsdException w:name="Light Shading" w:uiPriority="60"/>
+    <w:lsdException w:name="Light List" w:uiPriority="61"/>
+    <w:lsdException w:name="Light Grid" w:uiPriority="62"/>
+    <w:lsdException w:name="Medium Shading 1" w:uiPriority="63"/>
+    <w:lsdException w:name="Medium Shading 2" w:uiPriority="64"/>
+    <w:lsdException w:name="Medium List 1" w:uiPriority="65"/>
+    <w:lsdException w:name="Medium List 2" w:uiPriority="66"/>
+    <w:lsdException w:name="Medium Grid 1" w:uiPriority="67"/>
+    <w:lsdException w:name="Medium Grid 2" w:uiPriority="68"/>
+    <w:lsdException w:name="Medium Grid 3" w:uiPriority="69"/>
+    <w:lsdException w:name="Dark List" w:uiPriority="70"/>
+    <w:lsdException w:name="Colorful Shading" w:uiPriority="71"/>
+    <w:lsdException w:name="Colorful List" w:uiPriority="72"/>
+    <w:lsdException w:name="Colorful Grid" w:uiPriority="73"/>
+    <w:lsdException w:name="Light Shading Accent 1" w:uiPriority="60"/>
+    <w:lsdException w:name="Light List Accent 1" w:uiPriority="61"/>
+    <w:lsdException w:name="Light Grid Accent 1" w:uiPriority="62"/>
+    <w:lsdException w:name="Medium Shading 1 Accent 1" w:uiPriority="63"/>
+    <w:lsdException w:name="Medium Shading 2 Accent 1" w:uiPriority="64"/>
+    <w:lsdException w:name="Medium List 1 Accent 1" w:uiPriority="65"/>
+    <w:lsdException w:name="Revision" w:semiHidden="1"/>
+    <w:lsdException w:name="List Paragraph" w:uiPriority="0" w:qFormat="1"/>
+    <w:lsdException w:name="Quote" w:uiPriority="29" w:qFormat="1"/>
+    <w:lsdException w:name="Intense Quote" w:uiPriority="30" w:qFormat="1"/>
+    <w:lsdException w:name="Medium List 2 Accent 1" w:uiPriority="66"/>
+    <w:lsdException w:name="Medium Grid 1 Accent 1" w:uiPriority="67"/>
+    <w:lsdException w:name="Medium Grid 2 Accent 1" w:uiPriority="68"/>
+    <w:lsdException w:name="Medium Grid 3 Accent 1" w:uiPriority="69"/>
+    <w:lsdException w:name="Dark List Accent 1" w:uiPriority="70"/>
+    <w:lsdException w:name="Colorful Shading Accent 1" w:uiPriority="71"/>
+    <w:lsdException w:name="Colorful List Accent 1" w:uiPriority="72"/>
+    <w:lsdException w:name="Colorful Grid Accent 1" w:uiPriority="73"/>
+    <w:lsdException w:name="Light Shading Accent 2" w:uiPriority="60"/>
+    <w:lsdException w:name="Light List Accent 2" w:uiPriority="61"/>
+    <w:lsdException w:name="Light Grid Accent 2" w:uiPriority="62"/>
+    <w:lsdException w:name="Medium Shading 1 Accent 2" w:uiPriority="63"/>
+    <w:lsdException w:name="Medium Shading 2 Accent 2" w:uiPriority="64"/>
+    <w:lsdException w:name="Medium List 1 Accent 2" w:uiPriority="65"/>
+    <w:lsdException w:name="Medium List 2 Accent 2" w:uiPriority="66"/>
+    <w:lsdException w:name="Medium Grid 1 Accent 2" w:uiPriority="67"/>
+    <w:lsdException w:name="Medium Grid 2 Accent 2" w:uiPriority="68"/>
+    <w:lsdException w:name="Medium Grid 3 Accent 2" w:uiPriority="69"/>
+    <w:lsdException w:name="Dark List Accent 2" w:uiPriority="70"/>
+    <w:lsdException w:name="Colorful Shading Accent 2" w:uiPriority="71"/>
+    <w:lsdException w:name="Colorful List Accent 2" w:uiPriority="72"/>
+    <w:lsdException w:name="Colorful Grid Accent 2" w:uiPriority="73"/>
+    <w:lsdException w:name="Light Shading Accent 3" w:uiPriority="60"/>
+    <w:lsdException w:name="Light List Accent 3" w:uiPriority="61"/>
+    <w:lsdException w:name="Light Grid Accent 3" w:uiPriority="62"/>
+    <w:lsdException w:name="Medium Shading 1 Accent 3" w:uiPriority="63"/>
+    <w:lsdException w:name="Medium Shading 2 Accent 3" w:uiPriority="64"/>
+    <w:lsdException w:name="Medium List 1 Accent 3" w:uiPriority="65"/>
+    <w:lsdException w:name="Medium List 2 Accent 3" w:uiPriority="66"/>
+    <w:lsdException w:name="Medium Grid 1 Accent 3" w:uiPriority="67"/>
+    <w:lsdException w:name="Medium Grid 2 Accent 3" w:uiPriority="68"/>
+    <w:lsdException w:name="Medium Grid 3 Accent 3" w:uiPriority="69"/>
+    <w:lsdException w:name="Dark List Accent 3" w:uiPriority="70"/>
+    <w:lsdException w:name="Colorful Shading Accent 3" w:uiPriority="71"/>
+    <w:lsdException w:name="Colorful List Accent 3" w:uiPriority="72"/>
+    <w:lsdException w:name="Colorful Grid Accent 3" w:uiPriority="73"/>
+    <w:lsdException w:name="Light Shading Accent 4" w:uiPriority="60"/>
+    <w:lsdException w:name="Light List Accent 4" w:uiPriority="61"/>
+    <w:lsdException w:name="Light Grid Accent 4" w:uiPriority="62"/>
+    <w:lsdException w:name="Medium Shading 1 Accent 4" w:uiPriority="63"/>
+    <w:lsdException w:name="Medium Shading 2 Accent 4" w:uiPriority="64"/>
+    <w:lsdException w:name="Medium List 1 Accent 4" w:uiPriority="65"/>
+    <w:lsdException w:name="Medium List 2 Accent 4" w:uiPriority="66"/>
+    <w:lsdException w:name="Medium Grid 1 Accent 4" w:uiPriority="67"/>
+    <w:lsdException w:name="Medium Grid 2 Accent 4" w:uiPriority="68"/>
+    <w:lsdException w:name="Medium Grid 3 Accent 4" w:uiPriority="69"/>
+    <w:lsdException w:name="Dark List Accent 4" w:uiPriority="70"/>
+    <w:lsdException w:name="Colorful Shading Accent 4" w:uiPriority="71"/>
+    <w:lsdException w:name="Colorful List Accent 4" w:uiPriority="72"/>
+    <w:lsdException w:name="Colorful Grid Accent 4" w:uiPriority="73"/>
+    <w:lsdException w:name="Light Shading Accent 5" w:uiPriority="60"/>
+    <w:lsdException w:name="Light List Accent 5" w:uiPriority="61"/>
+    <w:lsdException w:name="Light Grid Accent 5" w:uiPriority="62"/>
+    <w:lsdException w:name="Medium Shading 1 Accent 5" w:uiPriority="63"/>
+    <w:lsdException w:name="Medium Shading 2 Accent 5" w:uiPriority="64"/>
+    <w:lsdException w:name="Medium List 1 Accent 5" w:uiPriority="65"/>
+    <w:lsdException w:name="Medium List 2 Accent 5" w:uiPriority="66"/>
+    <w:lsdException w:name="Medium Grid 1 Accent 5" w:uiPriority="67"/>
+    <w:lsdException w:name="Medium Grid 2 Accent 5" w:uiPriority="68"/>
+    <w:lsdException w:name="Medium Grid 3 Accent 5" w:uiPriority="69"/>
+    <w:lsdException w:name="Dark List Accent 5" w:uiPriority="70"/>
+    <w:lsdException w:name="Colorful Shading Accent 5" w:uiPriority="71"/>
+    <w:lsdException w:name="Colorful List Accent 5" w:uiPriority="72"/>
+    <w:lsdException w:name="Colorful Grid Accent 5" w:uiPriority="73"/>
+    <w:lsdException w:name="Light Shading Accent 6" w:uiPriority="60"/>
+    <w:lsdException w:name="Light List Accent 6" w:uiPriority="61"/>
+    <w:lsdException w:name="Light Grid Accent 6" w:uiPriority="62"/>
+    <w:lsdException w:name="Medium Shading 1 Accent 6" w:uiPriority="63"/>
+    <w:lsdException w:name="Medium Shading 2 Accent 6" w:uiPriority="64"/>
+    <w:lsdException w:name="Medium List 1 Accent 6" w:uiPriority="65"/>
+    <w:lsdException w:name="Medium List 2 Accent 6" w:uiPriority="66"/>
+    <w:lsdException w:name="Medium Grid 1 Accent 6" w:uiPriority="67"/>
+    <w:lsdException w:name="Medium Grid 2 Accent 6" w:uiPriority="68"/>
+    <w:lsdException w:name="Medium Grid 3 Accent 6" w:uiPriority="69"/>
+    <w:lsdException w:name="Dark List Accent 6" w:uiPriority="70"/>
+    <w:lsdException w:name="Colorful Shading Accent 6" w:uiPriority="71"/>
+    <w:lsdException w:name="Colorful List Accent 6" w:uiPriority="72"/>
+    <w:lsdException w:name="Colorful Grid Accent 6" w:uiPriority="73"/>
+    <w:lsdException w:name="Subtle Emphasis" w:uiPriority="19" w:qFormat="1"/>
+    <w:lsdException w:name="Intense Emphasis" w:uiPriority="21" w:qFormat="1"/>
+    <w:lsdException w:name="Subtle Reference" w:uiPriority="31" w:qFormat="1"/>
+    <w:lsdException w:name="Intense Reference" w:uiPriority="32" w:qFormat="1"/>
+    <w:lsdException w:name="Book Title" w:uiPriority="33" w:qFormat="1"/>
+    <w:lsdException w:name="Bibliography" w:semiHidden="1" w:uiPriority="37" w:unhideWhenUsed="1"/>
+    <w:lsdException w:name="TOC Heading" w:semiHidden="1" w:uiPriority="39" w:unhideWhenUsed="1" w:qFormat="1"/>
+    <w:lsdException w:name="Plain Table 1" w:uiPriority="41"/>
+    <w:lsdException w:name="Plain Table 2" w:uiPriority="42"/>
+    <w:lsdException w:name="Plain Table 3" w:uiPriority="43"/>
+    <w:lsdException w:name="Plain Table 4" w:uiPriority="44"/>
+    <w:lsdException w:name="Plain Table 5" w:uiPriority="45"/>
+    <w:lsdException w:name="Grid Table Light" w:uiPriority="40"/>
+    <w:lsdException w:name="Grid Table 1 Light" w:uiPriority="46"/>
+    <w:lsdException w:name="Grid Table 2" w:uiPriority="47"/>
+    <w:lsdException w:name="Grid Table 3" w:uiPriority="48"/>
+    <w:lsdException w:name="Grid Table 4" w:uiPriority="49"/>
+    <w:lsdException w:name="Grid Table 5 Dark" w:uiPriority="50"/>
+    <w:lsdException w:name="Grid Table 6 Colorful" w:uiPriority="51"/>
+    <w:lsdException w:name="Grid Table 7 Colorful" w:uiPriority="52"/>
+    <w:lsdException w:name="Grid Table 1 Light Accent 1" w:uiPriority="46"/>
+    <w:lsdException w:name="Grid Table 2 Accent 1" w:uiPriority="47"/>
+    <w:lsdException w:name="Grid Table 3 Accent 1" w:uiPriority="48"/>
+    <w:lsdException w:name="Grid Table 4 Accent 1" w:uiPriority="49"/>
+    <w:lsdException w:name="Grid Table 5 Dark Accent 1" w:uiPriority="50"/>
+    <w:lsdException w:name="Grid Table 6 Colorful Accent 1" w:uiPriority="51"/>
+    <w:lsdException w:name="Grid Table 7 Colorful Accent 1" w:uiPriority="52"/>
+    <w:lsdException w:name="Grid Table 1 Light Accent 2" w:uiPriority="46"/>
+    <w:lsdException w:name="Grid Table 2 Accent 2" w:uiPriority="47"/>
+    <w:lsdException w:name="Grid Table 3 Accent 2" w:uiPriority="48"/>
+    <w:lsdException w:name="Grid Table 4 Accent 2" w:uiPriority="49"/>
+    <w:lsdException w:name="Grid Table 5 Dark Accent 2" w:uiPriority="50"/>
+    <w:lsdException w:name="Grid Table 6 Colorful Accent 2" w:uiPriority="51"/>
+    <w:lsdException w:name="Grid Table 7 Colorful Accent 2" w:uiPriority="52"/>
+    <w:lsdException w:name="Grid Table 1 Light Accent 3" w:uiPriority="46"/>
+    <w:lsdException w:name="Grid Table 2 Accent 3" w:uiPriority="47"/>
+    <w:lsdException w:name="Grid Table 3 Accent 3" w:uiPriority="48"/>
+    <w:lsdException w:name="Grid Table 4 Accent 3" w:uiPriority="49"/>
+    <w:lsdException w:name="Grid Table 5 Dark Accent 3" w:uiPriority="50"/>
+    <w:lsdException w:name="Grid Table 6 Colorful Accent 3" w:uiPriority="51"/>
+    <w:lsdException w:name="Grid Table 7 Colorful Accent 3" w:uiPriority="52"/>
+    <w:lsdException w:name="Grid Table 1 Light Accent 4" w:uiPriority="46"/>
+    <w:lsdException w:name="Grid Table 2 Accent 4" w:uiPriority="47"/>
+    <w:lsdException w:name="Grid Table 3 Accent 4" w:uiPriority="48"/>
+    <w:lsdException w:name="Grid Table 4 Accent 4" w:uiPriority="49"/>
+    <w:lsdException w:name="Grid Table 5 Dark Accent 4" w:uiPriority="50"/>
+    <w:lsdException w:name="Grid Table 6 Colorful Accent 4" w:uiPriority="51"/>
+    <w:lsdException w:name="Grid Table 7 Colorful Accent 4" w:uiPriority="52"/>
+    <w:lsdException w:name="Grid Table 1 Light Accent 5" w:uiPriority="46"/>
+    <w:lsdException w:name="Grid Table 2 Accent 5" w:uiPriority="47"/>
+    <w:lsdException w:name="Grid Table 3 Accent 5" w:uiPriority="48"/>
+    <w:lsdException w:name="Grid Table 4 Accent 5" w:uiPriority="49"/>
+    <w:lsdException w:name="Grid Table 5 Dark Accent 5" w:uiPriority="50"/>
+    <w:lsdException w:name="Grid Table 6 Colorful Accent 5" w:uiPriority="51"/>
+    <w:lsdException w:name="Grid Table 7 Colorful Accent 5" w:uiPriority="52"/>
+    <w:lsdException w:name="Grid Table 1 Light Accent 6" w:uiPriority="46"/>
+    <w:lsdException w:name="Grid Table 2 Accent 6" w:uiPriority="47"/>
+    <w:lsdException w:name="Grid Table 3 Accent 6" w:uiPriority="48"/>
+    <w:lsdException w:name="Grid Table 4 Accent 6" w:uiPriority="49"/>
+    <w:lsdException w:name="Grid Table 5 Dark Accent 6" w:uiPriority="50"/>
+    <w:lsdException w:name="Grid Table 6 Colorful Accent 6" w:uiPriority="51"/>
+    <w:lsdException w:name="Grid Table 7 Colorful Accent 6" w:uiPriority="52"/>
+    <w:lsdException w:name="List Table 1 Light" w:uiPriority="46"/>
+    <w:lsdException w:name="List Table 2" w:uiPriority="47"/>
+    <w:lsdException w:name="List Table 3" w:uiPriority="48"/>
+    <w:lsdException w:name="List Table 4" w:uiPriority="49"/>
+    <w:lsdException w:name="List Table 5 Dark" w:uiPriority="50"/>
+    <w:lsdException w:name="List Table 6 Colorful" w:uiPriority="51"/>
+    <w:lsdException w:name="List Table 7 Colorful" w:uiPriority="52"/>
+    <w:lsdException w:name="List Table 1 Light Accent 1" w:uiPriority="46"/>
+    <w:lsdException w:name="List Table 2 Accent 1" w:uiPriority="47"/>
+    <w:lsdException w:name="List Table 3 Accent 1" w:uiPriority="48"/>
+    <w:lsdException w:name="List Table 4 Accent 1" w:uiPriority="49"/>
+    <w:lsdException w:name="List Table 5 Dark Accent 1" w:uiPriority="50"/>
+    <w:lsdException w:name="List Table 6 Colorful Accent 1" w:uiPriority="51"/>
+    <w:lsdException w:name="List Table 7 Colorful Accent 1" w:uiPriority="52"/>
+    <w:lsdException w:name="List Table 1 Light Accent 2" w:uiPriority="46"/>
+    <w:lsdException w:name="List Table 2 Accent 2" w:uiPriority="47"/>
+    <w:lsdException w:name="List Table 3 Accent 2" w:uiPriority="48"/>
+    <w:lsdException w:name="List Table 4 Accent 2" w:uiPriority="49"/>
+    <w:lsdException w:name="List Table 5 Dark Accent 2" w:uiPriority="50"/>
+    <w:lsdException w:name="List Table 6 Colorful Accent 2" w:uiPriority="51"/>
+    <w:lsdException w:name="List Table 7 Colorful Accent 2" w:uiPriority="52"/>
+    <w:lsdException w:name="List Table 1 Light Accent 3" w:uiPriority="46"/>
+    <w:lsdException w:name="List Table 2 Accent 3" w:uiPriority="47"/>
+    <w:lsdException w:name="List Table 3 Accent 3" w:uiPriority="48"/>
+    <w:lsdException w:name="List Table 4 Accent 3" w:uiPriority="49"/>
+    <w:lsdException w:name="List Table 5 Dark Accent 3" w:uiPriority="50"/>
+    <w:lsdException w:name="List Table 6 Colorful Accent 3" w:uiPriority="51"/>
+    <w:lsdException w:name="List Table 7 Colorful Accent 3" w:uiPriority="52"/>
+    <w:lsdException w:name="List Table 1 Light Accent 4" w:uiPriority="46"/>
+    <w:lsdException w:name="List Table 2 Accent 4" w:uiPriority="47"/>
+    <w:lsdException w:name="List Table 3 Accent 4" w:uiPriority="48"/>
+    <w:lsdException w:name="List Table 4 Accent 4" w:uiPriority="49"/>
+    <w:lsdException w:name="List Table 5 Dark Accent 4" w:uiPriority="50"/>
+    <w:lsdException w:name="List Table 6 Colorful Accent 4" w:uiPriority="51"/>
+    <w:lsdException w:name="List Table 7 Colorful Accent 4" w:uiPriority="52"/>
+    <w:lsdException w:name="List Table 1 Light Accent 5" w:uiPriority="46"/>
+    <w:lsdException w:name="List Table 2 Accent 5" w:uiPriority="47"/>
+    <w:lsdException w:name="List Table 3 Accent 5" w:uiPriority="48"/>
+    <w:lsdException w:name="List Table 4 Accent 5" w:uiPriority="49"/>
+    <w:lsdException w:name="List Table 5 Dark Accent 5" w:uiPriority="50"/>
+    <w:lsdException w:name="List Table 6 Colorful Accent 5" w:uiPriority="51"/>
+    <w:lsdException w:name="List Table 7 Colorful Accent 5" w:uiPriority="52"/>
+    <w:lsdException w:name="List Table 1 Light Accent 6" w:uiPriority="46"/>
+    <w:lsdException w:name="List Table 2 Accent 6" w:uiPriority="47"/>
+    <w:lsdException w:name="List Table 3 Accent 6" w:uiPriority="48"/>
+    <w:lsdException w:name="List Table 4 Accent 6" w:uiPriority="49"/>
+    <w:lsdException w:name="List Table 5 Dark Accent 6" w:uiPriority="50"/>
+    <w:lsdException w:name="List Table 6 Colorful Accent 6" w:uiPriority="51"/>
+    <w:lsdException w:name="List Table 7 Colorful Accent 6" w:uiPriority="52"/>
+  </w:latentStyles>
+  <w:style w:type="paragraph" w:default="1" w:styleId="a">
+    <w:name w:val="Normal"/>
+    <w:qFormat/>
+    <w:rsid w:val="00D001BC"/>
+    <w:pPr>
+      <w:spacing w:line="360" w:lineRule="auto"/>
+      <w:ind w:firstLine="709"/>
+      <w:jc w:val="both"/>
+    </w:pPr>
+    <w:rPr>
+      <w:rFonts w:ascii="Times New Roman" w:hAnsi="Times New Roman" w:cs="Times New Roman"/>
+      <w:color w:val="000000"/>
+      <w:sz w:val="24"/>
+      <w:lang w:eastAsia="bg-BG"/>
+    </w:rPr>
+  </w:style>
+  <w:style w:type="paragraph" w:styleId="1">
+    <w:name w:val="heading 1"/>
+    <w:basedOn w:val="a"/>
+    <w:next w:val="a"/>
+    <w:link w:val="10"/>
+    <w:uiPriority w:val="9"/>
+    <w:qFormat/>
+    <w:rsid w:val="00FF6092"/>
+    <w:pPr>
+      <w:keepNext/>
+      <w:keepLines/>
+      <w:numPr>
+        <w:numId w:val="8"/>
+      </w:numPr>
+      <w:spacing w:before="360" w:after="80"/>
+      <w:ind w:left="714" w:hanging="357"/>
+      <w:jc w:val="center"/>
+      <w:outlineLvl w:val="0"/>
+    </w:pPr>
+    <w:rPr>
+      <w:rFonts w:eastAsiaTheme="majorEastAsia" w:cstheme="majorBidi"/>
+      <w:b/>
+      <w:sz w:val="28"/>
+      <w:szCs w:val="32"/>
+    </w:rPr>
+  </w:style>
+  <w:style w:type="paragraph" w:styleId="2">
+    <w:name w:val="heading 2"/>
+    <w:basedOn w:val="a"/>
+    <w:next w:val="a"/>
+    <w:link w:val="20"/>
+    <w:uiPriority w:val="9"/>
+    <w:unhideWhenUsed/>
+    <w:qFormat/>
+    <w:rsid w:val="00680585"/>
+    <w:pPr>
+      <w:keepNext/>
+      <w:keepLines/>
+      <w:spacing w:before="160" w:after="80"/>
+      <w:ind w:left="709" w:firstLine="0"/>
+      <w:jc w:val="left"/>
+      <w:outlineLvl w:val="1"/>
+    </w:pPr>
+    <w:rPr>
+      <w:rFonts w:eastAsiaTheme="majorEastAsia" w:cstheme="majorBidi"/>
+      <w:b/>
+      <w:color w:val="auto"/>
+      <w:sz w:val="28"/>
+      <w:szCs w:val="26"/>
+    </w:rPr>
+  </w:style>
+  <w:style w:type="paragraph" w:styleId="3">
+    <w:name w:val="heading 3"/>
+    <w:basedOn w:val="2"/>
+    <w:next w:val="a"/>
+    <w:link w:val="30"/>
+    <w:uiPriority w:val="9"/>
+    <w:unhideWhenUsed/>
+    <w:qFormat/>
+    <w:rsid w:val="00680585"/>
+    <w:pPr>
+      <w:ind w:left="1134"/>
+      <w:outlineLvl w:val="2"/>
+    </w:pPr>
+    <w:rPr>
+      <w:sz w:val="26"/>
+      <w:szCs w:val="24"/>
+    </w:rPr>
+  </w:style>
+  <w:style w:type="character" w:default="1" w:styleId="a0">
+    <w:name w:val="Default Paragraph Font"/>
+    <w:uiPriority w:val="1"/>
+    <w:semiHidden/>
+    <w:unhideWhenUsed/>
+  </w:style>
+  <w:style w:type="table" w:default="1" w:styleId="a1">
+    <w:name w:val="Normal Table"/>
+    <w:uiPriority w:val="99"/>
+    <w:semiHidden/>
+    <w:unhideWhenUsed/>
+    <w:tblPr>
+      <w:tblInd w:w="0" w:type="dxa"/>
+      <w:tblCellMar>
+        <w:top w:w="0" w:type="dxa"/>
+        <w:left w:w="108" w:type="dxa"/>
+        <w:bottom w:w="0" w:type="dxa"/>
+        <w:right w:w="108" w:type="dxa"/>
+      </w:tblCellMar>
+    </w:tblPr>
+  </w:style>
+  <w:style w:type="numbering" w:default="1" w:styleId="a2">
+    <w:name w:val="No List"/>
+    <w:uiPriority w:val="99"/>
+    <w:semiHidden/>
+    <w:unhideWhenUsed/>
+  </w:style>
+  <w:style w:type="character" w:customStyle="1" w:styleId="10">
+    <w:name w:val="Заглавие 1 Знак"/>
+    <w:basedOn w:val="a0"/>
+    <w:link w:val="1"/>
+    <w:uiPriority w:val="9"/>
+    <w:rsid w:val="00FF6092"/>
+    <w:rPr>
+      <w:rFonts w:ascii="Times New Roman" w:eastAsiaTheme="majorEastAsia" w:hAnsi="Times New Roman" w:cstheme="majorBidi"/>
+      <w:b/>
+      <w:color w:val="000000"/>
+      <w:sz w:val="28"/>
+      <w:szCs w:val="32"/>
+      <w:lang w:eastAsia="bg-BG"/>
+    </w:rPr>
+  </w:style>
+  <w:style w:type="character" w:customStyle="1" w:styleId="20">
+    <w:name w:val="Заглавие 2 Знак"/>
+    <w:basedOn w:val="a0"/>
+    <w:link w:val="2"/>
+    <w:uiPriority w:val="9"/>
+    <w:rsid w:val="00680585"/>
+    <w:rPr>
+      <w:rFonts w:ascii="Times New Roman" w:eastAsiaTheme="majorEastAsia" w:hAnsi="Times New Roman" w:cstheme="majorBidi"/>
+      <w:b/>
+      <w:sz w:val="28"/>
+      <w:szCs w:val="26"/>
+      <w:lang w:eastAsia="bg-BG"/>
+    </w:rPr>
+  </w:style>
+  <w:style w:type="paragraph" w:styleId="a3">
+    <w:name w:val="TOC Heading"/>
+    <w:basedOn w:val="1"/>
+    <w:next w:val="a"/>
+    <w:uiPriority w:val="39"/>
+    <w:unhideWhenUsed/>
+    <w:qFormat/>
+    <w:rsid w:val="007830EB"/>
+    <w:pPr>
+      <w:spacing w:after="0" w:line="259" w:lineRule="auto"/>
+      <w:ind w:firstLine="0"/>
+      <w:jc w:val="left"/>
+      <w:outlineLvl w:val="9"/>
+    </w:pPr>
+    <w:rPr>
+      <w:rFonts w:asciiTheme="majorHAnsi" w:hAnsiTheme="majorHAnsi"/>
+      <w:b w:val="0"/>
+      <w:color w:val="2E74B5" w:themeColor="accent1" w:themeShade="BF"/>
+      <w:sz w:val="32"/>
+    </w:rPr>
+  </w:style>
+  <w:style w:type="paragraph" w:styleId="a4">
+    <w:name w:val="List Paragraph"/>
+    <w:basedOn w:val="a"/>
+    <w:qFormat/>
+    <w:rsid w:val="0090690F"/>
+    <w:pPr>
+      <w:ind w:left="720"/>
+      <w:contextualSpacing/>
+    </w:pPr>
+  </w:style>
+  <w:style w:type="paragraph" w:styleId="a5">
+    <w:name w:val="header"/>
+    <w:basedOn w:val="a"/>
+    <w:link w:val="a6"/>
+    <w:uiPriority w:val="99"/>
+    <w:unhideWhenUsed/>
+    <w:rsid w:val="0090690F"/>
+    <w:pPr>
+      <w:tabs>
+        <w:tab w:val="center" w:pos="4536"/>
+        <w:tab w:val="right" w:pos="9072"/>
+      </w:tabs>
+      <w:spacing w:after="0" w:line="240" w:lineRule="auto"/>
+    </w:pPr>
+  </w:style>
+  <w:style w:type="character" w:customStyle="1" w:styleId="a6">
+    <w:name w:val="Горен колонтитул Знак"/>
+    <w:basedOn w:val="a0"/>
+    <w:link w:val="a5"/>
+    <w:uiPriority w:val="99"/>
+    <w:rsid w:val="0090690F"/>
+    <w:rPr>
+      <w:rFonts w:ascii="Times New Roman" w:hAnsi="Times New Roman" w:cs="Times New Roman"/>
+      <w:color w:val="000000"/>
+      <w:sz w:val="24"/>
+      <w:lang w:eastAsia="bg-BG"/>
+    </w:rPr>
+  </w:style>
+  <w:style w:type="paragraph" w:styleId="a7">
+    <w:name w:val="footer"/>
+    <w:basedOn w:val="a"/>
+    <w:link w:val="a8"/>
+    <w:uiPriority w:val="99"/>
+    <w:unhideWhenUsed/>
+    <w:rsid w:val="0090690F"/>
+    <w:pPr>
+      <w:tabs>
+        <w:tab w:val="center" w:pos="4536"/>
+        <w:tab w:val="right" w:pos="9072"/>
+      </w:tabs>
+      <w:spacing w:after="0" w:line="240" w:lineRule="auto"/>
+    </w:pPr>
+  </w:style>
+  <w:style w:type="character" w:customStyle="1" w:styleId="a8">
+    <w:name w:val="Долен колонтитул Знак"/>
+    <w:basedOn w:val="a0"/>
+    <w:link w:val="a7"/>
+    <w:uiPriority w:val="99"/>
+    <w:rsid w:val="0090690F"/>
+    <w:rPr>
+      <w:rFonts w:ascii="Times New Roman" w:hAnsi="Times New Roman" w:cs="Times New Roman"/>
+      <w:color w:val="000000"/>
+      <w:sz w:val="24"/>
+      <w:lang w:eastAsia="bg-BG"/>
+    </w:rPr>
+  </w:style>
+  <w:style w:type="character" w:customStyle="1" w:styleId="30">
+    <w:name w:val="Заглавие 3 Знак"/>
+    <w:basedOn w:val="a0"/>
+    <w:link w:val="3"/>
+    <w:uiPriority w:val="9"/>
+    <w:rsid w:val="00680585"/>
+    <w:rPr>
+      <w:rFonts w:ascii="Times New Roman" w:eastAsiaTheme="majorEastAsia" w:hAnsi="Times New Roman" w:cstheme="majorBidi"/>
+      <w:b/>
+      <w:sz w:val="26"/>
+      <w:szCs w:val="24"/>
+      <w:lang w:eastAsia="bg-BG"/>
+    </w:rPr>
+  </w:style>
+  <w:style w:type="paragraph" w:styleId="a9">
+    <w:name w:val="Normal (Web)"/>
+    <w:basedOn w:val="a"/>
+    <w:uiPriority w:val="99"/>
+    <w:semiHidden/>
+    <w:unhideWhenUsed/>
+    <w:rsid w:val="003F3150"/>
+    <w:pPr>
+      <w:spacing w:before="100" w:beforeAutospacing="1" w:after="100" w:afterAutospacing="1" w:line="240" w:lineRule="auto"/>
+      <w:ind w:firstLine="0"/>
+      <w:jc w:val="left"/>
+    </w:pPr>
+    <w:rPr>
+      <w:color w:val="auto"/>
+      <w:szCs w:val="24"/>
+    </w:rPr>
+  </w:style>
+  <w:style w:type="paragraph" w:styleId="11">
+    <w:name w:val="toc 1"/>
+    <w:basedOn w:val="a"/>
+    <w:next w:val="a"/>
+    <w:autoRedefine/>
+    <w:uiPriority w:val="39"/>
+    <w:unhideWhenUsed/>
+    <w:rsid w:val="00123BF1"/>
+    <w:pPr>
+      <w:tabs>
+        <w:tab w:val="left" w:pos="660"/>
+        <w:tab w:val="right" w:leader="dot" w:pos="9062"/>
+      </w:tabs>
+      <w:spacing w:after="100"/>
+      <w:jc w:val="left"/>
+    </w:pPr>
+  </w:style>
+  <w:style w:type="paragraph" w:styleId="21">
+    <w:name w:val="toc 2"/>
+    <w:basedOn w:val="a"/>
+    <w:next w:val="a"/>
+    <w:autoRedefine/>
+    <w:uiPriority w:val="39"/>
+    <w:unhideWhenUsed/>
+    <w:rsid w:val="00123BF1"/>
+    <w:pPr>
+      <w:spacing w:after="100"/>
+      <w:ind w:left="240"/>
+    </w:pPr>
+  </w:style>
+  <w:style w:type="paragraph" w:styleId="31">
+    <w:name w:val="toc 3"/>
+    <w:basedOn w:val="a"/>
+    <w:next w:val="a"/>
+    <w:autoRedefine/>
+    <w:uiPriority w:val="39"/>
+    <w:unhideWhenUsed/>
+    <w:rsid w:val="00123BF1"/>
+    <w:pPr>
+      <w:spacing w:after="100"/>
+      <w:ind w:left="480"/>
+    </w:pPr>
+  </w:style>
+  <w:style w:type="character" w:styleId="aa">
+    <w:name w:val="Hyperlink"/>
+    <w:basedOn w:val="a0"/>
+    <w:uiPriority w:val="99"/>
+    <w:unhideWhenUsed/>
+    <w:rsid w:val="00123BF1"/>
+    <w:rPr>
+      <w:color w:val="0563C1" w:themeColor="hyperlink"/>
+      <w:u w:val="single"/>
+    </w:rPr>
+  </w:style>
+  <w:style w:type="character" w:styleId="ab">
+    <w:name w:val="Strong"/>
+    <w:basedOn w:val="a0"/>
+    <w:uiPriority w:val="22"/>
+    <w:qFormat/>
+    <w:rsid w:val="00906740"/>
+    <w:rPr>
+      <w:b/>
+      <w:bCs/>
+    </w:rPr>
+  </w:style>
+  <w:style w:type="character" w:styleId="ac">
+    <w:name w:val="Placeholder Text"/>
+    <w:basedOn w:val="a0"/>
+    <w:uiPriority w:val="99"/>
+    <w:semiHidden/>
+    <w:rsid w:val="005111B5"/>
+    <w:rPr>
+      <w:color w:val="808080"/>
+    </w:rPr>
+  </w:style>
+</w:styles>
+</file>
+
+<file path=word/glossary/document.xml><?xml version="1.0" encoding="utf-8"?>
+<w:glossaryDocument xmlns:wpc="http://schemas.microsoft.com/office/word/2010/wordprocessingCanvas" xmlns:cx="http://schemas.microsoft.com/office/drawing/2014/chartex" xmlns:mc="http://schemas.openxmlformats.org/markup-compatibility/2006" xmlns:o="urn:schemas-microsoft-com:office:office" xmlns:r="http://schemas.openxmlformats.org/officeDocument/2006/relationships" xmlns:m="http://schemas.openxmlformats.org/officeDocument/2006/math" xmlns:v="urn:schemas-microsoft-com:vml" xmlns:wp14="http://schemas.microsoft.com/office/word/2010/wordprocessingDrawing" xmlns:wp="http://schemas.openxmlformats.org/drawingml/2006/wordprocessingDrawing" xmlns:w10="urn:schemas-microsoft-com:office:word" xmlns:w="http://schemas.openxmlformats.org/wordprocessingml/2006/main" xmlns:w14="http://schemas.microsoft.com/office/word/2010/wordml" xmlns:w15="http://schemas.microsoft.com/office/word/2012/wordml" xmlns:w16se="http://schemas.microsoft.com/office/word/2015/wordml/symex" xmlns:wpg="http://schemas.microsoft.com/office/word/2010/wordprocessingGroup" xmlns:wpi="http://schemas.microsoft.com/office/word/2010/wordprocessingInk" xmlns:wne="http://schemas.microsoft.com/office/word/2006/wordml" xmlns:wps="http://schemas.microsoft.com/office/word/2010/wordprocessingShape" mc:Ignorable="w14 w15 w16se wp14"/>
+</file>
+
+<file path=word/glossary/fontTable.xml><?xml version="1.0" encoding="utf-8"?>
+<w:fonts xmlns:mc="http://schemas.openxmlformats.org/markup-compatibility/2006" xmlns:r="http://schemas.openxmlformats.org/officeDocument/2006/relationships" xmlns:w="http://schemas.openxmlformats.org/wordprocessingml/2006/main" xmlns:w14="http://schemas.microsoft.com/office/word/2010/wordml" xmlns:w15="http://schemas.microsoft.com/office/word/2012/wordml" xmlns:w16se="http://schemas.microsoft.com/office/word/2015/wordml/symex" mc:Ignorable="w14 w15 w16se">
+  <w:font w:name="Symbol">
+    <w:panose1 w:val="05050102010706020507"/>
+    <w:charset w:val="02"/>
+    <w:family w:val="roman"/>
+    <w:pitch w:val="variable"/>
+    <w:sig w:usb0="00000000" w:usb1="10000000" w:usb2="00000000" w:usb3="00000000" w:csb0="80000000" w:csb1="00000000"/>
+  </w:font>
+  <w:font w:name="Times New Roman">
+    <w:panose1 w:val="02020603050405020304"/>
+    <w:charset w:val="00"/>
+    <w:family w:val="roman"/>
+    <w:pitch w:val="variable"/>
+    <w:sig w:usb0="E0002AFF" w:usb1="C0007843" w:usb2="00000009" w:usb3="00000000" w:csb0="000001FF" w:csb1="00000000"/>
+  </w:font>
+  <w:font w:name="Courier New">
+    <w:panose1 w:val="02070309020205020404"/>
+    <w:charset w:val="00"/>
+    <w:family w:val="modern"/>
+    <w:pitch w:val="fixed"/>
+    <w:sig w:usb0="E0002EFF" w:usb1="C0007843" w:usb2="00000009" w:usb3="00000000" w:csb0="000001FF" w:csb1="00000000"/>
+  </w:font>
+  <w:font w:name="Wingdings">
+    <w:panose1 w:val="05000000000000000000"/>
+    <w:charset w:val="02"/>
+    <w:family w:val="auto"/>
+    <w:pitch w:val="variable"/>
+    <w:sig w:usb0="00000000" w:usb1="10000000" w:usb2="00000000" w:usb3="00000000" w:csb0="80000000" w:csb1="00000000"/>
+  </w:font>
+  <w:font w:name="Calibri">
+    <w:panose1 w:val="020F0502020204030204"/>
+    <w:charset w:val="00"/>
+    <w:family w:val="swiss"/>
+    <w:pitch w:val="variable"/>
+    <w:sig w:usb0="E00002FF" w:usb1="4000ACFF" w:usb2="00000001" w:usb3="00000000" w:csb0="0000019F" w:csb1="00000000"/>
+  </w:font>
+  <w:font w:name="Calibri Light">
+    <w:panose1 w:val="020F0302020204030204"/>
+    <w:charset w:val="00"/>
+    <w:family w:val="swiss"/>
+    <w:pitch w:val="variable"/>
+    <w:sig w:usb0="A00002EF" w:usb1="4000207B" w:usb2="00000000" w:usb3="00000000" w:csb0="0000009F" w:csb1="00000000"/>
+  </w:font>
+  <w:font w:name="Cambria">
+    <w:panose1 w:val="02040503050406030204"/>
+    <w:charset w:val="00"/>
+    <w:family w:val="roman"/>
+    <w:pitch w:val="variable"/>
+    <w:sig w:usb0="A00002EF" w:usb1="4000004B" w:usb2="00000000" w:usb3="00000000" w:csb0="0000009F" w:csb1="00000000"/>
+  </w:font>
+  <w:font w:name="Bahnschrift">
+    <w:panose1 w:val="020B0502040204020203"/>
+    <w:charset w:val="CC"/>
+    <w:family w:val="swiss"/>
+    <w:pitch w:val="variable"/>
+    <w:sig w:usb0="A00002C7" w:usb1="00000002" w:usb2="00000000" w:usb3="00000000" w:csb0="0000019F" w:csb1="00000000"/>
+  </w:font>
+  <w:font w:name="Cambria Math">
+    <w:panose1 w:val="02040503050406030204"/>
+    <w:charset w:val="CC"/>
+    <w:family w:val="roman"/>
+    <w:pitch w:val="variable"/>
+    <w:sig w:usb0="E00006FF" w:usb1="420024FF" w:usb2="02000000" w:usb3="00000000" w:csb0="0000019F" w:csb1="00000000"/>
+  </w:font>
+</w:fonts>
+</file>
+
+<file path=word/glossary/settings.xml><?xml version="1.0" encoding="utf-8"?>
+<w:settings xmlns:mc="http://schemas.openxmlformats.org/markup-compatibility/2006" xmlns:o="urn:schemas-microsoft-com:office:office" xmlns:r="http://schemas.openxmlformats.org/officeDocument/2006/relationships" xmlns:m="http://schemas.openxmlformats.org/officeDocument/2006/math" xmlns:v="urn:schemas-microsoft-com:vml" xmlns:w10="urn:schemas-microsoft-com:office:word" xmlns:w="http://schemas.openxmlformats.org/wordprocessingml/2006/main" xmlns:w14="http://schemas.microsoft.com/office/word/2010/wordml" xmlns:w15="http://schemas.microsoft.com/office/word/2012/wordml" xmlns:w16se="http://schemas.microsoft.com/office/word/2015/wordml/symex" xmlns:sl="http://schemas.openxmlformats.org/schemaLibrary/2006/main" mc:Ignorable="w14 w15 w16se">
+  <w:view w:val="normal"/>
+  <w:defaultTabStop w:val="708"/>
+  <w:hyphenationZone w:val="425"/>
+  <w:characterSpacingControl w:val="doNotCompress"/>
+  <w:compat>
+    <w:useFELayout/>
+    <w:compatSetting w:name="compatibilityMode" w:uri="http://schemas.microsoft.com/office/word" w:val="15"/>
+    <w:compatSetting w:name="overrideTableStyleFontSizeAndJustification" w:uri="http://schemas.microsoft.com/office/word" w:val="1"/>
+    <w:compatSetting w:name="enableOpenTypeFeatures" w:uri="http://schemas.microsoft.com/office/word" w:val="1"/>
+    <w:compatSetting w:name="doNotFlipMirrorIndents" w:uri="http://schemas.microsoft.com/office/word" w:val="1"/>
+    <w:compatSetting w:name="differentiateMultirowTableHeaders" w:uri="http://schemas.microsoft.com/office/word" w:val="1"/>
+  </w:compat>
+  <w:rsids>
+    <w:rsidRoot w:val="00EA5473"/>
+    <w:rsid w:val="00444EA8"/>
+    <w:rsid w:val="00EA5473"/>
+  </w:rsids>
+  <m:mathPr>
+    <m:mathFont m:val="Cambria Math"/>
+    <m:brkBin m:val="before"/>
+    <m:brkBinSub m:val="--"/>
+    <m:smallFrac m:val="0"/>
+    <m:dispDef/>
+    <m:lMargin m:val="0"/>
+    <m:rMargin m:val="0"/>
+    <m:defJc m:val="centerGroup"/>
+    <m:wrapIndent m:val="1440"/>
+    <m:intLim m:val="subSup"/>
+    <m:naryLim m:val="undOvr"/>
+  </m:mathPr>
+  <w:themeFontLang w:val="bg-BG"/>
+  <w:clrSchemeMapping w:bg1="light1" w:t1="dark1" w:bg2="light2" w:t2="dark2" w:accent1="accent1" w:accent2="accent2" w:accent3="accent3" w:accent4="accent4" w:accent5="accent5" w:accent6="accent6" w:hyperlink="hyperlink" w:followedHyperlink="followedHyperlink"/>
+  <w:decimalSymbol w:val=","/>
+  <w:listSeparator w:val=";"/>
+  <w15:chartTrackingRefBased/>
+</w:settings>
+</file>
+
+<file path=word/glossary/styles.xml><?xml version="1.0" encoding="utf-8"?>
+<w:styles xmlns:mc="http://schemas.openxmlformats.org/markup-compatibility/2006" xmlns:r="http://schemas.openxmlformats.org/officeDocument/2006/relationships" xmlns:w="http://schemas.openxmlformats.org/wordprocessingml/2006/main" xmlns:w14="http://schemas.microsoft.com/office/word/2010/wordml" xmlns:w15="http://schemas.microsoft.com/office/word/2012/wordml" xmlns:w16se="http://schemas.microsoft.com/office/word/2015/wordml/symex" mc:Ignorable="w14 w15 w16se">
+  <w:docDefaults>
+    <w:rPrDefault>
+      <w:rPr>
+        <w:rFonts w:asciiTheme="minorHAnsi" w:eastAsiaTheme="minorEastAsia" w:hAnsiTheme="minorHAnsi" w:cstheme="minorBidi"/>
+        <w:sz w:val="22"/>
+        <w:szCs w:val="22"/>
+        <w:lang w:val="bg-BG" w:eastAsia="bg-BG" w:bidi="ar-SA"/>
       </w:rPr>
     </w:rPrDefault>
     <w:pPrDefault>
@@ -7463,87 +10955,6 @@
   <w:style w:type="paragraph" w:default="1" w:styleId="a">
     <w:name w:val="Normal"/>
     <w:qFormat/>
-    <w:rsid w:val="00D001BC"/>
-    <w:pPr>
-      <w:spacing w:line="360" w:lineRule="auto"/>
-      <w:ind w:firstLine="709"/>
-      <w:jc w:val="both"/>
-    </w:pPr>
-    <w:rPr>
-      <w:rFonts w:ascii="Times New Roman" w:hAnsi="Times New Roman" w:cs="Times New Roman"/>
-      <w:color w:val="000000"/>
-      <w:sz w:val="24"/>
-      <w:lang w:eastAsia="bg-BG"/>
-    </w:rPr>
-  </w:style>
-  <w:style w:type="paragraph" w:styleId="1">
-    <w:name w:val="heading 1"/>
-    <w:basedOn w:val="a"/>
-    <w:next w:val="a"/>
-    <w:link w:val="10"/>
-    <w:uiPriority w:val="9"/>
-    <w:qFormat/>
-    <w:rsid w:val="00FF6092"/>
-    <w:pPr>
-      <w:keepNext/>
-      <w:keepLines/>
-      <w:numPr>
-        <w:numId w:val="8"/>
-      </w:numPr>
-      <w:spacing w:before="360" w:after="80"/>
-      <w:ind w:left="714" w:hanging="357"/>
-      <w:jc w:val="center"/>
-      <w:outlineLvl w:val="0"/>
-    </w:pPr>
-    <w:rPr>
-      <w:rFonts w:eastAsiaTheme="majorEastAsia" w:cstheme="majorBidi"/>
-      <w:b/>
-      <w:sz w:val="28"/>
-      <w:szCs w:val="32"/>
-    </w:rPr>
-  </w:style>
-  <w:style w:type="paragraph" w:styleId="2">
-    <w:name w:val="heading 2"/>
-    <w:basedOn w:val="a"/>
-    <w:next w:val="a"/>
-    <w:link w:val="20"/>
-    <w:uiPriority w:val="9"/>
-    <w:unhideWhenUsed/>
-    <w:qFormat/>
-    <w:rsid w:val="00680585"/>
-    <w:pPr>
-      <w:keepNext/>
-      <w:keepLines/>
-      <w:spacing w:before="160" w:after="80"/>
-      <w:ind w:left="709" w:firstLine="0"/>
-      <w:jc w:val="left"/>
-      <w:outlineLvl w:val="1"/>
-    </w:pPr>
-    <w:rPr>
-      <w:rFonts w:eastAsiaTheme="majorEastAsia" w:cstheme="majorBidi"/>
-      <w:b/>
-      <w:color w:val="auto"/>
-      <w:sz w:val="28"/>
-      <w:szCs w:val="26"/>
-    </w:rPr>
-  </w:style>
-  <w:style w:type="paragraph" w:styleId="3">
-    <w:name w:val="heading 3"/>
-    <w:basedOn w:val="2"/>
-    <w:next w:val="a"/>
-    <w:link w:val="30"/>
-    <w:uiPriority w:val="9"/>
-    <w:unhideWhenUsed/>
-    <w:qFormat/>
-    <w:rsid w:val="00680585"/>
-    <w:pPr>
-      <w:ind w:left="1134"/>
-      <w:outlineLvl w:val="2"/>
-    </w:pPr>
-    <w:rPr>
-      <w:sz w:val="26"/>
-      <w:szCs w:val="24"/>
-    </w:rPr>
   </w:style>
   <w:style w:type="character" w:default="1" w:styleId="a0">
     <w:name w:val="Default Paragraph Font"/>
@@ -7572,220 +10983,24 @@
     <w:semiHidden/>
     <w:unhideWhenUsed/>
   </w:style>
-  <w:style w:type="character" w:customStyle="1" w:styleId="10">
-    <w:name w:val="Заглавие 1 Знак"/>
+  <w:style w:type="character" w:styleId="a3">
+    <w:name w:val="Placeholder Text"/>
     <w:basedOn w:val="a0"/>
-    <w:link w:val="1"/>
-    <w:uiPriority w:val="9"/>
-    <w:rsid w:val="00FF6092"/>
-    <w:rPr>
-      <w:rFonts w:ascii="Times New Roman" w:eastAsiaTheme="majorEastAsia" w:hAnsi="Times New Roman" w:cstheme="majorBidi"/>
-      <w:b/>
-      <w:color w:val="000000"/>
-      <w:sz w:val="28"/>
-      <w:szCs w:val="32"/>
-      <w:lang w:eastAsia="bg-BG"/>
-    </w:rPr>
-  </w:style>
-  <w:style w:type="character" w:customStyle="1" w:styleId="20">
-    <w:name w:val="Заглавие 2 Знак"/>
-    <w:basedOn w:val="a0"/>
-    <w:link w:val="2"/>
-    <w:uiPriority w:val="9"/>
-    <w:rsid w:val="00680585"/>
-    <w:rPr>
-      <w:rFonts w:ascii="Times New Roman" w:eastAsiaTheme="majorEastAsia" w:hAnsi="Times New Roman" w:cstheme="majorBidi"/>
-      <w:b/>
-      <w:sz w:val="28"/>
-      <w:szCs w:val="26"/>
-      <w:lang w:eastAsia="bg-BG"/>
-    </w:rPr>
-  </w:style>
-  <w:style w:type="paragraph" w:styleId="a3">
-    <w:name w:val="TOC Heading"/>
-    <w:basedOn w:val="1"/>
-    <w:next w:val="a"/>
-    <w:uiPriority w:val="39"/>
-    <w:unhideWhenUsed/>
-    <w:qFormat/>
-    <w:rsid w:val="007830EB"/>
-    <w:pPr>
-      <w:spacing w:after="0" w:line="259" w:lineRule="auto"/>
-      <w:ind w:firstLine="0"/>
-      <w:jc w:val="left"/>
-      <w:outlineLvl w:val="9"/>
-    </w:pPr>
-    <w:rPr>
-      <w:rFonts w:asciiTheme="majorHAnsi" w:hAnsiTheme="majorHAnsi"/>
-      <w:b w:val="0"/>
-      <w:color w:val="2E74B5" w:themeColor="accent1" w:themeShade="BF"/>
-      <w:sz w:val="32"/>
-    </w:rPr>
-  </w:style>
-  <w:style w:type="paragraph" w:styleId="a4">
-    <w:name w:val="List Paragraph"/>
-    <w:basedOn w:val="a"/>
-    <w:uiPriority w:val="34"/>
-    <w:qFormat/>
-    <w:rsid w:val="0090690F"/>
-    <w:pPr>
-      <w:ind w:left="720"/>
-      <w:contextualSpacing/>
-    </w:pPr>
-  </w:style>
-  <w:style w:type="paragraph" w:styleId="a5">
-    <w:name w:val="header"/>
-    <w:basedOn w:val="a"/>
-    <w:link w:val="a6"/>
-    <w:uiPriority w:val="99"/>
-    <w:unhideWhenUsed/>
-    <w:rsid w:val="0090690F"/>
-    <w:pPr>
-      <w:tabs>
-        <w:tab w:val="center" w:pos="4536"/>
-        <w:tab w:val="right" w:pos="9072"/>
-      </w:tabs>
-      <w:spacing w:after="0" w:line="240" w:lineRule="auto"/>
-    </w:pPr>
-  </w:style>
-  <w:style w:type="character" w:customStyle="1" w:styleId="a6">
-    <w:name w:val="Горен колонтитул Знак"/>
-    <w:basedOn w:val="a0"/>
-    <w:link w:val="a5"/>
-    <w:uiPriority w:val="99"/>
-    <w:rsid w:val="0090690F"/>
-    <w:rPr>
-      <w:rFonts w:ascii="Times New Roman" w:hAnsi="Times New Roman" w:cs="Times New Roman"/>
-      <w:color w:val="000000"/>
-      <w:sz w:val="24"/>
-      <w:lang w:eastAsia="bg-BG"/>
-    </w:rPr>
-  </w:style>
-  <w:style w:type="paragraph" w:styleId="a7">
-    <w:name w:val="footer"/>
-    <w:basedOn w:val="a"/>
-    <w:link w:val="a8"/>
-    <w:uiPriority w:val="99"/>
-    <w:unhideWhenUsed/>
-    <w:rsid w:val="0090690F"/>
-    <w:pPr>
-      <w:tabs>
-        <w:tab w:val="center" w:pos="4536"/>
-        <w:tab w:val="right" w:pos="9072"/>
-      </w:tabs>
-      <w:spacing w:after="0" w:line="240" w:lineRule="auto"/>
-    </w:pPr>
-  </w:style>
-  <w:style w:type="character" w:customStyle="1" w:styleId="a8">
-    <w:name w:val="Долен колонтитул Знак"/>
-    <w:basedOn w:val="a0"/>
-    <w:link w:val="a7"/>
-    <w:uiPriority w:val="99"/>
-    <w:rsid w:val="0090690F"/>
-    <w:rPr>
-      <w:rFonts w:ascii="Times New Roman" w:hAnsi="Times New Roman" w:cs="Times New Roman"/>
-      <w:color w:val="000000"/>
-      <w:sz w:val="24"/>
-      <w:lang w:eastAsia="bg-BG"/>
-    </w:rPr>
-  </w:style>
-  <w:style w:type="character" w:customStyle="1" w:styleId="30">
-    <w:name w:val="Заглавие 3 Знак"/>
-    <w:basedOn w:val="a0"/>
-    <w:link w:val="3"/>
-    <w:uiPriority w:val="9"/>
-    <w:rsid w:val="00680585"/>
-    <w:rPr>
-      <w:rFonts w:ascii="Times New Roman" w:eastAsiaTheme="majorEastAsia" w:hAnsi="Times New Roman" w:cstheme="majorBidi"/>
-      <w:b/>
-      <w:sz w:val="26"/>
-      <w:szCs w:val="24"/>
-      <w:lang w:eastAsia="bg-BG"/>
-    </w:rPr>
-  </w:style>
-  <w:style w:type="paragraph" w:styleId="a9">
-    <w:name w:val="Normal (Web)"/>
-    <w:basedOn w:val="a"/>
     <w:uiPriority w:val="99"/>
     <w:semiHidden/>
-    <w:unhideWhenUsed/>
-    <w:rsid w:val="003F3150"/>
-    <w:pPr>
-      <w:spacing w:before="100" w:beforeAutospacing="1" w:after="100" w:afterAutospacing="1" w:line="240" w:lineRule="auto"/>
-      <w:ind w:firstLine="0"/>
-      <w:jc w:val="left"/>
-    </w:pPr>
+    <w:rsid w:val="00EA5473"/>
     <w:rPr>
-      <w:color w:val="auto"/>
-      <w:szCs w:val="24"/>
-    </w:rPr>
-  </w:style>
-  <w:style w:type="paragraph" w:styleId="11">
-    <w:name w:val="toc 1"/>
-    <w:basedOn w:val="a"/>
-    <w:next w:val="a"/>
-    <w:autoRedefine/>
-    <w:uiPriority w:val="39"/>
-    <w:unhideWhenUsed/>
-    <w:rsid w:val="00123BF1"/>
-    <w:pPr>
-      <w:tabs>
-        <w:tab w:val="left" w:pos="660"/>
-        <w:tab w:val="right" w:leader="dot" w:pos="9062"/>
-      </w:tabs>
-      <w:spacing w:after="100"/>
-      <w:jc w:val="left"/>
-    </w:pPr>
-  </w:style>
-  <w:style w:type="paragraph" w:styleId="21">
-    <w:name w:val="toc 2"/>
-    <w:basedOn w:val="a"/>
-    <w:next w:val="a"/>
-    <w:autoRedefine/>
-    <w:uiPriority w:val="39"/>
-    <w:unhideWhenUsed/>
-    <w:rsid w:val="00123BF1"/>
-    <w:pPr>
-      <w:spacing w:after="100"/>
-      <w:ind w:left="240"/>
-    </w:pPr>
-  </w:style>
-  <w:style w:type="paragraph" w:styleId="31">
-    <w:name w:val="toc 3"/>
-    <w:basedOn w:val="a"/>
-    <w:next w:val="a"/>
-    <w:autoRedefine/>
-    <w:uiPriority w:val="39"/>
-    <w:unhideWhenUsed/>
-    <w:rsid w:val="00123BF1"/>
-    <w:pPr>
-      <w:spacing w:after="100"/>
-      <w:ind w:left="480"/>
-    </w:pPr>
-  </w:style>
-  <w:style w:type="character" w:styleId="aa">
-    <w:name w:val="Hyperlink"/>
-    <w:basedOn w:val="a0"/>
-    <w:uiPriority w:val="99"/>
-    <w:unhideWhenUsed/>
-    <w:rsid w:val="00123BF1"/>
-    <w:rPr>
-      <w:color w:val="0563C1" w:themeColor="hyperlink"/>
-      <w:u w:val="single"/>
-    </w:rPr>
-  </w:style>
-  <w:style w:type="character" w:styleId="ab">
-    <w:name w:val="Strong"/>
-    <w:basedOn w:val="a0"/>
-    <w:uiPriority w:val="22"/>
-    <w:qFormat/>
-    <w:rsid w:val="00906740"/>
-    <w:rPr>
-      <w:b/>
-      <w:bCs/>
+      <w:color w:val="808080"/>
     </w:rPr>
   </w:style>
 </w:styles>
+</file>
+
+<file path=word/glossary/webSettings.xml><?xml version="1.0" encoding="utf-8"?>
+<w:webSettings xmlns:mc="http://schemas.openxmlformats.org/markup-compatibility/2006" xmlns:r="http://schemas.openxmlformats.org/officeDocument/2006/relationships" xmlns:w="http://schemas.openxmlformats.org/wordprocessingml/2006/main" xmlns:w14="http://schemas.microsoft.com/office/word/2010/wordml" xmlns:w15="http://schemas.microsoft.com/office/word/2012/wordml" xmlns:w16se="http://schemas.microsoft.com/office/word/2015/wordml/symex" mc:Ignorable="w14 w15 w16se">
+  <w:optimizeForBrowser/>
+  <w:allowPNG/>
+</w:webSettings>
 </file>
 
 <file path=word/theme/theme1.xml><?xml version="1.0" encoding="utf-8"?>
@@ -8054,7 +11269,7 @@
 </file>
 
 <file path=customXml/itemProps1.xml><?xml version="1.0" encoding="utf-8"?>
-<ds:datastoreItem xmlns:ds="http://schemas.openxmlformats.org/officeDocument/2006/customXml" ds:itemID="{4FDAB87A-F3E4-416E-9876-29AEFBC62DF7}">
+<ds:datastoreItem xmlns:ds="http://schemas.openxmlformats.org/officeDocument/2006/customXml" ds:itemID="{D2B1E72F-EF9B-4798-880B-A87E2D3F2492}">
   <ds:schemaRefs>
     <ds:schemaRef ds:uri="http://schemas.openxmlformats.org/officeDocument/2006/bibliography"/>
   </ds:schemaRefs>

</xml_diff>

<commit_message>
Updated documentation to head 4 - Android app
</commit_message>
<xml_diff>
--- a/Дипломна_работа_Мартин_Дамянов.docx
+++ b/Дипломна_работа_Мартин_Дамянов.docx
@@ -1673,8 +1673,7 @@
     </w:p>
     <w:p>
       <w:pPr>
-        <w:pStyle w:val="a9"/>
-        <w:jc w:val="center"/>
+        <w:pStyle w:val="ad"/>
       </w:pPr>
       <w:r>
         <w:rPr>
@@ -1732,45 +1731,33 @@
     </w:p>
     <w:p>
       <w:pPr>
-        <w:pStyle w:val="a9"/>
-        <w:ind w:left="1080"/>
-        <w:jc w:val="center"/>
-        <w:rPr>
-          <w:i/>
-        </w:rPr>
+        <w:pStyle w:val="ad"/>
       </w:pPr>
       <w:r>
         <w:rPr>
           <w:b/>
-          <w:i/>
         </w:rPr>
         <w:t>Фиг.</w:t>
       </w:r>
       <w:r>
         <w:rPr>
           <w:b/>
-          <w:i/>
         </w:rPr>
         <w:t xml:space="preserve"> </w:t>
       </w:r>
       <w:r>
         <w:rPr>
           <w:b/>
-          <w:i/>
         </w:rPr>
         <w:t>1</w:t>
       </w:r>
       <w:r>
         <w:rPr>
           <w:b/>
-          <w:i/>
         </w:rPr>
         <w:t>.</w:t>
       </w:r>
       <w:r>
-        <w:rPr>
-          <w:i/>
-        </w:rPr>
         <w:t xml:space="preserve"> – Блокова схема на системата</w:t>
       </w:r>
     </w:p>
@@ -2246,8 +2233,7 @@
     </w:p>
     <w:p>
       <w:pPr>
-        <w:spacing w:before="240"/>
-        <w:jc w:val="left"/>
+        <w:pStyle w:val="ad"/>
       </w:pPr>
       <w:r>
         <w:drawing>
@@ -2289,37 +2275,24 @@
     </w:p>
     <w:p>
       <w:pPr>
-        <w:pStyle w:val="a9"/>
-        <w:ind w:left="1080"/>
-        <w:jc w:val="center"/>
-        <w:rPr>
-          <w:i/>
-        </w:rPr>
+        <w:pStyle w:val="ad"/>
       </w:pPr>
       <w:r>
         <w:rPr>
           <w:b/>
-          <w:i/>
         </w:rPr>
         <w:t>Фиг.</w:t>
       </w:r>
       <w:r>
         <w:rPr>
           <w:b/>
-          <w:i/>
         </w:rPr>
         <w:t xml:space="preserve"> 2.</w:t>
       </w:r>
       <w:r>
-        <w:rPr>
-          <w:i/>
-        </w:rPr>
         <w:t xml:space="preserve"> – </w:t>
       </w:r>
       <w:r>
-        <w:rPr>
-          <w:i/>
-        </w:rPr>
         <w:t>Електрическата схема на свързването</w:t>
       </w:r>
     </w:p>
@@ -2555,6 +2528,9 @@
       </w:r>
     </w:p>
     <w:p>
+      <w:pPr>
+        <w:pStyle w:val="ad"/>
+      </w:pPr>
       <w:r>
         <w:rPr>
           <w:noProof/>
@@ -2611,60 +2587,39 @@
     </w:p>
     <w:p>
       <w:pPr>
-        <w:jc w:val="center"/>
-        <w:rPr>
-          <w:i/>
-        </w:rPr>
+        <w:pStyle w:val="ad"/>
       </w:pPr>
       <w:r>
         <w:rPr>
           <w:b/>
-          <w:i/>
         </w:rPr>
         <w:t xml:space="preserve">Фиг. </w:t>
       </w:r>
       <w:r>
         <w:rPr>
           <w:b/>
-          <w:i/>
         </w:rPr>
         <w:t>3</w:t>
       </w:r>
       <w:r>
         <w:rPr>
           <w:b/>
-          <w:i/>
         </w:rPr>
         <w:t>.</w:t>
       </w:r>
       <w:r>
-        <w:rPr>
-          <w:i/>
-        </w:rPr>
         <w:t xml:space="preserve"> Sequence Diagram –</w:t>
       </w:r>
       <w:r>
-        <w:rPr>
-          <w:i/>
-        </w:rPr>
         <w:t xml:space="preserve"> последователност на </w:t>
       </w:r>
       <w:r>
-        <w:rPr>
-          <w:i/>
-        </w:rPr>
         <w:t>действия</w:t>
       </w:r>
       <w:r>
-        <w:rPr>
-          <w:i/>
-        </w:rPr>
         <w:t xml:space="preserve">та </w:t>
       </w:r>
       <w:r>
-        <w:rPr>
-          <w:i/>
-        </w:rPr>
         <w:t>при чекиране</w:t>
       </w:r>
     </w:p>
@@ -3097,7 +3052,7 @@
     </w:p>
     <w:p>
       <w:pPr>
-        <w:jc w:val="center"/>
+        <w:pStyle w:val="ad"/>
       </w:pPr>
       <w:r>
         <w:drawing>
@@ -3139,39 +3094,30 @@
     </w:p>
     <w:p>
       <w:pPr>
-        <w:jc w:val="center"/>
+        <w:pStyle w:val="ad"/>
       </w:pPr>
       <w:r>
         <w:rPr>
           <w:b/>
-          <w:i/>
         </w:rPr>
         <w:t xml:space="preserve">Фиг. </w:t>
       </w:r>
       <w:r>
         <w:rPr>
           <w:b/>
-          <w:i/>
         </w:rPr>
         <w:t>4</w:t>
       </w:r>
       <w:r>
         <w:rPr>
           <w:b/>
-          <w:i/>
         </w:rPr>
         <w:t>.</w:t>
       </w:r>
       <w:r>
-        <w:rPr>
-          <w:i/>
-        </w:rPr>
         <w:t xml:space="preserve"> </w:t>
       </w:r>
       <w:r>
-        <w:rPr>
-          <w:i/>
-        </w:rPr>
         <w:t>ER-диаграма на базата данни</w:t>
       </w:r>
     </w:p>
@@ -4627,6 +4573,9 @@
       </w:r>
     </w:p>
     <w:p>
+      <w:pPr>
+        <w:spacing w:after="0"/>
+      </w:pPr>
       <w:r>
         <w:t xml:space="preserve">Параметрите </w:t>
       </w:r>
@@ -4686,11 +4635,15 @@
       </w:r>
     </w:p>
     <w:p>
+      <w:pPr>
+        <w:pStyle w:val="ad"/>
+        <w:spacing w:before="0" w:after="0"/>
+      </w:pPr>
       <w:r>
         <w:drawing>
           <wp:inline distT="0" distB="0" distL="0" distR="0" wp14:anchorId="5DE87688" wp14:editId="63A06E9F">
-            <wp:extent cx="4572000" cy="2700766"/>
-            <wp:effectExtent l="0" t="0" r="0" b="4445"/>
+            <wp:extent cx="3998858" cy="2362200"/>
+            <wp:effectExtent l="0" t="0" r="1905" b="0"/>
             <wp:docPr id="5" name="Картина 5"/>
             <wp:cNvGraphicFramePr>
               <a:graphicFrameLocks xmlns:a="http://schemas.openxmlformats.org/drawingml/2006/main" noChangeAspect="1"/>
@@ -4711,7 +4664,7 @@
                   <pic:spPr>
                     <a:xfrm>
                       <a:off x="0" y="0"/>
-                      <a:ext cx="4602278" cy="2718652"/>
+                      <a:ext cx="4093282" cy="2417978"/>
                     </a:xfrm>
                     <a:prstGeom prst="rect">
                       <a:avLst/>
@@ -4723,28 +4676,18 @@
           </wp:inline>
         </w:drawing>
       </w:r>
-      <w:r>
-        <w:t xml:space="preserve"> </w:t>
-      </w:r>
-    </w:p>
-    <w:p>
-      <w:pPr>
-        <w:jc w:val="center"/>
-        <w:rPr>
-          <w:i/>
-        </w:rPr>
+    </w:p>
+    <w:p>
+      <w:pPr>
+        <w:pStyle w:val="ad"/>
       </w:pPr>
       <w:r>
         <w:rPr>
           <w:b/>
-          <w:i/>
         </w:rPr>
         <w:t>Фиг. 5.</w:t>
       </w:r>
       <w:r>
-        <w:rPr>
-          <w:i/>
-        </w:rPr>
         <w:t xml:space="preserve"> Конфигурация на пиновете и SELECT_AID_APDU </w:t>
       </w:r>
     </w:p>
@@ -4774,33 +4717,31 @@
         <w:t xml:space="preserve"> успешно, </w:t>
       </w:r>
       <w:r>
-        <w:t xml:space="preserve">докато червен светодиод и нискотонов сигнал показват </w:t>
-      </w:r>
+        <w:t xml:space="preserve">докато червен светодиод и нискотонов сигнал показват че има някаква </w:t>
+      </w:r>
+      <w:r>
+        <w:t>грешк</w:t>
+      </w:r>
+      <w:r>
+        <w:t>а. Зумерът се управлява чрез ШИМ</w:t>
+      </w:r>
+      <w:r>
+        <w:t xml:space="preserve"> (LEDC периферия на ESP32) за</w:t>
+      </w:r>
+      <w:r>
+        <w:t xml:space="preserve"> генериране на различни честоти. Кодът е показан на фиг. 6:</w:t>
+      </w:r>
+    </w:p>
+    <w:p>
+      <w:pPr>
+        <w:pStyle w:val="ad"/>
+        <w:spacing w:after="0"/>
+      </w:pPr>
       <w:r>
         <w:lastRenderedPageBreak/>
-        <w:t xml:space="preserve">че има някаква </w:t>
-      </w:r>
-      <w:r>
-        <w:t>грешк</w:t>
-      </w:r>
-      <w:r>
-        <w:t>а. Зумерът се управлява чрез ШИМ</w:t>
-      </w:r>
-      <w:r>
-        <w:t xml:space="preserve"> (LEDC периферия на ESP32) за</w:t>
-      </w:r>
-      <w:r>
-        <w:t xml:space="preserve"> генериране на различни честоти. Кодът е показан на фиг. 6:</w:t>
-      </w:r>
-    </w:p>
-    <w:p>
-      <w:pPr>
-        <w:jc w:val="center"/>
-      </w:pPr>
-      <w:r>
         <w:drawing>
           <wp:inline distT="0" distB="0" distL="0" distR="0" wp14:anchorId="52ADE462" wp14:editId="0ADA8AF0">
-            <wp:extent cx="2904580" cy="3177540"/>
+            <wp:extent cx="2103557" cy="2301240"/>
             <wp:effectExtent l="0" t="0" r="0" b="3810"/>
             <wp:docPr id="8" name="Картина 8"/>
             <wp:cNvGraphicFramePr>
@@ -4822,7 +4763,7 @@
                   <pic:spPr>
                     <a:xfrm>
                       <a:off x="0" y="0"/>
-                      <a:ext cx="2926511" cy="3201532"/>
+                      <a:ext cx="2140537" cy="2341695"/>
                     </a:xfrm>
                     <a:prstGeom prst="rect">
                       <a:avLst/>
@@ -4837,14 +4778,1413 @@
     </w:p>
     <w:p>
       <w:pPr>
-        <w:jc w:val="center"/>
-      </w:pPr>
-      <w:r>
-        <w:t>Фиг. 6 Код за управление на светодиодите и зумера</w:t>
+        <w:pStyle w:val="ad"/>
+      </w:pPr>
+      <w:r>
+        <w:rPr>
+          <w:b/>
+        </w:rPr>
+        <w:t>Фиг. 6</w:t>
+      </w:r>
+      <w:r>
+        <w:rPr>
+          <w:b/>
+        </w:rPr>
+        <w:t>.</w:t>
+      </w:r>
+      <w:r>
+        <w:t xml:space="preserve"> Код за управление на светодиодите и зумера</w:t>
+      </w:r>
+    </w:p>
+    <w:p>
+      <w:pPr>
+        <w:pStyle w:val="3"/>
+        <w:numPr>
+          <w:ilvl w:val="1"/>
+          <w:numId w:val="49"/>
+        </w:numPr>
+      </w:pPr>
+      <w:r>
+        <w:t>Инициализация</w:t>
+      </w:r>
+    </w:p>
+    <w:p>
+      <w:pPr>
+        <w:spacing w:after="0"/>
+      </w:pPr>
+      <w:r>
+        <w:t>Функцията setup() се изп</w:t>
+      </w:r>
+      <w:r>
+        <w:t>ълнява еднократно при стартиране на микроконтролера</w:t>
+      </w:r>
+      <w:r>
+        <w:t>. Инициализира GPIO пиновете, LEDC PWM канала за зумера, PN532 модула и Wi-Fi връзката. При неуспешна инициализация на PN532 или Wi-Fi устройството влиз</w:t>
+      </w:r>
+      <w:r>
+        <w:t>а в безкраен цикъл с мигащ светодиод, който сигнализира за проблем. (фиг. 7)</w:t>
+      </w:r>
+    </w:p>
+    <w:p>
+      <w:pPr>
+        <w:pStyle w:val="ad"/>
+        <w:spacing w:after="0"/>
+      </w:pPr>
+      <w:r>
+        <w:rPr>
+          <w:noProof/>
+        </w:rPr>
+        <w:drawing>
+          <wp:inline distT="0" distB="0" distL="0" distR="0" wp14:anchorId="3C638E6B">
+            <wp:extent cx="4803351" cy="4381500"/>
+            <wp:effectExtent l="0" t="0" r="0" b="0"/>
+            <wp:docPr id="9" name="Картина 9"/>
+            <wp:cNvGraphicFramePr>
+              <a:graphicFrameLocks xmlns:a="http://schemas.openxmlformats.org/drawingml/2006/main" noChangeAspect="1"/>
+            </wp:cNvGraphicFramePr>
+            <a:graphic xmlns:a="http://schemas.openxmlformats.org/drawingml/2006/main">
+              <a:graphicData uri="http://schemas.openxmlformats.org/drawingml/2006/picture">
+                <pic:pic xmlns:pic="http://schemas.openxmlformats.org/drawingml/2006/picture">
+                  <pic:nvPicPr>
+                    <pic:cNvPr id="0" name="Picture 2"/>
+                    <pic:cNvPicPr>
+                      <a:picLocks noChangeAspect="1" noChangeArrowheads="1"/>
+                    </pic:cNvPicPr>
+                  </pic:nvPicPr>
+                  <pic:blipFill>
+                    <a:blip r:embed="rId15">
+                      <a:extLst>
+                        <a:ext uri="{28A0092B-C50C-407E-A947-70E740481C1C}">
+                          <a14:useLocalDpi xmlns:a14="http://schemas.microsoft.com/office/drawing/2010/main" val="0"/>
+                        </a:ext>
+                      </a:extLst>
+                    </a:blip>
+                    <a:srcRect/>
+                    <a:stretch>
+                      <a:fillRect/>
+                    </a:stretch>
+                  </pic:blipFill>
+                  <pic:spPr bwMode="auto">
+                    <a:xfrm>
+                      <a:off x="0" y="0"/>
+                      <a:ext cx="4856154" cy="4429666"/>
+                    </a:xfrm>
+                    <a:prstGeom prst="rect">
+                      <a:avLst/>
+                    </a:prstGeom>
+                    <a:noFill/>
+                  </pic:spPr>
+                </pic:pic>
+              </a:graphicData>
+            </a:graphic>
+          </wp:inline>
+        </w:drawing>
+      </w:r>
+    </w:p>
+    <w:p>
+      <w:pPr>
+        <w:pStyle w:val="ad"/>
+        <w:spacing w:before="0"/>
+        <w:rPr>
+          <w:lang w:val="en-US"/>
+        </w:rPr>
+      </w:pPr>
+      <w:r>
+        <w:rPr>
+          <w:b/>
+        </w:rPr>
+        <w:t>Фиг.</w:t>
+      </w:r>
+      <w:r>
+        <w:rPr>
+          <w:b/>
+        </w:rPr>
+        <w:t xml:space="preserve"> 7</w:t>
+      </w:r>
+      <w:r>
+        <w:rPr>
+          <w:b/>
+        </w:rPr>
+        <w:t>.</w:t>
+      </w:r>
+      <w:r>
+        <w:t xml:space="preserve"> </w:t>
+      </w:r>
+      <w:r>
+        <w:rPr>
+          <w:lang w:val="en-US"/>
+        </w:rPr>
+        <w:t>s</w:t>
+      </w:r>
+      <w:r>
+        <w:rPr>
+          <w:lang w:val="en-US"/>
+        </w:rPr>
+        <w:t xml:space="preserve">etup() </w:t>
+      </w:r>
+      <w:r>
+        <w:t xml:space="preserve">функция на </w:t>
+      </w:r>
+      <w:r>
+        <w:rPr>
+          <w:lang w:val="en-US"/>
+        </w:rPr>
+        <w:t>ESP32</w:t>
+      </w:r>
+    </w:p>
+    <w:p>
+      <w:pPr>
+        <w:pStyle w:val="3"/>
+        <w:numPr>
+          <w:ilvl w:val="1"/>
+          <w:numId w:val="49"/>
+        </w:numPr>
+      </w:pPr>
+      <w:r>
+        <w:lastRenderedPageBreak/>
+        <w:t>Основен цикъл</w:t>
+      </w:r>
+    </w:p>
+    <w:p>
+      <w:r>
+        <w:t>На фиг. 8 е показаната ф</w:t>
+      </w:r>
+      <w:r>
+        <w:t>ункцията loop()</w:t>
+      </w:r>
+      <w:r>
+        <w:t>, която</w:t>
+      </w:r>
+      <w:r>
+        <w:t xml:space="preserve"> се изпълнява </w:t>
+      </w:r>
+      <w:r>
+        <w:t>циклично</w:t>
+      </w:r>
+      <w:r>
+        <w:t xml:space="preserve">. Всяка итерация извиква inListPassiveTarget(), която блокира изпълнението докато не засече NFC устройство или изтече вътрешен timeout. При засечен телефон се изпраща SELECT AID APDU чрез inDataExchange(). Успешният отговор се </w:t>
+      </w:r>
+      <w:r>
+        <w:t>парсва</w:t>
+      </w:r>
+      <w:r>
+        <w:t xml:space="preserve"> и препраща към </w:t>
+      </w:r>
+      <w:r>
+        <w:t xml:space="preserve">бекенд </w:t>
+      </w:r>
+      <w:r>
+        <w:t xml:space="preserve">сървъра, след което се изпраща ACK </w:t>
+      </w:r>
+      <w:r>
+        <w:t xml:space="preserve">команда </w:t>
+      </w:r>
+      <w:r>
+        <w:t xml:space="preserve">към </w:t>
+      </w:r>
+      <w:r>
+        <w:t>телефона.</w:t>
+      </w:r>
+    </w:p>
+    <w:p>
+      <w:pPr>
+        <w:pStyle w:val="ad"/>
+      </w:pPr>
+      <w:r>
+        <w:drawing>
+          <wp:inline distT="0" distB="0" distL="0" distR="0" wp14:anchorId="0497AB62" wp14:editId="49377E2D">
+            <wp:extent cx="5341551" cy="5798456"/>
+            <wp:effectExtent l="0" t="0" r="0" b="0"/>
+            <wp:docPr id="11" name="Картина 11"/>
+            <wp:cNvGraphicFramePr>
+              <a:graphicFrameLocks xmlns:a="http://schemas.openxmlformats.org/drawingml/2006/main" noChangeAspect="1"/>
+            </wp:cNvGraphicFramePr>
+            <a:graphic xmlns:a="http://schemas.openxmlformats.org/drawingml/2006/main">
+              <a:graphicData uri="http://schemas.openxmlformats.org/drawingml/2006/picture">
+                <pic:pic xmlns:pic="http://schemas.openxmlformats.org/drawingml/2006/picture">
+                  <pic:nvPicPr>
+                    <pic:cNvPr id="1" name=""/>
+                    <pic:cNvPicPr/>
+                  </pic:nvPicPr>
+                  <pic:blipFill>
+                    <a:blip r:embed="rId16"/>
+                    <a:stretch>
+                      <a:fillRect/>
+                    </a:stretch>
+                  </pic:blipFill>
+                  <pic:spPr>
+                    <a:xfrm>
+                      <a:off x="0" y="0"/>
+                      <a:ext cx="5359711" cy="5818169"/>
+                    </a:xfrm>
+                    <a:prstGeom prst="rect">
+                      <a:avLst/>
+                    </a:prstGeom>
+                  </pic:spPr>
+                </pic:pic>
+              </a:graphicData>
+            </a:graphic>
+          </wp:inline>
+        </w:drawing>
+      </w:r>
+    </w:p>
+    <w:p>
+      <w:pPr>
+        <w:pStyle w:val="ad"/>
+        <w:rPr>
+          <w:lang w:val="en-US"/>
+        </w:rPr>
+      </w:pPr>
+      <w:r>
+        <w:rPr>
+          <w:b/>
+        </w:rPr>
+        <w:t>Фиг.</w:t>
+      </w:r>
+      <w:r>
+        <w:rPr>
+          <w:b/>
+        </w:rPr>
+        <w:t xml:space="preserve"> 8</w:t>
+      </w:r>
+      <w:r>
+        <w:rPr>
+          <w:b/>
+        </w:rPr>
+        <w:t>.</w:t>
+      </w:r>
+      <w:r>
+        <w:t xml:space="preserve"> </w:t>
+      </w:r>
+      <w:r>
+        <w:rPr>
+          <w:lang w:val="en-US"/>
+        </w:rPr>
+        <w:t>loop</w:t>
+      </w:r>
+      <w:r>
+        <w:rPr>
+          <w:lang w:val="en-US"/>
+        </w:rPr>
+        <w:t xml:space="preserve">() </w:t>
+      </w:r>
+      <w:r>
+        <w:t>функция, чакаща</w:t>
+      </w:r>
+      <w:r>
+        <w:rPr>
+          <w:lang w:val="en-US"/>
+        </w:rPr>
+        <w:t xml:space="preserve"> NFC </w:t>
+      </w:r>
+      <w:r>
+        <w:t xml:space="preserve">устройсво и получаване на </w:t>
+      </w:r>
+      <w:r>
+        <w:rPr>
+          <w:lang w:val="en-US"/>
+        </w:rPr>
+        <w:t>payload</w:t>
+      </w:r>
+      <w:r>
+        <w:t xml:space="preserve"> пакет</w:t>
+      </w:r>
+      <w:r>
+        <w:rPr>
+          <w:lang w:val="en-US"/>
+        </w:rPr>
+        <w:t xml:space="preserve"> </w:t>
+      </w:r>
+    </w:p>
+    <w:p>
+      <w:pPr>
+        <w:pStyle w:val="3"/>
+        <w:numPr>
+          <w:ilvl w:val="1"/>
+          <w:numId w:val="49"/>
+        </w:numPr>
+      </w:pPr>
+      <w:r>
+        <w:t xml:space="preserve">Декодиране на получения </w:t>
+      </w:r>
+      <w:r>
+        <w:rPr>
+          <w:lang w:val="en-US"/>
+        </w:rPr>
+        <w:t>payload</w:t>
+      </w:r>
+    </w:p>
+    <w:p>
+      <w:r>
+        <w:t xml:space="preserve">Функцията parsePayload() декодира бинарния отговор от Android HCE и реконструира текстовия низ във формат "ФН|ATC|hmachex" за FastAPI. Бинарният </w:t>
+      </w:r>
+      <w:r>
+        <w:lastRenderedPageBreak/>
+        <w:t>формат е проектиран с length-prefix за факултетния номер, за да се поддържат факултетни номера с различна дължина и водещи нули. Преди обработка се извършват две защитни пров</w:t>
+      </w:r>
+      <w:r>
+        <w:t>ерки срещу препълване на буфера</w:t>
+      </w:r>
+      <w:r>
+        <w:rPr>
+          <w:lang w:val="en-US"/>
+        </w:rPr>
+        <w:t xml:space="preserve">. </w:t>
+      </w:r>
+      <w:r>
+        <w:t>Функцията е на фиг. 9.</w:t>
+      </w:r>
+    </w:p>
+    <w:p>
+      <w:pPr>
+        <w:pStyle w:val="ad"/>
+      </w:pPr>
+      <w:r>
+        <w:drawing>
+          <wp:inline distT="0" distB="0" distL="0" distR="0" wp14:anchorId="51E3A077" wp14:editId="7CB7445C">
+            <wp:extent cx="5256827" cy="5882640"/>
+            <wp:effectExtent l="0" t="0" r="1270" b="3810"/>
+            <wp:docPr id="12" name="Картина 12"/>
+            <wp:cNvGraphicFramePr>
+              <a:graphicFrameLocks xmlns:a="http://schemas.openxmlformats.org/drawingml/2006/main" noChangeAspect="1"/>
+            </wp:cNvGraphicFramePr>
+            <a:graphic xmlns:a="http://schemas.openxmlformats.org/drawingml/2006/main">
+              <a:graphicData uri="http://schemas.openxmlformats.org/drawingml/2006/picture">
+                <pic:pic xmlns:pic="http://schemas.openxmlformats.org/drawingml/2006/picture">
+                  <pic:nvPicPr>
+                    <pic:cNvPr id="1" name=""/>
+                    <pic:cNvPicPr/>
+                  </pic:nvPicPr>
+                  <pic:blipFill>
+                    <a:blip r:embed="rId17"/>
+                    <a:stretch>
+                      <a:fillRect/>
+                    </a:stretch>
+                  </pic:blipFill>
+                  <pic:spPr>
+                    <a:xfrm>
+                      <a:off x="0" y="0"/>
+                      <a:ext cx="5340115" cy="5975843"/>
+                    </a:xfrm>
+                    <a:prstGeom prst="rect">
+                      <a:avLst/>
+                    </a:prstGeom>
+                  </pic:spPr>
+                </pic:pic>
+              </a:graphicData>
+            </a:graphic>
+          </wp:inline>
+        </w:drawing>
+      </w:r>
+    </w:p>
+    <w:p>
+      <w:pPr>
+        <w:pStyle w:val="ad"/>
+        <w:rPr>
+          <w:lang w:val="en-US"/>
+        </w:rPr>
+      </w:pPr>
+      <w:r>
+        <w:rPr>
+          <w:b/>
+        </w:rPr>
+        <w:t>Фиг.</w:t>
+      </w:r>
+      <w:r>
+        <w:rPr>
+          <w:b/>
+        </w:rPr>
+        <w:t xml:space="preserve"> 9</w:t>
+      </w:r>
+      <w:r>
+        <w:rPr>
+          <w:b/>
+        </w:rPr>
+        <w:t>.</w:t>
+      </w:r>
+      <w:r>
+        <w:t xml:space="preserve"> parsePayload</w:t>
+      </w:r>
+      <w:r>
+        <w:rPr>
+          <w:lang w:val="en-US"/>
+        </w:rPr>
+        <w:t xml:space="preserve">() </w:t>
+      </w:r>
+      <w:r>
+        <w:t>функция</w:t>
+      </w:r>
+      <w:r>
+        <w:t xml:space="preserve"> за</w:t>
+      </w:r>
+      <w:r>
+        <w:t xml:space="preserve"> декодиране на бинарния NFC отговор</w:t>
+      </w:r>
+      <w:r>
+        <w:rPr>
+          <w:lang w:val="en-US"/>
+        </w:rPr>
+        <w:t xml:space="preserve"> </w:t>
+      </w:r>
+    </w:p>
+    <w:p>
+      <w:pPr>
+        <w:pStyle w:val="3"/>
+        <w:numPr>
+          <w:ilvl w:val="1"/>
+          <w:numId w:val="49"/>
+        </w:numPr>
+      </w:pPr>
+      <w:r>
+        <w:t>Комуникация с бекенда</w:t>
+      </w:r>
+    </w:p>
+    <w:p>
+      <w:r>
+        <w:t xml:space="preserve">Функцията sendToServer() </w:t>
+      </w:r>
+      <w:r>
+        <w:t xml:space="preserve">(на фиг. 10) </w:t>
+      </w:r>
+      <w:r>
+        <w:t>конструира JSON тяло и изпраща HTTP POST заявка към /checkin endpoint-а на FastAPI. Преди заявката се пр</w:t>
+      </w:r>
+      <w:r>
+        <w:t xml:space="preserve">оверява Wi-Fi свързаността, а ако тя се е разпаднала се прави опит за </w:t>
+      </w:r>
+      <w:r>
+        <w:t xml:space="preserve">повторно свързване. </w:t>
+      </w:r>
+      <w:r>
+        <w:t xml:space="preserve">Времето за </w:t>
+      </w:r>
+      <w:r>
+        <w:lastRenderedPageBreak/>
+        <w:t xml:space="preserve">изчакване на отговор от сървъра е 8 секунди, което е </w:t>
+      </w:r>
+      <w:r>
+        <w:t xml:space="preserve">достатъчен </w:t>
+      </w:r>
+      <w:r>
+        <w:t xml:space="preserve">период </w:t>
+      </w:r>
+      <w:r>
+        <w:t>за отговор от локален сървър</w:t>
+      </w:r>
+      <w:r>
+        <w:t>.</w:t>
+      </w:r>
+    </w:p>
+    <w:p>
+      <w:r>
+        <w:t>Отговорът от сървъра обаче се обработва само до нивото на успешно чекиране или грешка. Тоест, дали проблемът идва от това, че студентът вече се е отчел или сървърът е стигнал до някаква грешка, се отразява само като съобщения в серийния монитор за дебъгване.</w:t>
+      </w:r>
+    </w:p>
+    <w:p>
+      <w:pPr>
+        <w:pStyle w:val="ad"/>
+      </w:pPr>
+      <w:r>
+        <w:drawing>
+          <wp:inline distT="0" distB="0" distL="0" distR="0" wp14:anchorId="742E3E57" wp14:editId="7D2546D0">
+            <wp:extent cx="5220429" cy="4391638"/>
+            <wp:effectExtent l="0" t="0" r="0" b="9525"/>
+            <wp:docPr id="13" name="Картина 13"/>
+            <wp:cNvGraphicFramePr>
+              <a:graphicFrameLocks xmlns:a="http://schemas.openxmlformats.org/drawingml/2006/main" noChangeAspect="1"/>
+            </wp:cNvGraphicFramePr>
+            <a:graphic xmlns:a="http://schemas.openxmlformats.org/drawingml/2006/main">
+              <a:graphicData uri="http://schemas.openxmlformats.org/drawingml/2006/picture">
+                <pic:pic xmlns:pic="http://schemas.openxmlformats.org/drawingml/2006/picture">
+                  <pic:nvPicPr>
+                    <pic:cNvPr id="1" name=""/>
+                    <pic:cNvPicPr/>
+                  </pic:nvPicPr>
+                  <pic:blipFill>
+                    <a:blip r:embed="rId18"/>
+                    <a:stretch>
+                      <a:fillRect/>
+                    </a:stretch>
+                  </pic:blipFill>
+                  <pic:spPr>
+                    <a:xfrm>
+                      <a:off x="0" y="0"/>
+                      <a:ext cx="5220429" cy="4391638"/>
+                    </a:xfrm>
+                    <a:prstGeom prst="rect">
+                      <a:avLst/>
+                    </a:prstGeom>
+                  </pic:spPr>
+                </pic:pic>
+              </a:graphicData>
+            </a:graphic>
+          </wp:inline>
+        </w:drawing>
+      </w:r>
+    </w:p>
+    <w:p>
+      <w:pPr>
+        <w:pStyle w:val="ad"/>
+        <w:rPr>
+          <w:lang w:val="en-US"/>
+        </w:rPr>
+      </w:pPr>
+      <w:r>
+        <w:rPr>
+          <w:b/>
+        </w:rPr>
+        <w:t>Фиг.</w:t>
+      </w:r>
+      <w:r>
+        <w:rPr>
+          <w:b/>
+        </w:rPr>
+        <w:t xml:space="preserve"> 9</w:t>
+      </w:r>
+      <w:r>
+        <w:rPr>
+          <w:b/>
+        </w:rPr>
+        <w:t>.</w:t>
+      </w:r>
+      <w:r>
+        <w:t xml:space="preserve"> </w:t>
+      </w:r>
+      <w:r>
+        <w:t xml:space="preserve">Изпращане на препакетирания </w:t>
+      </w:r>
+      <w:r>
+        <w:rPr>
+          <w:lang w:val="en-US"/>
+        </w:rPr>
+        <w:t xml:space="preserve">payload </w:t>
+      </w:r>
+      <w:r>
+        <w:t>към сървъра</w:t>
+      </w:r>
+      <w:r>
+        <w:rPr>
+          <w:lang w:val="en-US"/>
+        </w:rPr>
+        <w:t xml:space="preserve"> </w:t>
+      </w:r>
+    </w:p>
+    <w:p>
+      <w:pPr>
+        <w:pStyle w:val="2"/>
+        <w:numPr>
+          <w:ilvl w:val="0"/>
+          <w:numId w:val="49"/>
+        </w:numPr>
+      </w:pPr>
+      <w:r>
+        <w:rPr>
+          <w:lang w:val="en-US"/>
+        </w:rPr>
+        <w:t xml:space="preserve">Android </w:t>
+      </w:r>
+      <w:r>
+        <w:t>мобилно приложение</w:t>
+      </w:r>
+    </w:p>
+    <w:p>
+      <w:r>
+        <w:t>Мобилното приложение е написано на Kotlin и се състои от четири класа: MainActivity, HomeActivity, NfcHceService и StudentPrefs. За комуникация с бекенда се използва библиотеката Retrofit2, чийто интерфейс е дефиниран в ApiService.kt.</w:t>
+      </w:r>
+    </w:p>
+    <w:p>
+      <w:pPr>
+        <w:pStyle w:val="3"/>
+        <w:numPr>
+          <w:ilvl w:val="1"/>
+          <w:numId w:val="49"/>
+        </w:numPr>
+      </w:pPr>
+      <w:r>
+        <w:t>Съхранение на данните</w:t>
+      </w:r>
+    </w:p>
+    <w:p>
+      <w:r>
+        <w:t xml:space="preserve">Класът StudentPrefs отговаря за съхранението на чувствителните данни на студента: JWT токена, HMAC ключа, факултетния номер и ATC брояча. Данните се </w:t>
+      </w:r>
+      <w:r>
+        <w:lastRenderedPageBreak/>
+        <w:t>записват криптирани на устройството чрез EncryptedSharedPreferences. За управление на ключовете се използва Android Keystore, което означава, че данните не могат да бъдат прочетени дори при root достъп.</w:t>
+      </w:r>
+      <w:r>
+        <w:t xml:space="preserve"> Разписаният клас е показан на фиг. 10.</w:t>
+      </w:r>
+    </w:p>
+    <w:p>
+      <w:pPr>
+        <w:pStyle w:val="ad"/>
+      </w:pPr>
+      <w:r>
+        <w:drawing>
+          <wp:inline distT="0" distB="0" distL="0" distR="0" wp14:anchorId="12DB7E92" wp14:editId="01C9848D">
+            <wp:extent cx="4610100" cy="5641846"/>
+            <wp:effectExtent l="0" t="0" r="0" b="0"/>
+            <wp:docPr id="14" name="Картина 14"/>
+            <wp:cNvGraphicFramePr>
+              <a:graphicFrameLocks xmlns:a="http://schemas.openxmlformats.org/drawingml/2006/main" noChangeAspect="1"/>
+            </wp:cNvGraphicFramePr>
+            <a:graphic xmlns:a="http://schemas.openxmlformats.org/drawingml/2006/main">
+              <a:graphicData uri="http://schemas.openxmlformats.org/drawingml/2006/picture">
+                <pic:pic xmlns:pic="http://schemas.openxmlformats.org/drawingml/2006/picture">
+                  <pic:nvPicPr>
+                    <pic:cNvPr id="1" name=""/>
+                    <pic:cNvPicPr/>
+                  </pic:nvPicPr>
+                  <pic:blipFill>
+                    <a:blip r:embed="rId19"/>
+                    <a:stretch>
+                      <a:fillRect/>
+                    </a:stretch>
+                  </pic:blipFill>
+                  <pic:spPr>
+                    <a:xfrm>
+                      <a:off x="0" y="0"/>
+                      <a:ext cx="4619554" cy="5653416"/>
+                    </a:xfrm>
+                    <a:prstGeom prst="rect">
+                      <a:avLst/>
+                    </a:prstGeom>
+                  </pic:spPr>
+                </pic:pic>
+              </a:graphicData>
+            </a:graphic>
+          </wp:inline>
+        </w:drawing>
+      </w:r>
+    </w:p>
+    <w:p>
+      <w:pPr>
+        <w:pStyle w:val="ad"/>
+      </w:pPr>
+      <w:r>
+        <w:rPr>
+          <w:b/>
+        </w:rPr>
+        <w:t>Фиг. 10.</w:t>
+      </w:r>
+      <w:r>
+        <w:t xml:space="preserve"> Клас StudentPrefs за криптирано съхранение на данни</w:t>
+      </w:r>
+    </w:p>
+    <w:p>
+      <w:r>
+        <w:t>Функцията getAndIncrementAtc()</w:t>
+      </w:r>
+      <w:r>
+        <w:t xml:space="preserve"> в класа</w:t>
+      </w:r>
+      <w:r>
+        <w:t xml:space="preserve"> увеличава ATC брояча с 1 и връща новата стойност. Тя е маркирана с @Synchronized, за да се гарантира, че две нишки не могат да я изпълнят едновременно.</w:t>
+      </w:r>
+    </w:p>
+    <w:p>
+      <w:pPr>
+        <w:rPr>
+          <w:lang w:val="en-US"/>
+        </w:rPr>
+      </w:pPr>
+      <w:r>
+        <w:rPr>
+          <w:lang w:val="en-US"/>
+        </w:rPr>
+        <w:t xml:space="preserve">ATC </w:t>
+      </w:r>
+      <w:r>
+        <w:t xml:space="preserve">броячът всъщност се използва за защита срещу </w:t>
+      </w:r>
+      <w:r>
+        <w:rPr>
+          <w:lang w:val="en-US"/>
+        </w:rPr>
+        <w:t xml:space="preserve">Replay </w:t>
+      </w:r>
+      <w:r>
+        <w:t xml:space="preserve">атаки или от студенти, които се опитват сами да си създадат заявка, с която да си отчетат присъствие сами, без да са били реално на занятието. Всъщност, ако някой успее да открадне данните от </w:t>
+      </w:r>
+      <w:r>
+        <w:lastRenderedPageBreak/>
+        <w:t xml:space="preserve">заявката при изпращане по </w:t>
+      </w:r>
+      <w:r>
+        <w:rPr>
+          <w:lang w:val="en-US"/>
+        </w:rPr>
+        <w:t xml:space="preserve">NFC, </w:t>
+      </w:r>
+      <w:r>
+        <w:t xml:space="preserve">то той ще вземе текущия брояч, но докато успее да създаде нова заявка, и то при евентуална кражба и на </w:t>
+      </w:r>
+      <w:r>
+        <w:rPr>
+          <w:lang w:val="en-US"/>
+        </w:rPr>
+        <w:t xml:space="preserve">HMAC </w:t>
+      </w:r>
+      <w:r>
+        <w:t xml:space="preserve">ключа, броячът вероятно вече ще се е увеличил и бекенд сървъра ще откаже присъствието. Ако изпратения </w:t>
+      </w:r>
+      <w:r>
+        <w:rPr>
+          <w:lang w:val="en-US"/>
+        </w:rPr>
+        <w:t xml:space="preserve">ATC </w:t>
+      </w:r>
+      <w:r>
+        <w:t>брояч е по-малък от този, записан в базата данни на сървъра, то той ще върне грешка. По подобен начин се правя</w:t>
+      </w:r>
+      <w:r>
+        <w:t>т проверки и при разплащане с дебитни карти, примерът за</w:t>
+      </w:r>
+      <w:r>
+        <w:rPr>
+          <w:lang w:val="en-US"/>
+        </w:rPr>
+        <w:t xml:space="preserve"> ATC</w:t>
+      </w:r>
+      <w:r>
+        <w:t xml:space="preserve"> брояч е взет именно от там</w:t>
+      </w:r>
+      <w:r>
+        <w:rPr>
+          <w:lang w:val="en-US"/>
+        </w:rPr>
+        <w:t>.</w:t>
+      </w:r>
+    </w:p>
+    <w:p>
+      <w:pPr>
+        <w:pStyle w:val="3"/>
+        <w:numPr>
+          <w:ilvl w:val="1"/>
+          <w:numId w:val="49"/>
+        </w:numPr>
+        <w:rPr>
+          <w:lang w:val="en-US"/>
+        </w:rPr>
+      </w:pPr>
+      <w:r>
+        <w:t>Комуникация с бекенд сървъра</w:t>
+      </w:r>
+    </w:p>
+    <w:p>
+      <w:r>
+        <w:t>ApiService.kt съдържа дефиницията на всички заявки към сървъра. Използва се библиотеката Retrofit2, при която всяка заявка се описва като функция с анотация. Библиотеката автоматично изпраща заявката и преобразув</w:t>
+      </w:r>
+      <w:r>
+        <w:t>а JSON отговора в Kotlin обект. Дефинирани</w:t>
+      </w:r>
+      <w:r>
+        <w:t xml:space="preserve"> са две заявки: login за вход в системата и provisionKey за получаване на HMAC ключа от сървъра. </w:t>
+      </w:r>
+      <w:r>
+        <w:t>Интерфейсът е показана на фиг.</w:t>
+      </w:r>
+      <w:r>
+        <w:t xml:space="preserve"> </w:t>
+      </w:r>
+      <w:r>
+        <w:t>11</w:t>
+      </w:r>
+      <w:r>
+        <w:t xml:space="preserve">. </w:t>
+      </w:r>
+      <w:r>
+        <w:t xml:space="preserve">Обектът RetrofitClient създава единствена инстанция на клиента, която се използва навсякъде в приложението. </w:t>
+      </w:r>
+    </w:p>
+    <w:p>
+      <w:pPr>
+        <w:pStyle w:val="ad"/>
+      </w:pPr>
+      <w:r>
+        <w:drawing>
+          <wp:inline distT="0" distB="0" distL="0" distR="0" wp14:anchorId="57D2D549" wp14:editId="414317D2">
+            <wp:extent cx="3518637" cy="3543300"/>
+            <wp:effectExtent l="0" t="0" r="5715" b="0"/>
+            <wp:docPr id="16" name="Картина 16"/>
+            <wp:cNvGraphicFramePr>
+              <a:graphicFrameLocks xmlns:a="http://schemas.openxmlformats.org/drawingml/2006/main" noChangeAspect="1"/>
+            </wp:cNvGraphicFramePr>
+            <a:graphic xmlns:a="http://schemas.openxmlformats.org/drawingml/2006/main">
+              <a:graphicData uri="http://schemas.openxmlformats.org/drawingml/2006/picture">
+                <pic:pic xmlns:pic="http://schemas.openxmlformats.org/drawingml/2006/picture">
+                  <pic:nvPicPr>
+                    <pic:cNvPr id="1" name=""/>
+                    <pic:cNvPicPr/>
+                  </pic:nvPicPr>
+                  <pic:blipFill>
+                    <a:blip r:embed="rId20"/>
+                    <a:stretch>
+                      <a:fillRect/>
+                    </a:stretch>
+                  </pic:blipFill>
+                  <pic:spPr>
+                    <a:xfrm>
+                      <a:off x="0" y="0"/>
+                      <a:ext cx="3537178" cy="3561970"/>
+                    </a:xfrm>
+                    <a:prstGeom prst="rect">
+                      <a:avLst/>
+                    </a:prstGeom>
+                  </pic:spPr>
+                </pic:pic>
+              </a:graphicData>
+            </a:graphic>
+          </wp:inline>
+        </w:drawing>
+      </w:r>
+    </w:p>
+    <w:p>
+      <w:pPr>
+        <w:pStyle w:val="ad"/>
+      </w:pPr>
+      <w:r>
+        <w:rPr>
+          <w:b/>
+        </w:rPr>
+        <w:t>Фиг. 11</w:t>
+      </w:r>
+      <w:r>
+        <w:rPr>
+          <w:b/>
+        </w:rPr>
+        <w:t>.</w:t>
+      </w:r>
+      <w:r>
+        <w:t xml:space="preserve"> Интерфейс </w:t>
+      </w:r>
+      <w:r>
+        <w:rPr>
+          <w:lang w:val="en-US"/>
+        </w:rPr>
+        <w:t xml:space="preserve">ApiService </w:t>
+      </w:r>
+      <w:r>
+        <w:t xml:space="preserve">със заявки за логин и </w:t>
+      </w:r>
+      <w:r>
+        <w:t>provisionKey</w:t>
+      </w:r>
+    </w:p>
+    <w:p>
+      <w:r>
+        <w:t xml:space="preserve">Взимането на </w:t>
+      </w:r>
+      <w:r>
+        <w:rPr>
+          <w:lang w:val="en-US"/>
+        </w:rPr>
+        <w:t xml:space="preserve">HMAC </w:t>
+      </w:r>
+      <w:r>
+        <w:t xml:space="preserve">ключа се случва само веднъж – при първоначалното логване на студента. Тогава се взима </w:t>
+      </w:r>
+      <w:r>
+        <w:rPr>
+          <w:lang w:val="en-US"/>
+        </w:rPr>
+        <w:t xml:space="preserve">HMAC </w:t>
+      </w:r>
+      <w:r>
+        <w:t xml:space="preserve">ключа, както и </w:t>
+      </w:r>
+      <w:r>
+        <w:rPr>
+          <w:lang w:val="en-US"/>
+        </w:rPr>
+        <w:t xml:space="preserve">ATC </w:t>
+      </w:r>
+      <w:r>
+        <w:t xml:space="preserve">брояча и ф-н номер от базата данни на сървъра. Ако на телефон, в който вече има влезнал студент, ако друг се опита </w:t>
+      </w:r>
+      <w:r>
+        <w:lastRenderedPageBreak/>
+        <w:t xml:space="preserve">да влезе то при самото влизане на новия студент се взимат наново съответните му </w:t>
+      </w:r>
+      <w:r>
+        <w:t>HMAC ключ</w:t>
+      </w:r>
+      <w:r>
+        <w:t xml:space="preserve">, </w:t>
+      </w:r>
+      <w:r>
+        <w:rPr>
+          <w:lang w:val="en-US"/>
+        </w:rPr>
+        <w:t>ATC</w:t>
+      </w:r>
+      <w:r>
+        <w:t xml:space="preserve"> брояч и ФН.</w:t>
+      </w:r>
+    </w:p>
+    <w:p>
+      <w:pPr>
+        <w:pStyle w:val="3"/>
+        <w:numPr>
+          <w:ilvl w:val="1"/>
+          <w:numId w:val="49"/>
+        </w:numPr>
+        <w:rPr>
+          <w:lang w:val="en-US"/>
+        </w:rPr>
+      </w:pPr>
+      <w:r>
+        <w:t xml:space="preserve">Клас </w:t>
+      </w:r>
+      <w:r>
+        <w:rPr>
+          <w:lang w:val="en-US"/>
+        </w:rPr>
+        <w:t>MainActivity</w:t>
+      </w:r>
+    </w:p>
+    <w:p>
+      <w:r>
+        <w:t>MainActivity се стартира при отваряне на прило</w:t>
+      </w:r>
+      <w:r>
+        <w:t>жението и играе ролята на логин страница</w:t>
+      </w:r>
+      <w:r>
+        <w:t>.</w:t>
+      </w:r>
+      <w:r>
+        <w:t xml:space="preserve"> Вместо обаче приложението да изисква влизане с име и парола всеки път, е създаден механизъм за проверка дали студентът вече се е логвал и</w:t>
+      </w:r>
+      <w:r>
+        <w:t xml:space="preserve"> има записани данни чрез isProvisioned. Ако да, приложението директно отваря HomeActivity без да показва екрана за вход.</w:t>
+      </w:r>
+    </w:p>
+    <w:p>
+      <w:pPr>
+        <w:pStyle w:val="ad"/>
+      </w:pPr>
+      <w:r>
+        <w:drawing>
+          <wp:inline distT="0" distB="0" distL="0" distR="0" wp14:anchorId="2C5C9EB2" wp14:editId="56EF4273">
+            <wp:extent cx="5257800" cy="4514800"/>
+            <wp:effectExtent l="0" t="0" r="0" b="635"/>
+            <wp:docPr id="20" name="Картина 20"/>
+            <wp:cNvGraphicFramePr>
+              <a:graphicFrameLocks xmlns:a="http://schemas.openxmlformats.org/drawingml/2006/main" noChangeAspect="1"/>
+            </wp:cNvGraphicFramePr>
+            <a:graphic xmlns:a="http://schemas.openxmlformats.org/drawingml/2006/main">
+              <a:graphicData uri="http://schemas.openxmlformats.org/drawingml/2006/picture">
+                <pic:pic xmlns:pic="http://schemas.openxmlformats.org/drawingml/2006/picture">
+                  <pic:nvPicPr>
+                    <pic:cNvPr id="1" name=""/>
+                    <pic:cNvPicPr/>
+                  </pic:nvPicPr>
+                  <pic:blipFill>
+                    <a:blip r:embed="rId21"/>
+                    <a:stretch>
+                      <a:fillRect/>
+                    </a:stretch>
+                  </pic:blipFill>
+                  <pic:spPr>
+                    <a:xfrm>
+                      <a:off x="0" y="0"/>
+                      <a:ext cx="5264731" cy="4520752"/>
+                    </a:xfrm>
+                    <a:prstGeom prst="rect">
+                      <a:avLst/>
+                    </a:prstGeom>
+                  </pic:spPr>
+                </pic:pic>
+              </a:graphicData>
+            </a:graphic>
+          </wp:inline>
+        </w:drawing>
+      </w:r>
+    </w:p>
+    <w:p>
+      <w:pPr>
+        <w:pStyle w:val="ad"/>
+      </w:pPr>
+      <w:r>
+        <w:rPr>
+          <w:b/>
+        </w:rPr>
+        <w:t>Фиг</w:t>
+      </w:r>
+      <w:r>
+        <w:rPr>
+          <w:b/>
+        </w:rPr>
+        <w:t>. 12</w:t>
+      </w:r>
+      <w:r>
+        <w:t xml:space="preserve"> </w:t>
+      </w:r>
+      <w:r>
+        <w:t>Вход и получаване на данни от сървъра</w:t>
+      </w:r>
+    </w:p>
+    <w:p>
+      <w:r>
+        <w:t xml:space="preserve">Ако не е намерена информация за логнат потребител, се показва страницата за влизане в профил. </w:t>
+      </w:r>
+      <w:r>
+        <w:t>На фиг. 12 е показан кода за логването в приложението</w:t>
+      </w:r>
+      <w:r>
+        <w:t xml:space="preserve">. </w:t>
+      </w:r>
+      <w:r>
+        <w:t xml:space="preserve">След като бъдат въведени данните за вход и се натисне бутона за влизане, </w:t>
+      </w:r>
+      <w:r>
+        <w:t>се извършват две пос</w:t>
+      </w:r>
+      <w:r>
+        <w:t xml:space="preserve">ледователни заявки към сървъра - </w:t>
+      </w:r>
+      <w:r>
+        <w:t xml:space="preserve">първо login за получаване на JWT токен, </w:t>
+      </w:r>
+      <w:r>
+        <w:t xml:space="preserve">а </w:t>
+      </w:r>
+      <w:r>
+        <w:t xml:space="preserve">след това provisionKey за получаване на HMAC ключа, факултетния номер и текущата стойност на </w:t>
+      </w:r>
+      <w:r>
+        <w:lastRenderedPageBreak/>
+        <w:t>ATC брояча. Заявките се изпълняват асинхронно, за да не блокират ин</w:t>
+      </w:r>
+      <w:r>
+        <w:t>терфейса. При грешка се изписва съобщение според</w:t>
+      </w:r>
+      <w:r>
+        <w:t xml:space="preserve"> кода на грешката.</w:t>
+      </w:r>
+    </w:p>
+    <w:p>
+      <w:pPr>
+        <w:pStyle w:val="3"/>
+        <w:numPr>
+          <w:ilvl w:val="1"/>
+          <w:numId w:val="49"/>
+        </w:numPr>
+        <w:rPr>
+          <w:lang w:val="en-US"/>
+        </w:rPr>
+      </w:pPr>
+      <w:r>
+        <w:t xml:space="preserve">Клас </w:t>
+      </w:r>
+      <w:r>
+        <w:rPr>
+          <w:lang w:val="en-US"/>
+        </w:rPr>
+        <w:t>HomeActivity</w:t>
+      </w:r>
+    </w:p>
+    <w:p>
+      <w:pPr>
+        <w:rPr>
+          <w:lang w:val="en-US"/>
+        </w:rPr>
+      </w:pPr>
+      <w:r>
+        <w:t>HomeActivity е главният екран на приложението. Показв</w:t>
+      </w:r>
+      <w:r>
+        <w:t>а факултетния номер на студента</w:t>
+      </w:r>
+      <w:r>
+        <w:rPr>
+          <w:lang w:val="en-US"/>
+        </w:rPr>
+        <w:t xml:space="preserve"> </w:t>
+      </w:r>
+      <w:r>
+        <w:t>и</w:t>
+      </w:r>
+      <w:r>
+        <w:t xml:space="preserve"> статуса на NFC</w:t>
+      </w:r>
+      <w:r>
+        <w:t xml:space="preserve">(показва дали телефонът притежава </w:t>
+      </w:r>
+      <w:r>
+        <w:rPr>
+          <w:lang w:val="en-US"/>
+        </w:rPr>
+        <w:t>NFC</w:t>
+      </w:r>
+      <w:r>
+        <w:t xml:space="preserve"> модул и дали е включен от настройките)</w:t>
+      </w:r>
+      <w:r>
+        <w:t>. На екрана се визуализира</w:t>
+      </w:r>
+      <w:r>
+        <w:t xml:space="preserve">т GIF анимации спрямо текущото състоянието на </w:t>
+      </w:r>
+      <w:r>
+        <w:rPr>
+          <w:lang w:val="en-US"/>
+        </w:rPr>
+        <w:t xml:space="preserve">NFC </w:t>
+      </w:r>
+      <w:r>
+        <w:t>модула и стъпката до която е стигнало самото чекиране. Определени са четири състояния, които влизат от едно в друго</w:t>
+      </w:r>
+      <w:r>
+        <w:t>: NFC изключен, готов за чекиране, активна сесия и резултат от чекирането. Анимациите се зареждат чрез библиотеката Glide.</w:t>
+      </w:r>
+      <w:r>
+        <w:rPr>
+          <w:lang w:val="en-US"/>
+        </w:rPr>
+        <w:t xml:space="preserve"> </w:t>
+      </w:r>
+    </w:p>
+    <w:p>
+      <w:r>
+        <w:t>При натискане на бутона за чекиране се стартира 30-секунден таймер. Полето isCheckinActive в NfcHceService се задава на true, което позволява на услу</w:t>
+      </w:r>
+      <w:r>
+        <w:t>гата да отговаря на NFC четеца</w:t>
+      </w:r>
+      <w:r>
+        <w:rPr>
+          <w:lang w:val="en-US"/>
+        </w:rPr>
+        <w:t xml:space="preserve"> (</w:t>
+      </w:r>
+      <w:r>
+        <w:t>фиг. 13</w:t>
+      </w:r>
+      <w:r>
+        <w:rPr>
+          <w:lang w:val="en-US"/>
+        </w:rPr>
+        <w:t>)</w:t>
+      </w:r>
+      <w:r>
+        <w:t>.</w:t>
+      </w:r>
+      <w:r>
+        <w:t xml:space="preserve"> </w:t>
+      </w:r>
+      <w:r>
+        <w:t>Ако таймерът изтече преди успешно чекиране, се показва анимацията за неуспех.</w:t>
+      </w:r>
+    </w:p>
+    <w:p>
+      <w:pPr>
+        <w:pStyle w:val="ad"/>
+      </w:pPr>
+      <w:r>
+        <w:drawing>
+          <wp:inline distT="0" distB="0" distL="0" distR="0" wp14:anchorId="3D592A48" wp14:editId="4FB3D462">
+            <wp:extent cx="4053840" cy="4460920"/>
+            <wp:effectExtent l="0" t="0" r="3810" b="0"/>
+            <wp:docPr id="21" name="Картина 21"/>
+            <wp:cNvGraphicFramePr>
+              <a:graphicFrameLocks xmlns:a="http://schemas.openxmlformats.org/drawingml/2006/main" noChangeAspect="1"/>
+            </wp:cNvGraphicFramePr>
+            <a:graphic xmlns:a="http://schemas.openxmlformats.org/drawingml/2006/main">
+              <a:graphicData uri="http://schemas.openxmlformats.org/drawingml/2006/picture">
+                <pic:pic xmlns:pic="http://schemas.openxmlformats.org/drawingml/2006/picture">
+                  <pic:nvPicPr>
+                    <pic:cNvPr id="1" name=""/>
+                    <pic:cNvPicPr/>
+                  </pic:nvPicPr>
+                  <pic:blipFill>
+                    <a:blip r:embed="rId22"/>
+                    <a:stretch>
+                      <a:fillRect/>
+                    </a:stretch>
+                  </pic:blipFill>
+                  <pic:spPr>
+                    <a:xfrm>
+                      <a:off x="0" y="0"/>
+                      <a:ext cx="4117356" cy="4530815"/>
+                    </a:xfrm>
+                    <a:prstGeom prst="rect">
+                      <a:avLst/>
+                    </a:prstGeom>
+                  </pic:spPr>
+                </pic:pic>
+              </a:graphicData>
+            </a:graphic>
+          </wp:inline>
+        </w:drawing>
+      </w:r>
+      <w:r>
+        <w:t xml:space="preserve"> </w:t>
+      </w:r>
+    </w:p>
+    <w:p>
+      <w:pPr>
+        <w:pStyle w:val="ad"/>
+        <w:rPr>
+          <w:i w:val="0"/>
+        </w:rPr>
+      </w:pPr>
+      <w:r>
+        <w:rPr>
+          <w:b/>
+          <w:i w:val="0"/>
+        </w:rPr>
+        <w:t>Фиг. 13.</w:t>
+      </w:r>
+      <w:r>
+        <w:rPr>
+          <w:i w:val="0"/>
+        </w:rPr>
+        <w:t xml:space="preserve"> Стартиране на сесия за чекиране</w:t>
+      </w:r>
+    </w:p>
+    <w:p>
+      <w:r>
+        <w:lastRenderedPageBreak/>
+        <w:t>Методите onResu</w:t>
+      </w:r>
+      <w:r>
+        <w:t>me() и onPause() се извикват при показване и излизане (или скриване)</w:t>
+      </w:r>
+      <w:r>
+        <w:t xml:space="preserve"> на екрана. В onResume() се задават два callback-а към NfcHceService: единият за успешно чекиране,</w:t>
+      </w:r>
+      <w:r>
+        <w:t xml:space="preserve"> а</w:t>
+      </w:r>
+      <w:r>
+        <w:t xml:space="preserve"> другият за грешка. В onPause() таймерът се спира, с</w:t>
+      </w:r>
+      <w:r>
+        <w:t>есията се деактивира и колбец</w:t>
+      </w:r>
+      <w:r>
+        <w:t>ите се изчистват.</w:t>
+      </w:r>
+    </w:p>
+    <w:p>
+      <w:pPr>
+        <w:pStyle w:val="3"/>
+        <w:numPr>
+          <w:ilvl w:val="1"/>
+          <w:numId w:val="49"/>
+        </w:numPr>
+      </w:pPr>
+      <w:r>
+        <w:t>Клас NfcHceService</w:t>
+      </w:r>
+    </w:p>
+    <w:p>
+      <w:r>
+        <w:t xml:space="preserve">NfcHceService наследява HostApduService и реализира виртуалната NFC карта. </w:t>
+      </w:r>
+      <w:r>
+        <w:rPr>
+          <w:szCs w:val="24"/>
+        </w:rPr>
+        <w:t>Това</w:t>
+      </w:r>
+      <w:r>
+        <w:rPr>
+          <w:szCs w:val="24"/>
+        </w:rPr>
+        <w:t xml:space="preserve"> е</w:t>
+      </w:r>
+      <w:r>
+        <w:rPr>
+          <w:szCs w:val="24"/>
+        </w:rPr>
+        <w:t xml:space="preserve"> и може би</w:t>
+      </w:r>
+      <w:r>
+        <w:rPr>
+          <w:szCs w:val="24"/>
+        </w:rPr>
+        <w:t xml:space="preserve"> най-важният</w:t>
+      </w:r>
+      <w:r>
+        <w:rPr>
+          <w:szCs w:val="24"/>
+        </w:rPr>
+        <w:t xml:space="preserve"> и интересен</w:t>
+      </w:r>
+      <w:r>
+        <w:rPr>
+          <w:szCs w:val="24"/>
+        </w:rPr>
+        <w:t xml:space="preserve"> компонент на приложението.</w:t>
+      </w:r>
+      <w:r>
+        <w:rPr>
+          <w:szCs w:val="24"/>
+        </w:rPr>
+        <w:t xml:space="preserve"> </w:t>
+      </w:r>
+      <w:r>
+        <w:t xml:space="preserve">Услугата работи </w:t>
+      </w:r>
+      <w:r>
+        <w:t>при отворено приложение и активиран таймер за чекиране (натиснат е бутона „Чекирай се“ при което започва да тече 30-секундния диапазон)</w:t>
+      </w:r>
+      <w:r>
+        <w:t>. Три полета в companion object управляват комуникацията с HomeActi</w:t>
+      </w:r>
+      <w:r>
+        <w:t xml:space="preserve">vity. Единият от тях е </w:t>
+      </w:r>
+      <w:r>
+        <w:t>isCheckinActive</w:t>
+      </w:r>
+      <w:r>
+        <w:t>. Той</w:t>
+      </w:r>
+      <w:r>
+        <w:t xml:space="preserve"> контролира д</w:t>
+      </w:r>
+      <w:r>
+        <w:t>али услугата отговаря на четеца.</w:t>
+      </w:r>
+      <w:r>
+        <w:t xml:space="preserve"> tapCallback се извиква при успешно чекиране, а failureCallback при прекъсната NFC връзка.</w:t>
+      </w:r>
+    </w:p>
+    <w:p>
+      <w:r>
+        <w:t>Методът processCommandApdu() се извиква от Android OS при всяка входяща APDU команда. Първата</w:t>
+      </w:r>
+      <w:r>
+        <w:t xml:space="preserve"> проверка е за isCheckinActive -</w:t>
+      </w:r>
+      <w:r>
+        <w:t xml:space="preserve"> ако сесията не е активна, услугата връща SW_NOT_F</w:t>
+      </w:r>
+      <w:r>
+        <w:t>OUND и не изпраща данни. Това е основна защита, без която</w:t>
       </w:r>
       <w:bookmarkStart w:id="9" w:name="_GoBack"/>
       <w:bookmarkEnd w:id="9"/>
       <w:r>
+        <w:t xml:space="preserve"> всеки NFC четец с правилния AID би получил payload без знанието на студента:</w:t>
+      </w:r>
+      <w:r>
+        <w:br w:type="page"/>
+      </w:r>
+    </w:p>
+    <w:p>
+      <w:pPr>
+        <w:spacing w:line="259" w:lineRule="auto"/>
+        <w:ind w:firstLine="0"/>
+        <w:jc w:val="left"/>
+      </w:pPr>
+      <w:r>
+        <w:lastRenderedPageBreak/>
         <w:br w:type="page"/>
       </w:r>
     </w:p>
@@ -10447,6 +11787,23 @@
       <w:color w:val="808080"/>
     </w:rPr>
   </w:style>
+  <w:style w:type="paragraph" w:styleId="ad">
+    <w:name w:val="No Spacing"/>
+    <w:uiPriority w:val="1"/>
+    <w:qFormat/>
+    <w:rsid w:val="00C37686"/>
+    <w:pPr>
+      <w:spacing w:before="80" w:line="360" w:lineRule="auto"/>
+      <w:jc w:val="center"/>
+    </w:pPr>
+    <w:rPr>
+      <w:rFonts w:ascii="Times New Roman" w:hAnsi="Times New Roman" w:cs="Times New Roman"/>
+      <w:i/>
+      <w:color w:val="000000"/>
+      <w:sz w:val="24"/>
+      <w:lang w:eastAsia="bg-BG"/>
+    </w:rPr>
+  </w:style>
 </w:styles>
 </file>
 
@@ -10489,21 +11846,21 @@
     <w:charset w:val="00"/>
     <w:family w:val="swiss"/>
     <w:pitch w:val="variable"/>
-    <w:sig w:usb0="E00002FF" w:usb1="4000ACFF" w:usb2="00000001" w:usb3="00000000" w:csb0="0000019F" w:csb1="00000000"/>
+    <w:sig w:usb0="E0002AFF" w:usb1="4000ACFF" w:usb2="00000001" w:usb3="00000000" w:csb0="000001FF" w:csb1="00000000"/>
   </w:font>
   <w:font w:name="Calibri Light">
     <w:panose1 w:val="020F0302020204030204"/>
     <w:charset w:val="00"/>
     <w:family w:val="swiss"/>
     <w:pitch w:val="variable"/>
-    <w:sig w:usb0="A00002EF" w:usb1="4000207B" w:usb2="00000000" w:usb3="00000000" w:csb0="0000009F" w:csb1="00000000"/>
+    <w:sig w:usb0="A0002AEF" w:usb1="4000207B" w:usb2="00000000" w:usb3="00000000" w:csb0="000001FF" w:csb1="00000000"/>
   </w:font>
   <w:font w:name="Cambria">
     <w:panose1 w:val="02040503050406030204"/>
-    <w:charset w:val="00"/>
+    <w:charset w:val="CC"/>
     <w:family w:val="roman"/>
     <w:pitch w:val="variable"/>
-    <w:sig w:usb0="A00002EF" w:usb1="4000004B" w:usb2="00000000" w:usb3="00000000" w:csb0="0000009F" w:csb1="00000000"/>
+    <w:sig w:usb0="A00002EF" w:usb1="4000004B" w:usb2="00000000" w:usb3="00000000" w:csb0="0000019F" w:csb1="00000000"/>
   </w:font>
   <w:font w:name="Bahnschrift">
     <w:panose1 w:val="020B0502040204020203"/>
@@ -10538,7 +11895,7 @@
   </w:compat>
   <w:rsids>
     <w:rsidRoot w:val="00EA5473"/>
-    <w:rsid w:val="00444EA8"/>
+    <w:rsid w:val="000923EC"/>
     <w:rsid w:val="00EA5473"/>
   </w:rsids>
   <m:mathPr>
@@ -11269,7 +12626,7 @@
 </file>
 
 <file path=customXml/itemProps1.xml><?xml version="1.0" encoding="utf-8"?>
-<ds:datastoreItem xmlns:ds="http://schemas.openxmlformats.org/officeDocument/2006/customXml" ds:itemID="{D2B1E72F-EF9B-4798-880B-A87E2D3F2492}">
+<ds:datastoreItem xmlns:ds="http://schemas.openxmlformats.org/officeDocument/2006/customXml" ds:itemID="{AC674F9D-4935-4BFA-8365-04B185E3FA14}">
   <ds:schemaRefs>
     <ds:schemaRef ds:uri="http://schemas.openxmlformats.org/officeDocument/2006/bibliography"/>
   </ds:schemaRefs>

</xml_diff>

<commit_message>
Finished head 4 of the documentation. Updated toast timeout in app.js
</commit_message>
<xml_diff>
--- a/Дипломна_работа_Мартин_Дамянов.docx
+++ b/Дипломна_работа_Мартин_Дамянов.docx
@@ -8008,17 +8008,1279 @@
       </w:r>
     </w:p>
     <w:p>
+      <w:r>
+        <w:t xml:space="preserve">Освен /checkin, файлът attendance.py съдържа още четири endpoint-а. </w:t>
+      </w:r>
+    </w:p>
+    <w:p>
+      <w:r>
+        <w:t>GET /attendance връща списък с при</w:t>
+      </w:r>
+      <w:r>
+        <w:t xml:space="preserve">съствия с търсене и </w:t>
+      </w:r>
+      <w:r>
+        <w:rPr>
+          <w:lang w:val="en-US"/>
+        </w:rPr>
+        <w:t>pagination</w:t>
+      </w:r>
+      <w:r>
+        <w:t>.</w:t>
+      </w:r>
+      <w:r>
+        <w:t xml:space="preserve"> </w:t>
+      </w:r>
+      <w:r>
+        <w:t xml:space="preserve">Ролята на влезлия </w:t>
+      </w:r>
+      <w:r>
+        <w:t>потребител определя какво вижда -</w:t>
+      </w:r>
+      <w:r>
+        <w:t xml:space="preserve"> студентите виждат само собстве</w:t>
+      </w:r>
+      <w:r>
+        <w:t xml:space="preserve">ните си записи, </w:t>
+      </w:r>
+      <w:r>
+        <w:t>преподавателите</w:t>
+      </w:r>
+      <w:r>
+        <w:t xml:space="preserve"> виждат присъствията на студентите в преподаваните от тях занятия, а администраторите виждат всички присъствия</w:t>
+      </w:r>
+      <w:r>
+        <w:t xml:space="preserve">. Резултатът съдържа общия брой записи и текущата страница, което позволява на уеб интерфейса </w:t>
+      </w:r>
+      <w:r>
+        <w:t>да извежда информацията на отделни страници</w:t>
+      </w:r>
+      <w:r>
+        <w:t>.</w:t>
+      </w:r>
+    </w:p>
+    <w:p>
+      <w:r>
+        <w:t>POST /attendance п</w:t>
+      </w:r>
+      <w:r>
+        <w:t xml:space="preserve">озволява на преподаватели и администратори да добавят присъствие ръчно. Приема студент, занятие, дата и статус. Преди запис се проверява дали преподавателят </w:t>
+      </w:r>
+      <w:r>
+        <w:t>е свързан с посоченото занятие. А</w:t>
+      </w:r>
+      <w:r>
+        <w:t>ко не е, получава грешка HTTP 403. Проверява се също дали студентът вече има присъствие за същото занятие на същата дата. За разлика от автоматичното чекиране, тук полето recorded_by се попълва с потребителс</w:t>
+      </w:r>
+      <w:r>
+        <w:t>кото име на преподавателя</w:t>
+      </w:r>
+      <w:r>
+        <w:t>.</w:t>
+      </w:r>
+    </w:p>
+    <w:p>
+      <w:r>
+        <w:lastRenderedPageBreak/>
+        <w:t>PATCH /att</w:t>
+      </w:r>
+      <w:r>
+        <w:t>endance/{id} променя</w:t>
+      </w:r>
+      <w:r>
+        <w:t xml:space="preserve"> статуса на съществуващ запис. Преподавателят може да промени само записи, които той самият е създал или са записани автоматично от системата. Не може да</w:t>
+      </w:r>
+      <w:r>
+        <w:t xml:space="preserve"> се</w:t>
+      </w:r>
+      <w:r>
+        <w:t xml:space="preserve"> променя</w:t>
+      </w:r>
+      <w:r>
+        <w:t>т</w:t>
+      </w:r>
+      <w:r>
+        <w:t xml:space="preserve"> записи, въведени от друг преподавател или админист</w:t>
+      </w:r>
+      <w:r>
+        <w:t>ратор. Администраторът няма ограничения</w:t>
+      </w:r>
+      <w:r>
+        <w:t>.</w:t>
+      </w:r>
+    </w:p>
+    <w:p>
+      <w:r>
+        <w:t xml:space="preserve">DELETE /attendance/{id} </w:t>
+      </w:r>
+      <w:r>
+        <w:t>и</w:t>
+      </w:r>
+      <w:r>
+        <w:t xml:space="preserve">зтрива запис за присъствие. Преподавателят може да изтрие само записи </w:t>
+      </w:r>
+      <w:r>
+        <w:t>за занятия, които той води,</w:t>
+      </w:r>
+      <w:r>
+        <w:t xml:space="preserve"> само ако записът е създаден от него или автоматично от системата. Администраторът</w:t>
+      </w:r>
+      <w:r>
+        <w:t xml:space="preserve"> може да </w:t>
+      </w:r>
+      <w:r>
+        <w:t>трие</w:t>
+      </w:r>
+      <w:r>
+        <w:t xml:space="preserve"> всеки запис.</w:t>
+      </w:r>
+    </w:p>
+    <w:p>
+      <w:pPr>
+        <w:pStyle w:val="3"/>
+        <w:numPr>
+          <w:ilvl w:val="1"/>
+          <w:numId w:val="14"/>
+        </w:numPr>
+      </w:pPr>
+      <w:r>
+        <w:rPr>
+          <w:lang w:val="en-US"/>
+        </w:rPr>
+        <w:t>administration.py</w:t>
+      </w:r>
+    </w:p>
+    <w:p>
+      <w:r>
+        <w:t xml:space="preserve">Файлът </w:t>
+      </w:r>
+      <w:r>
+        <w:t>съдържа endpoint-ите за управление на учебния процес: дисциплини, учебен план, разписание и групи. Всички endpoint-и изискват администраторски права. За всеки обект в системата са реализирани операции за създаване, реда</w:t>
+      </w:r>
+      <w:r>
+        <w:t xml:space="preserve">кция и в някои случаи изтриване. За пример на фиг. 26 е даден </w:t>
+      </w:r>
+      <w:r>
+        <w:rPr>
+          <w:lang w:val="en-US"/>
+        </w:rPr>
+        <w:t>endpoint</w:t>
+      </w:r>
+      <w:r>
+        <w:t>-а за създаване на дисциплина, к</w:t>
+      </w:r>
+      <w:r>
+        <w:t>ато функциите за управление на другите о</w:t>
+      </w:r>
+      <w:r>
+        <w:t xml:space="preserve">бекти на системата са аналогични и </w:t>
+      </w:r>
+      <w:r>
+        <w:t>следват същата струк</w:t>
+      </w:r>
+      <w:r>
+        <w:t>тура, като се различават</w:t>
+      </w:r>
+      <w:r>
+        <w:t xml:space="preserve"> по </w:t>
+      </w:r>
+      <w:r>
+        <w:t>таблицата, към която запис</w:t>
+      </w:r>
+      <w:r>
+        <w:t>ват, като</w:t>
+      </w:r>
+      <w:r>
+        <w:t xml:space="preserve"> проверките</w:t>
+      </w:r>
+      <w:r>
+        <w:t xml:space="preserve"> са специфични за съответния обект.</w:t>
+      </w:r>
+    </w:p>
+    <w:p>
+      <w:pPr>
+        <w:ind w:firstLine="0"/>
+      </w:pPr>
+      <w:r>
+        <w:drawing>
+          <wp:inline distT="0" distB="0" distL="0" distR="0" wp14:anchorId="194CE508" wp14:editId="24E07146">
+            <wp:extent cx="5760720" cy="1905635"/>
+            <wp:effectExtent l="0" t="0" r="0" b="0"/>
+            <wp:docPr id="35" name="Картина 35"/>
+            <wp:cNvGraphicFramePr>
+              <a:graphicFrameLocks xmlns:a="http://schemas.openxmlformats.org/drawingml/2006/main" noChangeAspect="1"/>
+            </wp:cNvGraphicFramePr>
+            <a:graphic xmlns:a="http://schemas.openxmlformats.org/drawingml/2006/main">
+              <a:graphicData uri="http://schemas.openxmlformats.org/drawingml/2006/picture">
+                <pic:pic xmlns:pic="http://schemas.openxmlformats.org/drawingml/2006/picture">
+                  <pic:nvPicPr>
+                    <pic:cNvPr id="1" name=""/>
+                    <pic:cNvPicPr/>
+                  </pic:nvPicPr>
+                  <pic:blipFill>
+                    <a:blip r:embed="rId35"/>
+                    <a:stretch>
+                      <a:fillRect/>
+                    </a:stretch>
+                  </pic:blipFill>
+                  <pic:spPr>
+                    <a:xfrm>
+                      <a:off x="0" y="0"/>
+                      <a:ext cx="5760720" cy="1905635"/>
+                    </a:xfrm>
+                    <a:prstGeom prst="rect">
+                      <a:avLst/>
+                    </a:prstGeom>
+                  </pic:spPr>
+                </pic:pic>
+              </a:graphicData>
+            </a:graphic>
+          </wp:inline>
+        </w:drawing>
+      </w:r>
+    </w:p>
+    <w:p>
+      <w:pPr>
+        <w:pStyle w:val="ad"/>
+      </w:pPr>
+      <w:r>
+        <w:rPr>
+          <w:b/>
+        </w:rPr>
+        <w:t>Фиг.</w:t>
+      </w:r>
+      <w:r>
+        <w:rPr>
+          <w:b/>
+        </w:rPr>
+        <w:t xml:space="preserve"> 26.</w:t>
+      </w:r>
+      <w:r>
+        <w:t xml:space="preserve"> </w:t>
+      </w:r>
+      <w:r>
+        <w:t>Endpoint</w:t>
+      </w:r>
+      <w:r>
+        <w:t xml:space="preserve"> за с</w:t>
+      </w:r>
+      <w:r>
+        <w:t>ъздаване на дисциплина</w:t>
+      </w:r>
+    </w:p>
+    <w:p>
+      <w:pPr>
+        <w:pStyle w:val="3"/>
+        <w:numPr>
+          <w:ilvl w:val="1"/>
+          <w:numId w:val="14"/>
+        </w:numPr>
+      </w:pPr>
+      <w:r>
+        <w:rPr>
+          <w:lang w:val="en-US"/>
+        </w:rPr>
+        <w:t>main.py</w:t>
+      </w:r>
+    </w:p>
+    <w:p>
+      <w:r>
+        <w:t>Това е файлът, от който се стартира сървърът</w:t>
+      </w:r>
+      <w:r>
+        <w:t>. Конфигурира CORS за достъп от браузъра, регистрира трите рутера с техните URL префикси и монтира статичните файлове на уеб интерфейса. При стартиране автоматично с</w:t>
+      </w:r>
+      <w:r>
+        <w:t>ъздава таблиците в базата данни. Част от файла е изложена на фиг. 27.</w:t>
+      </w:r>
+    </w:p>
+    <w:p>
+      <w:pPr>
+        <w:pStyle w:val="ad"/>
+      </w:pPr>
+      <w:r>
+        <w:lastRenderedPageBreak/>
+        <w:drawing>
+          <wp:inline distT="0" distB="0" distL="0" distR="0" wp14:anchorId="716BE6CC" wp14:editId="07105EA4">
+            <wp:extent cx="4549140" cy="2808398"/>
+            <wp:effectExtent l="0" t="0" r="3810" b="0"/>
+            <wp:docPr id="36" name="Картина 36"/>
+            <wp:cNvGraphicFramePr>
+              <a:graphicFrameLocks xmlns:a="http://schemas.openxmlformats.org/drawingml/2006/main" noChangeAspect="1"/>
+            </wp:cNvGraphicFramePr>
+            <a:graphic xmlns:a="http://schemas.openxmlformats.org/drawingml/2006/main">
+              <a:graphicData uri="http://schemas.openxmlformats.org/drawingml/2006/picture">
+                <pic:pic xmlns:pic="http://schemas.openxmlformats.org/drawingml/2006/picture">
+                  <pic:nvPicPr>
+                    <pic:cNvPr id="1" name=""/>
+                    <pic:cNvPicPr/>
+                  </pic:nvPicPr>
+                  <pic:blipFill>
+                    <a:blip r:embed="rId36"/>
+                    <a:stretch>
+                      <a:fillRect/>
+                    </a:stretch>
+                  </pic:blipFill>
+                  <pic:spPr>
+                    <a:xfrm>
+                      <a:off x="0" y="0"/>
+                      <a:ext cx="4586018" cy="2831164"/>
+                    </a:xfrm>
+                    <a:prstGeom prst="rect">
+                      <a:avLst/>
+                    </a:prstGeom>
+                  </pic:spPr>
+                </pic:pic>
+              </a:graphicData>
+            </a:graphic>
+          </wp:inline>
+        </w:drawing>
+      </w:r>
+    </w:p>
+    <w:p>
+      <w:pPr>
+        <w:pStyle w:val="ad"/>
+      </w:pPr>
+      <w:r>
+        <w:rPr>
+          <w:b/>
+        </w:rPr>
+        <w:t>Фиг. 27.</w:t>
+      </w:r>
+      <w:r>
+        <w:t xml:space="preserve"> Конфигурация на FastAPI </w:t>
+      </w:r>
+      <w:r>
+        <w:t xml:space="preserve">в main.py </w:t>
+      </w:r>
+    </w:p>
+    <w:p>
+      <w:pPr>
+        <w:pStyle w:val="2"/>
+        <w:numPr>
+          <w:ilvl w:val="0"/>
+          <w:numId w:val="14"/>
+        </w:numPr>
+      </w:pPr>
+      <w:r>
+        <w:t>Уеб интерфейс</w:t>
+      </w:r>
+    </w:p>
+    <w:p>
+      <w:r>
+        <w:t>Уеб интерфейсът е реализиран с Vanilla JavaScript и с</w:t>
+      </w:r>
+      <w:r>
+        <w:t xml:space="preserve">е състои от три файла - </w:t>
+      </w:r>
+      <w:r>
+        <w:t xml:space="preserve">index.html (структура на страницата), styles.css (визия) и app.js (логика). FastAPI </w:t>
+      </w:r>
+      <w:r>
+        <w:t>доставя</w:t>
+      </w:r>
+      <w:r>
+        <w:t xml:space="preserve"> тези файлове директно</w:t>
+      </w:r>
+      <w:r>
+        <w:t xml:space="preserve"> (статично зареждане)</w:t>
+      </w:r>
+      <w:r>
+        <w:t xml:space="preserve">, без нужда от отделен уеб сървър. Целият код на интерфейса се съдържа в app.js и е </w:t>
+      </w:r>
+      <w:r>
+        <w:t>разделен на</w:t>
+      </w:r>
+      <w:r>
+        <w:t xml:space="preserve"> няколко логически части.</w:t>
+      </w:r>
+    </w:p>
+    <w:p>
+      <w:pPr>
+        <w:pStyle w:val="3"/>
+        <w:numPr>
+          <w:ilvl w:val="1"/>
+          <w:numId w:val="14"/>
+        </w:numPr>
+      </w:pPr>
+      <w:r>
+        <w:t>Глобално състояние</w:t>
+      </w:r>
+    </w:p>
+    <w:p>
+      <w:r>
+        <w:t>Всички данни, заредени от сървъра, се пазят в един глобален обект S</w:t>
+      </w:r>
+      <w:r>
+        <w:t xml:space="preserve"> (фиг. 28)</w:t>
+      </w:r>
+      <w:r>
+        <w:t xml:space="preserve">. Той съдържа JWT токена, ролята и потребителското </w:t>
+      </w:r>
+      <w:r>
+        <w:t>име на влезналия</w:t>
+      </w:r>
+      <w:r>
+        <w:t xml:space="preserve"> потребител, списъците с</w:t>
+      </w:r>
+      <w:r>
+        <w:t>ъс</w:t>
+      </w:r>
+      <w:r>
+        <w:t xml:space="preserve"> студенти, преподаватели, групи, дисциплини, учебен план и разписание, текущата страница за всеки списък и параметрите за търс</w:t>
+      </w:r>
+      <w:r>
+        <w:t>ене в регистъра на присъствията.</w:t>
+      </w:r>
+    </w:p>
+    <w:p>
+      <w:pPr>
+        <w:pStyle w:val="ad"/>
+      </w:pPr>
+      <w:r>
+        <w:drawing>
+          <wp:inline distT="0" distB="0" distL="0" distR="0" wp14:anchorId="4B9E1182" wp14:editId="09630294">
+            <wp:extent cx="5385604" cy="1531620"/>
+            <wp:effectExtent l="0" t="0" r="5715" b="0"/>
+            <wp:docPr id="37" name="Картина 37"/>
+            <wp:cNvGraphicFramePr>
+              <a:graphicFrameLocks xmlns:a="http://schemas.openxmlformats.org/drawingml/2006/main" noChangeAspect="1"/>
+            </wp:cNvGraphicFramePr>
+            <a:graphic xmlns:a="http://schemas.openxmlformats.org/drawingml/2006/main">
+              <a:graphicData uri="http://schemas.openxmlformats.org/drawingml/2006/picture">
+                <pic:pic xmlns:pic="http://schemas.openxmlformats.org/drawingml/2006/picture">
+                  <pic:nvPicPr>
+                    <pic:cNvPr id="1" name=""/>
+                    <pic:cNvPicPr/>
+                  </pic:nvPicPr>
+                  <pic:blipFill>
+                    <a:blip r:embed="rId37"/>
+                    <a:stretch>
+                      <a:fillRect/>
+                    </a:stretch>
+                  </pic:blipFill>
+                  <pic:spPr>
+                    <a:xfrm>
+                      <a:off x="0" y="0"/>
+                      <a:ext cx="5423357" cy="1542357"/>
+                    </a:xfrm>
+                    <a:prstGeom prst="rect">
+                      <a:avLst/>
+                    </a:prstGeom>
+                  </pic:spPr>
+                </pic:pic>
+              </a:graphicData>
+            </a:graphic>
+          </wp:inline>
+        </w:drawing>
+      </w:r>
+    </w:p>
+    <w:p>
+      <w:pPr>
+        <w:pStyle w:val="ad"/>
+      </w:pPr>
+      <w:r>
+        <w:rPr>
+          <w:b/>
+        </w:rPr>
+        <w:t>Фиг. 28.</w:t>
+      </w:r>
+      <w:r>
+        <w:t xml:space="preserve"> </w:t>
+      </w:r>
+      <w:r>
+        <w:t>Глобален обект за съхранение на данните</w:t>
+      </w:r>
+    </w:p>
+    <w:p>
+      <w:pPr>
+        <w:pStyle w:val="3"/>
+        <w:numPr>
+          <w:ilvl w:val="1"/>
+          <w:numId w:val="14"/>
+        </w:numPr>
+      </w:pPr>
+      <w:r>
+        <w:lastRenderedPageBreak/>
+        <w:t xml:space="preserve">Функция </w:t>
+      </w:r>
+      <w:r>
+        <w:rPr>
+          <w:lang w:val="en-US"/>
+        </w:rPr>
+        <w:t>api()</w:t>
+      </w:r>
+    </w:p>
+    <w:p>
+      <w:r>
+        <w:t>Всички заявки към сървъра минават през функция</w:t>
+      </w:r>
+      <w:r>
+        <w:t>та</w:t>
+      </w:r>
+      <w:r>
+        <w:t xml:space="preserve"> api()</w:t>
+      </w:r>
+      <w:r>
+        <w:t>, показана на фиг. 29</w:t>
+      </w:r>
+      <w:r>
+        <w:t>. Тя приема HTTP метод, път, тяло на заявката и незадължителни параметри за търсене. Автоматично добавя JWT токена в заглавието на заявката и при грешка извлича съобщението от отговора на сървъра. Използват се относителни URL адреси, което означава, че интерфейсът работи на</w:t>
+      </w:r>
+      <w:r>
+        <w:t xml:space="preserve"> всеки адрес без промяна в кода.</w:t>
+      </w:r>
+    </w:p>
+    <w:p>
+      <w:pPr>
+        <w:pStyle w:val="ad"/>
+      </w:pPr>
+      <w:r>
+        <w:drawing>
+          <wp:inline distT="0" distB="0" distL="0" distR="0" wp14:anchorId="5DB3871B" wp14:editId="0CC849A9">
+            <wp:extent cx="5036649" cy="3406140"/>
+            <wp:effectExtent l="0" t="0" r="0" b="3810"/>
+            <wp:docPr id="38" name="Картина 38"/>
+            <wp:cNvGraphicFramePr>
+              <a:graphicFrameLocks xmlns:a="http://schemas.openxmlformats.org/drawingml/2006/main" noChangeAspect="1"/>
+            </wp:cNvGraphicFramePr>
+            <a:graphic xmlns:a="http://schemas.openxmlformats.org/drawingml/2006/main">
+              <a:graphicData uri="http://schemas.openxmlformats.org/drawingml/2006/picture">
+                <pic:pic xmlns:pic="http://schemas.openxmlformats.org/drawingml/2006/picture">
+                  <pic:nvPicPr>
+                    <pic:cNvPr id="1" name=""/>
+                    <pic:cNvPicPr/>
+                  </pic:nvPicPr>
+                  <pic:blipFill>
+                    <a:blip r:embed="rId38"/>
+                    <a:stretch>
+                      <a:fillRect/>
+                    </a:stretch>
+                  </pic:blipFill>
+                  <pic:spPr>
+                    <a:xfrm>
+                      <a:off x="0" y="0"/>
+                      <a:ext cx="5067645" cy="3427102"/>
+                    </a:xfrm>
+                    <a:prstGeom prst="rect">
+                      <a:avLst/>
+                    </a:prstGeom>
+                  </pic:spPr>
+                </pic:pic>
+              </a:graphicData>
+            </a:graphic>
+          </wp:inline>
+        </w:drawing>
+      </w:r>
+    </w:p>
+    <w:p>
+      <w:pPr>
+        <w:pStyle w:val="ad"/>
+      </w:pPr>
+      <w:r>
+        <w:rPr>
+          <w:b/>
+        </w:rPr>
+        <w:t>Фиг. 29.</w:t>
+      </w:r>
+      <w:r>
+        <w:t xml:space="preserve"> </w:t>
+      </w:r>
+      <w:r>
+        <w:t>Функция api() за комуникация със сървъра</w:t>
+      </w:r>
+    </w:p>
+    <w:p>
+      <w:pPr>
+        <w:pStyle w:val="3"/>
+        <w:numPr>
+          <w:ilvl w:val="1"/>
+          <w:numId w:val="14"/>
+        </w:numPr>
+      </w:pPr>
+      <w:r>
+        <w:t>Вход в системата</w:t>
+      </w:r>
+    </w:p>
+    <w:p>
+      <w:r>
+        <w:t>При зареждане на страницата се проверява дали в localStorage има запазен JWT токен от предишна сесия</w:t>
+      </w:r>
+      <w:r>
+        <w:t xml:space="preserve"> (фиг. 30)</w:t>
+      </w:r>
+      <w:r>
+        <w:t xml:space="preserve">. Ако токенът е валиден и не е изтекъл, потребителят директно влиза в системата без да въвежда отново потребителско </w:t>
+      </w:r>
+      <w:r>
+        <w:t>име и парола.</w:t>
+      </w:r>
+    </w:p>
+    <w:p>
+      <w:pPr>
+        <w:pStyle w:val="ad"/>
+      </w:pPr>
+      <w:r>
+        <w:drawing>
+          <wp:inline distT="0" distB="0" distL="0" distR="0" wp14:anchorId="450544FB" wp14:editId="2690C3C7">
+            <wp:extent cx="5176244" cy="1524000"/>
+            <wp:effectExtent l="0" t="0" r="5715" b="0"/>
+            <wp:docPr id="40" name="Картина 40"/>
+            <wp:cNvGraphicFramePr>
+              <a:graphicFrameLocks xmlns:a="http://schemas.openxmlformats.org/drawingml/2006/main" noChangeAspect="1"/>
+            </wp:cNvGraphicFramePr>
+            <a:graphic xmlns:a="http://schemas.openxmlformats.org/drawingml/2006/main">
+              <a:graphicData uri="http://schemas.openxmlformats.org/drawingml/2006/picture">
+                <pic:pic xmlns:pic="http://schemas.openxmlformats.org/drawingml/2006/picture">
+                  <pic:nvPicPr>
+                    <pic:cNvPr id="1" name=""/>
+                    <pic:cNvPicPr/>
+                  </pic:nvPicPr>
+                  <pic:blipFill>
+                    <a:blip r:embed="rId39"/>
+                    <a:stretch>
+                      <a:fillRect/>
+                    </a:stretch>
+                  </pic:blipFill>
+                  <pic:spPr>
+                    <a:xfrm>
+                      <a:off x="0" y="0"/>
+                      <a:ext cx="5413459" cy="1593841"/>
+                    </a:xfrm>
+                    <a:prstGeom prst="rect">
+                      <a:avLst/>
+                    </a:prstGeom>
+                  </pic:spPr>
+                </pic:pic>
+              </a:graphicData>
+            </a:graphic>
+          </wp:inline>
+        </w:drawing>
+      </w:r>
+    </w:p>
+    <w:p>
+      <w:pPr>
+        <w:pStyle w:val="ad"/>
+      </w:pPr>
+      <w:r>
+        <w:rPr>
+          <w:b/>
+        </w:rPr>
+        <w:t>Фиг.</w:t>
+      </w:r>
+      <w:r>
+        <w:rPr>
+          <w:b/>
+        </w:rPr>
+        <w:t xml:space="preserve"> </w:t>
+      </w:r>
+      <w:r>
+        <w:rPr>
+          <w:b/>
+        </w:rPr>
+        <w:t>30.</w:t>
+      </w:r>
+      <w:r>
+        <w:t xml:space="preserve"> </w:t>
+      </w:r>
+      <w:r>
+        <w:t>Автоматичен вход при зареждане на страницата</w:t>
+      </w:r>
+    </w:p>
+    <w:p>
+      <w:r>
+        <w:lastRenderedPageBreak/>
+        <w:t>Ако токенът е изтекъл или липсва, се показ</w:t>
+      </w:r>
+      <w:r>
+        <w:t>ва логин екранът.</w:t>
+      </w:r>
+      <w:r>
+        <w:t xml:space="preserve"> </w:t>
+      </w:r>
+      <w:r>
+        <w:t xml:space="preserve">Функцията doLogin() изпраща потребителското </w:t>
+      </w:r>
+      <w:r>
+        <w:t>име</w:t>
+      </w:r>
+      <w:r>
+        <w:t xml:space="preserve"> и паролата към /auth/login. При успех декодира JWT токена, за да</w:t>
+      </w:r>
+      <w:r>
+        <w:t xml:space="preserve"> извлече ролята и потребителското</w:t>
+      </w:r>
+      <w:r>
+        <w:t xml:space="preserve"> </w:t>
+      </w:r>
+      <w:r>
+        <w:rPr>
+          <w:lang w:val="en-US"/>
+        </w:rPr>
+        <w:t>id</w:t>
+      </w:r>
+      <w:r>
+        <w:t>, записва токена в localStorage и зарежда главния екран. Функцията parseJWT() декодира средната част на токена, която е Base64 кодирана и</w:t>
+      </w:r>
+      <w:r>
+        <w:t xml:space="preserve"> съдържа данните на потребителя</w:t>
+      </w:r>
+      <w:r>
+        <w:rPr>
+          <w:lang w:val="en-US"/>
+        </w:rPr>
+        <w:t xml:space="preserve">. </w:t>
+      </w:r>
+      <w:r>
+        <w:t>Тялото на</w:t>
+      </w:r>
+      <w:r>
+        <w:t xml:space="preserve"> функцията е показано на фиг. 31</w:t>
+      </w:r>
+      <w:r>
+        <w:t>.</w:t>
+      </w:r>
+    </w:p>
+    <w:p>
+      <w:pPr>
+        <w:pStyle w:val="ad"/>
+      </w:pPr>
+      <w:r>
+        <w:drawing>
+          <wp:inline distT="0" distB="0" distL="0" distR="0" wp14:anchorId="5B842190" wp14:editId="144BB650">
+            <wp:extent cx="5082540" cy="3289197"/>
+            <wp:effectExtent l="0" t="0" r="3810" b="6985"/>
+            <wp:docPr id="39" name="Картина 39"/>
+            <wp:cNvGraphicFramePr>
+              <a:graphicFrameLocks xmlns:a="http://schemas.openxmlformats.org/drawingml/2006/main" noChangeAspect="1"/>
+            </wp:cNvGraphicFramePr>
+            <a:graphic xmlns:a="http://schemas.openxmlformats.org/drawingml/2006/main">
+              <a:graphicData uri="http://schemas.openxmlformats.org/drawingml/2006/picture">
+                <pic:pic xmlns:pic="http://schemas.openxmlformats.org/drawingml/2006/picture">
+                  <pic:nvPicPr>
+                    <pic:cNvPr id="1" name=""/>
+                    <pic:cNvPicPr/>
+                  </pic:nvPicPr>
+                  <pic:blipFill>
+                    <a:blip r:embed="rId40"/>
+                    <a:stretch>
+                      <a:fillRect/>
+                    </a:stretch>
+                  </pic:blipFill>
+                  <pic:spPr>
+                    <a:xfrm>
+                      <a:off x="0" y="0"/>
+                      <a:ext cx="5090453" cy="3294318"/>
+                    </a:xfrm>
+                    <a:prstGeom prst="rect">
+                      <a:avLst/>
+                    </a:prstGeom>
+                  </pic:spPr>
+                </pic:pic>
+              </a:graphicData>
+            </a:graphic>
+          </wp:inline>
+        </w:drawing>
+      </w:r>
+      <w:r>
+        <w:t xml:space="preserve"> </w:t>
+      </w:r>
+    </w:p>
+    <w:p>
+      <w:pPr>
+        <w:pStyle w:val="ad"/>
+      </w:pPr>
+      <w:r>
+        <w:rPr>
+          <w:b/>
+        </w:rPr>
+        <w:t>Фиг.</w:t>
+      </w:r>
+      <w:r>
+        <w:rPr>
+          <w:b/>
+        </w:rPr>
+        <w:t xml:space="preserve"> 31</w:t>
+      </w:r>
+      <w:r>
+        <w:t>.</w:t>
+      </w:r>
+      <w:r>
+        <w:t xml:space="preserve"> Вход с декодиране на JWT токен</w:t>
+      </w:r>
+    </w:p>
+    <w:p>
+      <w:pPr>
+        <w:pStyle w:val="3"/>
+        <w:numPr>
+          <w:ilvl w:val="1"/>
+          <w:numId w:val="14"/>
+        </w:numPr>
+      </w:pPr>
+      <w:r>
+        <w:t>Навигация и страничен панел</w:t>
+      </w:r>
+    </w:p>
+    <w:p>
+      <w:r>
+        <w:t xml:space="preserve">След успешен вход функцията initApp() скрива логин екрана, показва </w:t>
+      </w:r>
+      <w:r>
+        <w:t>основния</w:t>
+      </w:r>
+      <w:r>
+        <w:t xml:space="preserve"> интерфейс и изгражда страничния панел според ролята на потребителя. Конфигурацията на панела е дефинирана в обекта SIDEBAR_CFG</w:t>
+      </w:r>
+      <w:r>
+        <w:t xml:space="preserve"> (фиг. 32)</w:t>
+      </w:r>
+      <w:r>
+        <w:t>, който съдържа различни елементи за всяка роля. Администраторът вижда всички секции, преподавателят вижда само разписанието и присъствията</w:t>
+      </w:r>
+      <w:r>
+        <w:t xml:space="preserve"> в неговите занятия</w:t>
+      </w:r>
+      <w:r>
+        <w:t>, а студентът вижда</w:t>
+      </w:r>
+      <w:r>
+        <w:t xml:space="preserve"> само собствените си присъствия.</w:t>
+      </w:r>
+    </w:p>
+    <w:p>
+      <w:r>
+        <w:t xml:space="preserve">Функцията nav() </w:t>
+      </w:r>
+      <w:r>
+        <w:t xml:space="preserve">на фиг. 33 </w:t>
+      </w:r>
+      <w:r>
+        <w:t>се извиква при избор на елемент от панела. Тя скрива всички секции, показва избраната и извиква съответната функция за зареждане на данните. Всяка секция има своя render функция, която се търси в обек</w:t>
+      </w:r>
+      <w:r>
+        <w:t xml:space="preserve">т по </w:t>
+      </w:r>
+      <w:r>
+        <w:rPr>
+          <w:lang w:val="en-US"/>
+        </w:rPr>
+        <w:t>id</w:t>
+      </w:r>
+      <w:r>
+        <w:t xml:space="preserve"> на секцията.</w:t>
+      </w:r>
+    </w:p>
+    <w:p>
+      <w:pPr>
+        <w:pStyle w:val="ad"/>
+      </w:pPr>
+      <w:r>
+        <w:lastRenderedPageBreak/>
+        <w:drawing>
+          <wp:inline distT="0" distB="0" distL="0" distR="0" wp14:anchorId="284D3D72" wp14:editId="475386F8">
+            <wp:extent cx="5318760" cy="3640818"/>
+            <wp:effectExtent l="0" t="0" r="0" b="0"/>
+            <wp:docPr id="41" name="Картина 41"/>
+            <wp:cNvGraphicFramePr>
+              <a:graphicFrameLocks xmlns:a="http://schemas.openxmlformats.org/drawingml/2006/main" noChangeAspect="1"/>
+            </wp:cNvGraphicFramePr>
+            <a:graphic xmlns:a="http://schemas.openxmlformats.org/drawingml/2006/main">
+              <a:graphicData uri="http://schemas.openxmlformats.org/drawingml/2006/picture">
+                <pic:pic xmlns:pic="http://schemas.openxmlformats.org/drawingml/2006/picture">
+                  <pic:nvPicPr>
+                    <pic:cNvPr id="1" name=""/>
+                    <pic:cNvPicPr/>
+                  </pic:nvPicPr>
+                  <pic:blipFill>
+                    <a:blip r:embed="rId41"/>
+                    <a:stretch>
+                      <a:fillRect/>
+                    </a:stretch>
+                  </pic:blipFill>
+                  <pic:spPr>
+                    <a:xfrm>
+                      <a:off x="0" y="0"/>
+                      <a:ext cx="5325278" cy="3645279"/>
+                    </a:xfrm>
+                    <a:prstGeom prst="rect">
+                      <a:avLst/>
+                    </a:prstGeom>
+                  </pic:spPr>
+                </pic:pic>
+              </a:graphicData>
+            </a:graphic>
+          </wp:inline>
+        </w:drawing>
+      </w:r>
+    </w:p>
+    <w:p>
+      <w:pPr>
+        <w:pStyle w:val="ad"/>
+      </w:pPr>
+      <w:r>
+        <w:rPr>
+          <w:b/>
+        </w:rPr>
+        <w:t>Фиг. 32.</w:t>
+      </w:r>
+      <w:r>
+        <w:t xml:space="preserve"> </w:t>
+      </w:r>
+      <w:r>
+        <w:t>Конфигурация на страничния панел по</w:t>
+      </w:r>
+      <w:r>
+        <w:t xml:space="preserve"> потребителска</w:t>
+      </w:r>
+      <w:r>
+        <w:t xml:space="preserve"> роля </w:t>
+      </w:r>
+    </w:p>
+    <w:p>
+      <w:pPr>
+        <w:pStyle w:val="ad"/>
+      </w:pPr>
+      <w:r>
+        <w:drawing>
+          <wp:inline distT="0" distB="0" distL="0" distR="0" wp14:anchorId="0F930B0B" wp14:editId="66234065">
+            <wp:extent cx="5304026" cy="2750820"/>
+            <wp:effectExtent l="0" t="0" r="0" b="0"/>
+            <wp:docPr id="42" name="Картина 42"/>
+            <wp:cNvGraphicFramePr>
+              <a:graphicFrameLocks xmlns:a="http://schemas.openxmlformats.org/drawingml/2006/main" noChangeAspect="1"/>
+            </wp:cNvGraphicFramePr>
+            <a:graphic xmlns:a="http://schemas.openxmlformats.org/drawingml/2006/main">
+              <a:graphicData uri="http://schemas.openxmlformats.org/drawingml/2006/picture">
+                <pic:pic xmlns:pic="http://schemas.openxmlformats.org/drawingml/2006/picture">
+                  <pic:nvPicPr>
+                    <pic:cNvPr id="1" name=""/>
+                    <pic:cNvPicPr/>
+                  </pic:nvPicPr>
+                  <pic:blipFill>
+                    <a:blip r:embed="rId42"/>
+                    <a:stretch>
+                      <a:fillRect/>
+                    </a:stretch>
+                  </pic:blipFill>
+                  <pic:spPr>
+                    <a:xfrm>
+                      <a:off x="0" y="0"/>
+                      <a:ext cx="5313712" cy="2755843"/>
+                    </a:xfrm>
+                    <a:prstGeom prst="rect">
+                      <a:avLst/>
+                    </a:prstGeom>
+                  </pic:spPr>
+                </pic:pic>
+              </a:graphicData>
+            </a:graphic>
+          </wp:inline>
+        </w:drawing>
+      </w:r>
+    </w:p>
+    <w:p>
+      <w:pPr>
+        <w:pStyle w:val="ad"/>
+      </w:pPr>
+      <w:r>
+        <w:rPr>
+          <w:b/>
+        </w:rPr>
+        <w:t>Фиг. 33.</w:t>
+      </w:r>
+      <w:r>
+        <w:t xml:space="preserve"> </w:t>
+      </w:r>
+      <w:r>
+        <w:t xml:space="preserve">Навигация между секциите </w:t>
+      </w:r>
+    </w:p>
+    <w:p>
+      <w:pPr>
+        <w:pStyle w:val="3"/>
+        <w:numPr>
+          <w:ilvl w:val="1"/>
+          <w:numId w:val="14"/>
+        </w:numPr>
+      </w:pPr>
+      <w:r>
+        <w:t>Зареждане на данни</w:t>
+      </w:r>
+    </w:p>
+    <w:p>
+      <w:r>
+        <w:t>При вход функцията loadRefData() зарежда едновре</w:t>
+      </w:r>
+      <w:r>
+        <w:t>менно всички списъци от сървъра -</w:t>
+      </w:r>
+      <w:r>
+        <w:t xml:space="preserve"> студенти, преподаватели, групи, дисциплини, учебен план и разписание. Заявките се изпращат едновременно чрез Promise.all(), което намалява времето за зареждане. Студентите не зареждат тези данн</w:t>
+      </w:r>
+      <w:r>
+        <w:t>и, тъй като нямат достъп до тях</w:t>
+      </w:r>
+      <w:r>
+        <w:br w:type="page"/>
+      </w:r>
+    </w:p>
+    <w:p>
+      <w:pPr>
+        <w:pStyle w:val="3"/>
+        <w:numPr>
+          <w:ilvl w:val="1"/>
+          <w:numId w:val="14"/>
+        </w:numPr>
+      </w:pPr>
+      <w:r>
+        <w:lastRenderedPageBreak/>
+        <w:t>Разделяне на страници</w:t>
+      </w:r>
+    </w:p>
+    <w:p>
+      <w:r>
+        <w:t xml:space="preserve">Уеб интерфейсът използва два вида </w:t>
+      </w:r>
+      <w:r>
+        <w:t>р</w:t>
+      </w:r>
+      <w:r>
+        <w:t>азделяне на страници</w:t>
+      </w:r>
+      <w:r>
+        <w:t xml:space="preserve"> </w:t>
+      </w:r>
+      <w:r>
+        <w:t xml:space="preserve">в зависимост от секцията. За студенти, преподаватели, групи, дисциплини, учебен план и разписание се използва клиентско </w:t>
+      </w:r>
+      <w:r>
+        <w:t>разделяне. В</w:t>
+      </w:r>
+      <w:r>
+        <w:t>сички данни се зареждат веднъж при вход и се разделят на страници локално. За регистъра на присъствията с</w:t>
+      </w:r>
+      <w:r>
+        <w:t>е използва сървърно разделяне</w:t>
+      </w:r>
+      <w:r>
+        <w:t>, тъй като записите могат да бъдат много на брой.</w:t>
+      </w:r>
+    </w:p>
+    <w:p>
+      <w:r>
+        <w:t>При клиентското разделяне</w:t>
+      </w:r>
+      <w:r>
+        <w:t xml:space="preserve"> функцията slicePage() връща само записите за текущата страница, а buildPag() изгражда бутоните за навигация. При тъ</w:t>
+      </w:r>
+      <w:r>
+        <w:t>рсене страницата се нулира до 1.</w:t>
+      </w:r>
+    </w:p>
+    <w:p>
+      <w:r>
+        <w:t xml:space="preserve">За регистъра на присъствията параметрите skip и limit се изпращат към сървъра при всяка промяна на страницата. Търсенето използва </w:t>
+      </w:r>
+      <w:r>
+        <w:t xml:space="preserve">кратко </w:t>
+      </w:r>
+      <w:r>
+        <w:t>закъснение преди изпращане на заявката, за да не се претоварва сървърът при всяк</w:t>
+      </w:r>
+      <w:r>
+        <w:t>о натиснато копче. Тази част от кода може да бъде видяна на фиг. 34.</w:t>
+      </w:r>
+    </w:p>
+    <w:p>
+      <w:pPr>
+        <w:pStyle w:val="ad"/>
+      </w:pPr>
+      <w:r>
+        <w:drawing>
+          <wp:inline distT="0" distB="0" distL="0" distR="0" wp14:anchorId="3CF7D690" wp14:editId="103A2D9A">
+            <wp:extent cx="5760720" cy="2350770"/>
+            <wp:effectExtent l="0" t="0" r="0" b="0"/>
+            <wp:docPr id="43" name="Картина 43"/>
+            <wp:cNvGraphicFramePr>
+              <a:graphicFrameLocks xmlns:a="http://schemas.openxmlformats.org/drawingml/2006/main" noChangeAspect="1"/>
+            </wp:cNvGraphicFramePr>
+            <a:graphic xmlns:a="http://schemas.openxmlformats.org/drawingml/2006/main">
+              <a:graphicData uri="http://schemas.openxmlformats.org/drawingml/2006/picture">
+                <pic:pic xmlns:pic="http://schemas.openxmlformats.org/drawingml/2006/picture">
+                  <pic:nvPicPr>
+                    <pic:cNvPr id="1" name=""/>
+                    <pic:cNvPicPr/>
+                  </pic:nvPicPr>
+                  <pic:blipFill>
+                    <a:blip r:embed="rId43"/>
+                    <a:stretch>
+                      <a:fillRect/>
+                    </a:stretch>
+                  </pic:blipFill>
+                  <pic:spPr>
+                    <a:xfrm>
+                      <a:off x="0" y="0"/>
+                      <a:ext cx="5760720" cy="2350770"/>
+                    </a:xfrm>
+                    <a:prstGeom prst="rect">
+                      <a:avLst/>
+                    </a:prstGeom>
+                  </pic:spPr>
+                </pic:pic>
+              </a:graphicData>
+            </a:graphic>
+          </wp:inline>
+        </w:drawing>
+      </w:r>
+    </w:p>
+    <w:p>
+      <w:pPr>
+        <w:pStyle w:val="ad"/>
+      </w:pPr>
+      <w:r>
+        <w:t>Фиг. 34. Разделяне на страници</w:t>
+      </w:r>
+      <w:r>
+        <w:t xml:space="preserve"> на регистъра на присъствия</w:t>
+      </w:r>
+    </w:p>
+    <w:p>
+      <w:pPr>
+        <w:pStyle w:val="3"/>
+        <w:numPr>
+          <w:ilvl w:val="1"/>
+          <w:numId w:val="14"/>
+        </w:numPr>
+      </w:pPr>
+      <w:r>
+        <w:t>Модален прозорец</w:t>
+      </w:r>
+    </w:p>
+    <w:p>
+      <w:r>
+        <w:t>За операции като добавяне и редакция на записи се използва един общ модален прозорец. Съдържанието му се попълва динамично при отваряне според операцията. Функцията</w:t>
+      </w:r>
+      <w:r>
+        <w:t xml:space="preserve"> </w:t>
+      </w:r>
+      <w:r>
+        <w:t>modalSubmit</w:t>
+      </w:r>
+      <w:r>
+        <w:t>() от фиг. 35</w:t>
+      </w:r>
+      <w:r>
+        <w:t xml:space="preserve"> записва в S.modalCallback и се извиква при натискане на бутона </w:t>
+      </w:r>
+      <w:r>
+        <w:t>„</w:t>
+      </w:r>
+      <w:r>
+        <w:t>Запази</w:t>
+      </w:r>
+      <w:r>
+        <w:t>“</w:t>
+      </w:r>
+      <w:r>
+        <w:t>. При грешка се показва toast съобщение, а мо</w:t>
+      </w:r>
+      <w:r>
+        <w:t>далният прозорец остава отворен</w:t>
+      </w:r>
+      <w:r>
+        <w:t>.</w:t>
+      </w:r>
+    </w:p>
+    <w:p>
+      <w:pPr>
+        <w:pStyle w:val="ad"/>
+      </w:pPr>
+      <w:r>
+        <w:lastRenderedPageBreak/>
+        <w:drawing>
+          <wp:inline distT="0" distB="0" distL="0" distR="0" wp14:anchorId="64C089AE" wp14:editId="39DEE9CC">
+            <wp:extent cx="3947160" cy="1224425"/>
+            <wp:effectExtent l="0" t="0" r="0" b="0"/>
+            <wp:docPr id="44" name="Картина 44"/>
+            <wp:cNvGraphicFramePr>
+              <a:graphicFrameLocks xmlns:a="http://schemas.openxmlformats.org/drawingml/2006/main" noChangeAspect="1"/>
+            </wp:cNvGraphicFramePr>
+            <a:graphic xmlns:a="http://schemas.openxmlformats.org/drawingml/2006/main">
+              <a:graphicData uri="http://schemas.openxmlformats.org/drawingml/2006/picture">
+                <pic:pic xmlns:pic="http://schemas.openxmlformats.org/drawingml/2006/picture">
+                  <pic:nvPicPr>
+                    <pic:cNvPr id="1" name=""/>
+                    <pic:cNvPicPr/>
+                  </pic:nvPicPr>
+                  <pic:blipFill>
+                    <a:blip r:embed="rId44"/>
+                    <a:stretch>
+                      <a:fillRect/>
+                    </a:stretch>
+                  </pic:blipFill>
+                  <pic:spPr>
+                    <a:xfrm>
+                      <a:off x="0" y="0"/>
+                      <a:ext cx="3995685" cy="1239478"/>
+                    </a:xfrm>
+                    <a:prstGeom prst="rect">
+                      <a:avLst/>
+                    </a:prstGeom>
+                  </pic:spPr>
+                </pic:pic>
+              </a:graphicData>
+            </a:graphic>
+          </wp:inline>
+        </w:drawing>
+      </w:r>
+    </w:p>
+    <w:p>
+      <w:pPr>
+        <w:pStyle w:val="ad"/>
+      </w:pPr>
+      <w:r>
+        <w:rPr>
+          <w:b/>
+        </w:rPr>
+        <w:t>Фиг. 35.</w:t>
+      </w:r>
+      <w:r>
+        <w:t xml:space="preserve"> </w:t>
+      </w:r>
+      <w:r>
+        <w:t>Изпращане на данни от модалния прозорец</w:t>
+      </w:r>
+    </w:p>
+    <w:p>
+      <w:pPr>
+        <w:pStyle w:val="3"/>
+        <w:numPr>
+          <w:ilvl w:val="1"/>
+          <w:numId w:val="14"/>
+        </w:numPr>
+      </w:pPr>
+      <w:r>
+        <w:t>Toast известия</w:t>
+      </w:r>
+    </w:p>
+    <w:p>
+      <w:r>
+        <w:t>За кратките известия към потребителя се използват toast съобщения, които се появяват в долния десен ъ</w:t>
+      </w:r>
+      <w:r>
+        <w:t>гъл на екрана и изчезват след 5</w:t>
+      </w:r>
+      <w:r>
+        <w:t xml:space="preserve"> секунди. Поддържат се три вида -</w:t>
+      </w:r>
+      <w:r>
+        <w:t xml:space="preserve"> success (зелено), error (червено) и info (</w:t>
+      </w:r>
+      <w:r>
+        <w:t>синьо).</w:t>
+      </w:r>
       <w:bookmarkStart w:id="10" w:name="_GoBack"/>
       <w:bookmarkEnd w:id="10"/>
-      <w:r>
-        <w:br w:type="page"/>
-      </w:r>
-    </w:p>
-    <w:p>
-      <w:pPr>
-        <w:pStyle w:val="ad"/>
-        <w:jc w:val="both"/>
-      </w:pPr>
     </w:p>
     <w:p>
       <w:pPr>
@@ -11597,7 +12859,7 @@
 </file>
 
 <file path=customXml/itemProps1.xml><?xml version="1.0" encoding="utf-8"?>
-<ds:datastoreItem xmlns:ds="http://schemas.openxmlformats.org/officeDocument/2006/customXml" ds:itemID="{812B7D3B-55D8-404F-810A-6FF8E7D085B8}">
+<ds:datastoreItem xmlns:ds="http://schemas.openxmlformats.org/officeDocument/2006/customXml" ds:itemID="{9889986D-123E-43DB-9BCB-8E871C97D196}">
   <ds:schemaRefs>
     <ds:schemaRef ds:uri="http://schemas.openxmlformats.org/officeDocument/2006/bibliography"/>
   </ds:schemaRefs>

</xml_diff>

<commit_message>
Some updates for the manual adding of attendance
</commit_message>
<xml_diff>
--- a/Дипломна_работа_Мартин_Дамянов.docx
+++ b/Дипломна_работа_Мартин_Дамянов.docx
@@ -666,6 +666,7 @@
         </w:rPr>
       </w:sdtEndPr>
       <w:sdtContent>
+        <w:bookmarkStart w:id="0" w:name="_GoBack" w:displacedByCustomXml="prev"/>
         <w:p>
           <w:pPr>
             <w:pStyle w:val="a3"/>
@@ -673,11 +674,18 @@
               <w:ilvl w:val="0"/>
               <w:numId w:val="0"/>
             </w:numPr>
+            <w:rPr>
+              <w:color w:val="000000" w:themeColor="text1"/>
+            </w:rPr>
           </w:pPr>
           <w:r>
+            <w:rPr>
+              <w:color w:val="000000" w:themeColor="text1"/>
+            </w:rPr>
             <w:t>Съдържание</w:t>
           </w:r>
         </w:p>
+        <w:bookmarkEnd w:id="0"/>
         <w:p>
           <w:pPr>
             <w:pStyle w:val="11"/>
@@ -701,7 +709,7 @@
           <w:r>
             <w:fldChar w:fldCharType="separate"/>
           </w:r>
-          <w:hyperlink w:anchor="_Toc232510580" w:history="1">
+          <w:hyperlink w:anchor="_Toc232535439" w:history="1">
             <w:r>
               <w:rPr>
                 <w:rStyle w:val="aa"/>
@@ -744,7 +752,7 @@
                 <w:noProof/>
                 <w:webHidden/>
               </w:rPr>
-              <w:instrText xml:space="preserve"> PAGEREF _Toc232510580 \h </w:instrText>
+              <w:instrText xml:space="preserve"> PAGEREF _Toc232535439 \h </w:instrText>
             </w:r>
             <w:r>
               <w:rPr>
@@ -789,7 +797,7 @@
               <w:sz w:val="22"/>
             </w:rPr>
           </w:pPr>
-          <w:hyperlink w:anchor="_Toc232510581" w:history="1">
+          <w:hyperlink w:anchor="_Toc232535440" w:history="1">
             <w:r>
               <w:rPr>
                 <w:rStyle w:val="aa"/>
@@ -832,7 +840,7 @@
                 <w:noProof/>
                 <w:webHidden/>
               </w:rPr>
-              <w:instrText xml:space="preserve"> PAGEREF _Toc232510581 \h </w:instrText>
+              <w:instrText xml:space="preserve"> PAGEREF _Toc232535440 \h </w:instrText>
             </w:r>
             <w:r>
               <w:rPr>
@@ -878,7 +886,7 @@
               <w:sz w:val="22"/>
             </w:rPr>
           </w:pPr>
-          <w:hyperlink w:anchor="_Toc232510582" w:history="1">
+          <w:hyperlink w:anchor="_Toc232535441" w:history="1">
             <w:r>
               <w:rPr>
                 <w:rStyle w:val="aa"/>
@@ -921,7 +929,7 @@
                 <w:noProof/>
                 <w:webHidden/>
               </w:rPr>
-              <w:instrText xml:space="preserve"> PAGEREF _Toc232510582 \h </w:instrText>
+              <w:instrText xml:space="preserve"> PAGEREF _Toc232535441 \h </w:instrText>
             </w:r>
             <w:r>
               <w:rPr>
@@ -967,7 +975,7 @@
               <w:sz w:val="22"/>
             </w:rPr>
           </w:pPr>
-          <w:hyperlink w:anchor="_Toc232510583" w:history="1">
+          <w:hyperlink w:anchor="_Toc232535442" w:history="1">
             <w:r>
               <w:rPr>
                 <w:rStyle w:val="aa"/>
@@ -1010,7 +1018,7 @@
                 <w:noProof/>
                 <w:webHidden/>
               </w:rPr>
-              <w:instrText xml:space="preserve"> PAGEREF _Toc232510583 \h </w:instrText>
+              <w:instrText xml:space="preserve"> PAGEREF _Toc232535442 \h </w:instrText>
             </w:r>
             <w:r>
               <w:rPr>
@@ -1056,7 +1064,7 @@
               <w:sz w:val="22"/>
             </w:rPr>
           </w:pPr>
-          <w:hyperlink w:anchor="_Toc232510584" w:history="1">
+          <w:hyperlink w:anchor="_Toc232535443" w:history="1">
             <w:r>
               <w:rPr>
                 <w:rStyle w:val="aa"/>
@@ -1099,7 +1107,7 @@
                 <w:noProof/>
                 <w:webHidden/>
               </w:rPr>
-              <w:instrText xml:space="preserve"> PAGEREF _Toc232510584 \h </w:instrText>
+              <w:instrText xml:space="preserve"> PAGEREF _Toc232535443 \h </w:instrText>
             </w:r>
             <w:r>
               <w:rPr>
@@ -1145,7 +1153,7 @@
               <w:sz w:val="22"/>
             </w:rPr>
           </w:pPr>
-          <w:hyperlink w:anchor="_Toc232510585" w:history="1">
+          <w:hyperlink w:anchor="_Toc232535444" w:history="1">
             <w:r>
               <w:rPr>
                 <w:rStyle w:val="aa"/>
@@ -1188,7 +1196,7 @@
                 <w:noProof/>
                 <w:webHidden/>
               </w:rPr>
-              <w:instrText xml:space="preserve"> PAGEREF _Toc232510585 \h </w:instrText>
+              <w:instrText xml:space="preserve"> PAGEREF _Toc232535444 \h </w:instrText>
             </w:r>
             <w:r>
               <w:rPr>
@@ -1234,7 +1242,7 @@
               <w:sz w:val="22"/>
             </w:rPr>
           </w:pPr>
-          <w:hyperlink w:anchor="_Toc232510586" w:history="1">
+          <w:hyperlink w:anchor="_Toc232535445" w:history="1">
             <w:r>
               <w:rPr>
                 <w:rStyle w:val="aa"/>
@@ -1277,7 +1285,7 @@
                 <w:noProof/>
                 <w:webHidden/>
               </w:rPr>
-              <w:instrText xml:space="preserve"> PAGEREF _Toc232510586 \h </w:instrText>
+              <w:instrText xml:space="preserve"> PAGEREF _Toc232535445 \h </w:instrText>
             </w:r>
             <w:r>
               <w:rPr>
@@ -1323,7 +1331,7 @@
               <w:sz w:val="22"/>
             </w:rPr>
           </w:pPr>
-          <w:hyperlink w:anchor="_Toc232510587" w:history="1">
+          <w:hyperlink w:anchor="_Toc232535446" w:history="1">
             <w:r>
               <w:rPr>
                 <w:rStyle w:val="aa"/>
@@ -1366,7 +1374,7 @@
                 <w:noProof/>
                 <w:webHidden/>
               </w:rPr>
-              <w:instrText xml:space="preserve"> PAGEREF _Toc232510587 \h </w:instrText>
+              <w:instrText xml:space="preserve"> PAGEREF _Toc232535446 \h </w:instrText>
             </w:r>
             <w:r>
               <w:rPr>
@@ -1412,7 +1420,7 @@
               <w:sz w:val="22"/>
             </w:rPr>
           </w:pPr>
-          <w:hyperlink w:anchor="_Toc232510588" w:history="1">
+          <w:hyperlink w:anchor="_Toc232535447" w:history="1">
             <w:r>
               <w:rPr>
                 <w:rStyle w:val="aa"/>
@@ -1455,7 +1463,7 @@
                 <w:noProof/>
                 <w:webHidden/>
               </w:rPr>
-              <w:instrText xml:space="preserve"> PAGEREF _Toc232510588 \h </w:instrText>
+              <w:instrText xml:space="preserve"> PAGEREF _Toc232535447 \h </w:instrText>
             </w:r>
             <w:r>
               <w:rPr>
@@ -1500,7 +1508,7 @@
               <w:sz w:val="22"/>
             </w:rPr>
           </w:pPr>
-          <w:hyperlink w:anchor="_Toc232510589" w:history="1">
+          <w:hyperlink w:anchor="_Toc232535448" w:history="1">
             <w:r>
               <w:rPr>
                 <w:rStyle w:val="aa"/>
@@ -1543,7 +1551,7 @@
                 <w:noProof/>
                 <w:webHidden/>
               </w:rPr>
-              <w:instrText xml:space="preserve"> PAGEREF _Toc232510589 \h </w:instrText>
+              <w:instrText xml:space="preserve"> PAGEREF _Toc232535448 \h </w:instrText>
             </w:r>
             <w:r>
               <w:rPr>
@@ -1589,7 +1597,7 @@
               <w:sz w:val="22"/>
             </w:rPr>
           </w:pPr>
-          <w:hyperlink w:anchor="_Toc232510590" w:history="1">
+          <w:hyperlink w:anchor="_Toc232535449" w:history="1">
             <w:r>
               <w:rPr>
                 <w:rStyle w:val="aa"/>
@@ -1632,7 +1640,7 @@
                 <w:noProof/>
                 <w:webHidden/>
               </w:rPr>
-              <w:instrText xml:space="preserve"> PAGEREF _Toc232510590 \h </w:instrText>
+              <w:instrText xml:space="preserve"> PAGEREF _Toc232535449 \h </w:instrText>
             </w:r>
             <w:r>
               <w:rPr>
@@ -1678,7 +1686,7 @@
               <w:sz w:val="22"/>
             </w:rPr>
           </w:pPr>
-          <w:hyperlink w:anchor="_Toc232510591" w:history="1">
+          <w:hyperlink w:anchor="_Toc232535450" w:history="1">
             <w:r>
               <w:rPr>
                 <w:rStyle w:val="aa"/>
@@ -1721,7 +1729,7 @@
                 <w:noProof/>
                 <w:webHidden/>
               </w:rPr>
-              <w:instrText xml:space="preserve"> PAGEREF _Toc232510591 \h </w:instrText>
+              <w:instrText xml:space="preserve"> PAGEREF _Toc232535450 \h </w:instrText>
             </w:r>
             <w:r>
               <w:rPr>
@@ -1767,7 +1775,7 @@
               <w:sz w:val="22"/>
             </w:rPr>
           </w:pPr>
-          <w:hyperlink w:anchor="_Toc232510592" w:history="1">
+          <w:hyperlink w:anchor="_Toc232535451" w:history="1">
             <w:r>
               <w:rPr>
                 <w:rStyle w:val="aa"/>
@@ -1810,7 +1818,7 @@
                 <w:noProof/>
                 <w:webHidden/>
               </w:rPr>
-              <w:instrText xml:space="preserve"> PAGEREF _Toc232510592 \h </w:instrText>
+              <w:instrText xml:space="preserve"> PAGEREF _Toc232535451 \h </w:instrText>
             </w:r>
             <w:r>
               <w:rPr>
@@ -1856,7 +1864,7 @@
               <w:sz w:val="22"/>
             </w:rPr>
           </w:pPr>
-          <w:hyperlink w:anchor="_Toc232510593" w:history="1">
+          <w:hyperlink w:anchor="_Toc232535452" w:history="1">
             <w:r>
               <w:rPr>
                 <w:rStyle w:val="aa"/>
@@ -1907,7 +1915,7 @@
                 <w:noProof/>
                 <w:webHidden/>
               </w:rPr>
-              <w:instrText xml:space="preserve"> PAGEREF _Toc232510593 \h </w:instrText>
+              <w:instrText xml:space="preserve"> PAGEREF _Toc232535452 \h </w:instrText>
             </w:r>
             <w:r>
               <w:rPr>
@@ -1953,7 +1961,7 @@
               <w:sz w:val="22"/>
             </w:rPr>
           </w:pPr>
-          <w:hyperlink w:anchor="_Toc232510594" w:history="1">
+          <w:hyperlink w:anchor="_Toc232535453" w:history="1">
             <w:r>
               <w:rPr>
                 <w:rStyle w:val="aa"/>
@@ -1997,7 +2005,7 @@
                 <w:noProof/>
                 <w:webHidden/>
               </w:rPr>
-              <w:instrText xml:space="preserve"> PAGEREF _Toc232510594 \h </w:instrText>
+              <w:instrText xml:space="preserve"> PAGEREF _Toc232535453 \h </w:instrText>
             </w:r>
             <w:r>
               <w:rPr>
@@ -2043,7 +2051,7 @@
               <w:sz w:val="22"/>
             </w:rPr>
           </w:pPr>
-          <w:hyperlink w:anchor="_Toc232510595" w:history="1">
+          <w:hyperlink w:anchor="_Toc232535454" w:history="1">
             <w:r>
               <w:rPr>
                 <w:rStyle w:val="aa"/>
@@ -2086,7 +2094,7 @@
                 <w:noProof/>
                 <w:webHidden/>
               </w:rPr>
-              <w:instrText xml:space="preserve"> PAGEREF _Toc232510595 \h </w:instrText>
+              <w:instrText xml:space="preserve"> PAGEREF _Toc232535454 \h </w:instrText>
             </w:r>
             <w:r>
               <w:rPr>
@@ -2132,7 +2140,7 @@
               <w:sz w:val="22"/>
             </w:rPr>
           </w:pPr>
-          <w:hyperlink w:anchor="_Toc232510596" w:history="1">
+          <w:hyperlink w:anchor="_Toc232535455" w:history="1">
             <w:r>
               <w:rPr>
                 <w:rStyle w:val="aa"/>
@@ -2175,7 +2183,7 @@
                 <w:noProof/>
                 <w:webHidden/>
               </w:rPr>
-              <w:instrText xml:space="preserve"> PAGEREF _Toc232510596 \h </w:instrText>
+              <w:instrText xml:space="preserve"> PAGEREF _Toc232535455 \h </w:instrText>
             </w:r>
             <w:r>
               <w:rPr>
@@ -2221,7 +2229,7 @@
               <w:sz w:val="22"/>
             </w:rPr>
           </w:pPr>
-          <w:hyperlink w:anchor="_Toc232510597" w:history="1">
+          <w:hyperlink w:anchor="_Toc232535456" w:history="1">
             <w:r>
               <w:rPr>
                 <w:rStyle w:val="aa"/>
@@ -2264,7 +2272,7 @@
                 <w:noProof/>
                 <w:webHidden/>
               </w:rPr>
-              <w:instrText xml:space="preserve"> PAGEREF _Toc232510597 \h </w:instrText>
+              <w:instrText xml:space="preserve"> PAGEREF _Toc232535456 \h </w:instrText>
             </w:r>
             <w:r>
               <w:rPr>
@@ -2310,7 +2318,7 @@
               <w:sz w:val="22"/>
             </w:rPr>
           </w:pPr>
-          <w:hyperlink w:anchor="_Toc232510598" w:history="1">
+          <w:hyperlink w:anchor="_Toc232535457" w:history="1">
             <w:r>
               <w:rPr>
                 <w:rStyle w:val="aa"/>
@@ -2332,7 +2340,7 @@
                 <w:rStyle w:val="aa"/>
                 <w:noProof/>
               </w:rPr>
-              <w:t>Модел на базите данни</w:t>
+              <w:t>Модел на базата данни</w:t>
             </w:r>
             <w:r>
               <w:rPr>
@@ -2353,7 +2361,7 @@
                 <w:noProof/>
                 <w:webHidden/>
               </w:rPr>
-              <w:instrText xml:space="preserve"> PAGEREF _Toc232510598 \h </w:instrText>
+              <w:instrText xml:space="preserve"> PAGEREF _Toc232535457 \h </w:instrText>
             </w:r>
             <w:r>
               <w:rPr>
@@ -2399,7 +2407,7 @@
               <w:sz w:val="22"/>
             </w:rPr>
           </w:pPr>
-          <w:hyperlink w:anchor="_Toc232510599" w:history="1">
+          <w:hyperlink w:anchor="_Toc232535458" w:history="1">
             <w:r>
               <w:rPr>
                 <w:rStyle w:val="aa"/>
@@ -2444,7 +2452,7 @@
                 <w:noProof/>
                 <w:webHidden/>
               </w:rPr>
-              <w:instrText xml:space="preserve"> PAGEREF _Toc232510599 \h </w:instrText>
+              <w:instrText xml:space="preserve"> PAGEREF _Toc232535458 \h </w:instrText>
             </w:r>
             <w:r>
               <w:rPr>
@@ -2490,7 +2498,7 @@
               <w:sz w:val="22"/>
             </w:rPr>
           </w:pPr>
-          <w:hyperlink w:anchor="_Toc232510600" w:history="1">
+          <w:hyperlink w:anchor="_Toc232535459" w:history="1">
             <w:r>
               <w:rPr>
                 <w:rStyle w:val="aa"/>
@@ -2535,7 +2543,7 @@
                 <w:noProof/>
                 <w:webHidden/>
               </w:rPr>
-              <w:instrText xml:space="preserve"> PAGEREF _Toc232510600 \h </w:instrText>
+              <w:instrText xml:space="preserve"> PAGEREF _Toc232535459 \h </w:instrText>
             </w:r>
             <w:r>
               <w:rPr>
@@ -2581,7 +2589,7 @@
               <w:sz w:val="22"/>
             </w:rPr>
           </w:pPr>
-          <w:hyperlink w:anchor="_Toc232510601" w:history="1">
+          <w:hyperlink w:anchor="_Toc232535460" w:history="1">
             <w:r>
               <w:rPr>
                 <w:rStyle w:val="aa"/>
@@ -2626,7 +2634,7 @@
                 <w:noProof/>
                 <w:webHidden/>
               </w:rPr>
-              <w:instrText xml:space="preserve"> PAGEREF _Toc232510601 \h </w:instrText>
+              <w:instrText xml:space="preserve"> PAGEREF _Toc232535460 \h </w:instrText>
             </w:r>
             <w:r>
               <w:rPr>
@@ -2672,7 +2680,7 @@
               <w:sz w:val="22"/>
             </w:rPr>
           </w:pPr>
-          <w:hyperlink w:anchor="_Toc232510602" w:history="1">
+          <w:hyperlink w:anchor="_Toc232535461" w:history="1">
             <w:r>
               <w:rPr>
                 <w:rStyle w:val="aa"/>
@@ -2716,7 +2724,7 @@
                 <w:noProof/>
                 <w:webHidden/>
               </w:rPr>
-              <w:instrText xml:space="preserve"> PAGEREF _Toc232510602 \h </w:instrText>
+              <w:instrText xml:space="preserve"> PAGEREF _Toc232535461 \h </w:instrText>
             </w:r>
             <w:r>
               <w:rPr>
@@ -2762,7 +2770,7 @@
               <w:sz w:val="22"/>
             </w:rPr>
           </w:pPr>
-          <w:hyperlink w:anchor="_Toc232510603" w:history="1">
+          <w:hyperlink w:anchor="_Toc232535462" w:history="1">
             <w:r>
               <w:rPr>
                 <w:rStyle w:val="aa"/>
@@ -2807,7 +2815,7 @@
                 <w:noProof/>
                 <w:webHidden/>
               </w:rPr>
-              <w:instrText xml:space="preserve"> PAGEREF _Toc232510603 \h </w:instrText>
+              <w:instrText xml:space="preserve"> PAGEREF _Toc232535462 \h </w:instrText>
             </w:r>
             <w:r>
               <w:rPr>
@@ -2853,7 +2861,7 @@
               <w:sz w:val="22"/>
             </w:rPr>
           </w:pPr>
-          <w:hyperlink w:anchor="_Toc232510604" w:history="1">
+          <w:hyperlink w:anchor="_Toc232535463" w:history="1">
             <w:r>
               <w:rPr>
                 <w:rStyle w:val="aa"/>
@@ -2897,7 +2905,7 @@
                 <w:noProof/>
                 <w:webHidden/>
               </w:rPr>
-              <w:instrText xml:space="preserve"> PAGEREF _Toc232510604 \h </w:instrText>
+              <w:instrText xml:space="preserve"> PAGEREF _Toc232535463 \h </w:instrText>
             </w:r>
             <w:r>
               <w:rPr>
@@ -2943,7 +2951,7 @@
               <w:sz w:val="22"/>
             </w:rPr>
           </w:pPr>
-          <w:hyperlink w:anchor="_Toc232510605" w:history="1">
+          <w:hyperlink w:anchor="_Toc232535464" w:history="1">
             <w:r>
               <w:rPr>
                 <w:rStyle w:val="aa"/>
@@ -2987,7 +2995,7 @@
                 <w:noProof/>
                 <w:webHidden/>
               </w:rPr>
-              <w:instrText xml:space="preserve"> PAGEREF _Toc232510605 \h </w:instrText>
+              <w:instrText xml:space="preserve"> PAGEREF _Toc232535464 \h </w:instrText>
             </w:r>
             <w:r>
               <w:rPr>
@@ -3033,7 +3041,7 @@
               <w:sz w:val="22"/>
             </w:rPr>
           </w:pPr>
-          <w:hyperlink w:anchor="_Toc232510606" w:history="1">
+          <w:hyperlink w:anchor="_Toc232535465" w:history="1">
             <w:r>
               <w:rPr>
                 <w:rStyle w:val="aa"/>
@@ -3077,7 +3085,7 @@
                 <w:noProof/>
                 <w:webHidden/>
               </w:rPr>
-              <w:instrText xml:space="preserve"> PAGEREF _Toc232510606 \h </w:instrText>
+              <w:instrText xml:space="preserve"> PAGEREF _Toc232535465 \h </w:instrText>
             </w:r>
             <w:r>
               <w:rPr>
@@ -3123,7 +3131,7 @@
               <w:sz w:val="22"/>
             </w:rPr>
           </w:pPr>
-          <w:hyperlink w:anchor="_Toc232510607" w:history="1">
+          <w:hyperlink w:anchor="_Toc232535466" w:history="1">
             <w:r>
               <w:rPr>
                 <w:rStyle w:val="aa"/>
@@ -3166,7 +3174,7 @@
                 <w:noProof/>
                 <w:webHidden/>
               </w:rPr>
-              <w:instrText xml:space="preserve"> PAGEREF _Toc232510607 \h </w:instrText>
+              <w:instrText xml:space="preserve"> PAGEREF _Toc232535466 \h </w:instrText>
             </w:r>
             <w:r>
               <w:rPr>
@@ -3211,7 +3219,7 @@
               <w:sz w:val="22"/>
             </w:rPr>
           </w:pPr>
-          <w:hyperlink w:anchor="_Toc232510608" w:history="1">
+          <w:hyperlink w:anchor="_Toc232535467" w:history="1">
             <w:r>
               <w:rPr>
                 <w:rStyle w:val="aa"/>
@@ -3254,7 +3262,7 @@
                 <w:noProof/>
                 <w:webHidden/>
               </w:rPr>
-              <w:instrText xml:space="preserve"> PAGEREF _Toc232510608 \h </w:instrText>
+              <w:instrText xml:space="preserve"> PAGEREF _Toc232535467 \h </w:instrText>
             </w:r>
             <w:r>
               <w:rPr>
@@ -3300,7 +3308,7 @@
               <w:sz w:val="22"/>
             </w:rPr>
           </w:pPr>
-          <w:hyperlink w:anchor="_Toc232510609" w:history="1">
+          <w:hyperlink w:anchor="_Toc232535468" w:history="1">
             <w:r>
               <w:rPr>
                 <w:rStyle w:val="aa"/>
@@ -3343,7 +3351,7 @@
                 <w:noProof/>
                 <w:webHidden/>
               </w:rPr>
-              <w:instrText xml:space="preserve"> PAGEREF _Toc232510609 \h </w:instrText>
+              <w:instrText xml:space="preserve"> PAGEREF _Toc232535468 \h </w:instrText>
             </w:r>
             <w:r>
               <w:rPr>
@@ -3389,7 +3397,7 @@
               <w:sz w:val="22"/>
             </w:rPr>
           </w:pPr>
-          <w:hyperlink w:anchor="_Toc232510610" w:history="1">
+          <w:hyperlink w:anchor="_Toc232535469" w:history="1">
             <w:r>
               <w:rPr>
                 <w:rStyle w:val="aa"/>
@@ -3433,7 +3441,7 @@
                 <w:noProof/>
                 <w:webHidden/>
               </w:rPr>
-              <w:instrText xml:space="preserve"> PAGEREF _Toc232510610 \h </w:instrText>
+              <w:instrText xml:space="preserve"> PAGEREF _Toc232535469 \h </w:instrText>
             </w:r>
             <w:r>
               <w:rPr>
@@ -3479,7 +3487,7 @@
               <w:sz w:val="22"/>
             </w:rPr>
           </w:pPr>
-          <w:hyperlink w:anchor="_Toc232510611" w:history="1">
+          <w:hyperlink w:anchor="_Toc232535470" w:history="1">
             <w:r>
               <w:rPr>
                 <w:rStyle w:val="aa"/>
@@ -3538,7 +3546,7 @@
                 <w:noProof/>
                 <w:webHidden/>
               </w:rPr>
-              <w:instrText xml:space="preserve"> PAGEREF _Toc232510611 \h </w:instrText>
+              <w:instrText xml:space="preserve"> PAGEREF _Toc232535470 \h </w:instrText>
             </w:r>
             <w:r>
               <w:rPr>
@@ -3584,7 +3592,7 @@
               <w:sz w:val="22"/>
             </w:rPr>
           </w:pPr>
-          <w:hyperlink w:anchor="_Toc232510612" w:history="1">
+          <w:hyperlink w:anchor="_Toc232535471" w:history="1">
             <w:r>
               <w:rPr>
                 <w:rStyle w:val="aa"/>
@@ -3627,7 +3635,7 @@
                 <w:noProof/>
                 <w:webHidden/>
               </w:rPr>
-              <w:instrText xml:space="preserve"> PAGEREF _Toc232510612 \h </w:instrText>
+              <w:instrText xml:space="preserve"> PAGEREF _Toc232535471 \h </w:instrText>
             </w:r>
             <w:r>
               <w:rPr>
@@ -3673,7 +3681,7 @@
               <w:sz w:val="22"/>
             </w:rPr>
           </w:pPr>
-          <w:hyperlink w:anchor="_Toc232510613" w:history="1">
+          <w:hyperlink w:anchor="_Toc232535472" w:history="1">
             <w:r>
               <w:rPr>
                 <w:rStyle w:val="aa"/>
@@ -3732,7 +3740,7 @@
                 <w:noProof/>
                 <w:webHidden/>
               </w:rPr>
-              <w:instrText xml:space="preserve"> PAGEREF _Toc232510613 \h </w:instrText>
+              <w:instrText xml:space="preserve"> PAGEREF _Toc232535472 \h </w:instrText>
             </w:r>
             <w:r>
               <w:rPr>
@@ -3778,7 +3786,7 @@
               <w:sz w:val="22"/>
             </w:rPr>
           </w:pPr>
-          <w:hyperlink w:anchor="_Toc232510614" w:history="1">
+          <w:hyperlink w:anchor="_Toc232535473" w:history="1">
             <w:r>
               <w:rPr>
                 <w:rStyle w:val="aa"/>
@@ -3822,7 +3830,7 @@
                 <w:noProof/>
                 <w:webHidden/>
               </w:rPr>
-              <w:instrText xml:space="preserve"> PAGEREF _Toc232510614 \h </w:instrText>
+              <w:instrText xml:space="preserve"> PAGEREF _Toc232535473 \h </w:instrText>
             </w:r>
             <w:r>
               <w:rPr>
@@ -3868,7 +3876,7 @@
               <w:sz w:val="22"/>
             </w:rPr>
           </w:pPr>
-          <w:hyperlink w:anchor="_Toc232510615" w:history="1">
+          <w:hyperlink w:anchor="_Toc232535474" w:history="1">
             <w:r>
               <w:rPr>
                 <w:rStyle w:val="aa"/>
@@ -3912,7 +3920,7 @@
                 <w:noProof/>
                 <w:webHidden/>
               </w:rPr>
-              <w:instrText xml:space="preserve"> PAGEREF _Toc232510615 \h </w:instrText>
+              <w:instrText xml:space="preserve"> PAGEREF _Toc232535474 \h </w:instrText>
             </w:r>
             <w:r>
               <w:rPr>
@@ -3958,7 +3966,7 @@
               <w:sz w:val="22"/>
             </w:rPr>
           </w:pPr>
-          <w:hyperlink w:anchor="_Toc232510616" w:history="1">
+          <w:hyperlink w:anchor="_Toc232535475" w:history="1">
             <w:r>
               <w:rPr>
                 <w:rStyle w:val="aa"/>
@@ -4003,7 +4011,7 @@
                 <w:noProof/>
                 <w:webHidden/>
               </w:rPr>
-              <w:instrText xml:space="preserve"> PAGEREF _Toc232510616 \h </w:instrText>
+              <w:instrText xml:space="preserve"> PAGEREF _Toc232535475 \h </w:instrText>
             </w:r>
             <w:r>
               <w:rPr>
@@ -4049,7 +4057,7 @@
               <w:sz w:val="22"/>
             </w:rPr>
           </w:pPr>
-          <w:hyperlink w:anchor="_Toc232510617" w:history="1">
+          <w:hyperlink w:anchor="_Toc232535476" w:history="1">
             <w:r>
               <w:rPr>
                 <w:rStyle w:val="aa"/>
@@ -4092,7 +4100,7 @@
                 <w:noProof/>
                 <w:webHidden/>
               </w:rPr>
-              <w:instrText xml:space="preserve"> PAGEREF _Toc232510617 \h </w:instrText>
+              <w:instrText xml:space="preserve"> PAGEREF _Toc232535476 \h </w:instrText>
             </w:r>
             <w:r>
               <w:rPr>
@@ -4138,7 +4146,7 @@
               <w:sz w:val="22"/>
             </w:rPr>
           </w:pPr>
-          <w:hyperlink w:anchor="_Toc232510618" w:history="1">
+          <w:hyperlink w:anchor="_Toc232535477" w:history="1">
             <w:r>
               <w:rPr>
                 <w:rStyle w:val="aa"/>
@@ -4182,7 +4190,7 @@
                 <w:noProof/>
                 <w:webHidden/>
               </w:rPr>
-              <w:instrText xml:space="preserve"> PAGEREF _Toc232510618 \h </w:instrText>
+              <w:instrText xml:space="preserve"> PAGEREF _Toc232535477 \h </w:instrText>
             </w:r>
             <w:r>
               <w:rPr>
@@ -4228,7 +4236,7 @@
               <w:sz w:val="22"/>
             </w:rPr>
           </w:pPr>
-          <w:hyperlink w:anchor="_Toc232510619" w:history="1">
+          <w:hyperlink w:anchor="_Toc232535478" w:history="1">
             <w:r>
               <w:rPr>
                 <w:rStyle w:val="aa"/>
@@ -4271,7 +4279,7 @@
                 <w:noProof/>
                 <w:webHidden/>
               </w:rPr>
-              <w:instrText xml:space="preserve"> PAGEREF _Toc232510619 \h </w:instrText>
+              <w:instrText xml:space="preserve"> PAGEREF _Toc232535478 \h </w:instrText>
             </w:r>
             <w:r>
               <w:rPr>
@@ -4317,7 +4325,7 @@
               <w:sz w:val="22"/>
             </w:rPr>
           </w:pPr>
-          <w:hyperlink w:anchor="_Toc232510620" w:history="1">
+          <w:hyperlink w:anchor="_Toc232535479" w:history="1">
             <w:r>
               <w:rPr>
                 <w:rStyle w:val="aa"/>
@@ -4360,7 +4368,7 @@
                 <w:noProof/>
                 <w:webHidden/>
               </w:rPr>
-              <w:instrText xml:space="preserve"> PAGEREF _Toc232510620 \h </w:instrText>
+              <w:instrText xml:space="preserve"> PAGEREF _Toc232535479 \h </w:instrText>
             </w:r>
             <w:r>
               <w:rPr>
@@ -4406,7 +4414,7 @@
               <w:sz w:val="22"/>
             </w:rPr>
           </w:pPr>
-          <w:hyperlink w:anchor="_Toc232510621" w:history="1">
+          <w:hyperlink w:anchor="_Toc232535480" w:history="1">
             <w:r>
               <w:rPr>
                 <w:rStyle w:val="aa"/>
@@ -4449,7 +4457,7 @@
                 <w:noProof/>
                 <w:webHidden/>
               </w:rPr>
-              <w:instrText xml:space="preserve"> PAGEREF _Toc232510621 \h </w:instrText>
+              <w:instrText xml:space="preserve"> PAGEREF _Toc232535480 \h </w:instrText>
             </w:r>
             <w:r>
               <w:rPr>
@@ -4495,7 +4503,7 @@
               <w:sz w:val="22"/>
             </w:rPr>
           </w:pPr>
-          <w:hyperlink w:anchor="_Toc232510622" w:history="1">
+          <w:hyperlink w:anchor="_Toc232535481" w:history="1">
             <w:r>
               <w:rPr>
                 <w:rStyle w:val="aa"/>
@@ -4538,7 +4546,7 @@
                 <w:noProof/>
                 <w:webHidden/>
               </w:rPr>
-              <w:instrText xml:space="preserve"> PAGEREF _Toc232510622 \h </w:instrText>
+              <w:instrText xml:space="preserve"> PAGEREF _Toc232535481 \h </w:instrText>
             </w:r>
             <w:r>
               <w:rPr>
@@ -4584,7 +4592,7 @@
               <w:sz w:val="22"/>
             </w:rPr>
           </w:pPr>
-          <w:hyperlink w:anchor="_Toc232510623" w:history="1">
+          <w:hyperlink w:anchor="_Toc232535482" w:history="1">
             <w:r>
               <w:rPr>
                 <w:rStyle w:val="aa"/>
@@ -4627,7 +4635,7 @@
                 <w:noProof/>
                 <w:webHidden/>
               </w:rPr>
-              <w:instrText xml:space="preserve"> PAGEREF _Toc232510623 \h </w:instrText>
+              <w:instrText xml:space="preserve"> PAGEREF _Toc232535482 \h </w:instrText>
             </w:r>
             <w:r>
               <w:rPr>
@@ -4673,7 +4681,7 @@
               <w:sz w:val="22"/>
             </w:rPr>
           </w:pPr>
-          <w:hyperlink w:anchor="_Toc232510624" w:history="1">
+          <w:hyperlink w:anchor="_Toc232535483" w:history="1">
             <w:r>
               <w:rPr>
                 <w:rStyle w:val="aa"/>
@@ -4716,7 +4724,7 @@
                 <w:noProof/>
                 <w:webHidden/>
               </w:rPr>
-              <w:instrText xml:space="preserve"> PAGEREF _Toc232510624 \h </w:instrText>
+              <w:instrText xml:space="preserve"> PAGEREF _Toc232535483 \h </w:instrText>
             </w:r>
             <w:r>
               <w:rPr>
@@ -4762,7 +4770,7 @@
               <w:sz w:val="22"/>
             </w:rPr>
           </w:pPr>
-          <w:hyperlink w:anchor="_Toc232510625" w:history="1">
+          <w:hyperlink w:anchor="_Toc232535484" w:history="1">
             <w:r>
               <w:rPr>
                 <w:rStyle w:val="aa"/>
@@ -4805,7 +4813,7 @@
                 <w:noProof/>
                 <w:webHidden/>
               </w:rPr>
-              <w:instrText xml:space="preserve"> PAGEREF _Toc232510625 \h </w:instrText>
+              <w:instrText xml:space="preserve"> PAGEREF _Toc232535484 \h </w:instrText>
             </w:r>
             <w:r>
               <w:rPr>
@@ -4851,7 +4859,7 @@
               <w:sz w:val="22"/>
             </w:rPr>
           </w:pPr>
-          <w:hyperlink w:anchor="_Toc232510626" w:history="1">
+          <w:hyperlink w:anchor="_Toc232535485" w:history="1">
             <w:r>
               <w:rPr>
                 <w:rStyle w:val="aa"/>
@@ -4894,7 +4902,7 @@
                 <w:noProof/>
                 <w:webHidden/>
               </w:rPr>
-              <w:instrText xml:space="preserve"> PAGEREF _Toc232510626 \h </w:instrText>
+              <w:instrText xml:space="preserve"> PAGEREF _Toc232535485 \h </w:instrText>
             </w:r>
             <w:r>
               <w:rPr>
@@ -4940,7 +4948,7 @@
               <w:sz w:val="22"/>
             </w:rPr>
           </w:pPr>
-          <w:hyperlink w:anchor="_Toc232510627" w:history="1">
+          <w:hyperlink w:anchor="_Toc232535486" w:history="1">
             <w:r>
               <w:rPr>
                 <w:rStyle w:val="aa"/>
@@ -4983,7 +4991,7 @@
                 <w:noProof/>
                 <w:webHidden/>
               </w:rPr>
-              <w:instrText xml:space="preserve"> PAGEREF _Toc232510627 \h </w:instrText>
+              <w:instrText xml:space="preserve"> PAGEREF _Toc232535486 \h </w:instrText>
             </w:r>
             <w:r>
               <w:rPr>
@@ -5029,7 +5037,7 @@
               <w:sz w:val="22"/>
             </w:rPr>
           </w:pPr>
-          <w:hyperlink w:anchor="_Toc232510628" w:history="1">
+          <w:hyperlink w:anchor="_Toc232535487" w:history="1">
             <w:r>
               <w:rPr>
                 <w:rStyle w:val="aa"/>
@@ -5072,7 +5080,7 @@
                 <w:noProof/>
                 <w:webHidden/>
               </w:rPr>
-              <w:instrText xml:space="preserve"> PAGEREF _Toc232510628 \h </w:instrText>
+              <w:instrText xml:space="preserve"> PAGEREF _Toc232535487 \h </w:instrText>
             </w:r>
             <w:r>
               <w:rPr>
@@ -5118,7 +5126,7 @@
               <w:sz w:val="22"/>
             </w:rPr>
           </w:pPr>
-          <w:hyperlink w:anchor="_Toc232510629" w:history="1">
+          <w:hyperlink w:anchor="_Toc232535488" w:history="1">
             <w:r>
               <w:rPr>
                 <w:rStyle w:val="aa"/>
@@ -5161,7 +5169,7 @@
                 <w:noProof/>
                 <w:webHidden/>
               </w:rPr>
-              <w:instrText xml:space="preserve"> PAGEREF _Toc232510629 \h </w:instrText>
+              <w:instrText xml:space="preserve"> PAGEREF _Toc232535488 \h </w:instrText>
             </w:r>
             <w:r>
               <w:rPr>
@@ -5207,7 +5215,7 @@
               <w:sz w:val="22"/>
             </w:rPr>
           </w:pPr>
-          <w:hyperlink w:anchor="_Toc232510630" w:history="1">
+          <w:hyperlink w:anchor="_Toc232535489" w:history="1">
             <w:r>
               <w:rPr>
                 <w:rStyle w:val="aa"/>
@@ -5251,7 +5259,7 @@
                 <w:noProof/>
                 <w:webHidden/>
               </w:rPr>
-              <w:instrText xml:space="preserve"> PAGEREF _Toc232510630 \h </w:instrText>
+              <w:instrText xml:space="preserve"> PAGEREF _Toc232535489 \h </w:instrText>
             </w:r>
             <w:r>
               <w:rPr>
@@ -5296,7 +5304,7 @@
               <w:sz w:val="22"/>
             </w:rPr>
           </w:pPr>
-          <w:hyperlink w:anchor="_Toc232510631" w:history="1">
+          <w:hyperlink w:anchor="_Toc232535490" w:history="1">
             <w:r>
               <w:rPr>
                 <w:rStyle w:val="aa"/>
@@ -5339,7 +5347,7 @@
                 <w:noProof/>
                 <w:webHidden/>
               </w:rPr>
-              <w:instrText xml:space="preserve"> PAGEREF _Toc232510631 \h </w:instrText>
+              <w:instrText xml:space="preserve"> PAGEREF _Toc232535490 \h </w:instrText>
             </w:r>
             <w:r>
               <w:rPr>
@@ -5385,7 +5393,7 @@
               <w:sz w:val="22"/>
             </w:rPr>
           </w:pPr>
-          <w:hyperlink w:anchor="_Toc232510632" w:history="1">
+          <w:hyperlink w:anchor="_Toc232535491" w:history="1">
             <w:r>
               <w:rPr>
                 <w:rStyle w:val="aa"/>
@@ -5428,7 +5436,7 @@
                 <w:noProof/>
                 <w:webHidden/>
               </w:rPr>
-              <w:instrText xml:space="preserve"> PAGEREF _Toc232510632 \h </w:instrText>
+              <w:instrText xml:space="preserve"> PAGEREF _Toc232535491 \h </w:instrText>
             </w:r>
             <w:r>
               <w:rPr>
@@ -5474,7 +5482,7 @@
               <w:sz w:val="22"/>
             </w:rPr>
           </w:pPr>
-          <w:hyperlink w:anchor="_Toc232510633" w:history="1">
+          <w:hyperlink w:anchor="_Toc232535492" w:history="1">
             <w:r>
               <w:rPr>
                 <w:rStyle w:val="aa"/>
@@ -5517,7 +5525,7 @@
                 <w:noProof/>
                 <w:webHidden/>
               </w:rPr>
-              <w:instrText xml:space="preserve"> PAGEREF _Toc232510633 \h </w:instrText>
+              <w:instrText xml:space="preserve"> PAGEREF _Toc232535492 \h </w:instrText>
             </w:r>
             <w:r>
               <w:rPr>
@@ -5563,7 +5571,7 @@
               <w:sz w:val="22"/>
             </w:rPr>
           </w:pPr>
-          <w:hyperlink w:anchor="_Toc232510634" w:history="1">
+          <w:hyperlink w:anchor="_Toc232535493" w:history="1">
             <w:r>
               <w:rPr>
                 <w:rStyle w:val="aa"/>
@@ -5606,7 +5614,7 @@
                 <w:noProof/>
                 <w:webHidden/>
               </w:rPr>
-              <w:instrText xml:space="preserve"> PAGEREF _Toc232510634 \h </w:instrText>
+              <w:instrText xml:space="preserve"> PAGEREF _Toc232535493 \h </w:instrText>
             </w:r>
             <w:r>
               <w:rPr>
@@ -5652,7 +5660,7 @@
               <w:sz w:val="22"/>
             </w:rPr>
           </w:pPr>
-          <w:hyperlink w:anchor="_Toc232510635" w:history="1">
+          <w:hyperlink w:anchor="_Toc232535494" w:history="1">
             <w:r>
               <w:rPr>
                 <w:rStyle w:val="aa"/>
@@ -5695,7 +5703,7 @@
                 <w:noProof/>
                 <w:webHidden/>
               </w:rPr>
-              <w:instrText xml:space="preserve"> PAGEREF _Toc232510635 \h </w:instrText>
+              <w:instrText xml:space="preserve"> PAGEREF _Toc232535494 \h </w:instrText>
             </w:r>
             <w:r>
               <w:rPr>
@@ -5741,7 +5749,7 @@
               <w:sz w:val="22"/>
             </w:rPr>
           </w:pPr>
-          <w:hyperlink w:anchor="_Toc232510636" w:history="1">
+          <w:hyperlink w:anchor="_Toc232535495" w:history="1">
             <w:r>
               <w:rPr>
                 <w:rStyle w:val="aa"/>
@@ -5784,7 +5792,7 @@
                 <w:noProof/>
                 <w:webHidden/>
               </w:rPr>
-              <w:instrText xml:space="preserve"> PAGEREF _Toc232510636 \h </w:instrText>
+              <w:instrText xml:space="preserve"> PAGEREF _Toc232535495 \h </w:instrText>
             </w:r>
             <w:r>
               <w:rPr>
@@ -5830,7 +5838,7 @@
               <w:sz w:val="22"/>
             </w:rPr>
           </w:pPr>
-          <w:hyperlink w:anchor="_Toc232510637" w:history="1">
+          <w:hyperlink w:anchor="_Toc232535496" w:history="1">
             <w:r>
               <w:rPr>
                 <w:rStyle w:val="aa"/>
@@ -5881,7 +5889,7 @@
                 <w:noProof/>
                 <w:webHidden/>
               </w:rPr>
-              <w:instrText xml:space="preserve"> PAGEREF _Toc232510637 \h </w:instrText>
+              <w:instrText xml:space="preserve"> PAGEREF _Toc232535496 \h </w:instrText>
             </w:r>
             <w:r>
               <w:rPr>
@@ -5927,7 +5935,7 @@
               <w:sz w:val="22"/>
             </w:rPr>
           </w:pPr>
-          <w:hyperlink w:anchor="_Toc232510638" w:history="1">
+          <w:hyperlink w:anchor="_Toc232535497" w:history="1">
             <w:r>
               <w:rPr>
                 <w:rStyle w:val="aa"/>
@@ -5970,7 +5978,7 @@
                 <w:noProof/>
                 <w:webHidden/>
               </w:rPr>
-              <w:instrText xml:space="preserve"> PAGEREF _Toc232510638 \h </w:instrText>
+              <w:instrText xml:space="preserve"> PAGEREF _Toc232535497 \h </w:instrText>
             </w:r>
             <w:r>
               <w:rPr>
@@ -6016,7 +6024,7 @@
               <w:sz w:val="22"/>
             </w:rPr>
           </w:pPr>
-          <w:hyperlink w:anchor="_Toc232510639" w:history="1">
+          <w:hyperlink w:anchor="_Toc232535498" w:history="1">
             <w:r>
               <w:rPr>
                 <w:rStyle w:val="aa"/>
@@ -6067,7 +6075,7 @@
                 <w:noProof/>
                 <w:webHidden/>
               </w:rPr>
-              <w:instrText xml:space="preserve"> PAGEREF _Toc232510639 \h </w:instrText>
+              <w:instrText xml:space="preserve"> PAGEREF _Toc232535498 \h </w:instrText>
             </w:r>
             <w:r>
               <w:rPr>
@@ -6113,7 +6121,7 @@
               <w:sz w:val="22"/>
             </w:rPr>
           </w:pPr>
-          <w:hyperlink w:anchor="_Toc232510640" w:history="1">
+          <w:hyperlink w:anchor="_Toc232535499" w:history="1">
             <w:r>
               <w:rPr>
                 <w:rStyle w:val="aa"/>
@@ -6156,7 +6164,7 @@
                 <w:noProof/>
                 <w:webHidden/>
               </w:rPr>
-              <w:instrText xml:space="preserve"> PAGEREF _Toc232510640 \h </w:instrText>
+              <w:instrText xml:space="preserve"> PAGEREF _Toc232535499 \h </w:instrText>
             </w:r>
             <w:r>
               <w:rPr>
@@ -6202,7 +6210,7 @@
               <w:sz w:val="22"/>
             </w:rPr>
           </w:pPr>
-          <w:hyperlink w:anchor="_Toc232510641" w:history="1">
+          <w:hyperlink w:anchor="_Toc232535500" w:history="1">
             <w:r>
               <w:rPr>
                 <w:rStyle w:val="aa"/>
@@ -6246,7 +6254,7 @@
                 <w:noProof/>
                 <w:webHidden/>
               </w:rPr>
-              <w:instrText xml:space="preserve"> PAGEREF _Toc232510641 \h </w:instrText>
+              <w:instrText xml:space="preserve"> PAGEREF _Toc232535500 \h </w:instrText>
             </w:r>
             <w:r>
               <w:rPr>
@@ -6292,7 +6300,7 @@
               <w:sz w:val="22"/>
             </w:rPr>
           </w:pPr>
-          <w:hyperlink w:anchor="_Toc232510642" w:history="1">
+          <w:hyperlink w:anchor="_Toc232535501" w:history="1">
             <w:r>
               <w:rPr>
                 <w:rStyle w:val="aa"/>
@@ -6344,7 +6352,7 @@
                 <w:noProof/>
                 <w:webHidden/>
               </w:rPr>
-              <w:instrText xml:space="preserve"> PAGEREF _Toc232510642 \h </w:instrText>
+              <w:instrText xml:space="preserve"> PAGEREF _Toc232535501 \h </w:instrText>
             </w:r>
             <w:r>
               <w:rPr>
@@ -6390,7 +6398,7 @@
               <w:sz w:val="22"/>
             </w:rPr>
           </w:pPr>
-          <w:hyperlink w:anchor="_Toc232510643" w:history="1">
+          <w:hyperlink w:anchor="_Toc232535502" w:history="1">
             <w:r>
               <w:rPr>
                 <w:rStyle w:val="aa"/>
@@ -6442,7 +6450,7 @@
                 <w:noProof/>
                 <w:webHidden/>
               </w:rPr>
-              <w:instrText xml:space="preserve"> PAGEREF _Toc232510643 \h </w:instrText>
+              <w:instrText xml:space="preserve"> PAGEREF _Toc232535502 \h </w:instrText>
             </w:r>
             <w:r>
               <w:rPr>
@@ -6488,7 +6496,7 @@
               <w:sz w:val="22"/>
             </w:rPr>
           </w:pPr>
-          <w:hyperlink w:anchor="_Toc232510644" w:history="1">
+          <w:hyperlink w:anchor="_Toc232535503" w:history="1">
             <w:r>
               <w:rPr>
                 <w:rStyle w:val="aa"/>
@@ -6531,7 +6539,7 @@
                 <w:noProof/>
                 <w:webHidden/>
               </w:rPr>
-              <w:instrText xml:space="preserve"> PAGEREF _Toc232510644 \h </w:instrText>
+              <w:instrText xml:space="preserve"> PAGEREF _Toc232535503 \h </w:instrText>
             </w:r>
             <w:r>
               <w:rPr>
@@ -6577,7 +6585,7 @@
               <w:sz w:val="22"/>
             </w:rPr>
           </w:pPr>
-          <w:hyperlink w:anchor="_Toc232510645" w:history="1">
+          <w:hyperlink w:anchor="_Toc232535504" w:history="1">
             <w:r>
               <w:rPr>
                 <w:rStyle w:val="aa"/>
@@ -6620,7 +6628,7 @@
                 <w:noProof/>
                 <w:webHidden/>
               </w:rPr>
-              <w:instrText xml:space="preserve"> PAGEREF _Toc232510645 \h </w:instrText>
+              <w:instrText xml:space="preserve"> PAGEREF _Toc232535504 \h </w:instrText>
             </w:r>
             <w:r>
               <w:rPr>
@@ -6666,7 +6674,7 @@
               <w:sz w:val="22"/>
             </w:rPr>
           </w:pPr>
-          <w:hyperlink w:anchor="_Toc232510646" w:history="1">
+          <w:hyperlink w:anchor="_Toc232535505" w:history="1">
             <w:r>
               <w:rPr>
                 <w:rStyle w:val="aa"/>
@@ -6710,7 +6718,7 @@
                 <w:noProof/>
                 <w:webHidden/>
               </w:rPr>
-              <w:instrText xml:space="preserve"> PAGEREF _Toc232510646 \h </w:instrText>
+              <w:instrText xml:space="preserve"> PAGEREF _Toc232535505 \h </w:instrText>
             </w:r>
             <w:r>
               <w:rPr>
@@ -6756,7 +6764,7 @@
               <w:sz w:val="22"/>
             </w:rPr>
           </w:pPr>
-          <w:hyperlink w:anchor="_Toc232510647" w:history="1">
+          <w:hyperlink w:anchor="_Toc232535506" w:history="1">
             <w:r>
               <w:rPr>
                 <w:rStyle w:val="aa"/>
@@ -6800,7 +6808,7 @@
                 <w:noProof/>
                 <w:webHidden/>
               </w:rPr>
-              <w:instrText xml:space="preserve"> PAGEREF _Toc232510647 \h </w:instrText>
+              <w:instrText xml:space="preserve"> PAGEREF _Toc232535506 \h </w:instrText>
             </w:r>
             <w:r>
               <w:rPr>
@@ -6846,7 +6854,7 @@
               <w:sz w:val="22"/>
             </w:rPr>
           </w:pPr>
-          <w:hyperlink w:anchor="_Toc232510648" w:history="1">
+          <w:hyperlink w:anchor="_Toc232535507" w:history="1">
             <w:r>
               <w:rPr>
                 <w:rStyle w:val="aa"/>
@@ -6890,7 +6898,7 @@
                 <w:noProof/>
                 <w:webHidden/>
               </w:rPr>
-              <w:instrText xml:space="preserve"> PAGEREF _Toc232510648 \h </w:instrText>
+              <w:instrText xml:space="preserve"> PAGEREF _Toc232535507 \h </w:instrText>
             </w:r>
             <w:r>
               <w:rPr>
@@ -6936,7 +6944,7 @@
               <w:sz w:val="22"/>
             </w:rPr>
           </w:pPr>
-          <w:hyperlink w:anchor="_Toc232510649" w:history="1">
+          <w:hyperlink w:anchor="_Toc232535508" w:history="1">
             <w:r>
               <w:rPr>
                 <w:rStyle w:val="aa"/>
@@ -6980,7 +6988,7 @@
                 <w:noProof/>
                 <w:webHidden/>
               </w:rPr>
-              <w:instrText xml:space="preserve"> PAGEREF _Toc232510649 \h </w:instrText>
+              <w:instrText xml:space="preserve"> PAGEREF _Toc232535508 \h </w:instrText>
             </w:r>
             <w:r>
               <w:rPr>
@@ -7026,7 +7034,7 @@
               <w:sz w:val="22"/>
             </w:rPr>
           </w:pPr>
-          <w:hyperlink w:anchor="_Toc232510650" w:history="1">
+          <w:hyperlink w:anchor="_Toc232535509" w:history="1">
             <w:r>
               <w:rPr>
                 <w:rStyle w:val="aa"/>
@@ -7070,7 +7078,7 @@
                 <w:noProof/>
                 <w:webHidden/>
               </w:rPr>
-              <w:instrText xml:space="preserve"> PAGEREF _Toc232510650 \h </w:instrText>
+              <w:instrText xml:space="preserve"> PAGEREF _Toc232535509 \h </w:instrText>
             </w:r>
             <w:r>
               <w:rPr>
@@ -7116,7 +7124,7 @@
               <w:sz w:val="22"/>
             </w:rPr>
           </w:pPr>
-          <w:hyperlink w:anchor="_Toc232510651" w:history="1">
+          <w:hyperlink w:anchor="_Toc232535510" w:history="1">
             <w:r>
               <w:rPr>
                 <w:rStyle w:val="aa"/>
@@ -7159,7 +7167,7 @@
                 <w:noProof/>
                 <w:webHidden/>
               </w:rPr>
-              <w:instrText xml:space="preserve"> PAGEREF _Toc232510651 \h </w:instrText>
+              <w:instrText xml:space="preserve"> PAGEREF _Toc232535510 \h </w:instrText>
             </w:r>
             <w:r>
               <w:rPr>
@@ -7205,7 +7213,7 @@
               <w:sz w:val="22"/>
             </w:rPr>
           </w:pPr>
-          <w:hyperlink w:anchor="_Toc232510652" w:history="1">
+          <w:hyperlink w:anchor="_Toc232535511" w:history="1">
             <w:r>
               <w:rPr>
                 <w:rStyle w:val="aa"/>
@@ -7248,7 +7256,7 @@
                 <w:noProof/>
                 <w:webHidden/>
               </w:rPr>
-              <w:instrText xml:space="preserve"> PAGEREF _Toc232510652 \h </w:instrText>
+              <w:instrText xml:space="preserve"> PAGEREF _Toc232535511 \h </w:instrText>
             </w:r>
             <w:r>
               <w:rPr>
@@ -7294,7 +7302,7 @@
               <w:sz w:val="22"/>
             </w:rPr>
           </w:pPr>
-          <w:hyperlink w:anchor="_Toc232510653" w:history="1">
+          <w:hyperlink w:anchor="_Toc232535512" w:history="1">
             <w:r>
               <w:rPr>
                 <w:rStyle w:val="aa"/>
@@ -7345,7 +7353,7 @@
                 <w:noProof/>
                 <w:webHidden/>
               </w:rPr>
-              <w:instrText xml:space="preserve"> PAGEREF _Toc232510653 \h </w:instrText>
+              <w:instrText xml:space="preserve"> PAGEREF _Toc232535512 \h </w:instrText>
             </w:r>
             <w:r>
               <w:rPr>
@@ -7391,7 +7399,7 @@
               <w:sz w:val="22"/>
             </w:rPr>
           </w:pPr>
-          <w:hyperlink w:anchor="_Toc232510654" w:history="1">
+          <w:hyperlink w:anchor="_Toc232535513" w:history="1">
             <w:r>
               <w:rPr>
                 <w:rStyle w:val="aa"/>
@@ -7434,7 +7442,7 @@
                 <w:noProof/>
                 <w:webHidden/>
               </w:rPr>
-              <w:instrText xml:space="preserve"> PAGEREF _Toc232510654 \h </w:instrText>
+              <w:instrText xml:space="preserve"> PAGEREF _Toc232535513 \h </w:instrText>
             </w:r>
             <w:r>
               <w:rPr>
@@ -7480,7 +7488,7 @@
               <w:sz w:val="22"/>
             </w:rPr>
           </w:pPr>
-          <w:hyperlink w:anchor="_Toc232510655" w:history="1">
+          <w:hyperlink w:anchor="_Toc232535514" w:history="1">
             <w:r>
               <w:rPr>
                 <w:rStyle w:val="aa"/>
@@ -7523,7 +7531,7 @@
                 <w:noProof/>
                 <w:webHidden/>
               </w:rPr>
-              <w:instrText xml:space="preserve"> PAGEREF _Toc232510655 \h </w:instrText>
+              <w:instrText xml:space="preserve"> PAGEREF _Toc232535514 \h </w:instrText>
             </w:r>
             <w:r>
               <w:rPr>
@@ -7569,7 +7577,7 @@
               <w:sz w:val="22"/>
             </w:rPr>
           </w:pPr>
-          <w:hyperlink w:anchor="_Toc232510656" w:history="1">
+          <w:hyperlink w:anchor="_Toc232535515" w:history="1">
             <w:r>
               <w:rPr>
                 <w:rStyle w:val="aa"/>
@@ -7612,7 +7620,7 @@
                 <w:noProof/>
                 <w:webHidden/>
               </w:rPr>
-              <w:instrText xml:space="preserve"> PAGEREF _Toc232510656 \h </w:instrText>
+              <w:instrText xml:space="preserve"> PAGEREF _Toc232535515 \h </w:instrText>
             </w:r>
             <w:r>
               <w:rPr>
@@ -7658,7 +7666,7 @@
               <w:sz w:val="22"/>
             </w:rPr>
           </w:pPr>
-          <w:hyperlink w:anchor="_Toc232510657" w:history="1">
+          <w:hyperlink w:anchor="_Toc232535516" w:history="1">
             <w:r>
               <w:rPr>
                 <w:rStyle w:val="aa"/>
@@ -7701,7 +7709,7 @@
                 <w:noProof/>
                 <w:webHidden/>
               </w:rPr>
-              <w:instrText xml:space="preserve"> PAGEREF _Toc232510657 \h </w:instrText>
+              <w:instrText xml:space="preserve"> PAGEREF _Toc232535516 \h </w:instrText>
             </w:r>
             <w:r>
               <w:rPr>
@@ -7747,7 +7755,7 @@
               <w:sz w:val="22"/>
             </w:rPr>
           </w:pPr>
-          <w:hyperlink w:anchor="_Toc232510658" w:history="1">
+          <w:hyperlink w:anchor="_Toc232535517" w:history="1">
             <w:r>
               <w:rPr>
                 <w:rStyle w:val="aa"/>
@@ -7790,7 +7798,7 @@
                 <w:noProof/>
                 <w:webHidden/>
               </w:rPr>
-              <w:instrText xml:space="preserve"> PAGEREF _Toc232510658 \h </w:instrText>
+              <w:instrText xml:space="preserve"> PAGEREF _Toc232535517 \h </w:instrText>
             </w:r>
             <w:r>
               <w:rPr>
@@ -7836,7 +7844,7 @@
               <w:sz w:val="22"/>
             </w:rPr>
           </w:pPr>
-          <w:hyperlink w:anchor="_Toc232510659" w:history="1">
+          <w:hyperlink w:anchor="_Toc232535518" w:history="1">
             <w:r>
               <w:rPr>
                 <w:rStyle w:val="aa"/>
@@ -7879,7 +7887,7 @@
                 <w:noProof/>
                 <w:webHidden/>
               </w:rPr>
-              <w:instrText xml:space="preserve"> PAGEREF _Toc232510659 \h </w:instrText>
+              <w:instrText xml:space="preserve"> PAGEREF _Toc232535518 \h </w:instrText>
             </w:r>
             <w:r>
               <w:rPr>
@@ -7924,7 +7932,7 @@
               <w:sz w:val="22"/>
             </w:rPr>
           </w:pPr>
-          <w:hyperlink w:anchor="_Toc232510660" w:history="1">
+          <w:hyperlink w:anchor="_Toc232535519" w:history="1">
             <w:r>
               <w:rPr>
                 <w:rStyle w:val="aa"/>
@@ -7967,7 +7975,7 @@
                 <w:noProof/>
                 <w:webHidden/>
               </w:rPr>
-              <w:instrText xml:space="preserve"> PAGEREF _Toc232510660 \h </w:instrText>
+              <w:instrText xml:space="preserve"> PAGEREF _Toc232535519 \h </w:instrText>
             </w:r>
             <w:r>
               <w:rPr>
@@ -8013,7 +8021,7 @@
               <w:sz w:val="22"/>
             </w:rPr>
           </w:pPr>
-          <w:hyperlink w:anchor="_Toc232510661" w:history="1">
+          <w:hyperlink w:anchor="_Toc232535520" w:history="1">
             <w:r>
               <w:rPr>
                 <w:rStyle w:val="aa"/>
@@ -8056,7 +8064,7 @@
                 <w:noProof/>
                 <w:webHidden/>
               </w:rPr>
-              <w:instrText xml:space="preserve"> PAGEREF _Toc232510661 \h </w:instrText>
+              <w:instrText xml:space="preserve"> PAGEREF _Toc232535520 \h </w:instrText>
             </w:r>
             <w:r>
               <w:rPr>
@@ -8102,7 +8110,7 @@
               <w:sz w:val="22"/>
             </w:rPr>
           </w:pPr>
-          <w:hyperlink w:anchor="_Toc232510662" w:history="1">
+          <w:hyperlink w:anchor="_Toc232535521" w:history="1">
             <w:r>
               <w:rPr>
                 <w:rStyle w:val="aa"/>
@@ -8145,7 +8153,7 @@
                 <w:noProof/>
                 <w:webHidden/>
               </w:rPr>
-              <w:instrText xml:space="preserve"> PAGEREF _Toc232510662 \h </w:instrText>
+              <w:instrText xml:space="preserve"> PAGEREF _Toc232535521 \h </w:instrText>
             </w:r>
             <w:r>
               <w:rPr>
@@ -8191,7 +8199,7 @@
               <w:sz w:val="22"/>
             </w:rPr>
           </w:pPr>
-          <w:hyperlink w:anchor="_Toc232510663" w:history="1">
+          <w:hyperlink w:anchor="_Toc232535522" w:history="1">
             <w:r>
               <w:rPr>
                 <w:rStyle w:val="aa"/>
@@ -8234,7 +8242,7 @@
                 <w:noProof/>
                 <w:webHidden/>
               </w:rPr>
-              <w:instrText xml:space="preserve"> PAGEREF _Toc232510663 \h </w:instrText>
+              <w:instrText xml:space="preserve"> PAGEREF _Toc232535522 \h </w:instrText>
             </w:r>
             <w:r>
               <w:rPr>
@@ -8280,7 +8288,7 @@
               <w:sz w:val="22"/>
             </w:rPr>
           </w:pPr>
-          <w:hyperlink w:anchor="_Toc232510664" w:history="1">
+          <w:hyperlink w:anchor="_Toc232535523" w:history="1">
             <w:r>
               <w:rPr>
                 <w:rStyle w:val="aa"/>
@@ -8331,7 +8339,7 @@
                 <w:noProof/>
                 <w:webHidden/>
               </w:rPr>
-              <w:instrText xml:space="preserve"> PAGEREF _Toc232510664 \h </w:instrText>
+              <w:instrText xml:space="preserve"> PAGEREF _Toc232535523 \h </w:instrText>
             </w:r>
             <w:r>
               <w:rPr>
@@ -8376,7 +8384,7 @@
               <w:sz w:val="22"/>
             </w:rPr>
           </w:pPr>
-          <w:hyperlink w:anchor="_Toc232510665" w:history="1">
+          <w:hyperlink w:anchor="_Toc232535524" w:history="1">
             <w:r>
               <w:rPr>
                 <w:rStyle w:val="aa"/>
@@ -8403,7 +8411,7 @@
                 <w:noProof/>
                 <w:webHidden/>
               </w:rPr>
-              <w:instrText xml:space="preserve"> PAGEREF _Toc232510665 \h </w:instrText>
+              <w:instrText xml:space="preserve"> PAGEREF _Toc232535524 \h </w:instrText>
             </w:r>
             <w:r>
               <w:rPr>
@@ -8449,7 +8457,7 @@
               <w:sz w:val="22"/>
             </w:rPr>
           </w:pPr>
-          <w:hyperlink w:anchor="_Toc232510666" w:history="1">
+          <w:hyperlink w:anchor="_Toc232535525" w:history="1">
             <w:r>
               <w:rPr>
                 <w:rStyle w:val="aa"/>
@@ -8492,7 +8500,7 @@
                 <w:noProof/>
                 <w:webHidden/>
               </w:rPr>
-              <w:instrText xml:space="preserve"> PAGEREF _Toc232510666 \h </w:instrText>
+              <w:instrText xml:space="preserve"> PAGEREF _Toc232535525 \h </w:instrText>
             </w:r>
             <w:r>
               <w:rPr>
@@ -8538,7 +8546,7 @@
               <w:sz w:val="22"/>
             </w:rPr>
           </w:pPr>
-          <w:hyperlink w:anchor="_Toc232510667" w:history="1">
+          <w:hyperlink w:anchor="_Toc232535526" w:history="1">
             <w:r>
               <w:rPr>
                 <w:rStyle w:val="aa"/>
@@ -8581,7 +8589,7 @@
                 <w:noProof/>
                 <w:webHidden/>
               </w:rPr>
-              <w:instrText xml:space="preserve"> PAGEREF _Toc232510667 \h </w:instrText>
+              <w:instrText xml:space="preserve"> PAGEREF _Toc232535526 \h </w:instrText>
             </w:r>
             <w:r>
               <w:rPr>
@@ -8627,7 +8635,7 @@
               <w:sz w:val="22"/>
             </w:rPr>
           </w:pPr>
-          <w:hyperlink w:anchor="_Toc232510668" w:history="1">
+          <w:hyperlink w:anchor="_Toc232535527" w:history="1">
             <w:r>
               <w:rPr>
                 <w:rStyle w:val="aa"/>
@@ -8670,7 +8678,7 @@
                 <w:noProof/>
                 <w:webHidden/>
               </w:rPr>
-              <w:instrText xml:space="preserve"> PAGEREF _Toc232510668 \h </w:instrText>
+              <w:instrText xml:space="preserve"> PAGEREF _Toc232535527 \h </w:instrText>
             </w:r>
             <w:r>
               <w:rPr>
@@ -8716,7 +8724,7 @@
               <w:sz w:val="22"/>
             </w:rPr>
           </w:pPr>
-          <w:hyperlink w:anchor="_Toc232510669" w:history="1">
+          <w:hyperlink w:anchor="_Toc232535528" w:history="1">
             <w:r>
               <w:rPr>
                 <w:rStyle w:val="aa"/>
@@ -8759,7 +8767,7 @@
                 <w:noProof/>
                 <w:webHidden/>
               </w:rPr>
-              <w:instrText xml:space="preserve"> PAGEREF _Toc232510669 \h </w:instrText>
+              <w:instrText xml:space="preserve"> PAGEREF _Toc232535528 \h </w:instrText>
             </w:r>
             <w:r>
               <w:rPr>
@@ -8805,7 +8813,7 @@
               <w:sz w:val="22"/>
             </w:rPr>
           </w:pPr>
-          <w:hyperlink w:anchor="_Toc232510670" w:history="1">
+          <w:hyperlink w:anchor="_Toc232535529" w:history="1">
             <w:r>
               <w:rPr>
                 <w:rStyle w:val="aa"/>
@@ -8848,7 +8856,7 @@
                 <w:noProof/>
                 <w:webHidden/>
               </w:rPr>
-              <w:instrText xml:space="preserve"> PAGEREF _Toc232510670 \h </w:instrText>
+              <w:instrText xml:space="preserve"> PAGEREF _Toc232535529 \h </w:instrText>
             </w:r>
             <w:r>
               <w:rPr>
@@ -8894,7 +8902,7 @@
               <w:sz w:val="22"/>
             </w:rPr>
           </w:pPr>
-          <w:hyperlink w:anchor="_Toc232510671" w:history="1">
+          <w:hyperlink w:anchor="_Toc232535530" w:history="1">
             <w:r>
               <w:rPr>
                 <w:rStyle w:val="aa"/>
@@ -8937,7 +8945,7 @@
                 <w:noProof/>
                 <w:webHidden/>
               </w:rPr>
-              <w:instrText xml:space="preserve"> PAGEREF _Toc232510671 \h </w:instrText>
+              <w:instrText xml:space="preserve"> PAGEREF _Toc232535530 \h </w:instrText>
             </w:r>
             <w:r>
               <w:rPr>
@@ -8983,7 +8991,7 @@
               <w:sz w:val="22"/>
             </w:rPr>
           </w:pPr>
-          <w:hyperlink w:anchor="_Toc232510672" w:history="1">
+          <w:hyperlink w:anchor="_Toc232535531" w:history="1">
             <w:r>
               <w:rPr>
                 <w:rStyle w:val="aa"/>
@@ -9026,7 +9034,7 @@
                 <w:noProof/>
                 <w:webHidden/>
               </w:rPr>
-              <w:instrText xml:space="preserve"> PAGEREF _Toc232510672 \h </w:instrText>
+              <w:instrText xml:space="preserve"> PAGEREF _Toc232535531 \h </w:instrText>
             </w:r>
             <w:r>
               <w:rPr>
@@ -9072,7 +9080,7 @@
               <w:sz w:val="22"/>
             </w:rPr>
           </w:pPr>
-          <w:hyperlink w:anchor="_Toc232510673" w:history="1">
+          <w:hyperlink w:anchor="_Toc232535532" w:history="1">
             <w:r>
               <w:rPr>
                 <w:rStyle w:val="aa"/>
@@ -9123,7 +9131,7 @@
                 <w:noProof/>
                 <w:webHidden/>
               </w:rPr>
-              <w:instrText xml:space="preserve"> PAGEREF _Toc232510673 \h </w:instrText>
+              <w:instrText xml:space="preserve"> PAGEREF _Toc232535532 \h </w:instrText>
             </w:r>
             <w:r>
               <w:rPr>
@@ -9169,7 +9177,7 @@
               <w:sz w:val="22"/>
             </w:rPr>
           </w:pPr>
-          <w:hyperlink w:anchor="_Toc232510674" w:history="1">
+          <w:hyperlink w:anchor="_Toc232535533" w:history="1">
             <w:r>
               <w:rPr>
                 <w:rStyle w:val="aa"/>
@@ -9212,7 +9220,7 @@
                 <w:noProof/>
                 <w:webHidden/>
               </w:rPr>
-              <w:instrText xml:space="preserve"> PAGEREF _Toc232510674 \h </w:instrText>
+              <w:instrText xml:space="preserve"> PAGEREF _Toc232535533 \h </w:instrText>
             </w:r>
             <w:r>
               <w:rPr>
@@ -9257,7 +9265,7 @@
               <w:sz w:val="22"/>
             </w:rPr>
           </w:pPr>
-          <w:hyperlink w:anchor="_Toc232510675" w:history="1">
+          <w:hyperlink w:anchor="_Toc232535534" w:history="1">
             <w:r>
               <w:rPr>
                 <w:rStyle w:val="aa"/>
@@ -9300,7 +9308,7 @@
                 <w:noProof/>
                 <w:webHidden/>
               </w:rPr>
-              <w:instrText xml:space="preserve"> PAGEREF _Toc232510675 \h </w:instrText>
+              <w:instrText xml:space="preserve"> PAGEREF _Toc232535534 \h </w:instrText>
             </w:r>
             <w:r>
               <w:rPr>
@@ -9342,13 +9350,13 @@
               <w:sz w:val="22"/>
             </w:rPr>
           </w:pPr>
-          <w:hyperlink w:anchor="_Toc232510676" w:history="1">
+          <w:hyperlink w:anchor="_Toc232535535" w:history="1">
             <w:r>
               <w:rPr>
                 <w:rStyle w:val="aa"/>
                 <w:noProof/>
               </w:rPr>
-              <w:t>Източници</w:t>
+              <w:t>Речник на използвани съкращения и термини</w:t>
             </w:r>
             <w:r>
               <w:rPr>
@@ -9369,7 +9377,7 @@
                 <w:noProof/>
                 <w:webHidden/>
               </w:rPr>
-              <w:instrText xml:space="preserve"> PAGEREF _Toc232510676 \h </w:instrText>
+              <w:instrText xml:space="preserve"> PAGEREF _Toc232535535 \h </w:instrText>
             </w:r>
             <w:r>
               <w:rPr>
@@ -9402,12 +9410,70 @@
         </w:p>
         <w:p>
           <w:pPr>
+            <w:pStyle w:val="11"/>
             <w:spacing w:line="276" w:lineRule="auto"/>
             <w:rPr>
               <w:b/>
               <w:bCs/>
             </w:rPr>
           </w:pPr>
+          <w:hyperlink w:anchor="_Toc232535536" w:history="1">
+            <w:r>
+              <w:rPr>
+                <w:rStyle w:val="aa"/>
+                <w:noProof/>
+              </w:rPr>
+              <w:t>Източници</w:t>
+            </w:r>
+            <w:r>
+              <w:rPr>
+                <w:noProof/>
+                <w:webHidden/>
+              </w:rPr>
+              <w:tab/>
+            </w:r>
+            <w:r>
+              <w:rPr>
+                <w:noProof/>
+                <w:webHidden/>
+              </w:rPr>
+              <w:fldChar w:fldCharType="begin"/>
+            </w:r>
+            <w:r>
+              <w:rPr>
+                <w:noProof/>
+                <w:webHidden/>
+              </w:rPr>
+              <w:instrText xml:space="preserve"> PAGEREF _Toc232535536 \h </w:instrText>
+            </w:r>
+            <w:r>
+              <w:rPr>
+                <w:noProof/>
+                <w:webHidden/>
+              </w:rPr>
+            </w:r>
+            <w:r>
+              <w:rPr>
+                <w:noProof/>
+                <w:webHidden/>
+              </w:rPr>
+              <w:fldChar w:fldCharType="separate"/>
+            </w:r>
+            <w:r>
+              <w:rPr>
+                <w:noProof/>
+                <w:webHidden/>
+              </w:rPr>
+              <w:t>60</w:t>
+            </w:r>
+            <w:r>
+              <w:rPr>
+                <w:noProof/>
+                <w:webHidden/>
+              </w:rPr>
+              <w:fldChar w:fldCharType="end"/>
+            </w:r>
+          </w:hyperlink>
           <w:r>
             <w:rPr>
               <w:b/>
@@ -9422,12 +9488,12 @@
       <w:pPr>
         <w:pStyle w:val="1"/>
       </w:pPr>
-      <w:bookmarkStart w:id="0" w:name="_Toc232510580"/>
+      <w:bookmarkStart w:id="1" w:name="_Toc232535439"/>
       <w:r>
         <w:lastRenderedPageBreak/>
         <w:t>УВОД</w:t>
       </w:r>
-      <w:bookmarkEnd w:id="0"/>
+      <w:bookmarkEnd w:id="1"/>
     </w:p>
     <w:p>
       <w:r>
@@ -9585,7 +9651,7 @@
       <w:pPr>
         <w:pStyle w:val="1"/>
       </w:pPr>
-      <w:bookmarkStart w:id="1" w:name="_Toc232510581"/>
+      <w:bookmarkStart w:id="2" w:name="_Toc232535440"/>
       <w:r>
         <w:lastRenderedPageBreak/>
         <w:t>Цели и задачи. Анализ на с</w:t>
@@ -9596,7 +9662,7 @@
       <w:r>
         <w:t>ществуващи разработки</w:t>
       </w:r>
-      <w:bookmarkEnd w:id="1"/>
+      <w:bookmarkEnd w:id="2"/>
     </w:p>
     <w:p>
       <w:pPr>
@@ -9606,11 +9672,11 @@
           <w:numId w:val="6"/>
         </w:numPr>
       </w:pPr>
-      <w:bookmarkStart w:id="2" w:name="_Toc232510582"/>
+      <w:bookmarkStart w:id="3" w:name="_Toc232535441"/>
       <w:r>
         <w:t>Цели на проекта</w:t>
       </w:r>
-      <w:bookmarkEnd w:id="2"/>
+      <w:bookmarkEnd w:id="3"/>
     </w:p>
     <w:p>
       <w:r>
@@ -9636,11 +9702,11 @@
           <w:numId w:val="6"/>
         </w:numPr>
       </w:pPr>
-      <w:bookmarkStart w:id="3" w:name="_Toc232510583"/>
+      <w:bookmarkStart w:id="4" w:name="_Toc232535442"/>
       <w:r>
         <w:t>Задачи на проекта</w:t>
       </w:r>
-      <w:bookmarkEnd w:id="3"/>
+      <w:bookmarkEnd w:id="4"/>
     </w:p>
     <w:p>
       <w:r>
@@ -9752,11 +9818,11 @@
           <w:numId w:val="6"/>
         </w:numPr>
       </w:pPr>
-      <w:bookmarkStart w:id="4" w:name="_Toc232510584"/>
+      <w:bookmarkStart w:id="5" w:name="_Toc232535443"/>
       <w:r>
         <w:t>Анализ на съществуващи разработки</w:t>
       </w:r>
-      <w:bookmarkEnd w:id="4"/>
+      <w:bookmarkEnd w:id="5"/>
     </w:p>
     <w:p>
       <w:pPr>
@@ -9776,11 +9842,11 @@
           <w:numId w:val="4"/>
         </w:numPr>
       </w:pPr>
-      <w:bookmarkStart w:id="5" w:name="_Toc232510585"/>
+      <w:bookmarkStart w:id="6" w:name="_Toc232535444"/>
       <w:r>
         <w:t>Системи базирани на RFID</w:t>
       </w:r>
-      <w:bookmarkEnd w:id="5"/>
+      <w:bookmarkEnd w:id="6"/>
     </w:p>
     <w:p>
       <w:pPr>
@@ -9820,11 +9886,11 @@
           <w:numId w:val="4"/>
         </w:numPr>
       </w:pPr>
-      <w:bookmarkStart w:id="6" w:name="_Toc232510586"/>
+      <w:bookmarkStart w:id="7" w:name="_Toc232535445"/>
       <w:r>
         <w:t>Платформени решения</w:t>
       </w:r>
-      <w:bookmarkEnd w:id="6"/>
+      <w:bookmarkEnd w:id="7"/>
     </w:p>
     <w:p>
       <w:pPr>
@@ -9859,11 +9925,11 @@
           <w:numId w:val="4"/>
         </w:numPr>
       </w:pPr>
-      <w:bookmarkStart w:id="7" w:name="_Toc232510587"/>
+      <w:bookmarkStart w:id="8" w:name="_Toc232535446"/>
       <w:r>
         <w:t>NFC/HCE разработки</w:t>
       </w:r>
-      <w:bookmarkEnd w:id="7"/>
+      <w:bookmarkEnd w:id="8"/>
     </w:p>
     <w:p>
       <w:pPr>
@@ -9905,11 +9971,11 @@
           <w:numId w:val="6"/>
         </w:numPr>
       </w:pPr>
-      <w:bookmarkStart w:id="8" w:name="_Toc232510588"/>
+      <w:bookmarkStart w:id="9" w:name="_Toc232535447"/>
       <w:r>
         <w:t>Обосновка на избрания подход</w:t>
       </w:r>
-      <w:bookmarkEnd w:id="8"/>
+      <w:bookmarkEnd w:id="9"/>
     </w:p>
     <w:p>
       <w:r>
@@ -10008,12 +10074,12 @@
       <w:r>
         <w:br w:type="page"/>
       </w:r>
-      <w:bookmarkStart w:id="9" w:name="_Toc232510589"/>
+      <w:bookmarkStart w:id="10" w:name="_Toc232535448"/>
       <w:r>
         <w:lastRenderedPageBreak/>
         <w:t>Проектиране на системата</w:t>
       </w:r>
-      <w:bookmarkEnd w:id="9"/>
+      <w:bookmarkEnd w:id="10"/>
     </w:p>
     <w:p>
       <w:pPr>
@@ -10023,11 +10089,11 @@
           <w:numId w:val="7"/>
         </w:numPr>
       </w:pPr>
-      <w:bookmarkStart w:id="10" w:name="_Toc232510590"/>
+      <w:bookmarkStart w:id="11" w:name="_Toc232535449"/>
       <w:r>
         <w:t>Системна архитектура</w:t>
       </w:r>
-      <w:bookmarkEnd w:id="10"/>
+      <w:bookmarkEnd w:id="11"/>
     </w:p>
     <w:p>
       <w:r>
@@ -10052,7 +10118,7 @@
           <w:noProof/>
         </w:rPr>
         <w:drawing>
-          <wp:inline distT="0" distB="0" distL="0" distR="0" wp14:anchorId="5DC25521" wp14:editId="0348C87B">
+          <wp:inline distT="0" distB="0" distL="0" distR="0" wp14:anchorId="3A09E2E8" wp14:editId="2852B234">
             <wp:extent cx="4579620" cy="2011680"/>
             <wp:effectExtent l="0" t="0" r="0" b="7620"/>
             <wp:docPr id="1" name="Картина 1" descr="C:\Users\marti\OneDrive\Работен плот\blokova_shema.drawio.png"/>
@@ -10141,11 +10207,11 @@
           <w:numId w:val="5"/>
         </w:numPr>
       </w:pPr>
-      <w:bookmarkStart w:id="11" w:name="_Toc232510591"/>
+      <w:bookmarkStart w:id="12" w:name="_Toc232535450"/>
       <w:r>
         <w:t>Компоненти</w:t>
       </w:r>
-      <w:bookmarkEnd w:id="11"/>
+      <w:bookmarkEnd w:id="12"/>
     </w:p>
     <w:p>
       <w:pPr>
@@ -10156,13 +10222,13 @@
         </w:numPr>
         <w:ind w:left="1854"/>
       </w:pPr>
-      <w:bookmarkStart w:id="12" w:name="_ESP32_+_PN532"/>
-      <w:bookmarkStart w:id="13" w:name="_Toc232510592"/>
-      <w:bookmarkEnd w:id="12"/>
+      <w:bookmarkStart w:id="13" w:name="_ESP32_+_PN532"/>
+      <w:bookmarkStart w:id="14" w:name="_Toc232535451"/>
+      <w:bookmarkEnd w:id="13"/>
       <w:r>
         <w:t>ESP32 + PN532 (NFC четец)</w:t>
       </w:r>
-      <w:bookmarkEnd w:id="13"/>
+      <w:bookmarkEnd w:id="14"/>
     </w:p>
     <w:p>
       <w:r>
@@ -10676,7 +10742,7 @@
           <w:noProof/>
         </w:rPr>
         <w:drawing>
-          <wp:inline distT="0" distB="0" distL="0" distR="0" wp14:anchorId="1A3FC2F8" wp14:editId="1B2764FD">
+          <wp:inline distT="0" distB="0" distL="0" distR="0" wp14:anchorId="078B3927" wp14:editId="031C52DB">
             <wp:extent cx="5227320" cy="4132533"/>
             <wp:effectExtent l="0" t="0" r="0" b="1905"/>
             <wp:docPr id="3" name="Картина 3"/>
@@ -10744,7 +10810,7 @@
         </w:numPr>
         <w:ind w:left="1854"/>
       </w:pPr>
-      <w:bookmarkStart w:id="14" w:name="_Toc232510593"/>
+      <w:bookmarkStart w:id="15" w:name="_Toc232535452"/>
       <w:r>
         <w:rPr>
           <w:lang w:val="en-US"/>
@@ -10755,7 +10821,7 @@
       <w:r>
         <w:t>приложение</w:t>
       </w:r>
-      <w:bookmarkEnd w:id="14"/>
+      <w:bookmarkEnd w:id="15"/>
     </w:p>
     <w:p>
       <w:r>
@@ -10833,14 +10899,14 @@
         </w:numPr>
         <w:ind w:left="1854"/>
       </w:pPr>
-      <w:bookmarkStart w:id="15" w:name="_Toc232510594"/>
+      <w:bookmarkStart w:id="16" w:name="_Toc232535453"/>
       <w:r>
         <w:rPr>
           <w:lang w:val="en-US"/>
         </w:rPr>
         <w:t>FastAPI Backend</w:t>
       </w:r>
-      <w:bookmarkEnd w:id="15"/>
+      <w:bookmarkEnd w:id="16"/>
     </w:p>
     <w:p>
       <w:pPr>
@@ -10911,11 +10977,11 @@
         </w:numPr>
         <w:ind w:left="1854"/>
       </w:pPr>
-      <w:bookmarkStart w:id="16" w:name="_Toc232510595"/>
+      <w:bookmarkStart w:id="17" w:name="_Toc232535454"/>
       <w:r>
         <w:t>Уеб интерфейс</w:t>
       </w:r>
-      <w:bookmarkEnd w:id="16"/>
+      <w:bookmarkEnd w:id="17"/>
     </w:p>
     <w:p>
       <w:r>
@@ -10933,11 +10999,11 @@
           <w:numId w:val="5"/>
         </w:numPr>
       </w:pPr>
-      <w:bookmarkStart w:id="17" w:name="_Toc232510596"/>
+      <w:bookmarkStart w:id="18" w:name="_Toc232535455"/>
       <w:r>
         <w:t>Описание на комуникационния поток</w:t>
       </w:r>
-      <w:bookmarkEnd w:id="17"/>
+      <w:bookmarkEnd w:id="18"/>
     </w:p>
     <w:p>
       <w:r>
@@ -11058,7 +11124,7 @@
           <w:noProof/>
         </w:rPr>
         <w:drawing>
-          <wp:inline distT="0" distB="0" distL="0" distR="0" wp14:anchorId="5159ED90" wp14:editId="01FB9B3D">
+          <wp:inline distT="0" distB="0" distL="0" distR="0" wp14:anchorId="70A34C2F" wp14:editId="43AEA2DC">
             <wp:extent cx="5044673" cy="5501640"/>
             <wp:effectExtent l="0" t="0" r="3810" b="3810"/>
             <wp:docPr id="4" name="Картина 4" descr="C:\Users\marti\OneDrive\Работен плот\seq_diagram.png"/>
@@ -11455,11 +11521,11 @@
           <w:numId w:val="5"/>
         </w:numPr>
       </w:pPr>
-      <w:bookmarkStart w:id="18" w:name="_Toc232510597"/>
+      <w:bookmarkStart w:id="19" w:name="_Toc232535456"/>
       <w:r>
         <w:t>Видове потребители на системата</w:t>
       </w:r>
-      <w:bookmarkEnd w:id="18"/>
+      <w:bookmarkEnd w:id="19"/>
     </w:p>
     <w:p>
       <w:r>
@@ -11593,7 +11659,7 @@
           <w:numId w:val="5"/>
         </w:numPr>
       </w:pPr>
-      <w:bookmarkStart w:id="19" w:name="_Toc232510598"/>
+      <w:bookmarkStart w:id="20" w:name="_Toc232535457"/>
       <w:r>
         <w:t>Модел</w:t>
       </w:r>
@@ -11603,7 +11669,7 @@
       <w:r>
         <w:t xml:space="preserve"> данни</w:t>
       </w:r>
-      <w:bookmarkEnd w:id="19"/>
+      <w:bookmarkEnd w:id="20"/>
     </w:p>
     <w:p>
       <w:pPr>
@@ -11651,7 +11717,7 @@
           <w:noProof/>
         </w:rPr>
         <w:drawing>
-          <wp:inline distT="0" distB="0" distL="0" distR="0" wp14:anchorId="2C7F122F" wp14:editId="21E95032">
+          <wp:inline distT="0" distB="0" distL="0" distR="0" wp14:anchorId="1DAA9F2D" wp14:editId="35A93F3D">
             <wp:extent cx="5760720" cy="5300980"/>
             <wp:effectExtent l="0" t="0" r="0" b="0"/>
             <wp:docPr id="6" name="Картина 6"/>
@@ -11742,9 +11808,9 @@
           <w:lang w:val="en-US"/>
         </w:rPr>
       </w:pPr>
-      <w:bookmarkStart w:id="20" w:name="_Users"/>
-      <w:bookmarkStart w:id="21" w:name="_Toc232510599"/>
-      <w:bookmarkEnd w:id="20"/>
+      <w:bookmarkStart w:id="21" w:name="_Users"/>
+      <w:bookmarkStart w:id="22" w:name="_Toc232535458"/>
+      <w:bookmarkEnd w:id="21"/>
       <w:r>
         <w:rPr>
           <w:rStyle w:val="ab"/>
@@ -11755,7 +11821,7 @@
         <w:lastRenderedPageBreak/>
         <w:t>Users</w:t>
       </w:r>
-      <w:bookmarkEnd w:id="21"/>
+      <w:bookmarkEnd w:id="22"/>
     </w:p>
     <w:p>
       <w:r>
@@ -11789,14 +11855,14 @@
           <w:lang w:val="en-US"/>
         </w:rPr>
       </w:pPr>
-      <w:bookmarkStart w:id="22" w:name="_Toc232510600"/>
+      <w:bookmarkStart w:id="23" w:name="_Toc232535459"/>
       <w:r>
         <w:rPr>
           <w:lang w:val="en-US"/>
         </w:rPr>
         <w:t>Students</w:t>
       </w:r>
-      <w:bookmarkEnd w:id="22"/>
+      <w:bookmarkEnd w:id="23"/>
     </w:p>
     <w:p>
       <w:r>
@@ -11821,14 +11887,14 @@
           <w:lang w:val="en-US"/>
         </w:rPr>
       </w:pPr>
-      <w:bookmarkStart w:id="23" w:name="_Toc232510601"/>
+      <w:bookmarkStart w:id="24" w:name="_Toc232535460"/>
       <w:r>
         <w:rPr>
           <w:lang w:val="en-US"/>
         </w:rPr>
         <w:t>Teachers</w:t>
       </w:r>
-      <w:bookmarkEnd w:id="23"/>
+      <w:bookmarkEnd w:id="24"/>
     </w:p>
     <w:p>
       <w:pPr>
@@ -11855,14 +11921,14 @@
         </w:numPr>
         <w:ind w:left="1854"/>
       </w:pPr>
-      <w:bookmarkStart w:id="24" w:name="_Toc232510602"/>
+      <w:bookmarkStart w:id="25" w:name="_Toc232535461"/>
       <w:r>
         <w:rPr>
           <w:lang w:val="en-US"/>
         </w:rPr>
         <w:t>Courses</w:t>
       </w:r>
-      <w:bookmarkEnd w:id="24"/>
+      <w:bookmarkEnd w:id="25"/>
     </w:p>
     <w:p>
       <w:r>
@@ -11884,14 +11950,14 @@
           <w:lang w:val="en-US"/>
         </w:rPr>
       </w:pPr>
-      <w:bookmarkStart w:id="25" w:name="_Toc232510603"/>
+      <w:bookmarkStart w:id="26" w:name="_Toc232535462"/>
       <w:r>
         <w:rPr>
           <w:lang w:val="en-US"/>
         </w:rPr>
         <w:t>Groups</w:t>
       </w:r>
-      <w:bookmarkEnd w:id="25"/>
+      <w:bookmarkEnd w:id="26"/>
     </w:p>
     <w:p>
       <w:r>
@@ -11916,14 +11982,14 @@
         </w:numPr>
         <w:ind w:left="1854"/>
       </w:pPr>
-      <w:bookmarkStart w:id="26" w:name="_Toc232510604"/>
+      <w:bookmarkStart w:id="27" w:name="_Toc232535463"/>
       <w:r>
         <w:rPr>
           <w:lang w:val="en-US"/>
         </w:rPr>
         <w:t>GroupCourses</w:t>
       </w:r>
-      <w:bookmarkEnd w:id="26"/>
+      <w:bookmarkEnd w:id="27"/>
     </w:p>
     <w:p>
       <w:r>
@@ -11948,7 +12014,7 @@
         </w:numPr>
         <w:ind w:left="1854"/>
       </w:pPr>
-      <w:bookmarkStart w:id="27" w:name="_Toc232510605"/>
+      <w:bookmarkStart w:id="28" w:name="_Toc232535464"/>
       <w:r>
         <w:rPr>
           <w:lang w:val="en-US"/>
@@ -11956,7 +12022,7 @@
         <w:lastRenderedPageBreak/>
         <w:t>Schedules</w:t>
       </w:r>
-      <w:bookmarkEnd w:id="27"/>
+      <w:bookmarkEnd w:id="28"/>
     </w:p>
     <w:p>
       <w:r>
@@ -11993,14 +12059,14 @@
         </w:numPr>
         <w:ind w:left="1854"/>
       </w:pPr>
-      <w:bookmarkStart w:id="28" w:name="_Toc232510606"/>
+      <w:bookmarkStart w:id="29" w:name="_Toc232535465"/>
       <w:r>
         <w:rPr>
           <w:lang w:val="en-US"/>
         </w:rPr>
         <w:t>Attendance</w:t>
       </w:r>
-      <w:bookmarkEnd w:id="28"/>
+      <w:bookmarkEnd w:id="29"/>
     </w:p>
     <w:p>
       <w:pPr>
@@ -12038,11 +12104,11 @@
           <w:numId w:val="5"/>
         </w:numPr>
       </w:pPr>
-      <w:bookmarkStart w:id="29" w:name="_Toc232510607"/>
+      <w:bookmarkStart w:id="30" w:name="_Toc232535466"/>
       <w:r>
         <w:t>Проектиране на сигурността</w:t>
       </w:r>
-      <w:bookmarkEnd w:id="29"/>
+      <w:bookmarkEnd w:id="30"/>
     </w:p>
     <w:p>
       <w:pPr>
@@ -12211,12 +12277,12 @@
       <w:pPr>
         <w:pStyle w:val="1"/>
       </w:pPr>
-      <w:bookmarkStart w:id="30" w:name="_Toc232510608"/>
+      <w:bookmarkStart w:id="31" w:name="_Toc232535467"/>
       <w:r>
         <w:lastRenderedPageBreak/>
         <w:t>Използвани технологии</w:t>
       </w:r>
-      <w:bookmarkEnd w:id="30"/>
+      <w:bookmarkEnd w:id="31"/>
     </w:p>
     <w:p>
       <w:r>
@@ -12234,11 +12300,11 @@
           <w:numId w:val="11"/>
         </w:numPr>
       </w:pPr>
-      <w:bookmarkStart w:id="31" w:name="_Toc232510609"/>
+      <w:bookmarkStart w:id="32" w:name="_Toc232535468"/>
       <w:r>
         <w:t>Хардуерни компоненти</w:t>
       </w:r>
-      <w:bookmarkEnd w:id="31"/>
+      <w:bookmarkEnd w:id="32"/>
     </w:p>
     <w:p>
       <w:pPr>
@@ -12248,14 +12314,14 @@
           <w:numId w:val="11"/>
         </w:numPr>
       </w:pPr>
-      <w:bookmarkStart w:id="32" w:name="_Toc232510610"/>
+      <w:bookmarkStart w:id="33" w:name="_Toc232535469"/>
       <w:r>
         <w:rPr>
           <w:lang w:val="en-US"/>
         </w:rPr>
         <w:t>ESP32</w:t>
       </w:r>
-      <w:bookmarkEnd w:id="32"/>
+      <w:bookmarkEnd w:id="33"/>
     </w:p>
     <w:p>
       <w:pPr>
@@ -12328,7 +12394,7 @@
           <w:numId w:val="11"/>
         </w:numPr>
       </w:pPr>
-      <w:bookmarkStart w:id="33" w:name="_Toc232510611"/>
+      <w:bookmarkStart w:id="34" w:name="_Toc232535470"/>
       <w:r>
         <w:rPr>
           <w:lang w:val="en-US"/>
@@ -12344,7 +12410,7 @@
         </w:rPr>
         <w:t>)</w:t>
       </w:r>
-      <w:bookmarkEnd w:id="33"/>
+      <w:bookmarkEnd w:id="34"/>
     </w:p>
     <w:p>
       <w:pPr>
@@ -12452,11 +12518,11 @@
           <w:numId w:val="11"/>
         </w:numPr>
       </w:pPr>
-      <w:bookmarkStart w:id="34" w:name="_Toc232510612"/>
+      <w:bookmarkStart w:id="35" w:name="_Toc232535471"/>
       <w:r>
         <w:t>Програмни езици</w:t>
       </w:r>
-      <w:bookmarkEnd w:id="34"/>
+      <w:bookmarkEnd w:id="35"/>
     </w:p>
     <w:p>
       <w:pPr>
@@ -12466,7 +12532,7 @@
           <w:numId w:val="11"/>
         </w:numPr>
       </w:pPr>
-      <w:bookmarkStart w:id="35" w:name="_Toc232510613"/>
+      <w:bookmarkStart w:id="36" w:name="_Toc232535472"/>
       <w:r>
         <w:rPr>
           <w:lang w:val="en-US"/>
@@ -12482,7 +12548,7 @@
         </w:rPr>
         <w:t>)</w:t>
       </w:r>
-      <w:bookmarkEnd w:id="35"/>
+      <w:bookmarkEnd w:id="36"/>
     </w:p>
     <w:p>
       <w:r>
@@ -12506,7 +12572,7 @@
           <w:numId w:val="11"/>
         </w:numPr>
       </w:pPr>
-      <w:bookmarkStart w:id="36" w:name="_Toc232510614"/>
+      <w:bookmarkStart w:id="37" w:name="_Toc232535473"/>
       <w:r>
         <w:rPr>
           <w:lang w:val="en-US"/>
@@ -12514,7 +12580,7 @@
         <w:lastRenderedPageBreak/>
         <w:t>Kotlin</w:t>
       </w:r>
-      <w:bookmarkEnd w:id="36"/>
+      <w:bookmarkEnd w:id="37"/>
     </w:p>
     <w:p>
       <w:r>
@@ -12568,14 +12634,14 @@
           <w:numId w:val="11"/>
         </w:numPr>
       </w:pPr>
-      <w:bookmarkStart w:id="37" w:name="_Toc232510615"/>
+      <w:bookmarkStart w:id="38" w:name="_Toc232535474"/>
       <w:r>
         <w:rPr>
           <w:lang w:val="en-US"/>
         </w:rPr>
         <w:t>Python</w:t>
       </w:r>
-      <w:bookmarkEnd w:id="37"/>
+      <w:bookmarkEnd w:id="38"/>
     </w:p>
     <w:p>
       <w:pPr>
@@ -12631,14 +12697,14 @@
           <w:lang w:val="en-US"/>
         </w:rPr>
       </w:pPr>
-      <w:bookmarkStart w:id="38" w:name="_Toc232510616"/>
+      <w:bookmarkStart w:id="39" w:name="_Toc232535475"/>
       <w:r>
         <w:rPr>
           <w:lang w:val="en-US"/>
         </w:rPr>
         <w:t>JavaScript</w:t>
       </w:r>
-      <w:bookmarkEnd w:id="38"/>
+      <w:bookmarkEnd w:id="39"/>
     </w:p>
     <w:p>
       <w:r>
@@ -12653,11 +12719,11 @@
           <w:numId w:val="11"/>
         </w:numPr>
       </w:pPr>
-      <w:bookmarkStart w:id="39" w:name="_Toc232510617"/>
+      <w:bookmarkStart w:id="40" w:name="_Toc232535476"/>
       <w:r>
         <w:t>Фреймуъркове и библиотеки</w:t>
       </w:r>
-      <w:bookmarkEnd w:id="39"/>
+      <w:bookmarkEnd w:id="40"/>
     </w:p>
     <w:p>
       <w:pPr>
@@ -12667,14 +12733,14 @@
           <w:numId w:val="11"/>
         </w:numPr>
       </w:pPr>
-      <w:bookmarkStart w:id="40" w:name="_Toc232510618"/>
+      <w:bookmarkStart w:id="41" w:name="_Toc232535477"/>
       <w:r>
         <w:rPr>
           <w:lang w:val="en-US"/>
         </w:rPr>
         <w:t>FastAPI</w:t>
       </w:r>
-      <w:bookmarkEnd w:id="40"/>
+      <w:bookmarkEnd w:id="41"/>
     </w:p>
     <w:p>
       <w:pPr>
@@ -12710,11 +12776,11 @@
           <w:numId w:val="11"/>
         </w:numPr>
       </w:pPr>
-      <w:bookmarkStart w:id="41" w:name="_Toc232510619"/>
+      <w:bookmarkStart w:id="42" w:name="_Toc232535478"/>
       <w:r>
         <w:t>SQLAlchemy</w:t>
       </w:r>
-      <w:bookmarkEnd w:id="41"/>
+      <w:bookmarkEnd w:id="42"/>
     </w:p>
     <w:p>
       <w:r>
@@ -12735,11 +12801,11 @@
           <w:numId w:val="11"/>
         </w:numPr>
       </w:pPr>
-      <w:bookmarkStart w:id="42" w:name="_Toc232510620"/>
+      <w:bookmarkStart w:id="43" w:name="_Toc232535479"/>
       <w:r>
         <w:t>Adafruit PN532</w:t>
       </w:r>
-      <w:bookmarkEnd w:id="42"/>
+      <w:bookmarkEnd w:id="43"/>
     </w:p>
     <w:p>
       <w:r>
@@ -12754,11 +12820,11 @@
           <w:numId w:val="11"/>
         </w:numPr>
       </w:pPr>
-      <w:bookmarkStart w:id="43" w:name="_Toc232510621"/>
+      <w:bookmarkStart w:id="44" w:name="_Toc232535480"/>
       <w:r>
         <w:t>Retrofit2 (Android)</w:t>
       </w:r>
-      <w:bookmarkEnd w:id="43"/>
+      <w:bookmarkEnd w:id="44"/>
     </w:p>
     <w:p>
       <w:r>
@@ -12773,11 +12839,11 @@
           <w:numId w:val="11"/>
         </w:numPr>
       </w:pPr>
-      <w:bookmarkStart w:id="44" w:name="_Toc232510622"/>
+      <w:bookmarkStart w:id="45" w:name="_Toc232535481"/>
       <w:r>
         <w:t>База данни</w:t>
       </w:r>
-      <w:bookmarkEnd w:id="44"/>
+      <w:bookmarkEnd w:id="45"/>
     </w:p>
     <w:p>
       <w:r>
@@ -12806,11 +12872,11 @@
           <w:numId w:val="11"/>
         </w:numPr>
       </w:pPr>
-      <w:bookmarkStart w:id="45" w:name="_Toc232510623"/>
+      <w:bookmarkStart w:id="46" w:name="_Toc232535482"/>
       <w:r>
         <w:t>Сигурност и криптография</w:t>
       </w:r>
-      <w:bookmarkEnd w:id="45"/>
+      <w:bookmarkEnd w:id="46"/>
     </w:p>
     <w:p>
       <w:pPr>
@@ -12820,11 +12886,11 @@
           <w:numId w:val="11"/>
         </w:numPr>
       </w:pPr>
-      <w:bookmarkStart w:id="46" w:name="_Toc232510624"/>
+      <w:bookmarkStart w:id="47" w:name="_Toc232535483"/>
       <w:r>
         <w:t>HMAC-SHA256</w:t>
       </w:r>
-      <w:bookmarkEnd w:id="46"/>
+      <w:bookmarkEnd w:id="47"/>
     </w:p>
     <w:p>
       <w:pPr>
@@ -12856,11 +12922,11 @@
           <w:numId w:val="11"/>
         </w:numPr>
       </w:pPr>
-      <w:bookmarkStart w:id="47" w:name="_Toc232510625"/>
+      <w:bookmarkStart w:id="48" w:name="_Toc232535484"/>
       <w:r>
         <w:t>Android Keystore и EncryptedSharedPreferences</w:t>
       </w:r>
-      <w:bookmarkEnd w:id="47"/>
+      <w:bookmarkEnd w:id="48"/>
       <w:r>
         <w:t xml:space="preserve"> </w:t>
       </w:r>
@@ -12895,11 +12961,11 @@
           <w:numId w:val="11"/>
         </w:numPr>
       </w:pPr>
-      <w:bookmarkStart w:id="48" w:name="_Toc232510626"/>
+      <w:bookmarkStart w:id="49" w:name="_Toc232535485"/>
       <w:r>
         <w:t>JSON Web Tokens</w:t>
       </w:r>
-      <w:bookmarkEnd w:id="48"/>
+      <w:bookmarkEnd w:id="49"/>
     </w:p>
     <w:p>
       <w:r>
@@ -12947,11 +13013,11 @@
           <w:numId w:val="11"/>
         </w:numPr>
       </w:pPr>
-      <w:bookmarkStart w:id="49" w:name="_Toc232510627"/>
+      <w:bookmarkStart w:id="50" w:name="_Toc232535486"/>
       <w:r>
         <w:t>Стандарти и протоколи</w:t>
       </w:r>
-      <w:bookmarkEnd w:id="49"/>
+      <w:bookmarkEnd w:id="50"/>
     </w:p>
     <w:p>
       <w:pPr>
@@ -12961,11 +13027,11 @@
           <w:numId w:val="11"/>
         </w:numPr>
       </w:pPr>
-      <w:bookmarkStart w:id="50" w:name="_Toc232510628"/>
+      <w:bookmarkStart w:id="51" w:name="_Toc232535487"/>
       <w:r>
         <w:t>ISO 14443 и ISO-DEP</w:t>
       </w:r>
-      <w:bookmarkEnd w:id="50"/>
+      <w:bookmarkEnd w:id="51"/>
     </w:p>
     <w:p>
       <w:pPr>
@@ -13000,11 +13066,11 @@
           <w:numId w:val="11"/>
         </w:numPr>
       </w:pPr>
-      <w:bookmarkStart w:id="51" w:name="_Toc232510629"/>
+      <w:bookmarkStart w:id="52" w:name="_Toc232535488"/>
       <w:r>
         <w:t>ISO 7816-4</w:t>
       </w:r>
-      <w:bookmarkEnd w:id="51"/>
+      <w:bookmarkEnd w:id="52"/>
     </w:p>
     <w:p>
       <w:pPr>
@@ -13033,14 +13099,14 @@
           <w:numId w:val="11"/>
         </w:numPr>
       </w:pPr>
-      <w:bookmarkStart w:id="52" w:name="_Toc232510630"/>
+      <w:bookmarkStart w:id="53" w:name="_Toc232535489"/>
       <w:r>
         <w:rPr>
           <w:lang w:val="en-US"/>
         </w:rPr>
         <w:t>Host Card Emulation</w:t>
       </w:r>
-      <w:bookmarkEnd w:id="52"/>
+      <w:bookmarkEnd w:id="53"/>
     </w:p>
     <w:p>
       <w:r>
@@ -13078,12 +13144,12 @@
       <w:pPr>
         <w:pStyle w:val="1"/>
       </w:pPr>
-      <w:bookmarkStart w:id="53" w:name="_Toc232510631"/>
+      <w:bookmarkStart w:id="54" w:name="_Toc232535490"/>
       <w:r>
         <w:lastRenderedPageBreak/>
         <w:t>Програмна реализация</w:t>
       </w:r>
-      <w:bookmarkEnd w:id="53"/>
+      <w:bookmarkEnd w:id="54"/>
     </w:p>
     <w:p>
       <w:r>
@@ -13116,11 +13182,11 @@
           <w:numId w:val="14"/>
         </w:numPr>
       </w:pPr>
-      <w:bookmarkStart w:id="54" w:name="_Toc232510632"/>
+      <w:bookmarkStart w:id="55" w:name="_Toc232535491"/>
       <w:r>
         <w:t>Фърмуер на ESP32</w:t>
       </w:r>
-      <w:bookmarkEnd w:id="54"/>
+      <w:bookmarkEnd w:id="55"/>
     </w:p>
     <w:p>
       <w:r>
@@ -13171,11 +13237,11 @@
           <w:numId w:val="14"/>
         </w:numPr>
       </w:pPr>
-      <w:bookmarkStart w:id="55" w:name="_Toc232510633"/>
+      <w:bookmarkStart w:id="56" w:name="_Toc232535492"/>
       <w:r>
         <w:t>Конфигурация</w:t>
       </w:r>
-      <w:bookmarkEnd w:id="55"/>
+      <w:bookmarkEnd w:id="56"/>
     </w:p>
     <w:p>
       <w:pPr>
@@ -13246,7 +13312,7 @@
           <w:noProof/>
         </w:rPr>
         <w:drawing>
-          <wp:inline distT="0" distB="0" distL="0" distR="0" wp14:anchorId="0EB664B6" wp14:editId="064245BB">
+          <wp:inline distT="0" distB="0" distL="0" distR="0" wp14:anchorId="38EBE259" wp14:editId="4C574C58">
             <wp:extent cx="3998858" cy="2362200"/>
             <wp:effectExtent l="0" t="0" r="1905" b="0"/>
             <wp:docPr id="5" name="Картина 5"/>
@@ -13304,11 +13370,11 @@
           <w:numId w:val="14"/>
         </w:numPr>
       </w:pPr>
-      <w:bookmarkStart w:id="56" w:name="_Toc232510634"/>
+      <w:bookmarkStart w:id="57" w:name="_Toc232535493"/>
       <w:r>
         <w:t>Визуална и звукова сигнализация</w:t>
       </w:r>
-      <w:bookmarkEnd w:id="56"/>
+      <w:bookmarkEnd w:id="57"/>
     </w:p>
     <w:p>
       <w:r>
@@ -13350,7 +13416,7 @@
         </w:rPr>
         <w:lastRenderedPageBreak/>
         <w:drawing>
-          <wp:inline distT="0" distB="0" distL="0" distR="0" wp14:anchorId="5544F25B" wp14:editId="60B8F119">
+          <wp:inline distT="0" distB="0" distL="0" distR="0" wp14:anchorId="4C18A7E8" wp14:editId="68EE443F">
             <wp:extent cx="4572000" cy="2409976"/>
             <wp:effectExtent l="0" t="0" r="0" b="9525"/>
             <wp:docPr id="7" name="Картина 7"/>
@@ -13414,11 +13480,11 @@
           <w:numId w:val="14"/>
         </w:numPr>
       </w:pPr>
-      <w:bookmarkStart w:id="57" w:name="_Toc232510635"/>
+      <w:bookmarkStart w:id="58" w:name="_Toc232535494"/>
       <w:r>
         <w:t>Инициализация</w:t>
       </w:r>
-      <w:bookmarkEnd w:id="57"/>
+      <w:bookmarkEnd w:id="58"/>
     </w:p>
     <w:p>
       <w:pPr>
@@ -13447,7 +13513,7 @@
           <w:noProof/>
         </w:rPr>
         <w:drawing>
-          <wp:inline distT="0" distB="0" distL="0" distR="0" wp14:anchorId="7C129A46" wp14:editId="70B57A0B">
+          <wp:inline distT="0" distB="0" distL="0" distR="0" wp14:anchorId="17BD2458" wp14:editId="4E27F652">
             <wp:extent cx="4669692" cy="4259580"/>
             <wp:effectExtent l="0" t="0" r="0" b="7620"/>
             <wp:docPr id="9" name="Картина 9"/>
@@ -13560,12 +13626,12 @@
           <w:numId w:val="14"/>
         </w:numPr>
       </w:pPr>
-      <w:bookmarkStart w:id="58" w:name="_Toc232510636"/>
+      <w:bookmarkStart w:id="59" w:name="_Toc232535495"/>
       <w:r>
         <w:lastRenderedPageBreak/>
         <w:t>Основен цикъл</w:t>
       </w:r>
-      <w:bookmarkEnd w:id="58"/>
+      <w:bookmarkEnd w:id="59"/>
     </w:p>
     <w:p>
       <w:r>
@@ -13617,7 +13683,7 @@
           <w:noProof/>
         </w:rPr>
         <w:drawing>
-          <wp:inline distT="0" distB="0" distL="0" distR="0" wp14:anchorId="72AF1A96" wp14:editId="4CDEC819">
+          <wp:inline distT="0" distB="0" distL="0" distR="0" wp14:anchorId="6E218406" wp14:editId="16D2CB06">
             <wp:extent cx="5912104" cy="5554980"/>
             <wp:effectExtent l="0" t="0" r="0" b="7620"/>
             <wp:docPr id="18" name="Картина 18"/>
@@ -13731,7 +13797,7 @@
           <w:numId w:val="14"/>
         </w:numPr>
       </w:pPr>
-      <w:bookmarkStart w:id="59" w:name="_Toc232510637"/>
+      <w:bookmarkStart w:id="60" w:name="_Toc232535496"/>
       <w:r>
         <w:t xml:space="preserve">Декодиране на получения </w:t>
       </w:r>
@@ -13741,7 +13807,7 @@
         </w:rPr>
         <w:t>payload</w:t>
       </w:r>
-      <w:bookmarkEnd w:id="59"/>
+      <w:bookmarkEnd w:id="60"/>
     </w:p>
     <w:p>
       <w:r>
@@ -13773,7 +13839,7 @@
           <w:noProof/>
         </w:rPr>
         <w:drawing>
-          <wp:inline distT="0" distB="0" distL="0" distR="0" wp14:anchorId="0A7439AE" wp14:editId="27D57A6A">
+          <wp:inline distT="0" distB="0" distL="0" distR="0" wp14:anchorId="2FC36DF0" wp14:editId="775D51F9">
             <wp:extent cx="5256827" cy="5882640"/>
             <wp:effectExtent l="0" t="0" r="1270" b="3810"/>
             <wp:docPr id="12" name="Картина 12"/>
@@ -13864,11 +13930,11 @@
           <w:numId w:val="14"/>
         </w:numPr>
       </w:pPr>
-      <w:bookmarkStart w:id="60" w:name="_Toc232510638"/>
+      <w:bookmarkStart w:id="61" w:name="_Toc232535497"/>
       <w:r>
         <w:t>Комуникация с бекенда</w:t>
       </w:r>
-      <w:bookmarkEnd w:id="60"/>
+      <w:bookmarkEnd w:id="61"/>
     </w:p>
     <w:p>
       <w:r>
@@ -13920,7 +13986,7 @@
           <w:noProof/>
         </w:rPr>
         <w:drawing>
-          <wp:inline distT="0" distB="0" distL="0" distR="0" wp14:anchorId="43C602CF" wp14:editId="1E6691EC">
+          <wp:inline distT="0" distB="0" distL="0" distR="0" wp14:anchorId="521EA9BA" wp14:editId="7D62308A">
             <wp:extent cx="5220429" cy="4391638"/>
             <wp:effectExtent l="0" t="0" r="0" b="9525"/>
             <wp:docPr id="13" name="Картина 13"/>
@@ -14011,7 +14077,7 @@
           <w:numId w:val="14"/>
         </w:numPr>
       </w:pPr>
-      <w:bookmarkStart w:id="61" w:name="_Toc232510639"/>
+      <w:bookmarkStart w:id="62" w:name="_Toc232535498"/>
       <w:r>
         <w:rPr>
           <w:lang w:val="en-US"/>
@@ -14021,7 +14087,7 @@
       <w:r>
         <w:t>мобилно приложение</w:t>
       </w:r>
-      <w:bookmarkEnd w:id="61"/>
+      <w:bookmarkEnd w:id="62"/>
     </w:p>
     <w:p>
       <w:r>
@@ -14036,11 +14102,11 @@
           <w:numId w:val="14"/>
         </w:numPr>
       </w:pPr>
-      <w:bookmarkStart w:id="62" w:name="_Toc232510640"/>
+      <w:bookmarkStart w:id="63" w:name="_Toc232535499"/>
       <w:r>
         <w:t>Съхранение на данните</w:t>
       </w:r>
-      <w:bookmarkEnd w:id="62"/>
+      <w:bookmarkEnd w:id="63"/>
     </w:p>
     <w:p>
       <w:r>
@@ -14063,7 +14129,7 @@
           <w:noProof/>
         </w:rPr>
         <w:drawing>
-          <wp:inline distT="0" distB="0" distL="0" distR="0" wp14:anchorId="5FF8D297" wp14:editId="67B3CC1C">
+          <wp:inline distT="0" distB="0" distL="0" distR="0" wp14:anchorId="3AED1485" wp14:editId="34390BDB">
             <wp:extent cx="4610100" cy="5641846"/>
             <wp:effectExtent l="0" t="0" r="0" b="0"/>
             <wp:docPr id="14" name="Картина 14"/>
@@ -14212,11 +14278,11 @@
           <w:lang w:val="en-US"/>
         </w:rPr>
       </w:pPr>
-      <w:bookmarkStart w:id="63" w:name="_Toc232510641"/>
+      <w:bookmarkStart w:id="64" w:name="_Toc232535500"/>
       <w:r>
         <w:t>Комуникация с бекенд сървъра</w:t>
       </w:r>
-      <w:bookmarkEnd w:id="63"/>
+      <w:bookmarkEnd w:id="64"/>
     </w:p>
     <w:p>
       <w:r>
@@ -14244,7 +14310,7 @@
           <w:noProof/>
         </w:rPr>
         <w:drawing>
-          <wp:inline distT="0" distB="0" distL="0" distR="0" wp14:anchorId="77AA4588" wp14:editId="5A3A59CE">
+          <wp:inline distT="0" distB="0" distL="0" distR="0" wp14:anchorId="0B88ACB9" wp14:editId="1556F8B8">
             <wp:extent cx="3518637" cy="3543300"/>
             <wp:effectExtent l="0" t="0" r="5715" b="0"/>
             <wp:docPr id="16" name="Картина 16"/>
@@ -14335,7 +14401,7 @@
           <w:lang w:val="en-US"/>
         </w:rPr>
       </w:pPr>
-      <w:bookmarkStart w:id="64" w:name="_Toc232510642"/>
+      <w:bookmarkStart w:id="65" w:name="_Toc232535501"/>
       <w:r>
         <w:t xml:space="preserve">Клас </w:t>
       </w:r>
@@ -14345,7 +14411,7 @@
         </w:rPr>
         <w:t>MainActivity</w:t>
       </w:r>
-      <w:bookmarkEnd w:id="64"/>
+      <w:bookmarkEnd w:id="65"/>
     </w:p>
     <w:p>
       <w:r>
@@ -14373,7 +14439,7 @@
           <w:noProof/>
         </w:rPr>
         <w:drawing>
-          <wp:inline distT="0" distB="0" distL="0" distR="0" wp14:anchorId="0505CBB0" wp14:editId="1CA406A0">
+          <wp:inline distT="0" distB="0" distL="0" distR="0" wp14:anchorId="44907792" wp14:editId="7547F5E0">
             <wp:extent cx="5590420" cy="4335780"/>
             <wp:effectExtent l="0" t="0" r="0" b="7620"/>
             <wp:docPr id="17" name="Картина 17"/>
@@ -14470,7 +14536,7 @@
           <w:lang w:val="en-US"/>
         </w:rPr>
       </w:pPr>
-      <w:bookmarkStart w:id="65" w:name="_Toc232510643"/>
+      <w:bookmarkStart w:id="66" w:name="_Toc232535502"/>
       <w:r>
         <w:t xml:space="preserve">Клас </w:t>
       </w:r>
@@ -14480,7 +14546,7 @@
         </w:rPr>
         <w:t>HomeActivity</w:t>
       </w:r>
-      <w:bookmarkEnd w:id="65"/>
+      <w:bookmarkEnd w:id="66"/>
     </w:p>
     <w:p>
       <w:pPr>
@@ -14584,7 +14650,7 @@
           <w:noProof/>
         </w:rPr>
         <w:drawing>
-          <wp:inline distT="0" distB="0" distL="0" distR="0" wp14:anchorId="45C3A588" wp14:editId="7DB22CEB">
+          <wp:inline distT="0" distB="0" distL="0" distR="0" wp14:anchorId="64B08A69" wp14:editId="63BAB7AF">
             <wp:extent cx="4053840" cy="4460920"/>
             <wp:effectExtent l="0" t="0" r="3810" b="0"/>
             <wp:docPr id="21" name="Картина 21"/>
@@ -14679,11 +14745,11 @@
           <w:numId w:val="14"/>
         </w:numPr>
       </w:pPr>
-      <w:bookmarkStart w:id="66" w:name="_Toc232510644"/>
+      <w:bookmarkStart w:id="67" w:name="_Toc232535503"/>
       <w:r>
         <w:t>Клас NfcHceService</w:t>
       </w:r>
-      <w:bookmarkEnd w:id="66"/>
+      <w:bookmarkEnd w:id="67"/>
     </w:p>
     <w:p>
       <w:r>
@@ -14788,7 +14854,7 @@
           <w:noProof/>
         </w:rPr>
         <w:drawing>
-          <wp:inline distT="0" distB="0" distL="0" distR="0" wp14:anchorId="37721D65" wp14:editId="2FDE866E">
+          <wp:inline distT="0" distB="0" distL="0" distR="0" wp14:anchorId="0D2590BD" wp14:editId="752E662B">
             <wp:extent cx="4693920" cy="3400575"/>
             <wp:effectExtent l="0" t="0" r="0" b="9525"/>
             <wp:docPr id="22" name="Картина 22"/>
@@ -14941,7 +15007,7 @@
           <w:noProof/>
         </w:rPr>
         <w:drawing>
-          <wp:inline distT="0" distB="0" distL="0" distR="0" wp14:anchorId="06D80288" wp14:editId="27E5C358">
+          <wp:inline distT="0" distB="0" distL="0" distR="0" wp14:anchorId="101272B7" wp14:editId="2EC789F5">
             <wp:extent cx="5095875" cy="3794383"/>
             <wp:effectExtent l="0" t="0" r="0" b="0"/>
             <wp:docPr id="23" name="Картина 23"/>
@@ -15052,12 +15118,12 @@
           <w:numId w:val="14"/>
         </w:numPr>
       </w:pPr>
-      <w:bookmarkStart w:id="67" w:name="_Toc232510645"/>
+      <w:bookmarkStart w:id="68" w:name="_Toc232535504"/>
       <w:r>
         <w:lastRenderedPageBreak/>
         <w:t>Сървърна част</w:t>
       </w:r>
-      <w:bookmarkEnd w:id="67"/>
+      <w:bookmarkEnd w:id="68"/>
     </w:p>
     <w:p>
       <w:pPr>
@@ -15216,14 +15282,14 @@
           <w:numId w:val="14"/>
         </w:numPr>
       </w:pPr>
-      <w:bookmarkStart w:id="68" w:name="_Toc232510646"/>
+      <w:bookmarkStart w:id="69" w:name="_Toc232535505"/>
       <w:r>
         <w:rPr>
           <w:lang w:val="en-US"/>
         </w:rPr>
         <w:t>models.py</w:t>
       </w:r>
-      <w:bookmarkEnd w:id="68"/>
+      <w:bookmarkEnd w:id="69"/>
       <w:r>
         <w:t xml:space="preserve"> </w:t>
       </w:r>
@@ -15292,14 +15358,14 @@
           <w:numId w:val="14"/>
         </w:numPr>
       </w:pPr>
-      <w:bookmarkStart w:id="69" w:name="_Toc232510647"/>
+      <w:bookmarkStart w:id="70" w:name="_Toc232535506"/>
       <w:r>
         <w:rPr>
           <w:lang w:val="en-US"/>
         </w:rPr>
         <w:t>auth.py</w:t>
       </w:r>
-      <w:bookmarkEnd w:id="69"/>
+      <w:bookmarkEnd w:id="70"/>
     </w:p>
     <w:p>
       <w:pPr>
@@ -15378,7 +15444,7 @@
         </w:rPr>
         <w:lastRenderedPageBreak/>
         <w:drawing>
-          <wp:inline distT="0" distB="0" distL="0" distR="0" wp14:anchorId="3483D9B1" wp14:editId="41432328">
+          <wp:inline distT="0" distB="0" distL="0" distR="0" wp14:anchorId="38044DAD" wp14:editId="1824BF3D">
             <wp:extent cx="5760720" cy="1647825"/>
             <wp:effectExtent l="0" t="0" r="0" b="9525"/>
             <wp:docPr id="24" name="Картина 24"/>
@@ -15460,7 +15526,7 @@
           <w:noProof/>
         </w:rPr>
         <w:drawing>
-          <wp:inline distT="0" distB="0" distL="0" distR="0" wp14:anchorId="47A896CA" wp14:editId="29AD9462">
+          <wp:inline distT="0" distB="0" distL="0" distR="0" wp14:anchorId="54C95562" wp14:editId="4ADD82B8">
             <wp:extent cx="5760720" cy="2599690"/>
             <wp:effectExtent l="0" t="0" r="0" b="0"/>
             <wp:docPr id="25" name="Картина 25"/>
@@ -15580,7 +15646,7 @@
         </w:rPr>
         <w:lastRenderedPageBreak/>
         <w:drawing>
-          <wp:inline distT="0" distB="0" distL="0" distR="0" wp14:anchorId="032234A5" wp14:editId="524A4487">
+          <wp:inline distT="0" distB="0" distL="0" distR="0" wp14:anchorId="2EEC98D3" wp14:editId="45AF912C">
             <wp:extent cx="5760720" cy="3975735"/>
             <wp:effectExtent l="0" t="0" r="0" b="5715"/>
             <wp:docPr id="26" name="Картина 26"/>
@@ -15672,7 +15738,7 @@
           <w:noProof/>
         </w:rPr>
         <w:drawing>
-          <wp:inline distT="0" distB="0" distL="0" distR="0" wp14:anchorId="0633DDCB" wp14:editId="0ED06AB3">
+          <wp:inline distT="0" distB="0" distL="0" distR="0" wp14:anchorId="7B611980" wp14:editId="571C3F81">
             <wp:extent cx="5760720" cy="2836545"/>
             <wp:effectExtent l="0" t="0" r="0" b="1905"/>
             <wp:docPr id="27" name="Картина 27"/>
@@ -15774,14 +15840,14 @@
           <w:numId w:val="14"/>
         </w:numPr>
       </w:pPr>
-      <w:bookmarkStart w:id="70" w:name="_Toc232510648"/>
+      <w:bookmarkStart w:id="71" w:name="_Toc232535507"/>
       <w:r>
         <w:rPr>
           <w:lang w:val="en-US"/>
         </w:rPr>
         <w:t>attendance.py</w:t>
       </w:r>
-      <w:bookmarkEnd w:id="70"/>
+      <w:bookmarkEnd w:id="71"/>
     </w:p>
     <w:p>
       <w:r>
@@ -15858,7 +15924,7 @@
         </w:rPr>
         <w:lastRenderedPageBreak/>
         <w:drawing>
-          <wp:inline distT="0" distB="0" distL="0" distR="0" wp14:anchorId="6C9A001C" wp14:editId="6B031D04">
+          <wp:inline distT="0" distB="0" distL="0" distR="0" wp14:anchorId="71BD2960" wp14:editId="00E94F33">
             <wp:extent cx="5760720" cy="1135380"/>
             <wp:effectExtent l="0" t="0" r="0" b="7620"/>
             <wp:docPr id="28" name="Картина 28"/>
@@ -16162,7 +16228,7 @@
           <w:noProof/>
         </w:rPr>
         <w:drawing>
-          <wp:inline distT="0" distB="0" distL="0" distR="0" wp14:anchorId="717D238D" wp14:editId="68C9D739">
+          <wp:inline distT="0" distB="0" distL="0" distR="0" wp14:anchorId="11900CCE" wp14:editId="5E47F3EE">
             <wp:extent cx="5527357" cy="4015740"/>
             <wp:effectExtent l="0" t="0" r="0" b="3810"/>
             <wp:docPr id="29" name="Картина 29"/>
@@ -16265,7 +16331,7 @@
           <w:noProof/>
         </w:rPr>
         <w:drawing>
-          <wp:inline distT="0" distB="0" distL="0" distR="0" wp14:anchorId="2252A16A" wp14:editId="57073513">
+          <wp:inline distT="0" distB="0" distL="0" distR="0" wp14:anchorId="0965E68A" wp14:editId="2549FBAD">
             <wp:extent cx="5191242" cy="502920"/>
             <wp:effectExtent l="0" t="0" r="9525" b="0"/>
             <wp:docPr id="31" name="Картина 31"/>
@@ -16419,7 +16485,7 @@
           <w:noProof/>
         </w:rPr>
         <w:drawing>
-          <wp:inline distT="0" distB="0" distL="0" distR="0" wp14:anchorId="4A8C0460" wp14:editId="7890B4FB">
+          <wp:inline distT="0" distB="0" distL="0" distR="0" wp14:anchorId="2248D086" wp14:editId="5E7472C1">
             <wp:extent cx="5698399" cy="5341620"/>
             <wp:effectExtent l="0" t="0" r="0" b="0"/>
             <wp:docPr id="32" name="Картина 32"/>
@@ -16545,7 +16611,7 @@
           <w:noProof/>
         </w:rPr>
         <w:drawing>
-          <wp:inline distT="0" distB="0" distL="0" distR="0" wp14:anchorId="627C06C7" wp14:editId="4B1CFB66">
+          <wp:inline distT="0" distB="0" distL="0" distR="0" wp14:anchorId="34633A4B" wp14:editId="5DC02377">
             <wp:extent cx="5534391" cy="2468880"/>
             <wp:effectExtent l="0" t="0" r="9525" b="7620"/>
             <wp:docPr id="33" name="Картина 33"/>
@@ -16710,7 +16776,7 @@
         </w:rPr>
         <w:lastRenderedPageBreak/>
         <w:drawing>
-          <wp:inline distT="0" distB="0" distL="0" distR="0" wp14:anchorId="31E5629B" wp14:editId="48049306">
+          <wp:inline distT="0" distB="0" distL="0" distR="0" wp14:anchorId="2F1D6C5D" wp14:editId="16D3075A">
             <wp:extent cx="5760720" cy="3850005"/>
             <wp:effectExtent l="0" t="0" r="0" b="0"/>
             <wp:docPr id="34" name="Картина 34"/>
@@ -16913,14 +16979,14 @@
           <w:numId w:val="14"/>
         </w:numPr>
       </w:pPr>
-      <w:bookmarkStart w:id="71" w:name="_Toc232510649"/>
+      <w:bookmarkStart w:id="72" w:name="_Toc232535508"/>
       <w:r>
         <w:rPr>
           <w:lang w:val="en-US"/>
         </w:rPr>
         <w:t>administration.py</w:t>
       </w:r>
-      <w:bookmarkEnd w:id="71"/>
+      <w:bookmarkEnd w:id="72"/>
     </w:p>
     <w:p>
       <w:r>
@@ -16963,7 +17029,7 @@
           <w:noProof/>
         </w:rPr>
         <w:drawing>
-          <wp:inline distT="0" distB="0" distL="0" distR="0" wp14:anchorId="7289284A" wp14:editId="12DB9A4B">
+          <wp:inline distT="0" distB="0" distL="0" distR="0" wp14:anchorId="38CDB9D3" wp14:editId="475E9AFC">
             <wp:extent cx="5760720" cy="1905635"/>
             <wp:effectExtent l="0" t="0" r="0" b="0"/>
             <wp:docPr id="35" name="Картина 35"/>
@@ -17036,14 +17102,14 @@
           <w:numId w:val="14"/>
         </w:numPr>
       </w:pPr>
-      <w:bookmarkStart w:id="72" w:name="_Toc232510650"/>
+      <w:bookmarkStart w:id="73" w:name="_Toc232535509"/>
       <w:r>
         <w:rPr>
           <w:lang w:val="en-US"/>
         </w:rPr>
         <w:t>main.py</w:t>
       </w:r>
-      <w:bookmarkEnd w:id="72"/>
+      <w:bookmarkEnd w:id="73"/>
     </w:p>
     <w:p>
       <w:r>
@@ -17078,7 +17144,7 @@
         </w:rPr>
         <w:lastRenderedPageBreak/>
         <w:drawing>
-          <wp:inline distT="0" distB="0" distL="0" distR="0" wp14:anchorId="0DBAE905" wp14:editId="568A1A04">
+          <wp:inline distT="0" distB="0" distL="0" distR="0" wp14:anchorId="136C8C64" wp14:editId="46529FCF">
             <wp:extent cx="4549140" cy="2808398"/>
             <wp:effectExtent l="0" t="0" r="3810" b="0"/>
             <wp:docPr id="36" name="Картина 36"/>
@@ -17139,11 +17205,11 @@
           <w:numId w:val="14"/>
         </w:numPr>
       </w:pPr>
-      <w:bookmarkStart w:id="73" w:name="_Toc232510651"/>
+      <w:bookmarkStart w:id="74" w:name="_Toc232535510"/>
       <w:r>
         <w:t>Уеб интерфейс</w:t>
       </w:r>
-      <w:bookmarkEnd w:id="73"/>
+      <w:bookmarkEnd w:id="74"/>
     </w:p>
     <w:p>
       <w:r>
@@ -17182,11 +17248,11 @@
           <w:numId w:val="14"/>
         </w:numPr>
       </w:pPr>
-      <w:bookmarkStart w:id="74" w:name="_Toc232510652"/>
+      <w:bookmarkStart w:id="75" w:name="_Toc232535511"/>
       <w:r>
         <w:t>Глобално състояние</w:t>
       </w:r>
-      <w:bookmarkEnd w:id="74"/>
+      <w:bookmarkEnd w:id="75"/>
     </w:p>
     <w:p>
       <w:r>
@@ -17223,7 +17289,7 @@
           <w:noProof/>
         </w:rPr>
         <w:drawing>
-          <wp:inline distT="0" distB="0" distL="0" distR="0" wp14:anchorId="0B14E3F2" wp14:editId="3B79823F">
+          <wp:inline distT="0" distB="0" distL="0" distR="0" wp14:anchorId="6AC9ACFA" wp14:editId="55FDD86C">
             <wp:extent cx="5385604" cy="1531620"/>
             <wp:effectExtent l="0" t="0" r="5715" b="0"/>
             <wp:docPr id="37" name="Картина 37"/>
@@ -17284,7 +17350,7 @@
           <w:numId w:val="14"/>
         </w:numPr>
       </w:pPr>
-      <w:bookmarkStart w:id="75" w:name="_Toc232510653"/>
+      <w:bookmarkStart w:id="76" w:name="_Toc232535512"/>
       <w:r>
         <w:lastRenderedPageBreak/>
         <w:t xml:space="preserve">Функция </w:t>
@@ -17295,7 +17361,7 @@
         </w:rPr>
         <w:t>api()</w:t>
       </w:r>
-      <w:bookmarkEnd w:id="75"/>
+      <w:bookmarkEnd w:id="76"/>
     </w:p>
     <w:p>
       <w:r>
@@ -17326,7 +17392,7 @@
           <w:noProof/>
         </w:rPr>
         <w:drawing>
-          <wp:inline distT="0" distB="0" distL="0" distR="0" wp14:anchorId="3F8681BB" wp14:editId="262BAA6B">
+          <wp:inline distT="0" distB="0" distL="0" distR="0" wp14:anchorId="06648CC4" wp14:editId="5A78F366">
             <wp:extent cx="5036649" cy="3406140"/>
             <wp:effectExtent l="0" t="0" r="0" b="3810"/>
             <wp:docPr id="38" name="Картина 38"/>
@@ -17387,11 +17453,11 @@
           <w:numId w:val="14"/>
         </w:numPr>
       </w:pPr>
-      <w:bookmarkStart w:id="76" w:name="_Toc232510654"/>
+      <w:bookmarkStart w:id="77" w:name="_Toc232535513"/>
       <w:r>
         <w:t>Вход в системата</w:t>
       </w:r>
-      <w:bookmarkEnd w:id="76"/>
+      <w:bookmarkEnd w:id="77"/>
     </w:p>
     <w:p>
       <w:r>
@@ -17416,7 +17482,7 @@
           <w:noProof/>
         </w:rPr>
         <w:drawing>
-          <wp:inline distT="0" distB="0" distL="0" distR="0" wp14:anchorId="74358949" wp14:editId="44E09B1F">
+          <wp:inline distT="0" distB="0" distL="0" distR="0" wp14:anchorId="6D1E72BC" wp14:editId="4424789A">
             <wp:extent cx="5176244" cy="1524000"/>
             <wp:effectExtent l="0" t="0" r="5715" b="0"/>
             <wp:docPr id="40" name="Картина 40"/>
@@ -17541,7 +17607,7 @@
           <w:noProof/>
         </w:rPr>
         <w:drawing>
-          <wp:inline distT="0" distB="0" distL="0" distR="0" wp14:anchorId="77ABD9C9" wp14:editId="16CEF8F2">
+          <wp:inline distT="0" distB="0" distL="0" distR="0" wp14:anchorId="463391C6" wp14:editId="436C2D00">
             <wp:extent cx="5082540" cy="3289197"/>
             <wp:effectExtent l="0" t="0" r="3810" b="6985"/>
             <wp:docPr id="39" name="Картина 39"/>
@@ -17611,11 +17677,11 @@
           <w:numId w:val="14"/>
         </w:numPr>
       </w:pPr>
-      <w:bookmarkStart w:id="77" w:name="_Toc232510655"/>
+      <w:bookmarkStart w:id="78" w:name="_Toc232535514"/>
       <w:r>
         <w:t>Навигация и страничен панел</w:t>
       </w:r>
-      <w:bookmarkEnd w:id="77"/>
+      <w:bookmarkEnd w:id="78"/>
     </w:p>
     <w:p>
       <w:r>
@@ -17676,7 +17742,7 @@
         </w:rPr>
         <w:lastRenderedPageBreak/>
         <w:drawing>
-          <wp:inline distT="0" distB="0" distL="0" distR="0" wp14:anchorId="1D311862" wp14:editId="7F81317A">
+          <wp:inline distT="0" distB="0" distL="0" distR="0" wp14:anchorId="28072B33" wp14:editId="361100F8">
             <wp:extent cx="5318760" cy="3640818"/>
             <wp:effectExtent l="0" t="0" r="0" b="0"/>
             <wp:docPr id="41" name="Картина 41"/>
@@ -17744,7 +17810,7 @@
           <w:noProof/>
         </w:rPr>
         <w:drawing>
-          <wp:inline distT="0" distB="0" distL="0" distR="0" wp14:anchorId="1A541946" wp14:editId="275A40F6">
+          <wp:inline distT="0" distB="0" distL="0" distR="0" wp14:anchorId="455F01D6" wp14:editId="68D63D1D">
             <wp:extent cx="5304026" cy="2750820"/>
             <wp:effectExtent l="0" t="0" r="0" b="0"/>
             <wp:docPr id="42" name="Картина 42"/>
@@ -17805,11 +17871,11 @@
           <w:numId w:val="14"/>
         </w:numPr>
       </w:pPr>
-      <w:bookmarkStart w:id="78" w:name="_Toc232510656"/>
+      <w:bookmarkStart w:id="79" w:name="_Toc232535515"/>
       <w:r>
         <w:t>Зареждане на данни</w:t>
       </w:r>
-      <w:bookmarkEnd w:id="78"/>
+      <w:bookmarkEnd w:id="79"/>
     </w:p>
     <w:p>
       <w:r>
@@ -17836,12 +17902,12 @@
           <w:numId w:val="14"/>
         </w:numPr>
       </w:pPr>
-      <w:bookmarkStart w:id="79" w:name="_Toc232510657"/>
+      <w:bookmarkStart w:id="80" w:name="_Toc232535516"/>
       <w:r>
         <w:lastRenderedPageBreak/>
         <w:t>Разделяне на страници</w:t>
       </w:r>
-      <w:bookmarkEnd w:id="79"/>
+      <w:bookmarkEnd w:id="80"/>
     </w:p>
     <w:p>
       <w:r>
@@ -17876,7 +17942,7 @@
           <w:noProof/>
         </w:rPr>
         <w:drawing>
-          <wp:inline distT="0" distB="0" distL="0" distR="0" wp14:anchorId="4C7AEF7D" wp14:editId="23426B40">
+          <wp:inline distT="0" distB="0" distL="0" distR="0" wp14:anchorId="7DF38196" wp14:editId="01BF4198">
             <wp:extent cx="5760720" cy="2350770"/>
             <wp:effectExtent l="0" t="0" r="0" b="0"/>
             <wp:docPr id="43" name="Картина 43"/>
@@ -17931,11 +17997,11 @@
           <w:numId w:val="14"/>
         </w:numPr>
       </w:pPr>
-      <w:bookmarkStart w:id="80" w:name="_Toc232510658"/>
+      <w:bookmarkStart w:id="81" w:name="_Toc232535517"/>
       <w:r>
         <w:t>Модален прозорец</w:t>
       </w:r>
-      <w:bookmarkEnd w:id="80"/>
+      <w:bookmarkEnd w:id="81"/>
     </w:p>
     <w:p>
       <w:r>
@@ -17982,7 +18048,7 @@
         </w:rPr>
         <w:lastRenderedPageBreak/>
         <w:drawing>
-          <wp:inline distT="0" distB="0" distL="0" distR="0" wp14:anchorId="46192BC0" wp14:editId="4EB032C0">
+          <wp:inline distT="0" distB="0" distL="0" distR="0" wp14:anchorId="21441F7D" wp14:editId="4D78CBE3">
             <wp:extent cx="3947160" cy="1224425"/>
             <wp:effectExtent l="0" t="0" r="0" b="0"/>
             <wp:docPr id="44" name="Картина 44"/>
@@ -18043,11 +18109,11 @@
           <w:numId w:val="14"/>
         </w:numPr>
       </w:pPr>
-      <w:bookmarkStart w:id="81" w:name="_Toc232510659"/>
+      <w:bookmarkStart w:id="82" w:name="_Toc232535518"/>
       <w:r>
         <w:t>Toast известия</w:t>
       </w:r>
-      <w:bookmarkEnd w:id="81"/>
+      <w:bookmarkEnd w:id="82"/>
     </w:p>
     <w:p>
       <w:pPr>
@@ -18085,12 +18151,12 @@
       <w:pPr>
         <w:pStyle w:val="1"/>
       </w:pPr>
-      <w:bookmarkStart w:id="82" w:name="_Toc232510660"/>
+      <w:bookmarkStart w:id="83" w:name="_Toc232535519"/>
       <w:r>
         <w:lastRenderedPageBreak/>
         <w:t>Ръководство на потребителя</w:t>
       </w:r>
-      <w:bookmarkEnd w:id="82"/>
+      <w:bookmarkEnd w:id="83"/>
     </w:p>
     <w:p>
       <w:r>
@@ -18111,11 +18177,11 @@
           <w:numId w:val="18"/>
         </w:numPr>
       </w:pPr>
-      <w:bookmarkStart w:id="83" w:name="_Toc232510661"/>
+      <w:bookmarkStart w:id="84" w:name="_Toc232535520"/>
       <w:r>
         <w:t>Системни изисквания</w:t>
       </w:r>
-      <w:bookmarkEnd w:id="83"/>
+      <w:bookmarkEnd w:id="84"/>
     </w:p>
     <w:p>
       <w:r>
@@ -18247,11 +18313,11 @@
           <w:numId w:val="18"/>
         </w:numPr>
       </w:pPr>
-      <w:bookmarkStart w:id="84" w:name="_Toc232510662"/>
+      <w:bookmarkStart w:id="85" w:name="_Toc232535521"/>
       <w:r>
         <w:t>Инсталиране и конфигуриране</w:t>
       </w:r>
-      <w:bookmarkEnd w:id="84"/>
+      <w:bookmarkEnd w:id="85"/>
     </w:p>
     <w:p>
       <w:pPr>
@@ -18261,11 +18327,11 @@
           <w:numId w:val="18"/>
         </w:numPr>
       </w:pPr>
-      <w:bookmarkStart w:id="85" w:name="_Toc232510663"/>
+      <w:bookmarkStart w:id="86" w:name="_Toc232535522"/>
       <w:r>
         <w:t>Инсталиране на сървърната част</w:t>
       </w:r>
-      <w:bookmarkEnd w:id="85"/>
+      <w:bookmarkEnd w:id="86"/>
     </w:p>
     <w:p>
       <w:r>
@@ -18414,7 +18480,7 @@
           <w:numId w:val="18"/>
         </w:numPr>
       </w:pPr>
-      <w:bookmarkStart w:id="86" w:name="_Toc232510664"/>
+      <w:bookmarkStart w:id="87" w:name="_Toc232535523"/>
       <w:r>
         <w:t xml:space="preserve">Конфигурация и флашване на </w:t>
       </w:r>
@@ -18424,7 +18490,7 @@
         </w:rPr>
         <w:t>ESP32</w:t>
       </w:r>
-      <w:bookmarkEnd w:id="86"/>
+      <w:bookmarkEnd w:id="87"/>
     </w:p>
     <w:p>
       <w:r>
@@ -18511,11 +18577,11 @@
       <w:pPr>
         <w:pStyle w:val="3"/>
       </w:pPr>
-      <w:bookmarkStart w:id="87" w:name="_Toc232510665"/>
+      <w:bookmarkStart w:id="88" w:name="_Toc232535524"/>
       <w:r>
         <w:t>2.3. Инсталиране на мобилно приложение</w:t>
       </w:r>
-      <w:bookmarkEnd w:id="87"/>
+      <w:bookmarkEnd w:id="88"/>
     </w:p>
     <w:p>
       <w:r>
@@ -18535,11 +18601,11 @@
           <w:numId w:val="18"/>
         </w:numPr>
       </w:pPr>
-      <w:bookmarkStart w:id="88" w:name="_Toc232510666"/>
+      <w:bookmarkStart w:id="89" w:name="_Toc232535525"/>
       <w:r>
         <w:t>Работа с уеб интерфейса</w:t>
       </w:r>
-      <w:bookmarkEnd w:id="88"/>
+      <w:bookmarkEnd w:id="89"/>
     </w:p>
     <w:p>
       <w:pPr>
@@ -18549,11 +18615,11 @@
           <w:numId w:val="18"/>
         </w:numPr>
       </w:pPr>
-      <w:bookmarkStart w:id="89" w:name="_Toc232510667"/>
+      <w:bookmarkStart w:id="90" w:name="_Toc232535526"/>
       <w:r>
         <w:t>Вход в системата</w:t>
       </w:r>
-      <w:bookmarkEnd w:id="89"/>
+      <w:bookmarkEnd w:id="90"/>
     </w:p>
     <w:p>
       <w:r>
@@ -18596,7 +18662,7 @@
         </w:rPr>
         <w:lastRenderedPageBreak/>
         <w:drawing>
-          <wp:inline distT="0" distB="0" distL="0" distR="0" wp14:anchorId="5897CCF6" wp14:editId="529ED1B5">
+          <wp:inline distT="0" distB="0" distL="0" distR="0" wp14:anchorId="2E32AD44" wp14:editId="692DCF76">
             <wp:extent cx="5166360" cy="2746052"/>
             <wp:effectExtent l="0" t="0" r="0" b="0"/>
             <wp:docPr id="45" name="Картина 45"/>
@@ -18654,11 +18720,11 @@
           <w:numId w:val="18"/>
         </w:numPr>
       </w:pPr>
-      <w:bookmarkStart w:id="90" w:name="_Toc232510668"/>
+      <w:bookmarkStart w:id="91" w:name="_Toc232535527"/>
       <w:r>
         <w:t>Работа с администраторски профил</w:t>
       </w:r>
-      <w:bookmarkEnd w:id="90"/>
+      <w:bookmarkEnd w:id="91"/>
     </w:p>
     <w:p>
       <w:r>
@@ -18692,7 +18758,7 @@
           <w:noProof/>
         </w:rPr>
         <w:drawing>
-          <wp:inline distT="0" distB="0" distL="0" distR="0" wp14:anchorId="31DFEC83" wp14:editId="76813CAC">
+          <wp:inline distT="0" distB="0" distL="0" distR="0" wp14:anchorId="1D7CBFD4" wp14:editId="55D7F950">
             <wp:extent cx="5143500" cy="2729933"/>
             <wp:effectExtent l="0" t="0" r="0" b="0"/>
             <wp:docPr id="46" name="Картина 46"/>
@@ -18787,7 +18853,7 @@
         </w:rPr>
         <w:lastRenderedPageBreak/>
         <w:drawing>
-          <wp:inline distT="0" distB="0" distL="0" distR="0" wp14:anchorId="57017F94" wp14:editId="6F883C96">
+          <wp:inline distT="0" distB="0" distL="0" distR="0" wp14:anchorId="59844EF9" wp14:editId="43D6894A">
             <wp:extent cx="2961253" cy="2636520"/>
             <wp:effectExtent l="0" t="0" r="0" b="0"/>
             <wp:docPr id="47" name="Картина 47"/>
@@ -18996,7 +19062,7 @@
           <w:noProof/>
         </w:rPr>
         <w:drawing>
-          <wp:inline distT="0" distB="0" distL="0" distR="0" wp14:anchorId="58892EF1" wp14:editId="21DAB57C">
+          <wp:inline distT="0" distB="0" distL="0" distR="0" wp14:anchorId="185DA5C4" wp14:editId="5BAD076D">
             <wp:extent cx="2828184" cy="2766060"/>
             <wp:effectExtent l="0" t="0" r="0" b="0"/>
             <wp:docPr id="48" name="Картина 48"/>
@@ -19064,12 +19130,12 @@
           <w:numId w:val="18"/>
         </w:numPr>
       </w:pPr>
-      <w:bookmarkStart w:id="91" w:name="_Toc232510669"/>
+      <w:bookmarkStart w:id="92" w:name="_Toc232535528"/>
       <w:r>
         <w:lastRenderedPageBreak/>
         <w:t>Работа с преподавателски профил</w:t>
       </w:r>
-      <w:bookmarkEnd w:id="91"/>
+      <w:bookmarkEnd w:id="92"/>
     </w:p>
     <w:p>
       <w:r>
@@ -19123,7 +19189,7 @@
           <w:noProof/>
         </w:rPr>
         <w:drawing>
-          <wp:inline distT="0" distB="0" distL="0" distR="0" wp14:anchorId="5E711908" wp14:editId="33DA3095">
+          <wp:inline distT="0" distB="0" distL="0" distR="0" wp14:anchorId="1802B56B" wp14:editId="3AF69506">
             <wp:extent cx="5250979" cy="2110740"/>
             <wp:effectExtent l="0" t="0" r="6985" b="3810"/>
             <wp:docPr id="49" name="Картина 49"/>
@@ -19191,11 +19257,11 @@
           <w:numId w:val="18"/>
         </w:numPr>
       </w:pPr>
-      <w:bookmarkStart w:id="92" w:name="_Toc232510670"/>
+      <w:bookmarkStart w:id="93" w:name="_Toc232535529"/>
       <w:r>
         <w:t>Работа със студентски профил</w:t>
       </w:r>
-      <w:bookmarkEnd w:id="92"/>
+      <w:bookmarkEnd w:id="93"/>
     </w:p>
     <w:p>
       <w:r>
@@ -19217,7 +19283,7 @@
           <w:noProof/>
         </w:rPr>
         <w:drawing>
-          <wp:inline distT="0" distB="0" distL="0" distR="0" wp14:anchorId="54869473" wp14:editId="49F9F531">
+          <wp:inline distT="0" distB="0" distL="0" distR="0" wp14:anchorId="20BFE824" wp14:editId="7D396233">
             <wp:extent cx="5287627" cy="2514600"/>
             <wp:effectExtent l="0" t="0" r="8890" b="0"/>
             <wp:docPr id="50" name="Картина 50"/>
@@ -19301,12 +19367,12 @@
           <w:numId w:val="18"/>
         </w:numPr>
       </w:pPr>
-      <w:bookmarkStart w:id="93" w:name="_Toc232510671"/>
+      <w:bookmarkStart w:id="94" w:name="_Toc232535530"/>
       <w:r>
         <w:lastRenderedPageBreak/>
         <w:t>Работа с мобилно приложение</w:t>
       </w:r>
-      <w:bookmarkEnd w:id="93"/>
+      <w:bookmarkEnd w:id="94"/>
     </w:p>
     <w:p>
       <w:pPr>
@@ -19316,11 +19382,11 @@
           <w:numId w:val="18"/>
         </w:numPr>
       </w:pPr>
-      <w:bookmarkStart w:id="94" w:name="_Toc232510672"/>
+      <w:bookmarkStart w:id="95" w:name="_Toc232535531"/>
       <w:r>
         <w:t>Първоначално стартиране и вход в приложението</w:t>
       </w:r>
-      <w:bookmarkEnd w:id="94"/>
+      <w:bookmarkEnd w:id="95"/>
     </w:p>
     <w:p>
       <w:r>
@@ -19342,7 +19408,7 @@
           <w:noProof/>
         </w:rPr>
         <w:drawing>
-          <wp:inline distT="0" distB="0" distL="0" distR="0" wp14:anchorId="1540247B" wp14:editId="58C447B1">
+          <wp:inline distT="0" distB="0" distL="0" distR="0" wp14:anchorId="1D79366A" wp14:editId="4E294BF6">
             <wp:extent cx="1485900" cy="3287380"/>
             <wp:effectExtent l="0" t="0" r="0" b="8890"/>
             <wp:docPr id="51" name="Картина 51" descr="C:\git_repos\Screenshot_20260615-191149_Student_Attendance_App.jpg"/>
@@ -19419,7 +19485,7 @@
           <w:numId w:val="18"/>
         </w:numPr>
       </w:pPr>
-      <w:bookmarkStart w:id="95" w:name="_Toc232510673"/>
+      <w:bookmarkStart w:id="96" w:name="_Toc232535532"/>
       <w:r>
         <w:t xml:space="preserve">Чекиране с </w:t>
       </w:r>
@@ -19429,7 +19495,7 @@
         </w:rPr>
         <w:t>NFC</w:t>
       </w:r>
-      <w:bookmarkEnd w:id="95"/>
+      <w:bookmarkEnd w:id="96"/>
     </w:p>
     <w:p>
       <w:r>
@@ -19505,7 +19571,7 @@
           <w:noProof/>
         </w:rPr>
         <w:drawing>
-          <wp:inline distT="0" distB="0" distL="0" distR="0" wp14:anchorId="7CFF364D" wp14:editId="65D3227A">
+          <wp:inline distT="0" distB="0" distL="0" distR="0" wp14:anchorId="2153F2D6" wp14:editId="2C97C6BF">
             <wp:extent cx="1386840" cy="3081866"/>
             <wp:effectExtent l="0" t="0" r="3810" b="4445"/>
             <wp:docPr id="53" name="Картина 53" descr="C:\git_repos\Screenshot_20260615-191138_Student_Attendance_App.jpg"/>
@@ -19580,7 +19646,7 @@
           <w:noProof/>
         </w:rPr>
         <w:drawing>
-          <wp:inline distT="0" distB="0" distL="0" distR="0" wp14:anchorId="6FDEA1EC" wp14:editId="4AF6C163">
+          <wp:inline distT="0" distB="0" distL="0" distR="0" wp14:anchorId="55B06068" wp14:editId="6A6F5982">
             <wp:extent cx="1318260" cy="2929465"/>
             <wp:effectExtent l="0" t="0" r="0" b="4445"/>
             <wp:docPr id="54" name="Картина 54" descr="C:\git_repos\Screenshot_20260615-191249_Student_Attendance_App.jpg"/>
@@ -19676,7 +19742,7 @@
         </w:rPr>
         <w:lastRenderedPageBreak/>
         <w:drawing>
-          <wp:inline distT="0" distB="0" distL="0" distR="0" wp14:anchorId="7765C71B" wp14:editId="16945657">
+          <wp:inline distT="0" distB="0" distL="0" distR="0" wp14:anchorId="4CC9C75D" wp14:editId="73F20D47">
             <wp:extent cx="1368172" cy="3040380"/>
             <wp:effectExtent l="0" t="0" r="3810" b="7620"/>
             <wp:docPr id="55" name="Картина 55" descr="C:\git_repos\Screenshot_20260615-191302_Student_Attendance_App.jpg"/>
@@ -19744,11 +19810,11 @@
           <w:numId w:val="18"/>
         </w:numPr>
       </w:pPr>
-      <w:bookmarkStart w:id="96" w:name="_Toc232510674"/>
+      <w:bookmarkStart w:id="97" w:name="_Toc232535533"/>
       <w:r>
         <w:t>Често срещани проблеми</w:t>
       </w:r>
-      <w:bookmarkEnd w:id="96"/>
+      <w:bookmarkEnd w:id="97"/>
     </w:p>
     <w:p>
       <w:pPr>
@@ -20282,14 +20348,12 @@
         </w:rPr>
         <w:t>често срещани проблеми</w:t>
       </w:r>
-      <w:bookmarkStart w:id="97" w:name="_GoBack"/>
-      <w:bookmarkEnd w:id="97"/>
     </w:p>
     <w:p>
       <w:pPr>
         <w:pStyle w:val="1"/>
       </w:pPr>
-      <w:bookmarkStart w:id="98" w:name="_Toc232510675"/>
+      <w:bookmarkStart w:id="98" w:name="_Toc232535534"/>
       <w:r>
         <w:lastRenderedPageBreak/>
         <w:t>Заключение</w:t>
@@ -20546,6 +20610,7 @@
         <w:ind w:firstLine="708"/>
         <w:jc w:val="both"/>
       </w:pPr>
+      <w:bookmarkStart w:id="99" w:name="_Toc232535535"/>
       <w:r>
         <w:lastRenderedPageBreak/>
         <w:t>Речник на и</w:t>
@@ -20553,13 +20618,20 @@
       <w:r>
         <w:t>зползвани съкращения и термини</w:t>
       </w:r>
+      <w:bookmarkEnd w:id="99"/>
     </w:p>
     <w:p>
       <w:pPr>
         <w:ind w:firstLine="0"/>
       </w:pPr>
       <w:r>
-        <w:t>NFC - Near Field Communication (комуникация на близко разстояние)</w:t>
+        <w:rPr>
+          <w:b/>
+        </w:rPr>
+        <w:t>NFC</w:t>
+      </w:r>
+      <w:r>
+        <w:t xml:space="preserve"> - Near Field Communication (комуникация на близко разстояние)</w:t>
       </w:r>
     </w:p>
     <w:p>
@@ -20567,7 +20639,13 @@
         <w:ind w:firstLine="0"/>
       </w:pPr>
       <w:r>
-        <w:t>HCE - Host Card Emulation (емулация на карта от хост)</w:t>
+        <w:rPr>
+          <w:b/>
+        </w:rPr>
+        <w:t>HCE</w:t>
+      </w:r>
+      <w:r>
+        <w:t xml:space="preserve"> - Host Card Emulation (емулация на карта от хост)</w:t>
       </w:r>
     </w:p>
     <w:p>
@@ -20575,7 +20653,13 @@
         <w:ind w:firstLine="0"/>
       </w:pPr>
       <w:r>
-        <w:t>HMAC - Hash-based Message Authentication Code (код за удостоверяване на съобщение базиран на хеш)</w:t>
+        <w:rPr>
+          <w:b/>
+        </w:rPr>
+        <w:t>HMAC</w:t>
+      </w:r>
+      <w:r>
+        <w:t xml:space="preserve"> - Hash-based Message Authentication Code (код за удостоверяване на съобщение базиран на хеш)</w:t>
       </w:r>
     </w:p>
     <w:p>
@@ -20583,7 +20667,13 @@
         <w:ind w:firstLine="0"/>
       </w:pPr>
       <w:r>
-        <w:t>ATC - Application Transaction Counter (брояч на транзакции на приложението)</w:t>
+        <w:rPr>
+          <w:b/>
+        </w:rPr>
+        <w:t>ATC</w:t>
+      </w:r>
+      <w:r>
+        <w:t xml:space="preserve"> - Application Transaction Counter (брояч на транзакции на приложението)</w:t>
       </w:r>
     </w:p>
     <w:p>
@@ -20591,7 +20681,13 @@
         <w:ind w:firstLine="0"/>
       </w:pPr>
       <w:r>
-        <w:t>APDU - Application Protocol Data Unit (единица данни на приложния протокол)</w:t>
+        <w:rPr>
+          <w:b/>
+        </w:rPr>
+        <w:t>APDU</w:t>
+      </w:r>
+      <w:r>
+        <w:t xml:space="preserve"> - Application Protocol Data Unit (единица данни на приложния протокол)</w:t>
       </w:r>
     </w:p>
     <w:p>
@@ -20599,7 +20695,13 @@
         <w:ind w:firstLine="0"/>
       </w:pPr>
       <w:r>
-        <w:t>SPI - Serial Peripheral Interface (сериен периферен интерфейс)</w:t>
+        <w:rPr>
+          <w:b/>
+        </w:rPr>
+        <w:t>SPI</w:t>
+      </w:r>
+      <w:r>
+        <w:t xml:space="preserve"> - Serial Peripheral Interface (сериен периферен интерфейс)</w:t>
       </w:r>
     </w:p>
     <w:p>
@@ -20607,7 +20709,13 @@
         <w:ind w:firstLine="0"/>
       </w:pPr>
       <w:r>
-        <w:t>JWT - JSON Web Token</w:t>
+        <w:rPr>
+          <w:b/>
+        </w:rPr>
+        <w:t>JWT</w:t>
+      </w:r>
+      <w:r>
+        <w:t xml:space="preserve"> - JSON Web Token</w:t>
       </w:r>
     </w:p>
     <w:p>
@@ -20615,7 +20723,13 @@
         <w:ind w:firstLine="0"/>
       </w:pPr>
       <w:r>
-        <w:t>AES - Advanced Encryption Standard (усъвършенстван стандарт за криптиране)</w:t>
+        <w:rPr>
+          <w:b/>
+        </w:rPr>
+        <w:t>AES</w:t>
+      </w:r>
+      <w:r>
+        <w:t xml:space="preserve"> - Advanced Encryption Standard (усъвършенстван стандарт за криптиране)</w:t>
       </w:r>
     </w:p>
     <w:p>
@@ -20623,7 +20737,13 @@
         <w:ind w:firstLine="0"/>
       </w:pPr>
       <w:r>
-        <w:t>API - Application Programming Interface (интерфейс за програмиране на приложения)</w:t>
+        <w:rPr>
+          <w:b/>
+        </w:rPr>
+        <w:t>API</w:t>
+      </w:r>
+      <w:r>
+        <w:t xml:space="preserve"> - Application Programming Interface (интерфейс за програмиране на приложения)</w:t>
       </w:r>
     </w:p>
     <w:p>
@@ -20631,7 +20751,13 @@
         <w:ind w:firstLine="0"/>
       </w:pPr>
       <w:r>
-        <w:t>REST - Representational State Transfer</w:t>
+        <w:rPr>
+          <w:b/>
+        </w:rPr>
+        <w:t>REST</w:t>
+      </w:r>
+      <w:r>
+        <w:t xml:space="preserve"> - Representational State Transfer</w:t>
       </w:r>
     </w:p>
     <w:p>
@@ -20639,7 +20765,13 @@
         <w:ind w:firstLine="0"/>
       </w:pPr>
       <w:r>
-        <w:t>ORM - Object-Relational Mapper</w:t>
+        <w:rPr>
+          <w:b/>
+        </w:rPr>
+        <w:t>ORM</w:t>
+      </w:r>
+      <w:r>
+        <w:t xml:space="preserve"> - Object-Relational Mapper</w:t>
       </w:r>
     </w:p>
     <w:p>
@@ -20647,7 +20779,13 @@
         <w:ind w:firstLine="0"/>
       </w:pPr>
       <w:r>
-        <w:t>SHA - Secure Hash Algorithm (защитен хеш алгоритъм)</w:t>
+        <w:rPr>
+          <w:b/>
+        </w:rPr>
+        <w:t>SHA</w:t>
+      </w:r>
+      <w:r>
+        <w:t xml:space="preserve"> - Secure Hash Algorithm (защитен хеш алгоритъм)</w:t>
       </w:r>
     </w:p>
     <w:p>
@@ -20655,7 +20793,13 @@
         <w:ind w:firstLine="0"/>
       </w:pPr>
       <w:r>
-        <w:t>GPIO - General Purpose Input/Output (универсален вход/изход)</w:t>
+        <w:rPr>
+          <w:b/>
+        </w:rPr>
+        <w:t>GPIO</w:t>
+      </w:r>
+      <w:r>
+        <w:t xml:space="preserve"> - General Purpose Input/Output (универсален вход/изход)</w:t>
       </w:r>
     </w:p>
     <w:p>
@@ -20663,7 +20807,13 @@
         <w:ind w:firstLine="0"/>
       </w:pPr>
       <w:r>
-        <w:t>PWM - Pulse Width Modulation (широчинно-импулсна модулация)</w:t>
+        <w:rPr>
+          <w:b/>
+        </w:rPr>
+        <w:t>PWM</w:t>
+      </w:r>
+      <w:r>
+        <w:t xml:space="preserve"> - Pulse Width Modulation (широчинно-импулсна модулация)</w:t>
       </w:r>
     </w:p>
     <w:p>
@@ -20671,7 +20821,13 @@
         <w:ind w:firstLine="0"/>
       </w:pPr>
       <w:r>
-        <w:t>AID - Application Identifier (идентификатор на приложение)</w:t>
+        <w:rPr>
+          <w:b/>
+        </w:rPr>
+        <w:t>AID</w:t>
+      </w:r>
+      <w:r>
+        <w:t xml:space="preserve"> - Application Identifier (идентификатор на приложение)</w:t>
       </w:r>
     </w:p>
     <w:p>
@@ -20679,7 +20835,13 @@
         <w:ind w:firstLine="0"/>
       </w:pPr>
       <w:r>
-        <w:t>RFID - Radio Frequency Identification (радиочестотна идентификация)</w:t>
+        <w:rPr>
+          <w:b/>
+        </w:rPr>
+        <w:t>RFID</w:t>
+      </w:r>
+      <w:r>
+        <w:t xml:space="preserve"> - Radio Frequency Identification (радиочестотна идентификация)</w:t>
       </w:r>
     </w:p>
     <w:p>
@@ -20687,7 +20849,13 @@
         <w:ind w:firstLine="0"/>
       </w:pPr>
       <w:r>
-        <w:t>JSON - JavaScript Object Notation</w:t>
+        <w:rPr>
+          <w:b/>
+        </w:rPr>
+        <w:t>JSON</w:t>
+      </w:r>
+      <w:r>
+        <w:t xml:space="preserve"> - JavaScript Object Notation</w:t>
       </w:r>
     </w:p>
     <w:p>
@@ -20695,7 +20863,13 @@
         <w:ind w:firstLine="0"/>
       </w:pPr>
       <w:r>
-        <w:t>URL - Uniform Resource Locator</w:t>
+        <w:rPr>
+          <w:b/>
+        </w:rPr>
+        <w:t>URL</w:t>
+      </w:r>
+      <w:r>
+        <w:t xml:space="preserve"> - Uniform Resource Locator</w:t>
       </w:r>
     </w:p>
     <w:p>
@@ -20703,7 +20877,13 @@
         <w:ind w:firstLine="0"/>
       </w:pPr>
       <w:r>
-        <w:t>HTTP/HTTPS - Hypertext Transfer Protocol (Secure)</w:t>
+        <w:rPr>
+          <w:b/>
+        </w:rPr>
+        <w:t>HTTP/HTTPS</w:t>
+      </w:r>
+      <w:r>
+        <w:t xml:space="preserve"> - Hypertext Transfer Protocol (Secure)</w:t>
       </w:r>
     </w:p>
     <w:p>
@@ -20711,7 +20891,13 @@
         <w:ind w:firstLine="0"/>
       </w:pPr>
       <w:r>
-        <w:t>Replay атака - атака при която прихванато съобщение се изпраща повторно</w:t>
+        <w:rPr>
+          <w:b/>
+        </w:rPr>
+        <w:t>Replay</w:t>
+      </w:r>
+      <w:r>
+        <w:t xml:space="preserve"> атака - атака при която прихванато съобщение се изпраща повторно</w:t>
       </w:r>
     </w:p>
     <w:p>
@@ -20719,7 +20905,13 @@
         <w:ind w:firstLine="0"/>
       </w:pPr>
       <w:r>
-        <w:t>Payload - полезното съдържание на предадените данни</w:t>
+        <w:rPr>
+          <w:b/>
+        </w:rPr>
+        <w:t>Payload</w:t>
+      </w:r>
+      <w:r>
+        <w:t xml:space="preserve"> - полезното съдържание на предадените данни</w:t>
       </w:r>
     </w:p>
     <w:p>
@@ -20727,7 +20919,13 @@
         <w:ind w:firstLine="0"/>
       </w:pPr>
       <w:r>
-        <w:t>Endpoint - адрес на API, към който се изпращат заявки</w:t>
+        <w:rPr>
+          <w:b/>
+        </w:rPr>
+        <w:t>Endpoint</w:t>
+      </w:r>
+      <w:r>
+        <w:t xml:space="preserve"> - адрес на API, към който се изпращат заявки</w:t>
       </w:r>
     </w:p>
     <w:p>
@@ -20735,7 +20933,13 @@
         <w:ind w:firstLine="0"/>
       </w:pPr>
       <w:r>
-        <w:t>Фърмуер - програмен код, записан директно в хардуера на микроконтролера</w:t>
+        <w:rPr>
+          <w:b/>
+        </w:rPr>
+        <w:t>Фърмуер</w:t>
+      </w:r>
+      <w:r>
+        <w:t xml:space="preserve"> - програмен код, записан директно в хардуера на микроконтролера</w:t>
       </w:r>
       <w:r>
         <w:br w:type="page"/>
@@ -20751,12 +20955,12 @@
         <w:ind w:left="714"/>
         <w:jc w:val="both"/>
       </w:pPr>
-      <w:bookmarkStart w:id="99" w:name="_Toc232510676"/>
+      <w:bookmarkStart w:id="100" w:name="_Toc232535536"/>
       <w:r>
         <w:lastRenderedPageBreak/>
         <w:t>Източници</w:t>
       </w:r>
-      <w:bookmarkEnd w:id="99"/>
+      <w:bookmarkEnd w:id="100"/>
     </w:p>
     <w:p>
       <w:r>
@@ -21170,7 +21374,7 @@
           <w:rPr>
             <w:noProof/>
           </w:rPr>
-          <w:t>56</w:t>
+          <w:t>2</w:t>
         </w:r>
         <w:r>
           <w:fldChar w:fldCharType="end"/>
@@ -24917,7 +25121,7 @@
 </file>
 
 <file path=customXml/itemProps1.xml><?xml version="1.0" encoding="utf-8"?>
-<ds:datastoreItem xmlns:ds="http://schemas.openxmlformats.org/officeDocument/2006/customXml" ds:itemID="{CDFE574F-4600-4D2C-889C-95E5F1594B38}">
+<ds:datastoreItem xmlns:ds="http://schemas.openxmlformats.org/officeDocument/2006/customXml" ds:itemID="{88E586B4-37A6-49F1-89EB-C142511E68EE}">
   <ds:schemaRefs>
     <ds:schemaRef ds:uri="http://schemas.openxmlformats.org/officeDocument/2006/bibliography"/>
   </ds:schemaRefs>

</xml_diff>